<commit_message>
Commit all previously uncommitted changes from stages 3–9 + Phase 1
Includes: valuation engines (marketability fields, delete run), AI valuation
(suggestedLandRateGovt/Market), report generation, review/delivery, auth
improvements, shared types/schemas (enums, valuation, assignment, inspection,
property-data, field-visibility), StatusBadge (DATA_VERIFIED status),
usePermissions (isInspector), AppLayout, AssignmentsPage, NewAssignmentPage,
CLAUDE.md, deploy script, report templates, seed script.

These files were modified locally but never committed; CI was failing because
it type-checks against git HEAD.

Co-Authored-By: Claude Sonnet 4.6 <noreply@anthropic.com>
</commit_message>
<xml_diff>
--- a/apps/api/src/modules/reports/templates/processed/PNB_Flat.docx
+++ b/apps/api/src/modules/reports/templates/processed/PNB_Flat.docx
@@ -1,6 +1,175 @@
 
-<file path=word/document.xml><?xml version="1.0" encoding="UTF-8" standalone="yes"?>-<w:document xmlns:mc="http://schemas.openxmlformats.org/markup-compatibility/2006" xmlns:o="urn:schemas-microsoft-com:office:office" xmlns:r="http://schemas.openxmlformats.org/officeDocument/2006/relationships" xmlns:m="http://schemas.openxmlformats.org/officeDocument/2006/math" xmlns:v="urn:schemas-microsoft-com:vml" xmlns:wp="http://schemas.openxmlformats.org/drawingml/2006/wordprocessingDrawing" xmlns:w10="urn:schemas-microsoft-com:office:word" xmlns:w="http://schemas.openxmlformats.org/wordprocessingml/2006/main" xmlns:wne="http://schemas.microsoft.com/office/word/2006/wordml" xmlns:sl="http://schemas.openxmlformats.org/schemaLibrary/2006/main" xmlns:a="http://schemas.openxmlformats.org/drawingml/2006/main" xmlns:pic="http://schemas.openxmlformats.org/drawingml/2006/picture" xmlns:c="http://schemas.openxmlformats.org/drawingml/2006/chart" xmlns:lc="http://schemas.openxmlformats.org/drawingml/2006/lockedCanvas" xmlns:dgm="http://schemas.openxmlformats.org/drawingml/2006/diagram" xmlns:wps="http://schemas.microsoft.com/office/word/2010/wordprocessingShape" xmlns:wpg="http://schemas.microsoft.com/office/word/2010/wordprocessingGroup" xmlns:w14="http://schemas.microsoft.com/office/word/2010/wordml" xmlns:w15="http://schemas.microsoft.com/office/word/2012/wordml" xmlns:w16="http://schemas.microsoft.com/office/word/2018/wordml" xmlns:w16cex="http://schemas.microsoft.com/office/word/2018/wordml/cex" xmlns:w16cid="http://schemas.microsoft.com/office/word/2016/wordml/cid" xmlns="http://schemas.microsoft.com/office/tasks/2019/documenttasks" xmlns:cr="http://schemas.microsoft.com/office/comments/2020/reactions"><w:body><w:p><w:pPr><w:rPr><w:b w:val="1"/><w:bCs w:val="1"/><w:u w:val="single"/></w:rPr></w:pPr><w:r><w:rPr><w:rtl w:val="0"/></w:rPr></w:r></w:p><w:p><w:pPr><w:jc w:val="right"/><w:rPr><w:b w:val="1"/><w:bCs w:val="1"/><w:u w:val="single"/></w:rPr></w:pPr><w:r><w:rPr><w:rtl w:val="0"/></w:rPr></w:r></w:p><w:p><w:pPr><w:jc w:val="right"/><w:rPr><w:b w:val="1"/><w:bCs w:val="1"/><w:u w:val="single"/></w:rPr></w:pPr><w:r><w:rPr><w:rtl w:val="0"/></w:rPr></w:r></w:p><w:p><w:pPr><w:jc w:val="right"/><w:rPr><w:b w:val="1"/><w:bCs w:val="1"/><w:u w:val="single"/></w:rPr></w:pPr><w:r><w:rPr><w:rtl w:val="0"/></w:rPr></w:r></w:p><w:p><w:pPr><w:jc w:val="right"/><w:rPr><w:b w:val="1"/><w:bCs w:val="1"/><w:u w:val="single"/></w:rPr></w:pPr><w:r><w:rPr><w:rtl w:val="0"/></w:rPr></w:r></w:p><w:p><w:pPr><w:jc w:val="right"/><w:rPr><w:b w:val="1"/><w:bCs w:val="1"/><w:u w:val="single"/></w:rPr></w:pPr><w:r><w:rPr><w:rtl w:val="0"/></w:rPr></w:r></w:p><w:p><w:pPr><w:jc w:val="right"/><w:rPr><w:b w:val="1"/><w:bCs w:val="1"/><w:u w:val="single"/></w:rPr></w:pPr><w:r><w:rPr><w:rtl w:val="0"/></w:rPr></w:r></w:p><w:p><w:pPr><w:jc w:val="right"/><w:rPr><w:b w:val="1"/><w:bCs w:val="1"/><w:u w:val="single"/></w:rPr></w:pPr><w:r><w:rPr><w:b w:val="1"/><w:bCs w:val="1"/><w:u w:val="single"/><w:rtl w:val="0"/></w:rPr><w:t xml:space="preserve">Appendix-II</w:t></w:r></w:p><w:p><w:pPr><w:rPr><w:b w:val="1"/><w:bCs w:val="1"/><w:u w:val="single"/></w:rPr></w:pPr><w:r><w:rPr><w:rtl w:val="0"/></w:rPr></w:r></w:p><w:p><w:pPr><w:rPr><w:b w:val="1"/><w:bCs w:val="1"/><w:u w:val="single"/></w:rPr></w:pPr><w:r><w:rPr><w:rtl w:val="0"/></w:rPr></w:r></w:p><w:p><w:pPr><w:rPr><w:b w:val="1"/><w:bCs w:val="1"/></w:rPr></w:pPr><w:r><w:rPr><w:b w:val="1"/><w:bCs w:val="1"/></w:rPr><w:t xml:space="preserve">Ref. No. {firmReferenceNo}&lt;w:tab/&gt;&lt;w:tab/&gt;&lt;w:t xml:space="preserve"&gt;              &lt;w:t xml:space="preserve"&gt;             &lt;w:t xml:space="preserve"&gt; &lt;w:t xml:space="preserve"&gt;            Date: {reportDate}</w:t></w:r></w:p><w:p><w:pPr><w:pStyle w:val="Subtitle"/><w:pBdr><w:top w:color="000000" w:space="1" w:sz="4" w:val="single"/><w:left w:color="000000" w:space="20" w:sz="4" w:val="single"/><w:bottom w:color="000000" w:space="1" w:sz="4" w:val="single"/><w:right w:color="000000" w:space="4" w:sz="4" w:val="single"/></w:pBdr><w:spacing w:line="360" w:lineRule="auto"/><w:jc w:val="center"/><w:rPr><w:rFonts w:ascii="Calibri" w:cs="Calibri" w:eastAsia="Calibri" w:hAnsi="Calibri"/><w:i w:val="1"/><w:iCs w:val="1"/><w:sz w:val="22"/><w:szCs w:val="22"/><w:u w:val="single"/></w:rPr></w:pPr><w:r><w:rPr><w:rtl w:val="0"/></w:rPr></w:r></w:p><w:p><w:pPr><w:pStyle w:val="Subtitle"/><w:pBdr><w:top w:color="000000" w:space="1" w:sz="4" w:val="single"/><w:left w:color="000000" w:space="20" w:sz="4" w:val="single"/><w:bottom w:color="000000" w:space="1" w:sz="4" w:val="single"/><w:right w:color="000000" w:space="4" w:sz="4" w:val="single"/></w:pBdr><w:spacing w:line="360" w:lineRule="auto"/><w:jc w:val="center"/><w:rPr><w:rFonts w:ascii="Calibri" w:cs="Calibri" w:eastAsia="Calibri" w:hAnsi="Calibri"/><w:i w:val="1"/><w:iCs w:val="1"/><w:sz w:val="28"/><w:szCs w:val="28"/><w:u w:val="single"/></w:rPr></w:pPr><w:r><w:rPr><w:rFonts w:ascii="Calibri" w:cs="Calibri" w:eastAsia="Calibri" w:hAnsi="Calibri"/><w:i w:val="1"/><w:iCs w:val="1"/><w:sz w:val="28"/><w:szCs w:val="28"/><w:u w:val="single"/><w:rtl w:val="0"/></w:rPr><w:t xml:space="preserve">VALUATION REPORT OF</w:t></w:r></w:p><w:p><w:pPr><w:pStyle w:val="Subtitle"/><w:pBdr><w:top w:color="000000" w:space="1" w:sz="4" w:val="single"/><w:left w:color="000000" w:space="20" w:sz="4" w:val="single"/><w:bottom w:color="000000" w:space="1" w:sz="4" w:val="single"/><w:right w:color="000000" w:space="4" w:sz="4" w:val="single"/></w:pBdr><w:spacing w:line="360" w:lineRule="auto"/><w:jc w:val="center"/><w:rPr><w:rFonts w:ascii="Calibri" w:cs="Calibri" w:eastAsia="Calibri" w:hAnsi="Calibri"/><w:sz w:val="28"/><w:szCs w:val="28"/><w:u w:val="single"/></w:rPr></w:pPr><w:r><w:rPr><w:rFonts w:ascii="Calibri" w:cs="Calibri" w:eastAsia="Calibri" w:hAnsi="Calibri"/><w:sz w:val="28"/><w:szCs w:val="28"/><w:u w:val="single"/><w:rtl w:val="0"/></w:rPr><w:t xml:space="preserve"> </w:t></w:r><w:r><w:rPr><w:rFonts w:ascii="Calibri" w:cs="Calibri" w:eastAsia="Calibri" w:hAnsi="Calibri"/><w:sz w:val="28"/><w:szCs w:val="28"/><w:highlight w:val="yellow"/><w:u w:val="single"/><w:rtl w:val="0"/></w:rPr><w:t xml:space="preserve">{ownerName}</w:t></w:r><w:r><w:rPr><w:rFonts w:ascii="Calibri" w:cs="Calibri" w:eastAsia="Calibri" w:hAnsi="Calibri"/><w:sz w:val="28"/><w:szCs w:val="28"/><w:u w:val="single"/><w:rtl w:val="0"/></w:rPr><w:t xml:space="preserve"> </w:t></w:r></w:p><w:p><w:pPr><w:pStyle w:val="Subtitle"/><w:pBdr><w:top w:color="000000" w:space="1" w:sz="4" w:val="single"/><w:left w:color="000000" w:space="20" w:sz="4" w:val="single"/><w:bottom w:color="000000" w:space="1" w:sz="4" w:val="single"/><w:right w:color="000000" w:space="4" w:sz="4" w:val="single"/></w:pBdr><w:spacing w:line="360" w:lineRule="auto"/><w:jc w:val="center"/><w:rPr><w:rFonts w:ascii="Calibri" w:cs="Calibri" w:eastAsia="Calibri" w:hAnsi="Calibri"/><w:sz w:val="28"/><w:szCs w:val="28"/><w:u w:val="single"/></w:rPr></w:pPr><w:r><w:rPr><w:rFonts w:ascii="Calibri" w:cs="Calibri" w:eastAsia="Calibri" w:hAnsi="Calibri"/><w:sz w:val="28"/><w:szCs w:val="28"/><w:u w:val="single"/><w:rtl w:val="0"/></w:rPr><w:t xml:space="preserve">At</w:t></w:r></w:p><w:p><w:pPr><w:pStyle w:val="Subtitle"/><w:pBdr><w:top w:color="000000" w:space="1" w:sz="4" w:val="single"/><w:left w:color="000000" w:space="20" w:sz="4" w:val="single"/><w:bottom w:color="000000" w:space="1" w:sz="4" w:val="single"/><w:right w:color="000000" w:space="4" w:sz="4" w:val="single"/></w:pBdr><w:spacing w:line="360" w:lineRule="auto"/><w:jc w:val="center"/><w:rPr><w:rFonts w:ascii="Calibri" w:cs="Calibri" w:eastAsia="Calibri" w:hAnsi="Calibri"/><w:sz w:val="28"/><w:szCs w:val="28"/><w:u w:val="single"/></w:rPr></w:pPr><w:r><w:rPr><w:rFonts w:ascii="Calibri" w:cs="Calibri" w:eastAsia="Calibri" w:hAnsi="Calibri"/><w:sz w:val="28"/><w:szCs w:val="28"/><w:highlight w:val="yellow"/><w:u w:val="single"/><w:rtl w:val="0"/></w:rPr><w:t xml:space="preserve">FLAT NO. 4901, 49</w:t></w:r><w:r><w:rPr><w:rFonts w:ascii="Calibri" w:cs="Calibri" w:eastAsia="Calibri" w:hAnsi="Calibri"/><w:sz w:val="28"/><w:szCs w:val="28"/><w:highlight w:val="yellow"/><w:u w:val="single"/><w:vertAlign w:val="superscript"/><w:rtl w:val="0"/></w:rPr><w:t xml:space="preserve">TH</w:t></w:r><w:r><w:rPr><w:rFonts w:ascii="Calibri" w:cs="Calibri" w:eastAsia="Calibri" w:hAnsi="Calibri"/><w:sz w:val="28"/><w:szCs w:val="28"/><w:highlight w:val="yellow"/><w:u w:val="single"/><w:rtl w:val="0"/></w:rPr><w:t xml:space="preserve"> FLOOR, EAST WING, THE WORLD CREST, SENAPATI BAPAT MARG. CS NO. 443, 444, 445(PT), 446 OF VILLAGE LOWER PAREL, MUMBAI 400013</w:t></w:r><w:r><w:rPr><w:rtl w:val="0"/></w:rPr></w:r></w:p><w:p><w:pPr><w:pStyle w:val="Subtitle"/><w:pBdr><w:top w:color="000000" w:space="1" w:sz="4" w:val="single"/><w:left w:color="000000" w:space="20" w:sz="4" w:val="single"/><w:bottom w:color="000000" w:space="1" w:sz="4" w:val="single"/><w:right w:color="000000" w:space="4" w:sz="4" w:val="single"/></w:pBdr><w:spacing w:line="360" w:lineRule="auto"/><w:jc w:val="center"/><w:rPr><w:rFonts w:ascii="Calibri" w:cs="Calibri" w:eastAsia="Calibri" w:hAnsi="Calibri"/><w:sz w:val="28"/><w:szCs w:val="28"/><w:u w:val="single"/></w:rPr></w:pPr><w:r><w:rPr><w:rFonts w:ascii="Calibri" w:cs="Calibri" w:eastAsia="Calibri" w:hAnsi="Calibri"/><w:sz w:val="28"/><w:szCs w:val="28"/><w:u w:val="single"/><w:rtl w:val="0"/></w:rPr><w:t xml:space="preserve">FOR</w:t></w:r></w:p><w:p><w:pPr><w:pStyle w:val="Subtitle"/><w:pBdr><w:top w:color="000000" w:space="1" w:sz="4" w:val="single"/><w:left w:color="000000" w:space="20" w:sz="4" w:val="single"/><w:bottom w:color="000000" w:space="1" w:sz="4" w:val="single"/><w:right w:color="000000" w:space="4" w:sz="4" w:val="single"/></w:pBdr><w:spacing w:line="360" w:lineRule="auto"/><w:jc w:val="center"/><w:rPr><w:rFonts w:ascii="Calibri" w:cs="Calibri" w:eastAsia="Calibri" w:hAnsi="Calibri"/><w:sz w:val="28"/><w:szCs w:val="28"/><w:u w:val="single"/></w:rPr></w:pPr><w:r><w:rPr><w:rFonts w:ascii="Calibri" w:cs="Calibri" w:eastAsia="Calibri" w:hAnsi="Calibri"/><w:sz w:val="28"/><w:szCs w:val="28"/><w:highlight w:val="yellow"/><w:u w:val="single"/><w:rtl w:val="0"/></w:rPr><w:t xml:space="preserve">PNB, LALBAUG BRANCH</w:t></w:r><w:r><w:rPr><w:rFonts w:ascii="Calibri" w:cs="Calibri" w:eastAsia="Calibri" w:hAnsi="Calibri"/><w:sz w:val="28"/><w:szCs w:val="28"/><w:u w:val="single"/><w:rtl w:val="0"/></w:rPr><w:t xml:space="preserve">  </w:t></w:r></w:p><w:p><w:pPr><w:spacing w:after="0" w:lineRule="auto"/><w:ind w:left="10" w:right="6" w:hanging="10"/><w:jc w:val="center"/><w:rPr/></w:pPr><w:r><w:rPr><w:rtl w:val="0"/></w:rPr></w:r></w:p><w:p><w:pPr><w:spacing w:after="0" w:lineRule="auto"/><w:ind w:left="10" w:right="6" w:hanging="10"/><w:jc w:val="center"/><w:rPr/></w:pPr><w:r><w:rPr><w:rtl w:val="0"/></w:rPr></w:r></w:p><w:p><w:pPr><w:spacing w:after="0" w:lineRule="auto"/><w:ind w:left="10" w:right="6" w:hanging="10"/><w:jc w:val="center"/><w:rPr/></w:pPr><w:r><w:rPr><w:rtl w:val="0"/></w:rPr></w:r></w:p><w:p><w:pPr><w:spacing w:after="0" w:lineRule="auto"/><w:ind w:left="10" w:right="6" w:hanging="10"/><w:jc w:val="center"/><w:rPr/></w:pPr><w:r><w:rPr><w:rtl w:val="0"/></w:rPr></w:r></w:p><w:p><w:pPr><w:spacing w:after="0" w:lineRule="auto"/><w:ind w:left="10" w:right="6" w:hanging="10"/><w:jc w:val="center"/><w:rPr/></w:pPr><w:r><w:rPr><w:rtl w:val="0"/></w:rPr></w:r></w:p><w:p><w:pPr><w:spacing w:after="0" w:lineRule="auto"/><w:ind w:left="10" w:right="6" w:hanging="10"/><w:jc w:val="center"/><w:rPr/></w:pPr><w:r><w:rPr><w:rtl w:val="0"/></w:rPr></w:r></w:p><w:p><w:pPr><w:spacing w:after="0" w:lineRule="auto"/><w:ind w:left="10" w:right="6" w:hanging="10"/><w:jc w:val="center"/><w:rPr/></w:pPr><w:r><w:rPr><w:rtl w:val="0"/></w:rPr></w:r></w:p><w:p><w:pPr><w:spacing w:after="0" w:lineRule="auto"/><w:ind w:left="10" w:right="6" w:hanging="10"/><w:jc w:val="center"/><w:rPr/></w:pPr><w:r><w:rPr><w:rtl w:val="0"/></w:rPr></w:r></w:p><w:p><w:pPr><w:spacing w:after="0" w:lineRule="auto"/><w:ind w:left="10" w:right="6" w:hanging="10"/><w:jc w:val="center"/><w:rPr/></w:pPr><w:r><w:rPr><w:rtl w:val="0"/></w:rPr></w:r></w:p><w:p><w:pPr><w:spacing w:after="0" w:lineRule="auto"/><w:ind w:left="10" w:right="6" w:hanging="10"/><w:jc w:val="center"/><w:rPr/></w:pPr><w:r><w:rPr><w:rtl w:val="0"/></w:rPr></w:r></w:p><w:p><w:pPr><w:rPr><w:b w:val="1"/><w:bCs w:val="1"/><w:u w:val="single"/></w:rPr></w:pPr><w:r><w:rPr><w:rtl w:val="0"/></w:rPr></w:r></w:p><w:p><w:pPr><w:rPr><w:b w:val="1"/><w:bCs w:val="1"/><w:u w:val="single"/></w:rPr></w:pPr><w:r><w:br w:type="page"/></w:r><w:r><w:rPr><w:rtl w:val="0"/></w:rPr></w:r><w:r><w:drawing><wp:anchor allowOverlap="1" behindDoc="0" distB="0" distT="0" distL="114300" distR="114300" hidden="0" layoutInCell="1" locked="0" relativeHeight="0" simplePos="0"><wp:simplePos x="0" y="0"/><wp:positionH relativeFrom="column"><wp:posOffset>-302258</wp:posOffset></wp:positionH><wp:positionV relativeFrom="paragraph"><wp:posOffset>526415</wp:posOffset></wp:positionV><wp:extent cx="7010400" cy="1196340"/><wp:effectExtent b="0" l="0" r="0" t="0"/><wp:wrapSquare wrapText="bothSides" distB="0" distT="0" distL="114300" distR="114300"/><wp:docPr id="1" name="image13.jpg"/><a:graphic><a:graphicData uri="http://schemas.openxmlformats.org/drawingml/2006/picture"><pic:pic><pic:nvPicPr><pic:cNvPr id="0" name="image13.jpg"/><pic:cNvPicPr preferRelativeResize="0"/></pic:nvPicPr><pic:blipFill><a:blip r:embed="rId6"/><a:srcRect b="0" l="0" r="0" t="0"/><a:stretch><a:fillRect/></a:stretch></pic:blipFill><pic:spPr><a:xfrm><a:off x="0" y="0"/><a:ext cx="7010400" cy="1196340"/></a:xfrm><a:prstGeom prst="rect"/><a:ln/></pic:spPr></pic:pic></a:graphicData></a:graphic></wp:anchor></w:drawing></w:r></w:p><w:p><w:pPr><w:pStyle w:val="Heading1"/><w:rPr><w:rFonts w:ascii="Calibri" w:cs="Calibri" w:eastAsia="Calibri" w:hAnsi="Calibri"/><w:color w:val="000000"/><w:sz w:val="22"/><w:szCs w:val="22"/></w:rPr></w:pPr><w:r><w:rPr><w:rFonts w:ascii="Calibri" w:cs="Calibri" w:eastAsia="Calibri" w:hAnsi="Calibri"/><w:color w:val="000000"/><w:sz w:val="22"/><w:szCs w:val="22"/><w:rtl w:val="0"/></w:rPr><w:t xml:space="preserve">PUNJAB NATIONAL BANK, {bankBranch}</w:t></w:r></w:p><w:p><w:pPr><w:pStyle w:val="Heading1"/><w:rPr><w:rFonts w:ascii="Calibri" w:cs="Calibri" w:eastAsia="Calibri" w:hAnsi="Calibri"/><w:color w:val="000000"/><w:sz w:val="22"/><w:szCs w:val="22"/></w:rPr></w:pPr><w:r><w:rPr><w:rFonts w:ascii="Calibri" w:cs="Calibri" w:eastAsia="Calibri" w:hAnsi="Calibri"/><w:color w:val="000000"/><w:sz w:val="22"/><w:szCs w:val="22"/><w:rtl w:val="0"/></w:rPr><w:t xml:space="preserve">VALUATION REPORT (IN RESPECT OF FLAT)</w:t></w:r></w:p><w:p><w:pPr><w:rPr><w:sz w:val="2"/><w:szCs w:val="2"/></w:rPr></w:pPr><w:r><w:rPr><w:rtl w:val="0"/></w:rPr></w:r></w:p><w:tbl><w:tblPr><w:tblStyle w:val="Table1"/><w:tblpPr w:leftFromText="180" w:rightFromText="180" w:topFromText="0" w:bottomFromText="0" w:vertAnchor="text" w:horzAnchor="text" w:tblpX="-431" w:tblpY="1"/><w:tblW w:w="10632.0" w:type="dxa"/><w:jc w:val="left"/><w:tblBorders><w:top w:color="000000" w:space="0" w:sz="4" w:val="single"/><w:left w:color="000000" w:space="0" w:sz="4" w:val="single"/><w:bottom w:color="000000" w:space="0" w:sz="4" w:val="single"/><w:right w:color="000000" w:space="0" w:sz="4" w:val="single"/><w:insideH w:color="000000" w:space="0" w:sz="4" w:val="single"/><w:insideV w:color="000000" w:space="0" w:sz="4" w:val="single"/></w:tblBorders><w:tblLayout w:type="fixed"/><w:tblLook w:val="0400"/></w:tblPr><w:tblGrid><w:gridCol w:w="851"/><w:gridCol w:w="4820"/><w:gridCol w:w="2551"/><w:gridCol w:w="2410"/><w:tblGridChange w:id="0"><w:tblGrid><w:gridCol w:w="851"/><w:gridCol w:w="4820"/><w:gridCol w:w="2551"/><w:gridCol w:w="2410"/></w:tblGrid></w:tblGridChange></w:tblGrid><w:tr><w:trPr><w:cantSplit w:val="0"/><w:tblHeader w:val="0"/></w:trPr><w:tc><w:tcPr/><w:p><w:pPr><w:rPr/></w:pPr><w:r><w:rPr><w:b w:val="1"/><w:bCs w:val="1"/><w:rtl w:val="0"/></w:rPr><w:t xml:space="preserve">SR.NO</w:t></w:r><w:r><w:rPr><w:rtl w:val="0"/></w:rPr></w:r></w:p></w:tc><w:tc><w:tcPr/><w:p><w:pPr><w:rPr/></w:pPr><w:r><w:rPr><w:b w:val="1"/><w:bCs w:val="1"/><w:rtl w:val="0"/></w:rPr><w:t xml:space="preserve">Particulars</w:t></w:r><w:r><w:rPr><w:rtl w:val="0"/></w:rPr></w:r></w:p></w:tc><w:tc><w:tcPr><w:gridSpan w:val="2"/></w:tcPr><w:p><w:pPr><w:rPr/></w:pPr><w:r><w:rPr><w:b w:val="1"/><w:bCs w:val="1"/><w:rtl w:val="0"/></w:rPr><w:t xml:space="preserve">Content</w:t></w:r><w:r><w:rPr><w:rtl w:val="0"/></w:rPr></w:r></w:p></w:tc></w:tr><w:tr><w:trPr><w:cantSplit w:val="0"/><w:tblHeader w:val="0"/></w:trPr><w:tc><w:tcPr/><w:p><w:pPr><w:rPr><w:b w:val="1"/><w:bCs w:val="1"/></w:rPr></w:pPr><w:r><w:rPr><w:b w:val="1"/><w:bCs w:val="1"/><w:rtl w:val="0"/></w:rPr><w:t xml:space="preserve">I </w:t></w:r></w:p></w:tc><w:tc><w:tcPr/><w:p><w:pPr><w:rPr><w:b w:val="1"/><w:bCs w:val="1"/></w:rPr></w:pPr><w:r><w:rPr><w:b w:val="1"/><w:bCs w:val="1"/><w:rtl w:val="0"/></w:rPr><w:t xml:space="preserve">GENERAL  </w:t></w:r></w:p></w:tc><w:tc><w:tcPr><w:gridSpan w:val="2"/></w:tcPr><w:p><w:pPr><w:rPr><w:b w:val="1"/><w:bCs w:val="1"/></w:rPr></w:pPr><w:r><w:rPr><w:rtl w:val="0"/></w:rPr></w:r></w:p></w:tc></w:tr><w:tr><w:trPr><w:cantSplit w:val="0"/><w:tblHeader w:val="0"/></w:trPr><w:tc><w:tcPr/><w:p><w:pPr><w:rPr><w:b w:val="1"/><w:bCs w:val="1"/></w:rPr></w:pPr><w:r><w:rPr><w:rtl w:val="0"/></w:rPr></w:r></w:p></w:tc><w:tc><w:tcPr/><w:p><w:pPr><w:rPr><w:b w:val="1"/><w:bCs w:val="1"/></w:rPr></w:pPr><w:r><w:rPr><w:sz w:val="24"/><w:szCs w:val="24"/><w:rtl w:val="0"/></w:rPr><w:t xml:space="preserve">Name &amp; address of the Valuer</w:t></w:r><w:r><w:rPr><w:rtl w:val="0"/></w:rPr></w:r></w:p></w:tc><w:tc><w:tcPr><w:gridSpan w:val="2"/></w:tcPr><w:p><w:pPr><w:rPr><w:b w:val="1"/><w:bCs w:val="1"/></w:rPr></w:pPr><w:r><w:rPr><w:rtl w:val="0"/></w:rPr></w:r></w:p></w:tc></w:tr><w:tr><w:trPr><w:cantSplit w:val="0"/><w:tblHeader w:val="0"/></w:trPr><w:tc><w:tcPr/><w:p><w:pPr><w:rPr><w:b w:val="1"/><w:bCs w:val="1"/></w:rPr></w:pPr><w:r><w:rPr><w:rtl w:val="0"/></w:rPr><w:t xml:space="preserve">2.</w:t></w:r><w:r><w:rPr><w:rtl w:val="0"/></w:rPr></w:r></w:p></w:tc><w:tc><w:tcPr/><w:p><w:pPr><w:rPr><w:b w:val="1"/><w:bCs w:val="1"/></w:rPr></w:pPr><w:r><w:rPr><w:rtl w:val="0"/></w:rPr><w:t xml:space="preserve">Purpose for which the valuation is made</w:t></w:r><w:r><w:rPr><w:rtl w:val="0"/></w:rPr></w:r></w:p></w:tc><w:tc><w:tcPr><w:gridSpan w:val="2"/></w:tcPr><w:p><w:pPr><w:rPr/></w:pPr><w:r><w:rPr><w:rtl w:val="0"/></w:rPr></w:r></w:p></w:tc></w:tr><w:tr><w:trPr><w:cantSplit w:val="0"/><w:tblHeader w:val="0"/></w:trPr><w:tc><w:tcPr><w:vMerge w:val="restart"/></w:tcPr><w:p><w:pPr><w:jc w:val="both"/><w:rPr/></w:pPr><w:r><w:rPr><w:rtl w:val="0"/></w:rPr><w:t xml:space="preserve">3.</w:t></w:r></w:p></w:tc><w:tc><w:tcPr/><w:p><w:pPr><w:rPr/></w:pPr><w:r><w:rPr><w:rtl w:val="0"/></w:rPr><w:t xml:space="preserve">a) Date of inspection</w:t></w:r></w:p></w:tc><w:tc><w:tcPr><w:gridSpan w:val="2"/></w:tcPr><w:p><w:pPr><w:rPr/></w:pPr><w:r><w:rPr><w:rtl w:val="0"/></w:rPr></w:r></w:p></w:tc></w:tr><w:tr><w:trPr><w:cantSplit w:val="0"/><w:tblHeader w:val="0"/></w:trPr><w:tc><w:tcPr><w:vMerge w:val="continue"/></w:tcPr><w:p><w:pPr><w:keepNext w:val="0"/><w:keepLines w:val="0"/><w:pageBreakBefore w:val="0"/><w:widowControl w:val="0"/><w:pBdr><w:top w:space="0" w:sz="0" w:val="nil"/><w:left w:space="0" w:sz="0" w:val="nil"/><w:bottom w:space="0" w:sz="0" w:val="nil"/><w:right w:space="0" w:sz="0" w:val="nil"/><w:between w:space="0" w:sz="0" w:val="nil"/></w:pBdr><w:shd w:fill="auto" w:val="clear"/><w:spacing w:after="0" w:before="0" w:line="276" w:lineRule="auto"/><w:ind w:left="0" w:right="0" w:firstLine="0"/><w:jc w:val="left"/><w:rPr/></w:pPr><w:r><w:rPr><w:rtl w:val="0"/></w:rPr></w:r></w:p></w:tc><w:tc><w:tcPr/><w:p><w:pPr><w:rPr/></w:pPr><w:r><w:rPr><w:rtl w:val="0"/></w:rPr><w:t xml:space="preserve">b) Date on which the valuation is made</w:t></w:r></w:p></w:tc><w:tc><w:tcPr><w:gridSpan w:val="2"/></w:tcPr><w:p><w:pPr><w:rPr/></w:pPr><w:r><w:rPr><w:rtl w:val="0"/></w:rPr></w:r></w:p></w:tc></w:tr><w:tr><w:trPr><w:cantSplit w:val="0"/><w:tblHeader w:val="0"/></w:trPr><w:tc><w:tcPr/><w:p><w:pPr><w:rPr/></w:pPr><w:r><w:rPr><w:rtl w:val="0"/></w:rPr><w:t xml:space="preserve">4.</w:t></w:r></w:p></w:tc><w:tc><w:tcPr/><w:p><w:pPr><w:rPr/></w:pPr><w:r><w:rPr><w:rtl w:val="0"/></w:rPr><w:t xml:space="preserve">List of documents produced for perusal</w:t></w:r></w:p></w:tc><w:tc><w:tcPr><w:gridSpan w:val="2"/></w:tcPr><w:p><w:pPr><w:rPr><w:b w:val="1"/><w:bCs w:val="1"/></w:rPr></w:pPr><w:r><w:rPr><w:rtl w:val="0"/></w:rPr></w:r></w:p></w:tc></w:tr><w:tr><w:trPr><w:cantSplit w:val="0"/><w:tblHeader w:val="0"/></w:trPr><w:tc><w:tcPr/><w:p><w:pPr><w:rPr/></w:pPr><w:r><w:rPr><w:rtl w:val="0"/></w:rPr></w:r></w:p></w:tc><w:tc><w:tcPr/><w:p><w:pPr><w:keepNext w:val="0"/><w:keepLines w:val="0"/><w:pageBreakBefore w:val="0"/><w:widowControl w:val="1"/><w:numPr><w:ilvl w:val="0"/><w:numId w:val="1"/></w:numPr><w:pBdr><w:top w:space="0" w:sz="0" w:val="nil"/><w:left w:space="0" w:sz="0" w:val="nil"/><w:bottom w:space="0" w:sz="0" w:val="nil"/><w:right w:space="0" w:sz="0" w:val="nil"/><w:between w:space="0" w:sz="0" w:val="nil"/></w:pBdr><w:shd w:fill="auto" w:val="clear"/><w:spacing w:after="160" w:before="0" w:line="276" w:lineRule="auto"/><w:ind w:left="556" w:right="0" w:hanging="360"/><w:jc w:val="left"/><w:rPr><w:rFonts w:ascii="Calibri" w:cs="Calibri" w:eastAsia="Calibri" w:hAnsi="Calibri"/><w:b w:val="0"/><w:bCs w:val="0"/><w:i w:val="0"/><w:iCs w:val="0"/><w:smallCaps w:val="0"/><w:strike w:val="0"/><w:color w:val="000000"/><w:sz w:val="22"/><w:szCs w:val="22"/><w:u w:val="none"/><w:shd w:fill="auto" w:val="clear"/><w:vertAlign w:val="baseline"/></w:rPr></w:pPr><w:r><w:rPr><w:rFonts w:ascii="Calibri" w:cs="Calibri" w:eastAsia="Calibri" w:hAnsi="Calibri"/><w:b w:val="0"/><w:bCs w:val="0"/><w:i w:val="0"/><w:iCs w:val="0"/><w:smallCaps w:val="0"/><w:strike w:val="0"/><w:color w:val="000000"/><w:sz w:val="22"/><w:szCs w:val="22"/><w:u w:val="none"/><w:shd w:fill="auto" w:val="clear"/><w:vertAlign w:val="baseline"/><w:rtl w:val="0"/></w:rPr><w:t xml:space="preserve">Agreement for Sale</w:t></w:r></w:p></w:tc><w:tc><w:tcPr><w:gridSpan w:val="2"/></w:tcPr><w:p><w:pPr><w:spacing w:line="276" w:lineRule="auto"/><w:jc w:val="both"/><w:rPr/></w:pPr><w:r><w:rPr><w:rtl w:val="0"/></w:rPr></w:r></w:p></w:tc></w:tr><w:tr><w:trPr><w:cantSplit w:val="0"/><w:tblHeader w:val="0"/></w:trPr><w:tc><w:tcPr/><w:p><w:pPr><w:rPr/></w:pPr><w:r><w:rPr><w:rtl w:val="0"/></w:rPr></w:r></w:p></w:tc><w:tc><w:tcPr/><w:p><w:pPr><w:keepNext w:val="0"/><w:keepLines w:val="0"/><w:pageBreakBefore w:val="0"/><w:widowControl w:val="1"/><w:numPr><w:ilvl w:val="0"/><w:numId w:val="1"/></w:numPr><w:pBdr><w:top w:space="0" w:sz="0" w:val="nil"/><w:left w:space="0" w:sz="0" w:val="nil"/><w:bottom w:space="0" w:sz="0" w:val="nil"/><w:right w:space="0" w:sz="0" w:val="nil"/><w:between w:space="0" w:sz="0" w:val="nil"/></w:pBdr><w:shd w:fill="auto" w:val="clear"/><w:spacing w:after="160" w:before="0" w:line="276" w:lineRule="auto"/><w:ind w:left="556" w:right="0" w:hanging="360"/><w:jc w:val="left"/><w:rPr><w:rFonts w:ascii="Calibri" w:cs="Calibri" w:eastAsia="Calibri" w:hAnsi="Calibri"/><w:b w:val="0"/><w:bCs w:val="0"/><w:i w:val="0"/><w:iCs w:val="0"/><w:smallCaps w:val="0"/><w:strike w:val="0"/><w:color w:val="000000"/><w:sz w:val="22"/><w:szCs w:val="22"/><w:u w:val="none"/><w:shd w:fill="auto" w:val="clear"/><w:vertAlign w:val="baseline"/></w:rPr></w:pPr><w:r><w:rPr><w:rFonts w:ascii="Calibri" w:cs="Calibri" w:eastAsia="Calibri" w:hAnsi="Calibri"/><w:b w:val="0"/><w:bCs w:val="0"/><w:i w:val="0"/><w:iCs w:val="0"/><w:smallCaps w:val="0"/><w:strike w:val="0"/><w:color w:val="000000"/><w:sz w:val="22"/><w:szCs w:val="22"/><w:u w:val="none"/><w:shd w:fill="auto" w:val="clear"/><w:vertAlign w:val="baseline"/><w:rtl w:val="0"/></w:rPr><w:t xml:space="preserve">Part Occupancy Certificate</w:t></w:r></w:p></w:tc><w:tc><w:tcPr><w:gridSpan w:val="2"/></w:tcPr><w:p><w:pPr><w:spacing w:line="276" w:lineRule="auto"/><w:jc w:val="both"/><w:rPr/></w:pPr><w:r><w:rPr><w:rtl w:val="0"/></w:rPr></w:r></w:p></w:tc></w:tr><w:tr><w:trPr><w:cantSplit w:val="0"/><w:tblHeader w:val="0"/></w:trPr><w:tc><w:tcPr/><w:p><w:pPr><w:rPr/></w:pPr><w:r><w:rPr><w:rtl w:val="0"/></w:rPr></w:r></w:p></w:tc><w:tc><w:tcPr/><w:p><w:pPr><w:keepNext w:val="0"/><w:keepLines w:val="0"/><w:pageBreakBefore w:val="0"/><w:widowControl w:val="1"/><w:numPr><w:ilvl w:val="0"/><w:numId w:val="1"/></w:numPr><w:pBdr><w:top w:space="0" w:sz="0" w:val="nil"/><w:left w:space="0" w:sz="0" w:val="nil"/><w:bottom w:space="0" w:sz="0" w:val="nil"/><w:right w:space="0" w:sz="0" w:val="nil"/><w:between w:space="0" w:sz="0" w:val="nil"/></w:pBdr><w:shd w:fill="auto" w:val="clear"/><w:spacing w:after="160" w:before="0" w:line="276" w:lineRule="auto"/><w:ind w:left="556" w:right="0" w:hanging="360"/><w:jc w:val="left"/><w:rPr><w:rFonts w:ascii="Calibri" w:cs="Calibri" w:eastAsia="Calibri" w:hAnsi="Calibri"/><w:b w:val="0"/><w:bCs w:val="0"/><w:i w:val="0"/><w:iCs w:val="0"/><w:smallCaps w:val="0"/><w:strike w:val="0"/><w:color w:val="000000"/><w:sz w:val="22"/><w:szCs w:val="22"/><w:u w:val="none"/><w:shd w:fill="auto" w:val="clear"/><w:vertAlign w:val="baseline"/></w:rPr></w:pPr><w:r><w:rPr><w:rFonts w:ascii="Calibri" w:cs="Calibri" w:eastAsia="Calibri" w:hAnsi="Calibri"/><w:b w:val="0"/><w:bCs w:val="0"/><w:i w:val="0"/><w:iCs w:val="0"/><w:smallCaps w:val="0"/><w:strike w:val="0"/><w:color w:val="000000"/><w:sz w:val="22"/><w:szCs w:val="22"/><w:u w:val="none"/><w:shd w:fill="auto" w:val="clear"/><w:vertAlign w:val="baseline"/><w:rtl w:val="0"/></w:rPr><w:t xml:space="preserve">Index II</w:t></w:r></w:p></w:tc><w:tc><w:tcPr><w:gridSpan w:val="2"/></w:tcPr><w:p><w:pPr><w:spacing w:line="276" w:lineRule="auto"/><w:jc w:val="both"/><w:rPr/></w:pPr><w:r><w:rPr><w:rtl w:val="0"/></w:rPr></w:r></w:p></w:tc></w:tr><w:tr><w:trPr><w:cantSplit w:val="0"/><w:tblHeader w:val="0"/></w:trPr><w:tc><w:tcPr/><w:p><w:pPr><w:rPr/></w:pPr><w:r><w:rPr><w:rtl w:val="0"/></w:rPr></w:r></w:p></w:tc><w:tc><w:tcPr/><w:p><w:pPr><w:keepNext w:val="0"/><w:keepLines w:val="0"/><w:pageBreakBefore w:val="0"/><w:widowControl w:val="1"/><w:numPr><w:ilvl w:val="0"/><w:numId w:val="1"/></w:numPr><w:pBdr><w:top w:space="0" w:sz="0" w:val="nil"/><w:left w:space="0" w:sz="0" w:val="nil"/><w:bottom w:space="0" w:sz="0" w:val="nil"/><w:right w:space="0" w:sz="0" w:val="nil"/><w:between w:space="0" w:sz="0" w:val="nil"/></w:pBdr><w:shd w:fill="auto" w:val="clear"/><w:spacing w:after="160" w:before="0" w:line="276" w:lineRule="auto"/><w:ind w:left="556" w:right="0" w:hanging="360"/><w:jc w:val="left"/><w:rPr><w:rFonts w:ascii="Calibri" w:cs="Calibri" w:eastAsia="Calibri" w:hAnsi="Calibri"/><w:b w:val="0"/><w:bCs w:val="0"/><w:i w:val="0"/><w:iCs w:val="0"/><w:smallCaps w:val="0"/><w:strike w:val="0"/><w:color w:val="000000"/><w:sz w:val="22"/><w:szCs w:val="22"/><w:u w:val="none"/><w:shd w:fill="auto" w:val="clear"/><w:vertAlign w:val="baseline"/></w:rPr></w:pPr><w:r><w:rPr><w:rFonts w:ascii="Calibri" w:cs="Calibri" w:eastAsia="Calibri" w:hAnsi="Calibri"/><w:b w:val="0"/><w:bCs w:val="0"/><w:i w:val="0"/><w:iCs w:val="0"/><w:smallCaps w:val="0"/><w:strike w:val="0"/><w:color w:val="000000"/><w:sz w:val="22"/><w:szCs w:val="22"/><w:u w:val="none"/><w:shd w:fill="auto" w:val="clear"/><w:vertAlign w:val="baseline"/><w:rtl w:val="0"/></w:rPr><w:t xml:space="preserve">Other Documents</w:t></w:r></w:p></w:tc><w:tc><w:tcPr><w:gridSpan w:val="2"/></w:tcPr><w:p><w:pPr><w:spacing w:line="276" w:lineRule="auto"/><w:ind w:left="360" w:firstLine="0"/><w:jc w:val="both"/><w:rPr/></w:pPr><w:r><w:rPr><w:rtl w:val="0"/></w:rPr></w:r></w:p></w:tc></w:tr><w:tr><w:trPr><w:cantSplit w:val="0"/><w:tblHeader w:val="0"/></w:trPr><w:tc><w:tcPr/><w:p><w:pPr><w:rPr/></w:pPr><w:r><w:rPr><w:rtl w:val="0"/></w:rPr><w:t xml:space="preserve">5.</w:t></w:r></w:p></w:tc><w:tc><w:tcPr/><w:p><w:pPr><w:spacing w:line="276" w:lineRule="auto"/><w:rPr/></w:pPr><w:r><w:rPr><w:rtl w:val="0"/></w:rPr><w:t xml:space="preserve">Name of the owner(s) and his / their address (es)</w:t></w:r></w:p><w:p><w:pPr><w:spacing w:line="276" w:lineRule="auto"/><w:rPr/></w:pPr><w:r><w:rPr><w:rtl w:val="0"/></w:rPr><w:t xml:space="preserve">With Phone no. (details of share of each owner in</w:t></w:r></w:p><w:p><w:pPr><w:spacing w:line="276" w:lineRule="auto"/><w:rPr/></w:pPr><w:r><w:rPr><w:rtl w:val="0"/></w:rPr><w:t xml:space="preserve">case of joint ownership)</w:t></w:r></w:p></w:tc><w:tc><w:tcPr><w:gridSpan w:val="2"/></w:tcPr><w:p><w:pPr><w:spacing w:line="276" w:lineRule="auto"/><w:rPr><w:b w:val="1"/><w:bCs w:val="1"/></w:rPr></w:pPr><w:r><w:rPr><w:b w:val="1"/><w:bCs w:val="1"/><w:rtl w:val="0"/></w:rPr><w:t xml:space="preserve">Owner: </w:t></w:r></w:p><w:p><w:pPr><w:spacing w:line="276" w:lineRule="auto"/><w:rPr><w:sz w:val="12"/><w:szCs w:val="12"/></w:rPr></w:pPr><w:r><w:rPr><w:rtl w:val="0"/></w:rPr></w:r></w:p><w:p><w:pPr><w:spacing w:line="276" w:lineRule="auto"/><w:rPr/></w:pPr><w:r><w:rPr><w:b w:val="1"/><w:bCs w:val="1"/><w:rtl w:val="0"/></w:rPr><w:t xml:space="preserve">Contact No</w:t></w:r><w:r><w:rPr><w:rtl w:val="0"/></w:rPr><w:t xml:space="preserve">.: </w:t></w:r></w:p><w:p><w:pPr><w:spacing w:line="276" w:lineRule="auto"/><w:rPr><w:sz w:val="8"/><w:szCs w:val="8"/></w:rPr></w:pPr><w:r><w:rPr><w:rtl w:val="0"/></w:rPr></w:r></w:p><w:p><w:pPr><w:spacing w:line="276" w:lineRule="auto"/><w:rPr/></w:pPr><w:r><w:rPr><w:b w:val="1"/><w:bCs w:val="1"/><w:rtl w:val="0"/></w:rPr><w:t xml:space="preserve">Ownership</w:t></w:r><w:r><w:rPr><w:rtl w:val="0"/></w:rPr><w:t xml:space="preserve">: </w:t></w:r></w:p></w:tc></w:tr><w:tr><w:trPr><w:cantSplit w:val="0"/><w:tblHeader w:val="0"/></w:trPr><w:tc><w:tcPr/><w:p><w:pPr><w:spacing w:line="276" w:lineRule="auto"/><w:rPr/></w:pPr><w:r><w:rPr><w:rtl w:val="0"/></w:rPr><w:t xml:space="preserve">6.</w:t></w:r></w:p></w:tc><w:tc><w:tcPr/><w:p><w:pPr><w:rPr/></w:pPr><w:r><w:rPr><w:rtl w:val="0"/></w:rPr><w:t xml:space="preserve">Brief description of the property</w:t></w:r></w:p></w:tc><w:tc><w:tcPr><w:gridSpan w:val="2"/></w:tcPr><w:p><w:pPr><w:jc w:val="both"/><w:rPr/></w:pPr><w:r><w:rPr><w:rtl w:val="0"/></w:rPr></w:r></w:p></w:tc></w:tr><w:tr><w:trPr><w:cantSplit w:val="0"/><w:trHeight w:val="145" w:hRule="atLeast"/><w:tblHeader w:val="0"/></w:trPr><w:tc><w:tcPr><w:vMerge w:val="restart"/></w:tcPr><w:p><w:pPr><w:rPr/></w:pPr><w:r><w:rPr><w:rtl w:val="0"/></w:rPr><w:t xml:space="preserve">7.</w:t></w:r></w:p></w:tc><w:tc><w:tcPr><w:gridSpan w:val="3"/></w:tcPr><w:p><w:pPr><w:rPr><w:b w:val="1"/><w:bCs w:val="1"/></w:rPr></w:pPr><w:r><w:rPr><w:b w:val="1"/><w:bCs w:val="1"/><w:rtl w:val="0"/></w:rPr><w:t xml:space="preserve">Location of property</w:t></w:r></w:p></w:tc></w:tr><w:tr><w:trPr><w:cantSplit w:val="0"/><w:tblHeader w:val="0"/></w:trPr><w:tc><w:tcPr><w:vMerge w:val="continue"/></w:tcPr><w:p><w:pPr><w:keepNext w:val="0"/><w:keepLines w:val="0"/><w:pageBreakBefore w:val="0"/><w:widowControl w:val="0"/><w:pBdr><w:top w:space="0" w:sz="0" w:val="nil"/><w:left w:space="0" w:sz="0" w:val="nil"/><w:bottom w:space="0" w:sz="0" w:val="nil"/><w:right w:space="0" w:sz="0" w:val="nil"/><w:between w:space="0" w:sz="0" w:val="nil"/></w:pBdr><w:shd w:fill="auto" w:val="clear"/><w:spacing w:after="0" w:before="0" w:line="276" w:lineRule="auto"/><w:ind w:left="0" w:right="0" w:firstLine="0"/><w:jc w:val="left"/><w:rPr><w:b w:val="1"/><w:bCs w:val="1"/></w:rPr></w:pPr><w:r><w:rPr><w:rtl w:val="0"/></w:rPr></w:r></w:p></w:tc><w:tc><w:tcPr/><w:p><w:pPr><w:keepNext w:val="0"/><w:keepLines w:val="0"/><w:pageBreakBefore w:val="0"/><w:widowControl w:val="1"/><w:numPr><w:ilvl w:val="0"/><w:numId w:val="4"/></w:numPr><w:pBdr><w:top w:space="0" w:sz="0" w:val="nil"/><w:left w:space="0" w:sz="0" w:val="nil"/><w:bottom w:space="0" w:sz="0" w:val="nil"/><w:right w:space="0" w:sz="0" w:val="nil"/><w:between w:space="0" w:sz="0" w:val="nil"/></w:pBdr><w:shd w:fill="auto" w:val="clear"/><w:spacing w:after="160" w:before="0" w:line="259" w:lineRule="auto"/><w:ind w:left="720" w:right="0" w:hanging="360"/><w:jc w:val="left"/><w:rPr><w:rFonts w:ascii="Calibri" w:cs="Calibri" w:eastAsia="Calibri" w:hAnsi="Calibri"/><w:b w:val="0"/><w:bCs w:val="0"/><w:i w:val="0"/><w:iCs w:val="0"/><w:smallCaps w:val="0"/><w:strike w:val="0"/><w:color w:val="000000"/><w:sz w:val="22"/><w:szCs w:val="22"/><w:u w:val="none"/><w:shd w:fill="auto" w:val="clear"/><w:vertAlign w:val="baseline"/></w:rPr></w:pPr><w:r><w:rPr><w:rFonts w:ascii="Calibri" w:cs="Calibri" w:eastAsia="Calibri" w:hAnsi="Calibri"/><w:b w:val="0"/><w:bCs w:val="0"/><w:i w:val="0"/><w:iCs w:val="0"/><w:smallCaps w:val="0"/><w:strike w:val="0"/><w:color w:val="000000"/><w:sz w:val="22"/><w:szCs w:val="22"/><w:u w:val="none"/><w:shd w:fill="auto" w:val="clear"/><w:vertAlign w:val="baseline"/><w:rtl w:val="0"/></w:rPr><w:t xml:space="preserve">Plot No. / Survey No.</w:t></w:r></w:p></w:tc><w:tc><w:tcPr><w:gridSpan w:val="2"/></w:tcPr><w:p><w:pPr><w:rPr/></w:pPr><w:r><w:rPr><w:rtl w:val="0"/></w:rPr></w:r></w:p></w:tc></w:tr><w:tr><w:trPr><w:cantSplit w:val="0"/><w:tblHeader w:val="0"/></w:trPr><w:tc><w:tcPr><w:vMerge w:val="continue"/></w:tcPr><w:p><w:pPr><w:keepNext w:val="0"/><w:keepLines w:val="0"/><w:pageBreakBefore w:val="0"/><w:widowControl w:val="0"/><w:pBdr><w:top w:space="0" w:sz="0" w:val="nil"/><w:left w:space="0" w:sz="0" w:val="nil"/><w:bottom w:space="0" w:sz="0" w:val="nil"/><w:right w:space="0" w:sz="0" w:val="nil"/><w:between w:space="0" w:sz="0" w:val="nil"/></w:pBdr><w:shd w:fill="auto" w:val="clear"/><w:spacing w:after="0" w:before="0" w:line="276" w:lineRule="auto"/><w:ind w:left="0" w:right="0" w:firstLine="0"/><w:jc w:val="left"/><w:rPr/></w:pPr><w:r><w:rPr><w:rtl w:val="0"/></w:rPr></w:r></w:p></w:tc><w:tc><w:tcPr/><w:p><w:pPr><w:keepNext w:val="0"/><w:keepLines w:val="0"/><w:pageBreakBefore w:val="0"/><w:widowControl w:val="1"/><w:numPr><w:ilvl w:val="0"/><w:numId w:val="4"/></w:numPr><w:pBdr><w:top w:space="0" w:sz="0" w:val="nil"/><w:left w:space="0" w:sz="0" w:val="nil"/><w:bottom w:space="0" w:sz="0" w:val="nil"/><w:right w:space="0" w:sz="0" w:val="nil"/><w:between w:space="0" w:sz="0" w:val="nil"/></w:pBdr><w:shd w:fill="auto" w:val="clear"/><w:spacing w:after="160" w:before="0" w:line="259" w:lineRule="auto"/><w:ind w:left="720" w:right="0" w:hanging="360"/><w:jc w:val="left"/><w:rPr><w:rFonts w:ascii="Calibri" w:cs="Calibri" w:eastAsia="Calibri" w:hAnsi="Calibri"/><w:b w:val="0"/><w:bCs w:val="0"/><w:i w:val="0"/><w:iCs w:val="0"/><w:smallCaps w:val="0"/><w:strike w:val="0"/><w:color w:val="000000"/><w:sz w:val="22"/><w:szCs w:val="22"/><w:u w:val="none"/><w:shd w:fill="auto" w:val="clear"/><w:vertAlign w:val="baseline"/></w:rPr></w:pPr><w:r><w:rPr><w:rFonts w:ascii="Calibri" w:cs="Calibri" w:eastAsia="Calibri" w:hAnsi="Calibri"/><w:b w:val="0"/><w:bCs w:val="0"/><w:i w:val="0"/><w:iCs w:val="0"/><w:smallCaps w:val="0"/><w:strike w:val="0"/><w:color w:val="000000"/><w:sz w:val="22"/><w:szCs w:val="22"/><w:u w:val="none"/><w:shd w:fill="auto" w:val="clear"/><w:vertAlign w:val="baseline"/><w:rtl w:val="0"/></w:rPr><w:t xml:space="preserve">Door No.</w:t></w:r></w:p></w:tc><w:tc><w:tcPr><w:gridSpan w:val="2"/></w:tcPr><w:p><w:pPr><w:rPr/></w:pPr><w:r><w:rPr><w:rtl w:val="0"/></w:rPr></w:r></w:p></w:tc></w:tr><w:tr><w:trPr><w:cantSplit w:val="0"/><w:tblHeader w:val="0"/></w:trPr><w:tc><w:tcPr><w:vMerge w:val="continue"/></w:tcPr><w:p><w:pPr><w:keepNext w:val="0"/><w:keepLines w:val="0"/><w:pageBreakBefore w:val="0"/><w:widowControl w:val="0"/><w:pBdr><w:top w:space="0" w:sz="0" w:val="nil"/><w:left w:space="0" w:sz="0" w:val="nil"/><w:bottom w:space="0" w:sz="0" w:val="nil"/><w:right w:space="0" w:sz="0" w:val="nil"/><w:between w:space="0" w:sz="0" w:val="nil"/></w:pBdr><w:shd w:fill="auto" w:val="clear"/><w:spacing w:after="0" w:before="0" w:line="276" w:lineRule="auto"/><w:ind w:left="0" w:right="0" w:firstLine="0"/><w:jc w:val="left"/><w:rPr/></w:pPr><w:r><w:rPr><w:rtl w:val="0"/></w:rPr></w:r></w:p></w:tc><w:tc><w:tcPr/><w:p><w:pPr><w:keepNext w:val="0"/><w:keepLines w:val="0"/><w:pageBreakBefore w:val="0"/><w:widowControl w:val="1"/><w:numPr><w:ilvl w:val="0"/><w:numId w:val="4"/></w:numPr><w:pBdr><w:top w:space="0" w:sz="0" w:val="nil"/><w:left w:space="0" w:sz="0" w:val="nil"/><w:bottom w:space="0" w:sz="0" w:val="nil"/><w:right w:space="0" w:sz="0" w:val="nil"/><w:between w:space="0" w:sz="0" w:val="nil"/></w:pBdr><w:shd w:fill="auto" w:val="clear"/><w:spacing w:after="160" w:before="0" w:line="259" w:lineRule="auto"/><w:ind w:left="720" w:right="0" w:hanging="360"/><w:jc w:val="left"/><w:rPr><w:rFonts w:ascii="Calibri" w:cs="Calibri" w:eastAsia="Calibri" w:hAnsi="Calibri"/><w:b w:val="0"/><w:bCs w:val="0"/><w:i w:val="0"/><w:iCs w:val="0"/><w:smallCaps w:val="0"/><w:strike w:val="0"/><w:color w:val="000000"/><w:sz w:val="22"/><w:szCs w:val="22"/><w:u w:val="none"/><w:shd w:fill="auto" w:val="clear"/><w:vertAlign w:val="baseline"/></w:rPr></w:pPr><w:r><w:rPr><w:rFonts w:ascii="Calibri" w:cs="Calibri" w:eastAsia="Calibri" w:hAnsi="Calibri"/><w:b w:val="0"/><w:bCs w:val="0"/><w:i w:val="0"/><w:iCs w:val="0"/><w:smallCaps w:val="0"/><w:strike w:val="0"/><w:color w:val="000000"/><w:sz w:val="22"/><w:szCs w:val="22"/><w:u w:val="none"/><w:shd w:fill="auto" w:val="clear"/><w:vertAlign w:val="baseline"/><w:rtl w:val="0"/></w:rPr><w:t xml:space="preserve">C. T. S. No. / Village</w:t></w:r></w:p></w:tc><w:tc><w:tcPr><w:gridSpan w:val="2"/></w:tcPr><w:p><w:pPr><w:rPr/></w:pPr><w:r><w:rPr><w:rtl w:val="0"/></w:rPr></w:r></w:p></w:tc></w:tr><w:tr><w:trPr><w:cantSplit w:val="0"/><w:tblHeader w:val="0"/></w:trPr><w:tc><w:tcPr><w:vMerge w:val="continue"/></w:tcPr><w:p><w:pPr><w:keepNext w:val="0"/><w:keepLines w:val="0"/><w:pageBreakBefore w:val="0"/><w:widowControl w:val="0"/><w:pBdr><w:top w:space="0" w:sz="0" w:val="nil"/><w:left w:space="0" w:sz="0" w:val="nil"/><w:bottom w:space="0" w:sz="0" w:val="nil"/><w:right w:space="0" w:sz="0" w:val="nil"/><w:between w:space="0" w:sz="0" w:val="nil"/></w:pBdr><w:shd w:fill="auto" w:val="clear"/><w:spacing w:after="0" w:before="0" w:line="276" w:lineRule="auto"/><w:ind w:left="0" w:right="0" w:firstLine="0"/><w:jc w:val="left"/><w:rPr/></w:pPr><w:r><w:rPr><w:rtl w:val="0"/></w:rPr></w:r></w:p></w:tc><w:tc><w:tcPr/><w:p><w:pPr><w:keepNext w:val="0"/><w:keepLines w:val="0"/><w:pageBreakBefore w:val="0"/><w:widowControl w:val="1"/><w:numPr><w:ilvl w:val="0"/><w:numId w:val="4"/></w:numPr><w:pBdr><w:top w:space="0" w:sz="0" w:val="nil"/><w:left w:space="0" w:sz="0" w:val="nil"/><w:bottom w:space="0" w:sz="0" w:val="nil"/><w:right w:space="0" w:sz="0" w:val="nil"/><w:between w:space="0" w:sz="0" w:val="nil"/></w:pBdr><w:shd w:fill="auto" w:val="clear"/><w:spacing w:after="160" w:before="0" w:line="259" w:lineRule="auto"/><w:ind w:left="720" w:right="0" w:hanging="360"/><w:jc w:val="left"/><w:rPr><w:rFonts w:ascii="Calibri" w:cs="Calibri" w:eastAsia="Calibri" w:hAnsi="Calibri"/><w:b w:val="0"/><w:bCs w:val="0"/><w:i w:val="0"/><w:iCs w:val="0"/><w:smallCaps w:val="0"/><w:strike w:val="0"/><w:color w:val="000000"/><w:sz w:val="22"/><w:szCs w:val="22"/><w:u w:val="none"/><w:shd w:fill="auto" w:val="clear"/><w:vertAlign w:val="baseline"/></w:rPr></w:pPr><w:r><w:rPr><w:rFonts w:ascii="Calibri" w:cs="Calibri" w:eastAsia="Calibri" w:hAnsi="Calibri"/><w:b w:val="0"/><w:bCs w:val="0"/><w:i w:val="0"/><w:iCs w:val="0"/><w:smallCaps w:val="0"/><w:strike w:val="0"/><w:color w:val="000000"/><w:sz w:val="22"/><w:szCs w:val="22"/><w:u w:val="none"/><w:shd w:fill="auto" w:val="clear"/><w:vertAlign w:val="baseline"/><w:rtl w:val="0"/></w:rPr><w:t xml:space="preserve">Ward / Taluka</w:t></w:r></w:p></w:tc><w:tc><w:tcPr><w:gridSpan w:val="2"/></w:tcPr><w:p><w:pPr><w:rPr/></w:pPr><w:r><w:rPr><w:rtl w:val="0"/></w:rPr></w:r></w:p></w:tc></w:tr><w:tr><w:trPr><w:cantSplit w:val="0"/><w:tblHeader w:val="0"/></w:trPr><w:tc><w:tcPr><w:vMerge w:val="continue"/></w:tcPr><w:p><w:pPr><w:keepNext w:val="0"/><w:keepLines w:val="0"/><w:pageBreakBefore w:val="0"/><w:widowControl w:val="0"/><w:pBdr><w:top w:space="0" w:sz="0" w:val="nil"/><w:left w:space="0" w:sz="0" w:val="nil"/><w:bottom w:space="0" w:sz="0" w:val="nil"/><w:right w:space="0" w:sz="0" w:val="nil"/><w:between w:space="0" w:sz="0" w:val="nil"/></w:pBdr><w:shd w:fill="auto" w:val="clear"/><w:spacing w:after="0" w:before="0" w:line="276" w:lineRule="auto"/><w:ind w:left="0" w:right="0" w:firstLine="0"/><w:jc w:val="left"/><w:rPr/></w:pPr><w:r><w:rPr><w:rtl w:val="0"/></w:rPr></w:r></w:p></w:tc><w:tc><w:tcPr/><w:p><w:pPr><w:keepNext w:val="0"/><w:keepLines w:val="0"/><w:pageBreakBefore w:val="0"/><w:widowControl w:val="1"/><w:numPr><w:ilvl w:val="0"/><w:numId w:val="4"/></w:numPr><w:pBdr><w:top w:space="0" w:sz="0" w:val="nil"/><w:left w:space="0" w:sz="0" w:val="nil"/><w:bottom w:space="0" w:sz="0" w:val="nil"/><w:right w:space="0" w:sz="0" w:val="nil"/><w:between w:space="0" w:sz="0" w:val="nil"/></w:pBdr><w:shd w:fill="auto" w:val="clear"/><w:spacing w:after="160" w:before="0" w:line="259" w:lineRule="auto"/><w:ind w:left="720" w:right="0" w:hanging="360"/><w:jc w:val="left"/><w:rPr><w:rFonts w:ascii="Calibri" w:cs="Calibri" w:eastAsia="Calibri" w:hAnsi="Calibri"/><w:b w:val="0"/><w:bCs w:val="0"/><w:i w:val="0"/><w:iCs w:val="0"/><w:smallCaps w:val="0"/><w:strike w:val="0"/><w:color w:val="000000"/><w:sz w:val="22"/><w:szCs w:val="22"/><w:u w:val="none"/><w:shd w:fill="auto" w:val="clear"/><w:vertAlign w:val="baseline"/></w:rPr></w:pPr><w:r><w:rPr><w:rFonts w:ascii="Calibri" w:cs="Calibri" w:eastAsia="Calibri" w:hAnsi="Calibri"/><w:b w:val="0"/><w:bCs w:val="0"/><w:i w:val="0"/><w:iCs w:val="0"/><w:smallCaps w:val="0"/><w:strike w:val="0"/><w:color w:val="000000"/><w:sz w:val="22"/><w:szCs w:val="22"/><w:u w:val="none"/><w:shd w:fill="auto" w:val="clear"/><w:vertAlign w:val="baseline"/><w:rtl w:val="0"/></w:rPr><w:t xml:space="preserve">Mandal / District</w:t></w:r></w:p></w:tc><w:tc><w:tcPr><w:gridSpan w:val="2"/></w:tcPr><w:p><w:pPr><w:rPr/></w:pPr><w:r><w:rPr><w:rtl w:val="0"/></w:rPr></w:r></w:p></w:tc></w:tr><w:tr><w:trPr><w:cantSplit w:val="0"/><w:tblHeader w:val="0"/></w:trPr><w:tc><w:tcPr><w:vMerge w:val="continue"/></w:tcPr><w:p><w:pPr><w:keepNext w:val="0"/><w:keepLines w:val="0"/><w:pageBreakBefore w:val="0"/><w:widowControl w:val="0"/><w:pBdr><w:top w:space="0" w:sz="0" w:val="nil"/><w:left w:space="0" w:sz="0" w:val="nil"/><w:bottom w:space="0" w:sz="0" w:val="nil"/><w:right w:space="0" w:sz="0" w:val="nil"/><w:between w:space="0" w:sz="0" w:val="nil"/></w:pBdr><w:shd w:fill="auto" w:val="clear"/><w:spacing w:after="0" w:before="0" w:line="276" w:lineRule="auto"/><w:ind w:left="0" w:right="0" w:firstLine="0"/><w:jc w:val="left"/><w:rPr/></w:pPr><w:r><w:rPr><w:rtl w:val="0"/></w:rPr></w:r></w:p></w:tc><w:tc><w:tcPr/><w:p><w:pPr><w:keepNext w:val="0"/><w:keepLines w:val="0"/><w:pageBreakBefore w:val="0"/><w:widowControl w:val="1"/><w:numPr><w:ilvl w:val="0"/><w:numId w:val="4"/></w:numPr><w:pBdr><w:top w:space="0" w:sz="0" w:val="nil"/><w:left w:space="0" w:sz="0" w:val="nil"/><w:bottom w:space="0" w:sz="0" w:val="nil"/><w:right w:space="0" w:sz="0" w:val="nil"/><w:between w:space="0" w:sz="0" w:val="nil"/></w:pBdr><w:shd w:fill="auto" w:val="clear"/><w:spacing w:after="160" w:before="0" w:line="259" w:lineRule="auto"/><w:ind w:left="720" w:right="0" w:hanging="360"/><w:jc w:val="left"/><w:rPr><w:rFonts w:ascii="Calibri" w:cs="Calibri" w:eastAsia="Calibri" w:hAnsi="Calibri"/><w:b w:val="0"/><w:bCs w:val="0"/><w:i w:val="0"/><w:iCs w:val="0"/><w:smallCaps w:val="0"/><w:strike w:val="0"/><w:color w:val="000000"/><w:sz w:val="22"/><w:szCs w:val="22"/><w:u w:val="none"/><w:shd w:fill="auto" w:val="clear"/><w:vertAlign w:val="baseline"/></w:rPr></w:pPr><w:r><w:rPr><w:rFonts w:ascii="Calibri" w:cs="Calibri" w:eastAsia="Calibri" w:hAnsi="Calibri"/><w:b w:val="0"/><w:bCs w:val="0"/><w:i w:val="0"/><w:iCs w:val="0"/><w:smallCaps w:val="0"/><w:strike w:val="0"/><w:color w:val="000000"/><w:sz w:val="22"/><w:szCs w:val="22"/><w:u w:val="none"/><w:shd w:fill="auto" w:val="clear"/><w:vertAlign w:val="baseline"/><w:rtl w:val="0"/></w:rPr><w:t xml:space="preserve">Date of issue and validity of layout of approved map / plan</w:t></w:r></w:p></w:tc><w:tc><w:tcPr><w:gridSpan w:val="2"/></w:tcPr><w:p><w:pPr><w:tabs><w:tab w:val="left" w:leader="none" w:pos="1654"/></w:tabs><w:rPr/></w:pPr><w:r><w:rPr><w:rtl w:val="0"/></w:rPr></w:r></w:p></w:tc></w:tr><w:tr><w:trPr><w:cantSplit w:val="0"/><w:tblHeader w:val="0"/></w:trPr><w:tc><w:tcPr><w:vMerge w:val="continue"/></w:tcPr><w:p><w:pPr><w:keepNext w:val="0"/><w:keepLines w:val="0"/><w:pageBreakBefore w:val="0"/><w:widowControl w:val="0"/><w:pBdr><w:top w:space="0" w:sz="0" w:val="nil"/><w:left w:space="0" w:sz="0" w:val="nil"/><w:bottom w:space="0" w:sz="0" w:val="nil"/><w:right w:space="0" w:sz="0" w:val="nil"/><w:between w:space="0" w:sz="0" w:val="nil"/></w:pBdr><w:shd w:fill="auto" w:val="clear"/><w:spacing w:after="0" w:before="0" w:line="276" w:lineRule="auto"/><w:ind w:left="0" w:right="0" w:firstLine="0"/><w:jc w:val="left"/><w:rPr/></w:pPr><w:r><w:rPr><w:rtl w:val="0"/></w:rPr></w:r></w:p></w:tc><w:tc><w:tcPr/><w:p><w:pPr><w:keepNext w:val="0"/><w:keepLines w:val="0"/><w:pageBreakBefore w:val="0"/><w:widowControl w:val="1"/><w:numPr><w:ilvl w:val="0"/><w:numId w:val="4"/></w:numPr><w:pBdr><w:top w:space="0" w:sz="0" w:val="nil"/><w:left w:space="0" w:sz="0" w:val="nil"/><w:bottom w:space="0" w:sz="0" w:val="nil"/><w:right w:space="0" w:sz="0" w:val="nil"/><w:between w:space="0" w:sz="0" w:val="nil"/></w:pBdr><w:shd w:fill="auto" w:val="clear"/><w:spacing w:after="160" w:before="0" w:line="259" w:lineRule="auto"/><w:ind w:left="720" w:right="0" w:hanging="360"/><w:jc w:val="left"/><w:rPr><w:rFonts w:ascii="Calibri" w:cs="Calibri" w:eastAsia="Calibri" w:hAnsi="Calibri"/><w:b w:val="0"/><w:bCs w:val="0"/><w:i w:val="0"/><w:iCs w:val="0"/><w:smallCaps w:val="0"/><w:strike w:val="0"/><w:color w:val="000000"/><w:sz w:val="22"/><w:szCs w:val="22"/><w:u w:val="none"/><w:shd w:fill="auto" w:val="clear"/><w:vertAlign w:val="baseline"/></w:rPr></w:pPr><w:r><w:rPr><w:rFonts w:ascii="Calibri" w:cs="Calibri" w:eastAsia="Calibri" w:hAnsi="Calibri"/><w:b w:val="0"/><w:bCs w:val="0"/><w:i w:val="0"/><w:iCs w:val="0"/><w:smallCaps w:val="0"/><w:strike w:val="0"/><w:color w:val="000000"/><w:sz w:val="22"/><w:szCs w:val="22"/><w:u w:val="none"/><w:shd w:fill="auto" w:val="clear"/><w:vertAlign w:val="baseline"/><w:rtl w:val="0"/></w:rPr><w:t xml:space="preserve">Approved map / plan issuing authority</w:t></w:r></w:p></w:tc><w:tc><w:tcPr><w:gridSpan w:val="2"/></w:tcPr><w:p><w:pPr><w:rPr><w:b w:val="1"/><w:bCs w:val="1"/></w:rPr></w:pPr><w:r><w:rPr><w:rtl w:val="0"/></w:rPr></w:r></w:p></w:tc></w:tr><w:tr><w:trPr><w:cantSplit w:val="0"/><w:tblHeader w:val="0"/></w:trPr><w:tc><w:tcPr><w:vMerge w:val="continue"/></w:tcPr><w:p><w:pPr><w:keepNext w:val="0"/><w:keepLines w:val="0"/><w:pageBreakBefore w:val="0"/><w:widowControl w:val="0"/><w:pBdr><w:top w:space="0" w:sz="0" w:val="nil"/><w:left w:space="0" w:sz="0" w:val="nil"/><w:bottom w:space="0" w:sz="0" w:val="nil"/><w:right w:space="0" w:sz="0" w:val="nil"/><w:between w:space="0" w:sz="0" w:val="nil"/></w:pBdr><w:shd w:fill="auto" w:val="clear"/><w:spacing w:after="0" w:before="0" w:line="276" w:lineRule="auto"/><w:ind w:left="0" w:right="0" w:firstLine="0"/><w:jc w:val="left"/><w:rPr><w:b w:val="1"/><w:bCs w:val="1"/></w:rPr></w:pPr><w:r><w:rPr><w:rtl w:val="0"/></w:rPr></w:r></w:p></w:tc><w:tc><w:tcPr/><w:p><w:pPr><w:keepNext w:val="0"/><w:keepLines w:val="0"/><w:pageBreakBefore w:val="0"/><w:widowControl w:val="1"/><w:numPr><w:ilvl w:val="0"/><w:numId w:val="4"/></w:numPr><w:pBdr><w:top w:space="0" w:sz="0" w:val="nil"/><w:left w:space="0" w:sz="0" w:val="nil"/><w:bottom w:space="0" w:sz="0" w:val="nil"/><w:right w:space="0" w:sz="0" w:val="nil"/><w:between w:space="0" w:sz="0" w:val="nil"/></w:pBdr><w:shd w:fill="auto" w:val="clear"/><w:spacing w:after="160" w:before="0" w:line="259" w:lineRule="auto"/><w:ind w:left="720" w:right="0" w:hanging="360"/><w:jc w:val="left"/><w:rPr><w:rFonts w:ascii="Calibri" w:cs="Calibri" w:eastAsia="Calibri" w:hAnsi="Calibri"/><w:b w:val="0"/><w:bCs w:val="0"/><w:i w:val="0"/><w:iCs w:val="0"/><w:smallCaps w:val="0"/><w:strike w:val="0"/><w:color w:val="000000"/><w:sz w:val="22"/><w:szCs w:val="22"/><w:u w:val="none"/><w:shd w:fill="auto" w:val="clear"/><w:vertAlign w:val="baseline"/></w:rPr></w:pPr><w:r><w:rPr><w:rFonts w:ascii="Calibri" w:cs="Calibri" w:eastAsia="Calibri" w:hAnsi="Calibri"/><w:b w:val="0"/><w:bCs w:val="0"/><w:i w:val="0"/><w:iCs w:val="0"/><w:smallCaps w:val="0"/><w:strike w:val="0"/><w:color w:val="000000"/><w:sz w:val="22"/><w:szCs w:val="22"/><w:u w:val="none"/><w:shd w:fill="auto" w:val="clear"/><w:vertAlign w:val="baseline"/><w:rtl w:val="0"/></w:rPr><w:t xml:space="preserve">Whether genuineness of authority of approved map / plan is verified</w:t></w:r></w:p></w:tc><w:tc><w:tcPr><w:gridSpan w:val="2"/></w:tcPr><w:p><w:pPr><w:rPr/></w:pPr><w:r><w:rPr><w:rtl w:val="0"/></w:rPr></w:r></w:p></w:tc></w:tr><w:tr><w:trPr><w:cantSplit w:val="0"/><w:tblHeader w:val="0"/></w:trPr><w:tc><w:tcPr><w:vMerge w:val="continue"/></w:tcPr><w:p><w:pPr><w:keepNext w:val="0"/><w:keepLines w:val="0"/><w:pageBreakBefore w:val="0"/><w:widowControl w:val="0"/><w:pBdr><w:top w:space="0" w:sz="0" w:val="nil"/><w:left w:space="0" w:sz="0" w:val="nil"/><w:bottom w:space="0" w:sz="0" w:val="nil"/><w:right w:space="0" w:sz="0" w:val="nil"/><w:between w:space="0" w:sz="0" w:val="nil"/></w:pBdr><w:shd w:fill="auto" w:val="clear"/><w:spacing w:after="0" w:before="0" w:line="276" w:lineRule="auto"/><w:ind w:left="0" w:right="0" w:firstLine="0"/><w:jc w:val="left"/><w:rPr/></w:pPr><w:r><w:rPr><w:rtl w:val="0"/></w:rPr></w:r></w:p></w:tc><w:tc><w:tcPr/><w:p><w:pPr><w:keepNext w:val="0"/><w:keepLines w:val="0"/><w:pageBreakBefore w:val="0"/><w:widowControl w:val="1"/><w:numPr><w:ilvl w:val="0"/><w:numId w:val="4"/></w:numPr><w:pBdr><w:top w:space="0" w:sz="0" w:val="nil"/><w:left w:space="0" w:sz="0" w:val="nil"/><w:bottom w:space="0" w:sz="0" w:val="nil"/><w:right w:space="0" w:sz="0" w:val="nil"/><w:between w:space="0" w:sz="0" w:val="nil"/></w:pBdr><w:shd w:fill="auto" w:val="clear"/><w:spacing w:after="160" w:before="0" w:line="259" w:lineRule="auto"/><w:ind w:left="720" w:right="0" w:hanging="360"/><w:jc w:val="left"/><w:rPr><w:rFonts w:ascii="Calibri" w:cs="Calibri" w:eastAsia="Calibri" w:hAnsi="Calibri"/><w:b w:val="0"/><w:bCs w:val="0"/><w:i w:val="0"/><w:iCs w:val="0"/><w:smallCaps w:val="0"/><w:strike w:val="0"/><w:color w:val="000000"/><w:sz w:val="22"/><w:szCs w:val="22"/><w:u w:val="none"/><w:shd w:fill="auto" w:val="clear"/><w:vertAlign w:val="baseline"/></w:rPr></w:pPr><w:r><w:rPr><w:rFonts w:ascii="Calibri" w:cs="Calibri" w:eastAsia="Calibri" w:hAnsi="Calibri"/><w:b w:val="0"/><w:bCs w:val="0"/><w:i w:val="0"/><w:iCs w:val="0"/><w:smallCaps w:val="0"/><w:strike w:val="0"/><w:color w:val="000000"/><w:sz w:val="22"/><w:szCs w:val="22"/><w:u w:val="none"/><w:shd w:fill="auto" w:val="clear"/><w:vertAlign w:val="baseline"/><w:rtl w:val="0"/></w:rPr><w:t xml:space="preserve">Any other comments on authentic of approved plan</w:t></w:r></w:p></w:tc><w:tc><w:tcPr><w:gridSpan w:val="2"/></w:tcPr><w:p><w:pPr><w:rPr/></w:pPr><w:r><w:rPr><w:rtl w:val="0"/></w:rPr></w:r></w:p></w:tc></w:tr><w:tr><w:trPr><w:cantSplit w:val="0"/><w:tblHeader w:val="0"/></w:trPr><w:tc><w:tcPr><w:vMerge w:val="continue"/></w:tcPr><w:p><w:pPr><w:keepNext w:val="0"/><w:keepLines w:val="0"/><w:pageBreakBefore w:val="0"/><w:widowControl w:val="0"/><w:pBdr><w:top w:space="0" w:sz="0" w:val="nil"/><w:left w:space="0" w:sz="0" w:val="nil"/><w:bottom w:space="0" w:sz="0" w:val="nil"/><w:right w:space="0" w:sz="0" w:val="nil"/><w:between w:space="0" w:sz="0" w:val="nil"/></w:pBdr><w:shd w:fill="auto" w:val="clear"/><w:spacing w:after="0" w:before="0" w:line="276" w:lineRule="auto"/><w:ind w:left="0" w:right="0" w:firstLine="0"/><w:jc w:val="left"/><w:rPr/></w:pPr><w:r><w:rPr><w:rtl w:val="0"/></w:rPr></w:r></w:p></w:tc><w:tc><w:tcPr/><w:p><w:pPr><w:keepNext w:val="0"/><w:keepLines w:val="0"/><w:pageBreakBefore w:val="0"/><w:widowControl w:val="1"/><w:numPr><w:ilvl w:val="0"/><w:numId w:val="4"/></w:numPr><w:pBdr><w:top w:space="0" w:sz="0" w:val="nil"/><w:left w:space="0" w:sz="0" w:val="nil"/><w:bottom w:space="0" w:sz="0" w:val="nil"/><w:right w:space="0" w:sz="0" w:val="nil"/><w:between w:space="0" w:sz="0" w:val="nil"/></w:pBdr><w:shd w:fill="auto" w:val="clear"/><w:spacing w:after="160" w:before="0" w:line="259" w:lineRule="auto"/><w:ind w:left="720" w:right="0" w:hanging="360"/><w:jc w:val="left"/><w:rPr><w:rFonts w:ascii="Calibri" w:cs="Calibri" w:eastAsia="Calibri" w:hAnsi="Calibri"/><w:b w:val="0"/><w:bCs w:val="0"/><w:i w:val="0"/><w:iCs w:val="0"/><w:smallCaps w:val="0"/><w:strike w:val="0"/><w:color w:val="000000"/><w:sz w:val="22"/><w:szCs w:val="22"/><w:u w:val="none"/><w:shd w:fill="auto" w:val="clear"/><w:vertAlign w:val="baseline"/></w:rPr></w:pPr><w:r><w:rPr><w:rFonts w:ascii="Calibri" w:cs="Calibri" w:eastAsia="Calibri" w:hAnsi="Calibri"/><w:b w:val="0"/><w:bCs w:val="0"/><w:i w:val="0"/><w:iCs w:val="0"/><w:smallCaps w:val="0"/><w:strike w:val="0"/><w:color w:val="000000"/><w:sz w:val="22"/><w:szCs w:val="22"/><w:u w:val="none"/><w:shd w:fill="auto" w:val="clear"/><w:vertAlign w:val="baseline"/><w:rtl w:val="0"/></w:rPr><w:t xml:space="preserve">Comment on unauthorized construction if any  </w:t></w:r></w:p></w:tc><w:tc><w:tcPr><w:gridSpan w:val="2"/></w:tcPr><w:p><w:pPr><w:rPr/></w:pPr><w:r><w:rPr><w:rtl w:val="0"/></w:rPr></w:r></w:p></w:tc></w:tr><w:tr><w:trPr><w:cantSplit w:val="0"/><w:tblHeader w:val="0"/></w:trPr><w:tc><w:tcPr><w:vMerge w:val="continue"/></w:tcPr><w:p><w:pPr><w:keepNext w:val="0"/><w:keepLines w:val="0"/><w:pageBreakBefore w:val="0"/><w:widowControl w:val="0"/><w:pBdr><w:top w:space="0" w:sz="0" w:val="nil"/><w:left w:space="0" w:sz="0" w:val="nil"/><w:bottom w:space="0" w:sz="0" w:val="nil"/><w:right w:space="0" w:sz="0" w:val="nil"/><w:between w:space="0" w:sz="0" w:val="nil"/></w:pBdr><w:shd w:fill="auto" w:val="clear"/><w:spacing w:after="0" w:before="0" w:line="276" w:lineRule="auto"/><w:ind w:left="0" w:right="0" w:firstLine="0"/><w:jc w:val="left"/><w:rPr/></w:pPr><w:r><w:rPr><w:rtl w:val="0"/></w:rPr></w:r></w:p></w:tc><w:tc><w:tcPr/><w:p><w:pPr><w:keepNext w:val="0"/><w:keepLines w:val="0"/><w:pageBreakBefore w:val="0"/><w:widowControl w:val="1"/><w:numPr><w:ilvl w:val="0"/><w:numId w:val="4"/></w:numPr><w:pBdr><w:top w:space="0" w:sz="0" w:val="nil"/><w:left w:space="0" w:sz="0" w:val="nil"/><w:bottom w:space="0" w:sz="0" w:val="nil"/><w:right w:space="0" w:sz="0" w:val="nil"/><w:between w:space="0" w:sz="0" w:val="nil"/></w:pBdr><w:shd w:fill="auto" w:val="clear"/><w:spacing w:after="160" w:before="0" w:line="259" w:lineRule="auto"/><w:ind w:left="720" w:right="0" w:hanging="360"/><w:jc w:val="left"/><w:rPr><w:rFonts w:ascii="Calibri" w:cs="Calibri" w:eastAsia="Calibri" w:hAnsi="Calibri"/><w:b w:val="0"/><w:bCs w:val="0"/><w:i w:val="0"/><w:iCs w:val="0"/><w:smallCaps w:val="0"/><w:strike w:val="0"/><w:color w:val="000000"/><w:sz w:val="22"/><w:szCs w:val="22"/><w:u w:val="none"/><w:shd w:fill="auto" w:val="clear"/><w:vertAlign w:val="baseline"/></w:rPr></w:pPr><w:r><w:rPr><w:rFonts w:ascii="Calibri" w:cs="Calibri" w:eastAsia="Calibri" w:hAnsi="Calibri"/><w:b w:val="0"/><w:bCs w:val="0"/><w:i w:val="0"/><w:iCs w:val="0"/><w:smallCaps w:val="0"/><w:strike w:val="0"/><w:color w:val="000000"/><w:sz w:val="22"/><w:szCs w:val="22"/><w:u w:val="none"/><w:shd w:fill="auto" w:val="clear"/><w:vertAlign w:val="baseline"/><w:rtl w:val="0"/></w:rPr><w:t xml:space="preserve">Comment on demolition proceedings if any </w:t></w:r></w:p></w:tc><w:tc><w:tcPr><w:gridSpan w:val="2"/></w:tcPr><w:p><w:pPr><w:rPr/></w:pPr><w:r><w:rPr><w:rtl w:val="0"/></w:rPr></w:r></w:p></w:tc></w:tr><w:tr><w:trPr><w:cantSplit w:val="0"/><w:trHeight w:val="941" w:hRule="atLeast"/><w:tblHeader w:val="0"/></w:trPr><w:tc><w:tcPr/><w:p><w:pPr><w:rPr/></w:pPr><w:r><w:rPr><w:rtl w:val="0"/></w:rPr><w:t xml:space="preserve">8.</w:t></w:r></w:p></w:tc><w:tc><w:tcPr/><w:p><w:pPr><w:rPr/></w:pPr><w:r><w:rPr><w:rtl w:val="0"/></w:rPr><w:t xml:space="preserve">Postal address of the property</w:t></w:r></w:p></w:tc><w:tc><w:tcPr><w:gridSpan w:val="2"/></w:tcPr><w:p><w:pPr><w:spacing w:line="276" w:lineRule="auto"/><w:jc w:val="both"/><w:rPr/></w:pPr><w:r><w:rPr><w:rtl w:val="0"/></w:rPr></w:r></w:p></w:tc></w:tr><w:tr><w:trPr><w:cantSplit w:val="0"/><w:tblHeader w:val="0"/></w:trPr><w:tc><w:tcPr><w:vMerge w:val="restart"/></w:tcPr><w:p><w:pPr><w:spacing w:line="276" w:lineRule="auto"/><w:rPr/></w:pPr><w:r><w:rPr><w:rtl w:val="0"/></w:rPr><w:t xml:space="preserve">9.</w:t></w:r></w:p></w:tc><w:tc><w:tcPr/><w:p><w:pPr><w:spacing w:line="276" w:lineRule="auto"/><w:rPr/></w:pPr><w:r><w:rPr><w:rtl w:val="0"/></w:rPr><w:t xml:space="preserve">City / Town</w:t></w:r></w:p></w:tc><w:tc><w:tcPr><w:gridSpan w:val="2"/></w:tcPr><w:p><w:pPr><w:spacing w:line="276" w:lineRule="auto"/><w:rPr/></w:pPr><w:r><w:rPr><w:rtl w:val="0"/></w:rPr></w:r></w:p></w:tc></w:tr><w:tr><w:trPr><w:cantSplit w:val="0"/><w:tblHeader w:val="0"/></w:trPr><w:tc><w:tcPr><w:vMerge w:val="continue"/></w:tcPr><w:p><w:pPr><w:keepNext w:val="0"/><w:keepLines w:val="0"/><w:pageBreakBefore w:val="0"/><w:widowControl w:val="0"/><w:pBdr><w:top w:space="0" w:sz="0" w:val="nil"/><w:left w:space="0" w:sz="0" w:val="nil"/><w:bottom w:space="0" w:sz="0" w:val="nil"/><w:right w:space="0" w:sz="0" w:val="nil"/><w:between w:space="0" w:sz="0" w:val="nil"/></w:pBdr><w:shd w:fill="auto" w:val="clear"/><w:spacing w:after="0" w:before="0" w:line="276" w:lineRule="auto"/><w:ind w:left="0" w:right="0" w:firstLine="0"/><w:jc w:val="left"/><w:rPr/></w:pPr><w:r><w:rPr><w:rtl w:val="0"/></w:rPr></w:r></w:p></w:tc><w:tc><w:tcPr/><w:p><w:pPr><w:spacing w:line="276" w:lineRule="auto"/><w:rPr/></w:pPr><w:r><w:rPr><w:rtl w:val="0"/></w:rPr><w:t xml:space="preserve">Residential Area</w:t></w:r></w:p></w:tc><w:tc><w:tcPr><w:gridSpan w:val="2"/></w:tcPr><w:p><w:pPr><w:spacing w:line="276" w:lineRule="auto"/><w:rPr/></w:pPr><w:r><w:rPr><w:rtl w:val="0"/></w:rPr></w:r></w:p></w:tc></w:tr><w:tr><w:trPr><w:cantSplit w:val="0"/><w:tblHeader w:val="0"/></w:trPr><w:tc><w:tcPr><w:vMerge w:val="continue"/></w:tcPr><w:p><w:pPr><w:keepNext w:val="0"/><w:keepLines w:val="0"/><w:pageBreakBefore w:val="0"/><w:widowControl w:val="0"/><w:pBdr><w:top w:space="0" w:sz="0" w:val="nil"/><w:left w:space="0" w:sz="0" w:val="nil"/><w:bottom w:space="0" w:sz="0" w:val="nil"/><w:right w:space="0" w:sz="0" w:val="nil"/><w:between w:space="0" w:sz="0" w:val="nil"/></w:pBdr><w:shd w:fill="auto" w:val="clear"/><w:spacing w:after="0" w:before="0" w:line="276" w:lineRule="auto"/><w:ind w:left="0" w:right="0" w:firstLine="0"/><w:jc w:val="left"/><w:rPr/></w:pPr><w:r><w:rPr><w:rtl w:val="0"/></w:rPr></w:r></w:p></w:tc><w:tc><w:tcPr/><w:p><w:pPr><w:spacing w:line="276" w:lineRule="auto"/><w:rPr/></w:pPr><w:r><w:rPr><w:rtl w:val="0"/></w:rPr><w:t xml:space="preserve">Commercial Area</w:t></w:r></w:p></w:tc><w:tc><w:tcPr><w:gridSpan w:val="2"/></w:tcPr><w:p><w:pPr><w:spacing w:line="276" w:lineRule="auto"/><w:rPr/></w:pPr><w:r><w:rPr><w:rtl w:val="0"/></w:rPr></w:r></w:p></w:tc></w:tr><w:tr><w:trPr><w:cantSplit w:val="0"/><w:tblHeader w:val="0"/></w:trPr><w:tc><w:tcPr><w:vMerge w:val="continue"/></w:tcPr><w:p><w:pPr><w:keepNext w:val="0"/><w:keepLines w:val="0"/><w:pageBreakBefore w:val="0"/><w:widowControl w:val="0"/><w:pBdr><w:top w:space="0" w:sz="0" w:val="nil"/><w:left w:space="0" w:sz="0" w:val="nil"/><w:bottom w:space="0" w:sz="0" w:val="nil"/><w:right w:space="0" w:sz="0" w:val="nil"/><w:between w:space="0" w:sz="0" w:val="nil"/></w:pBdr><w:shd w:fill="auto" w:val="clear"/><w:spacing w:after="0" w:before="0" w:line="276" w:lineRule="auto"/><w:ind w:left="0" w:right="0" w:firstLine="0"/><w:jc w:val="left"/><w:rPr/></w:pPr><w:r><w:rPr><w:rtl w:val="0"/></w:rPr></w:r></w:p></w:tc><w:tc><w:tcPr/><w:p><w:pPr><w:spacing w:line="276" w:lineRule="auto"/><w:rPr/></w:pPr><w:r><w:rPr><w:rtl w:val="0"/></w:rPr><w:t xml:space="preserve">Industrial Area</w:t></w:r></w:p></w:tc><w:tc><w:tcPr><w:gridSpan w:val="2"/></w:tcPr><w:p><w:pPr><w:spacing w:line="276" w:lineRule="auto"/><w:rPr/></w:pPr><w:r><w:rPr><w:rtl w:val="0"/></w:rPr></w:r></w:p></w:tc></w:tr><w:tr><w:trPr><w:cantSplit w:val="0"/><w:tblHeader w:val="0"/></w:trPr><w:tc><w:tcPr><w:vMerge w:val="restart"/></w:tcPr><w:p><w:pPr><w:spacing w:line="276" w:lineRule="auto"/><w:rPr/></w:pPr><w:r><w:rPr><w:rtl w:val="0"/></w:rPr><w:t xml:space="preserve">10.</w:t></w:r></w:p></w:tc><w:tc><w:tcPr/><w:p><w:pPr><w:spacing w:line="276" w:lineRule="auto"/><w:rPr/></w:pPr><w:r><w:rPr><w:rtl w:val="0"/></w:rPr><w:t xml:space="preserve">Classification of the area</w:t></w:r></w:p></w:tc><w:tc><w:tcPr><w:gridSpan w:val="2"/></w:tcPr><w:p><w:pPr><w:spacing w:line="276" w:lineRule="auto"/><w:rPr/></w:pPr><w:r><w:rPr><w:rtl w:val="0"/></w:rPr></w:r></w:p></w:tc></w:tr><w:tr><w:trPr><w:cantSplit w:val="0"/><w:tblHeader w:val="0"/></w:trPr><w:tc><w:tcPr><w:vMerge w:val="continue"/></w:tcPr><w:p><w:pPr><w:keepNext w:val="0"/><w:keepLines w:val="0"/><w:pageBreakBefore w:val="0"/><w:widowControl w:val="0"/><w:pBdr><w:top w:space="0" w:sz="0" w:val="nil"/><w:left w:space="0" w:sz="0" w:val="nil"/><w:bottom w:space="0" w:sz="0" w:val="nil"/><w:right w:space="0" w:sz="0" w:val="nil"/><w:between w:space="0" w:sz="0" w:val="nil"/></w:pBdr><w:shd w:fill="auto" w:val="clear"/><w:spacing w:after="0" w:before="0" w:line="276" w:lineRule="auto"/><w:ind w:left="0" w:right="0" w:firstLine="0"/><w:jc w:val="left"/><w:rPr/></w:pPr><w:r><w:rPr><w:rtl w:val="0"/></w:rPr></w:r></w:p></w:tc><w:tc><w:tcPr/><w:p><w:pPr><w:spacing w:line="276" w:lineRule="auto"/><w:rPr/></w:pPr><w:r><w:rPr><w:rtl w:val="0"/></w:rPr><w:t xml:space="preserve">i) High / Middle / Poor</w:t></w:r></w:p></w:tc><w:tc><w:tcPr><w:gridSpan w:val="2"/></w:tcPr><w:p><w:pPr><w:spacing w:line="276" w:lineRule="auto"/><w:rPr/></w:pPr><w:r><w:rPr><w:rtl w:val="0"/></w:rPr></w:r></w:p></w:tc></w:tr><w:tr><w:trPr><w:cantSplit w:val="0"/><w:tblHeader w:val="0"/></w:trPr><w:tc><w:tcPr><w:vMerge w:val="continue"/></w:tcPr><w:p><w:pPr><w:keepNext w:val="0"/><w:keepLines w:val="0"/><w:pageBreakBefore w:val="0"/><w:widowControl w:val="0"/><w:pBdr><w:top w:space="0" w:sz="0" w:val="nil"/><w:left w:space="0" w:sz="0" w:val="nil"/><w:bottom w:space="0" w:sz="0" w:val="nil"/><w:right w:space="0" w:sz="0" w:val="nil"/><w:between w:space="0" w:sz="0" w:val="nil"/></w:pBdr><w:shd w:fill="auto" w:val="clear"/><w:spacing w:after="0" w:before="0" w:line="276" w:lineRule="auto"/><w:ind w:left="0" w:right="0" w:firstLine="0"/><w:jc w:val="left"/><w:rPr/></w:pPr><w:r><w:rPr><w:rtl w:val="0"/></w:rPr></w:r></w:p></w:tc><w:tc><w:tcPr/><w:p><w:pPr><w:spacing w:line="276" w:lineRule="auto"/><w:rPr/></w:pPr><w:r><w:rPr><w:rtl w:val="0"/></w:rPr><w:t xml:space="preserve">ii) Urban / Semi Urban / Rural</w:t></w:r></w:p></w:tc><w:tc><w:tcPr><w:gridSpan w:val="2"/></w:tcPr><w:p><w:pPr><w:spacing w:line="276" w:lineRule="auto"/><w:rPr/></w:pPr><w:r><w:rPr><w:rtl w:val="0"/></w:rPr></w:r></w:p></w:tc></w:tr><w:tr><w:trPr><w:cantSplit w:val="0"/><w:tblHeader w:val="0"/></w:trPr><w:tc><w:tcPr/><w:p><w:pPr><w:spacing w:line="276" w:lineRule="auto"/><w:rPr/></w:pPr><w:r><w:rPr><w:rtl w:val="0"/></w:rPr><w:t xml:space="preserve">11.</w:t></w:r></w:p></w:tc><w:tc><w:tcPr/><w:p><w:pPr><w:spacing w:line="276" w:lineRule="auto"/><w:rPr/></w:pPr><w:r><w:rPr><w:rtl w:val="0"/></w:rPr><w:t xml:space="preserve">Coming under Corporation limit / Village Panchayat / Municipality</w:t></w:r></w:p></w:tc><w:tc><w:tcPr><w:gridSpan w:val="2"/></w:tcPr><w:p><w:pPr><w:spacing w:line="276" w:lineRule="auto"/><w:rPr/></w:pPr><w:r><w:rPr><w:rtl w:val="0"/></w:rPr></w:r></w:p></w:tc></w:tr><w:tr><w:trPr><w:cantSplit w:val="0"/><w:trHeight w:val="995" w:hRule="atLeast"/><w:tblHeader w:val="0"/></w:trPr><w:tc><w:tcPr/><w:p><w:pPr><w:spacing w:line="276" w:lineRule="auto"/><w:rPr/></w:pPr><w:r><w:rPr><w:rtl w:val="0"/></w:rPr><w:t xml:space="preserve">12.</w:t></w:r></w:p></w:tc><w:tc><w:tcPr/><w:p><w:pPr><w:spacing w:line="276" w:lineRule="auto"/><w:rPr/></w:pPr><w:r><w:rPr><w:rtl w:val="0"/></w:rPr><w:t xml:space="preserve">Whether covered under any State / Central Govt. Enactments (e.g. Urban Land Ceiling Act) or notified under agency area / scheduled area / cantonment area</w:t></w:r></w:p></w:tc><w:tc><w:tcPr><w:gridSpan w:val="2"/></w:tcPr><w:p><w:pPr><w:spacing w:after="43" w:line="276" w:lineRule="auto"/><w:ind w:left="1" w:firstLine="0"/><w:rPr/></w:pPr><w:r><w:rPr><w:rtl w:val="0"/></w:rPr></w:r></w:p><w:p><w:pPr><w:spacing w:after="43" w:line="276" w:lineRule="auto"/><w:ind w:left="1" w:firstLine="0"/><w:rPr/></w:pPr><w:r><w:rPr><w:rtl w:val="0"/></w:rPr></w:r></w:p></w:tc></w:tr><w:tr><w:trPr><w:cantSplit w:val="0"/><w:tblHeader w:val="0"/></w:trPr><w:tc><w:tcPr><w:vMerge w:val="restart"/></w:tcPr><w:p><w:pPr><w:spacing w:line="276" w:lineRule="auto"/><w:rPr/></w:pPr><w:r><w:rPr><w:rtl w:val="0"/></w:rPr><w:t xml:space="preserve">13.</w:t></w:r></w:p></w:tc><w:tc><w:tcPr/><w:p><w:pPr><w:spacing w:line="276" w:lineRule="auto"/><w:rPr/></w:pPr><w:r><w:rPr><w:rtl w:val="0"/></w:rPr><w:t xml:space="preserve">Boundaries of the property</w:t></w:r></w:p></w:tc><w:tc><w:tcPr/><w:p><w:pPr><w:spacing w:line="276" w:lineRule="auto"/><w:jc w:val="center"/><w:rPr><w:b w:val="1"/><w:bCs w:val="1"/></w:rPr></w:pPr><w:r><w:rPr><w:b w:val="1"/><w:bCs w:val="1"/><w:rtl w:val="0"/></w:rPr><w:t xml:space="preserve">(As per Site)</w:t></w:r></w:p></w:tc><w:tc><w:tcPr/><w:p><w:pPr><w:spacing w:line="276" w:lineRule="auto"/><w:jc w:val="center"/><w:rPr><w:b w:val="1"/><w:bCs w:val="1"/></w:rPr></w:pPr><w:r><w:rPr><w:b w:val="1"/><w:bCs w:val="1"/><w:rtl w:val="0"/></w:rPr><w:t xml:space="preserve">(As per Flat)</w:t></w:r></w:p></w:tc></w:tr><w:tr><w:trPr><w:cantSplit w:val="0"/><w:tblHeader w:val="0"/></w:trPr><w:tc><w:tcPr><w:vMerge w:val="continue"/></w:tcPr><w:p><w:pPr><w:keepNext w:val="0"/><w:keepLines w:val="0"/><w:pageBreakBefore w:val="0"/><w:widowControl w:val="0"/><w:pBdr><w:top w:space="0" w:sz="0" w:val="nil"/><w:left w:space="0" w:sz="0" w:val="nil"/><w:bottom w:space="0" w:sz="0" w:val="nil"/><w:right w:space="0" w:sz="0" w:val="nil"/><w:between w:space="0" w:sz="0" w:val="nil"/></w:pBdr><w:shd w:fill="auto" w:val="clear"/><w:spacing w:after="0" w:before="0" w:line="276" w:lineRule="auto"/><w:ind w:left="0" w:right="0" w:firstLine="0"/><w:jc w:val="left"/><w:rPr><w:b w:val="1"/><w:bCs w:val="1"/></w:rPr></w:pPr><w:r><w:rPr><w:rtl w:val="0"/></w:rPr></w:r></w:p></w:tc><w:tc><w:tcPr/><w:p><w:pPr><w:spacing w:line="276" w:lineRule="auto"/><w:rPr/></w:pPr><w:r><w:rPr><w:rtl w:val="0"/></w:rPr><w:t xml:space="preserve">East</w:t></w:r></w:p></w:tc><w:tc><w:tcPr/><w:p><w:pPr><w:spacing w:line="276" w:lineRule="auto"/><w:jc w:val="center"/><w:rPr/></w:pPr><w:r><w:rPr><w:rtl w:val="0"/></w:rPr></w:r></w:p></w:tc><w:tc><w:tcPr/><w:p><w:pPr><w:tabs><w:tab w:val="left" w:leader="none" w:pos="375"/></w:tabs><w:spacing w:line="276" w:lineRule="auto"/><w:jc w:val="center"/><w:rPr/></w:pPr><w:r><w:rPr><w:rtl w:val="0"/></w:rPr></w:r></w:p></w:tc></w:tr><w:tr><w:trPr><w:cantSplit w:val="0"/><w:tblHeader w:val="0"/></w:trPr><w:tc><w:tcPr><w:vMerge w:val="continue"/></w:tcPr><w:p><w:pPr><w:keepNext w:val="0"/><w:keepLines w:val="0"/><w:pageBreakBefore w:val="0"/><w:widowControl w:val="0"/><w:pBdr><w:top w:space="0" w:sz="0" w:val="nil"/><w:left w:space="0" w:sz="0" w:val="nil"/><w:bottom w:space="0" w:sz="0" w:val="nil"/><w:right w:space="0" w:sz="0" w:val="nil"/><w:between w:space="0" w:sz="0" w:val="nil"/></w:pBdr><w:shd w:fill="auto" w:val="clear"/><w:spacing w:after="0" w:before="0" w:line="276" w:lineRule="auto"/><w:ind w:left="0" w:right="0" w:firstLine="0"/><w:jc w:val="left"/><w:rPr/></w:pPr><w:r><w:rPr><w:rtl w:val="0"/></w:rPr></w:r></w:p></w:tc><w:tc><w:tcPr/><w:p><w:pPr><w:spacing w:line="276" w:lineRule="auto"/><w:rPr/></w:pPr><w:r><w:rPr><w:rtl w:val="0"/></w:rPr><w:t xml:space="preserve">West</w:t></w:r></w:p></w:tc><w:tc><w:tcPr/><w:p><w:pPr><w:spacing w:line="276" w:lineRule="auto"/><w:jc w:val="center"/><w:rPr/></w:pPr><w:r><w:rPr><w:rtl w:val="0"/></w:rPr></w:r></w:p></w:tc><w:tc><w:tcPr/><w:p><w:pPr><w:spacing w:line="276" w:lineRule="auto"/><w:jc w:val="center"/><w:rPr/></w:pPr><w:r><w:rPr><w:rtl w:val="0"/></w:rPr></w:r></w:p></w:tc></w:tr><w:tr><w:trPr><w:cantSplit w:val="0"/><w:tblHeader w:val="0"/></w:trPr><w:tc><w:tcPr><w:vMerge w:val="continue"/></w:tcPr><w:p><w:pPr><w:keepNext w:val="0"/><w:keepLines w:val="0"/><w:pageBreakBefore w:val="0"/><w:widowControl w:val="0"/><w:pBdr><w:top w:space="0" w:sz="0" w:val="nil"/><w:left w:space="0" w:sz="0" w:val="nil"/><w:bottom w:space="0" w:sz="0" w:val="nil"/><w:right w:space="0" w:sz="0" w:val="nil"/><w:between w:space="0" w:sz="0" w:val="nil"/></w:pBdr><w:shd w:fill="auto" w:val="clear"/><w:spacing w:after="0" w:before="0" w:line="276" w:lineRule="auto"/><w:ind w:left="0" w:right="0" w:firstLine="0"/><w:jc w:val="left"/><w:rPr/></w:pPr><w:r><w:rPr><w:rtl w:val="0"/></w:rPr></w:r></w:p></w:tc><w:tc><w:tcPr/><w:p><w:pPr><w:spacing w:line="276" w:lineRule="auto"/><w:rPr/></w:pPr><w:r><w:rPr><w:rtl w:val="0"/></w:rPr><w:t xml:space="preserve">North</w:t></w:r></w:p></w:tc><w:tc><w:tcPr/><w:p><w:pPr><w:spacing w:line="276" w:lineRule="auto"/><w:jc w:val="center"/><w:rPr/></w:pPr><w:r><w:rPr><w:rtl w:val="0"/></w:rPr></w:r></w:p></w:tc><w:tc><w:tcPr/><w:p><w:pPr><w:spacing w:line="276" w:lineRule="auto"/><w:jc w:val="center"/><w:rPr/></w:pPr><w:r><w:rPr><w:rtl w:val="0"/></w:rPr></w:r></w:p></w:tc></w:tr><w:tr><w:trPr><w:cantSplit w:val="0"/><w:tblHeader w:val="0"/></w:trPr><w:tc><w:tcPr><w:vMerge w:val="continue"/></w:tcPr><w:p><w:pPr><w:keepNext w:val="0"/><w:keepLines w:val="0"/><w:pageBreakBefore w:val="0"/><w:widowControl w:val="0"/><w:pBdr><w:top w:space="0" w:sz="0" w:val="nil"/><w:left w:space="0" w:sz="0" w:val="nil"/><w:bottom w:space="0" w:sz="0" w:val="nil"/><w:right w:space="0" w:sz="0" w:val="nil"/><w:between w:space="0" w:sz="0" w:val="nil"/></w:pBdr><w:shd w:fill="auto" w:val="clear"/><w:spacing w:after="0" w:before="0" w:line="276" w:lineRule="auto"/><w:ind w:left="0" w:right="0" w:firstLine="0"/><w:jc w:val="left"/><w:rPr/></w:pPr><w:r><w:rPr><w:rtl w:val="0"/></w:rPr></w:r></w:p></w:tc><w:tc><w:tcPr/><w:p><w:pPr><w:spacing w:line="276" w:lineRule="auto"/><w:rPr/></w:pPr><w:r><w:rPr><w:rtl w:val="0"/></w:rPr><w:t xml:space="preserve">South</w:t></w:r></w:p></w:tc><w:tc><w:tcPr/><w:p><w:pPr><w:spacing w:line="276" w:lineRule="auto"/><w:jc w:val="center"/><w:rPr/></w:pPr><w:r><w:rPr><w:rtl w:val="0"/></w:rPr></w:r></w:p></w:tc><w:tc><w:tcPr/><w:p><w:pPr><w:spacing w:line="276" w:lineRule="auto"/><w:jc w:val="center"/><w:rPr/></w:pPr><w:r><w:rPr><w:rtl w:val="0"/></w:rPr></w:r></w:p></w:tc></w:tr><w:tr><w:trPr><w:cantSplit w:val="0"/><w:tblHeader w:val="0"/></w:trPr><w:tc><w:tcPr><w:vMerge w:val="restart"/></w:tcPr><w:p><w:pPr><w:spacing w:line="276" w:lineRule="auto"/><w:rPr/></w:pPr><w:r><w:rPr><w:rtl w:val="0"/></w:rPr><w:t xml:space="preserve">14.</w:t></w:r></w:p></w:tc><w:tc><w:tcPr><w:vMerge w:val="restart"/></w:tcPr><w:p><w:pPr><w:spacing w:line="276" w:lineRule="auto"/><w:rPr/></w:pPr><w:r><w:rPr><w:rtl w:val="0"/></w:rPr><w:t xml:space="preserve">Dimensions of the site / Flat</w:t></w:r></w:p></w:tc><w:tc><w:tcPr/><w:p><w:pPr><w:spacing w:line="276" w:lineRule="auto"/><w:jc w:val="center"/><w:rPr><w:b w:val="1"/><w:bCs w:val="1"/></w:rPr></w:pPr><w:r><w:rPr><w:b w:val="1"/><w:bCs w:val="1"/><w:rtl w:val="0"/></w:rPr><w:t xml:space="preserve">A</w:t></w:r></w:p></w:tc><w:tc><w:tcPr/><w:p><w:pPr><w:spacing w:line="276" w:lineRule="auto"/><w:jc w:val="center"/><w:rPr><w:b w:val="1"/><w:bCs w:val="1"/></w:rPr></w:pPr><w:r><w:rPr><w:b w:val="1"/><w:bCs w:val="1"/><w:rtl w:val="0"/></w:rPr><w:t xml:space="preserve">B</w:t></w:r></w:p></w:tc></w:tr><w:tr><w:trPr><w:cantSplit w:val="0"/><w:tblHeader w:val="0"/></w:trPr><w:tc><w:tcPr><w:vMerge w:val="continue"/></w:tcPr><w:p><w:pPr><w:keepNext w:val="0"/><w:keepLines w:val="0"/><w:pageBreakBefore w:val="0"/><w:widowControl w:val="0"/><w:pBdr><w:top w:space="0" w:sz="0" w:val="nil"/><w:left w:space="0" w:sz="0" w:val="nil"/><w:bottom w:space="0" w:sz="0" w:val="nil"/><w:right w:space="0" w:sz="0" w:val="nil"/><w:between w:space="0" w:sz="0" w:val="nil"/></w:pBdr><w:shd w:fill="auto" w:val="clear"/><w:spacing w:after="0" w:before="0" w:line="276" w:lineRule="auto"/><w:ind w:left="0" w:right="0" w:firstLine="0"/><w:jc w:val="left"/><w:rPr><w:b w:val="1"/><w:bCs w:val="1"/></w:rPr></w:pPr><w:r><w:rPr><w:rtl w:val="0"/></w:rPr></w:r></w:p></w:tc><w:tc><w:tcPr><w:vMerge w:val="continue"/></w:tcPr><w:p><w:pPr><w:keepNext w:val="0"/><w:keepLines w:val="0"/><w:pageBreakBefore w:val="0"/><w:widowControl w:val="0"/><w:pBdr><w:top w:space="0" w:sz="0" w:val="nil"/><w:left w:space="0" w:sz="0" w:val="nil"/><w:bottom w:space="0" w:sz="0" w:val="nil"/><w:right w:space="0" w:sz="0" w:val="nil"/><w:between w:space="0" w:sz="0" w:val="nil"/></w:pBdr><w:shd w:fill="auto" w:val="clear"/><w:spacing w:after="0" w:before="0" w:line="276" w:lineRule="auto"/><w:ind w:left="0" w:right="0" w:firstLine="0"/><w:jc w:val="left"/><w:rPr><w:b w:val="1"/><w:bCs w:val="1"/></w:rPr></w:pPr><w:r><w:rPr><w:rtl w:val="0"/></w:rPr></w:r></w:p></w:tc><w:tc><w:tcPr/><w:p><w:pPr><w:jc w:val="center"/><w:rPr><w:b w:val="1"/><w:bCs w:val="1"/></w:rPr></w:pPr><w:r><w:rPr><w:b w:val="1"/><w:bCs w:val="1"/><w:rtl w:val="0"/></w:rPr><w:t xml:space="preserve">As per the Deed</w:t></w:r></w:p></w:tc><w:tc><w:tcPr/><w:p><w:pPr><w:jc w:val="center"/><w:rPr><w:b w:val="1"/><w:bCs w:val="1"/></w:rPr></w:pPr><w:r><w:rPr><w:b w:val="1"/><w:bCs w:val="1"/><w:rtl w:val="0"/></w:rPr><w:t xml:space="preserve">Actuals</w:t></w:r></w:p></w:tc></w:tr><w:tr><w:trPr><w:cantSplit w:val="0"/><w:trHeight w:val="606" w:hRule="atLeast"/><w:tblHeader w:val="0"/></w:trPr><w:tc><w:tcPr><w:vMerge w:val="continue"/></w:tcPr><w:p><w:pPr><w:keepNext w:val="0"/><w:keepLines w:val="0"/><w:pageBreakBefore w:val="0"/><w:widowControl w:val="0"/><w:pBdr><w:top w:space="0" w:sz="0" w:val="nil"/><w:left w:space="0" w:sz="0" w:val="nil"/><w:bottom w:space="0" w:sz="0" w:val="nil"/><w:right w:space="0" w:sz="0" w:val="nil"/><w:between w:space="0" w:sz="0" w:val="nil"/></w:pBdr><w:shd w:fill="auto" w:val="clear"/><w:spacing w:after="0" w:before="0" w:line="276" w:lineRule="auto"/><w:ind w:left="0" w:right="0" w:firstLine="0"/><w:jc w:val="left"/><w:rPr><w:b w:val="1"/><w:bCs w:val="1"/></w:rPr></w:pPr><w:r><w:rPr><w:rtl w:val="0"/></w:rPr></w:r></w:p></w:tc><w:tc><w:tcPr/><w:p><w:pPr><w:rPr/></w:pPr><w:r><w:rPr><w:rtl w:val="0"/></w:rPr></w:r></w:p></w:tc><w:tc><w:tcPr/><w:p><w:pPr><w:spacing w:line="276" w:lineRule="auto"/><w:jc w:val="both"/><w:rPr/></w:pPr><w:r><w:rPr><w:rtl w:val="0"/></w:rPr></w:r></w:p></w:tc><w:tc><w:tcPr/><w:p><w:pPr><w:jc w:val="both"/><w:rPr/></w:pPr><w:r><w:rPr><w:rtl w:val="0"/></w:rPr></w:r></w:p></w:tc></w:tr><w:tr><w:trPr><w:cantSplit w:val="0"/><w:tblHeader w:val="0"/></w:trPr><w:tc><w:tcPr/><w:p><w:pPr><w:rPr/></w:pPr><w:r><w:rPr><w:rtl w:val="0"/></w:rPr><w:t xml:space="preserve">15.</w:t></w:r></w:p></w:tc><w:tc><w:tcPr/><w:p><w:pPr><w:rPr/></w:pPr><w:r><w:rPr><w:rtl w:val="0"/></w:rPr><w:t xml:space="preserve">Extent of the site</w:t></w:r></w:p></w:tc><w:tc><w:tcPr><w:gridSpan w:val="2"/></w:tcPr><w:p><w:pPr><w:jc w:val="both"/><w:rPr/></w:pPr><w:r><w:rPr><w:rtl w:val="0"/></w:rPr></w:r></w:p></w:tc></w:tr><w:tr><w:trPr><w:cantSplit w:val="0"/><w:tblHeader w:val="0"/></w:trPr><w:tc><w:tcPr/><w:p><w:pPr><w:rPr/></w:pPr><w:r><w:rPr><w:rtl w:val="0"/></w:rPr><w:t xml:space="preserve">15.1</w:t></w:r></w:p></w:tc><w:tc><w:tcPr/><w:p><w:pPr><w:spacing w:line="276" w:lineRule="auto"/><w:rPr/></w:pPr><w:r><w:rPr><w:rtl w:val="0"/></w:rPr><w:t xml:space="preserve">Latitude, Longitude, &amp; Co-ordinates of Flat</w:t></w:r></w:p></w:tc><w:tc><w:tcPr><w:gridSpan w:val="2"/></w:tcPr><w:p><w:pPr><w:spacing w:line="276" w:lineRule="auto"/><w:rPr/></w:pPr><w:r><w:rPr><w:rtl w:val="0"/></w:rPr></w:r></w:p></w:tc></w:tr><w:tr><w:trPr><w:cantSplit w:val="0"/><w:tblHeader w:val="0"/></w:trPr><w:tc><w:tcPr/><w:p><w:pPr><w:rPr/></w:pPr><w:r><w:rPr><w:rtl w:val="0"/></w:rPr><w:t xml:space="preserve">16</w:t></w:r></w:p></w:tc><w:tc><w:tcPr/><w:p><w:pPr><w:spacing w:line="276" w:lineRule="auto"/><w:rPr/></w:pPr><w:r><w:rPr><w:rtl w:val="0"/></w:rPr><w:t xml:space="preserve">Extent of the site considered for valuation (least of 13A &amp; 13B)</w:t></w:r></w:p></w:tc><w:tc><w:tcPr><w:gridSpan w:val="2"/></w:tcPr><w:p><w:pPr><w:spacing w:line="276" w:lineRule="auto"/><w:jc w:val="both"/><w:rPr/></w:pPr><w:r><w:rPr><w:rtl w:val="0"/></w:rPr></w:r></w:p></w:tc></w:tr><w:tr><w:trPr><w:cantSplit w:val="0"/><w:tblHeader w:val="0"/></w:trPr><w:tc><w:tcPr/><w:p><w:pPr><w:rPr/></w:pPr><w:r><w:rPr><w:rtl w:val="0"/></w:rPr><w:t xml:space="preserve">17</w:t></w:r></w:p></w:tc><w:tc><w:tcPr/><w:p><w:pPr><w:spacing w:line="276" w:lineRule="auto"/><w:rPr/></w:pPr><w:r><w:rPr><w:rtl w:val="0"/></w:rPr><w:t xml:space="preserve">Whether occupied by the owner / tenant? If occupied by tenant, since how long?</w:t></w:r></w:p></w:tc><w:tc><w:tcPr><w:gridSpan w:val="2"/></w:tcPr><w:p><w:pPr><w:spacing w:line="276" w:lineRule="auto"/><w:rPr/></w:pPr><w:r><w:rPr><w:rtl w:val="0"/></w:rPr></w:r></w:p></w:tc></w:tr><w:tr><w:trPr><w:cantSplit w:val="0"/><w:tblHeader w:val="0"/></w:trPr><w:tc><w:tcPr/><w:p><w:pPr><w:rPr><w:b w:val="1"/><w:bCs w:val="1"/></w:rPr></w:pPr><w:r><w:rPr><w:b w:val="1"/><w:bCs w:val="1"/><w:rtl w:val="0"/></w:rPr><w:t xml:space="preserve">II.</w:t></w:r></w:p></w:tc><w:tc><w:tcPr/><w:p><w:pPr><w:spacing w:line="276" w:lineRule="auto"/><w:rPr><w:b w:val="1"/><w:bCs w:val="1"/></w:rPr></w:pPr><w:r><w:rPr><w:b w:val="1"/><w:bCs w:val="1"/><w:rtl w:val="0"/></w:rPr><w:t xml:space="preserve">FLAT</w:t></w:r></w:p></w:tc><w:tc><w:tcPr><w:gridSpan w:val="2"/></w:tcPr><w:p><w:pPr><w:spacing w:line="276" w:lineRule="auto"/><w:jc w:val="center"/><w:rPr/></w:pPr><w:r><w:rPr><w:rtl w:val="0"/></w:rPr></w:r></w:p></w:tc></w:tr><w:tr><w:trPr><w:cantSplit w:val="0"/><w:tblHeader w:val="0"/></w:trPr><w:tc><w:tcPr/><w:p><w:pPr><w:rPr/></w:pPr><w:r><w:rPr><w:rtl w:val="0"/></w:rPr><w:t xml:space="preserve">1.</w:t></w:r></w:p></w:tc><w:tc><w:tcPr/><w:p><w:pPr><w:spacing w:line="276" w:lineRule="auto"/><w:rPr/></w:pPr><w:r><w:rPr><w:rtl w:val="0"/></w:rPr><w:t xml:space="preserve">Name of the Apartment </w:t></w:r></w:p></w:tc><w:tc><w:tcPr><w:gridSpan w:val="2"/></w:tcPr><w:p><w:pPr><w:tabs><w:tab w:val="left" w:leader="none" w:pos="3788"/></w:tabs><w:spacing w:line="276" w:lineRule="auto"/><w:rPr/></w:pPr><w:r><w:rPr><w:rtl w:val="0"/></w:rPr></w:r></w:p><w:p><w:pPr><w:tabs><w:tab w:val="left" w:leader="none" w:pos="3788"/></w:tabs><w:spacing w:line="276" w:lineRule="auto"/><w:rPr/></w:pPr><w:r><w:rPr><w:rtl w:val="0"/></w:rPr></w:r></w:p></w:tc></w:tr><w:tr><w:trPr><w:cantSplit w:val="0"/><w:tblHeader w:val="0"/></w:trPr><w:tc><w:tcPr/><w:p><w:pPr><w:spacing w:line="276" w:lineRule="auto"/><w:rPr/></w:pPr><w:r><w:rPr><w:rtl w:val="0"/></w:rPr><w:t xml:space="preserve">2.</w:t></w:r></w:p></w:tc><w:tc><w:tcPr/><w:p><w:pPr><w:spacing w:line="276" w:lineRule="auto"/><w:rPr/></w:pPr><w:r><w:rPr><w:rtl w:val="0"/></w:rPr><w:t xml:space="preserve">Description of the locality</w:t></w:r></w:p><w:p><w:pPr><w:spacing w:line="276" w:lineRule="auto"/><w:rPr/></w:pPr><w:r><w:rPr><w:rtl w:val="0"/></w:rPr><w:t xml:space="preserve">Residential / Commercial / Mixed</w:t></w:r></w:p></w:tc><w:tc><w:tcPr><w:gridSpan w:val="2"/></w:tcPr><w:p><w:pPr><w:spacing w:line="276" w:lineRule="auto"/><w:rPr/></w:pPr><w:r><w:rPr><w:rtl w:val="0"/></w:rPr></w:r></w:p></w:tc></w:tr><w:tr><w:trPr><w:cantSplit w:val="0"/><w:tblHeader w:val="0"/></w:trPr><w:tc><w:tcPr/><w:p><w:pPr><w:spacing w:line="276" w:lineRule="auto"/><w:rPr/></w:pPr><w:r><w:rPr><w:rtl w:val="0"/></w:rPr><w:t xml:space="preserve">3.</w:t></w:r></w:p></w:tc><w:tc><w:tcPr/><w:p><w:pPr><w:spacing w:line="276" w:lineRule="auto"/><w:rPr/></w:pPr><w:r><w:rPr><w:rtl w:val="0"/></w:rPr><w:t xml:space="preserve">Year of Construction</w:t></w:r></w:p></w:tc><w:tc><w:tcPr><w:gridSpan w:val="2"/></w:tcPr><w:p><w:pPr><w:spacing w:line="276" w:lineRule="auto"/><w:rPr/></w:pPr><w:r><w:rPr><w:rtl w:val="0"/></w:rPr></w:r></w:p></w:tc></w:tr><w:tr><w:trPr><w:cantSplit w:val="0"/><w:tblHeader w:val="0"/></w:trPr><w:tc><w:tcPr/><w:p><w:pPr><w:spacing w:line="276" w:lineRule="auto"/><w:rPr/></w:pPr><w:r><w:rPr><w:rtl w:val="0"/></w:rPr><w:t xml:space="preserve">4.</w:t></w:r></w:p></w:tc><w:tc><w:tcPr/><w:p><w:pPr><w:spacing w:line="276" w:lineRule="auto"/><w:rPr/></w:pPr><w:r><w:rPr><w:rtl w:val="0"/></w:rPr><w:t xml:space="preserve">Number of Floors</w:t></w:r></w:p></w:tc><w:tc><w:tcPr><w:gridSpan w:val="2"/></w:tcPr><w:p><w:pPr><w:spacing w:line="276" w:lineRule="auto"/><w:rPr/></w:pPr><w:r><w:rPr><w:rtl w:val="0"/></w:rPr></w:r></w:p></w:tc></w:tr><w:tr><w:trPr><w:cantSplit w:val="0"/><w:tblHeader w:val="0"/></w:trPr><w:tc><w:tcPr/><w:p><w:pPr><w:spacing w:line="276" w:lineRule="auto"/><w:rPr/></w:pPr><w:r><w:rPr><w:rtl w:val="0"/></w:rPr><w:t xml:space="preserve">5.</w:t></w:r></w:p></w:tc><w:tc><w:tcPr/><w:p><w:pPr><w:spacing w:line="276" w:lineRule="auto"/><w:rPr/></w:pPr><w:r><w:rPr><w:rtl w:val="0"/></w:rPr><w:t xml:space="preserve">Type of Structure</w:t></w:r></w:p></w:tc><w:tc><w:tcPr><w:gridSpan w:val="2"/></w:tcPr><w:p><w:pPr><w:spacing w:line="276" w:lineRule="auto"/><w:rPr/></w:pPr><w:r><w:rPr><w:rtl w:val="0"/></w:rPr></w:r></w:p></w:tc></w:tr><w:tr><w:trPr><w:cantSplit w:val="0"/><w:tblHeader w:val="0"/></w:trPr><w:tc><w:tcPr/><w:p><w:pPr><w:spacing w:line="276" w:lineRule="auto"/><w:rPr/></w:pPr><w:r><w:rPr><w:rtl w:val="0"/></w:rPr><w:t xml:space="preserve">6.</w:t></w:r></w:p></w:tc><w:tc><w:tcPr/><w:p><w:pPr><w:spacing w:line="276" w:lineRule="auto"/><w:rPr/></w:pPr><w:r><w:rPr><w:rtl w:val="0"/></w:rPr><w:t xml:space="preserve">Number of Dwelling flats</w:t></w:r></w:p></w:tc><w:tc><w:tcPr><w:gridSpan w:val="2"/></w:tcPr><w:p><w:pPr><w:spacing w:line="276" w:lineRule="auto"/><w:rPr/></w:pPr><w:r><w:rPr><w:rtl w:val="0"/></w:rPr></w:r></w:p></w:tc></w:tr><w:tr><w:trPr><w:cantSplit w:val="0"/><w:tblHeader w:val="0"/></w:trPr><w:tc><w:tcPr/><w:p><w:pPr><w:spacing w:line="276" w:lineRule="auto"/><w:rPr/></w:pPr><w:r><w:rPr><w:rtl w:val="0"/></w:rPr><w:t xml:space="preserve">7.</w:t></w:r></w:p></w:tc><w:tc><w:tcPr/><w:p><w:pPr><w:spacing w:line="276" w:lineRule="auto"/><w:rPr/></w:pPr><w:r><w:rPr><w:rtl w:val="0"/></w:rPr><w:t xml:space="preserve">Quality of Construction</w:t></w:r></w:p></w:tc><w:tc><w:tcPr><w:gridSpan w:val="2"/></w:tcPr><w:p><w:pPr><w:spacing w:line="276" w:lineRule="auto"/><w:rPr/></w:pPr><w:r><w:rPr><w:rtl w:val="0"/></w:rPr></w:r></w:p></w:tc></w:tr><w:tr><w:trPr><w:cantSplit w:val="0"/><w:tblHeader w:val="0"/></w:trPr><w:tc><w:tcPr/><w:p><w:pPr><w:spacing w:line="276" w:lineRule="auto"/><w:rPr/></w:pPr><w:r><w:rPr><w:rtl w:val="0"/></w:rPr><w:t xml:space="preserve">8.</w:t></w:r></w:p></w:tc><w:tc><w:tcPr/><w:p><w:pPr><w:spacing w:line="276" w:lineRule="auto"/><w:rPr/></w:pPr><w:r><w:rPr><w:rtl w:val="0"/></w:rPr><w:t xml:space="preserve">Appearance of the Flat</w:t></w:r></w:p></w:tc><w:tc><w:tcPr><w:gridSpan w:val="2"/></w:tcPr><w:p><w:pPr><w:spacing w:line="276" w:lineRule="auto"/><w:rPr/></w:pPr><w:r><w:rPr><w:rtl w:val="0"/></w:rPr></w:r></w:p></w:tc></w:tr><w:tr><w:trPr><w:cantSplit w:val="0"/><w:tblHeader w:val="0"/></w:trPr><w:tc><w:tcPr/><w:p><w:pPr><w:spacing w:line="276" w:lineRule="auto"/><w:rPr/></w:pPr><w:r><w:rPr><w:rtl w:val="0"/></w:rPr><w:t xml:space="preserve">9.</w:t></w:r></w:p></w:tc><w:tc><w:tcPr/><w:p><w:pPr><w:spacing w:line="276" w:lineRule="auto"/><w:rPr/></w:pPr><w:r><w:rPr><w:rtl w:val="0"/></w:rPr><w:t xml:space="preserve">Maintenance of the Flat</w:t></w:r></w:p></w:tc><w:tc><w:tcPr><w:gridSpan w:val="2"/></w:tcPr><w:p><w:pPr><w:spacing w:line="276" w:lineRule="auto"/><w:rPr/></w:pPr><w:r><w:rPr><w:rtl w:val="0"/></w:rPr></w:r></w:p></w:tc></w:tr><w:tr><w:trPr><w:cantSplit w:val="0"/><w:tblHeader w:val="0"/></w:trPr><w:tc><w:tcPr/><w:p><w:pPr><w:spacing w:line="276" w:lineRule="auto"/><w:rPr/></w:pPr><w:r><w:rPr><w:rtl w:val="0"/></w:rPr><w:t xml:space="preserve">10.</w:t></w:r></w:p></w:tc><w:tc><w:tcPr/><w:p><w:pPr><w:spacing w:line="276" w:lineRule="auto"/><w:rPr/></w:pPr><w:r><w:rPr><w:rtl w:val="0"/></w:rPr><w:t xml:space="preserve">Facilities Available</w:t></w:r></w:p></w:tc><w:tc><w:tcPr><w:gridSpan w:val="2"/></w:tcPr><w:p><w:pPr><w:spacing w:line="276" w:lineRule="auto"/><w:rPr/></w:pPr><w:r><w:rPr><w:rtl w:val="0"/></w:rPr></w:r></w:p></w:tc></w:tr><w:tr><w:trPr><w:cantSplit w:val="0"/><w:tblHeader w:val="0"/></w:trPr><w:tc><w:tcPr><w:vMerge w:val="restart"/></w:tcPr><w:p><w:pPr><w:spacing w:line="276" w:lineRule="auto"/><w:rPr/></w:pPr><w:r><w:rPr><w:rtl w:val="0"/></w:rPr></w:r></w:p></w:tc><w:tc><w:tcPr/><w:p><w:pPr><w:spacing w:line="276" w:lineRule="auto"/><w:rPr/></w:pPr><w:r><w:rPr><w:rtl w:val="0"/></w:rPr><w:t xml:space="preserve">Lift</w:t></w:r></w:p></w:tc><w:tc><w:tcPr><w:gridSpan w:val="2"/></w:tcPr><w:p><w:pPr><w:spacing w:line="276" w:lineRule="auto"/><w:rPr/></w:pPr><w:r><w:rPr><w:rtl w:val="0"/></w:rPr></w:r></w:p></w:tc></w:tr><w:tr><w:trPr><w:cantSplit w:val="0"/><w:tblHeader w:val="0"/></w:trPr><w:tc><w:tcPr><w:vMerge w:val="continue"/></w:tcPr><w:p><w:pPr><w:keepNext w:val="0"/><w:keepLines w:val="0"/><w:pageBreakBefore w:val="0"/><w:widowControl w:val="0"/><w:pBdr><w:top w:space="0" w:sz="0" w:val="nil"/><w:left w:space="0" w:sz="0" w:val="nil"/><w:bottom w:space="0" w:sz="0" w:val="nil"/><w:right w:space="0" w:sz="0" w:val="nil"/><w:between w:space="0" w:sz="0" w:val="nil"/></w:pBdr><w:shd w:fill="auto" w:val="clear"/><w:spacing w:after="0" w:before="0" w:line="276" w:lineRule="auto"/><w:ind w:left="0" w:right="0" w:firstLine="0"/><w:jc w:val="left"/><w:rPr/></w:pPr><w:r><w:rPr><w:rtl w:val="0"/></w:rPr></w:r></w:p></w:tc><w:tc><w:tcPr/><w:p><w:pPr><w:spacing w:line="276" w:lineRule="auto"/><w:rPr/></w:pPr><w:r><w:rPr><w:rtl w:val="0"/></w:rPr><w:t xml:space="preserve">Protected Water Supply</w:t></w:r></w:p></w:tc><w:tc><w:tcPr><w:gridSpan w:val="2"/></w:tcPr><w:p><w:pPr><w:spacing w:line="276" w:lineRule="auto"/><w:rPr/></w:pPr><w:r><w:rPr><w:rtl w:val="0"/></w:rPr></w:r></w:p></w:tc></w:tr><w:tr><w:trPr><w:cantSplit w:val="0"/><w:tblHeader w:val="0"/></w:trPr><w:tc><w:tcPr><w:vMerge w:val="continue"/></w:tcPr><w:p><w:pPr><w:keepNext w:val="0"/><w:keepLines w:val="0"/><w:pageBreakBefore w:val="0"/><w:widowControl w:val="0"/><w:pBdr><w:top w:space="0" w:sz="0" w:val="nil"/><w:left w:space="0" w:sz="0" w:val="nil"/><w:bottom w:space="0" w:sz="0" w:val="nil"/><w:right w:space="0" w:sz="0" w:val="nil"/><w:between w:space="0" w:sz="0" w:val="nil"/></w:pBdr><w:shd w:fill="auto" w:val="clear"/><w:spacing w:after="0" w:before="0" w:line="276" w:lineRule="auto"/><w:ind w:left="0" w:right="0" w:firstLine="0"/><w:jc w:val="left"/><w:rPr/></w:pPr><w:r><w:rPr><w:rtl w:val="0"/></w:rPr></w:r></w:p></w:tc><w:tc><w:tcPr/><w:p><w:pPr><w:spacing w:line="276" w:lineRule="auto"/><w:rPr/></w:pPr><w:r><w:rPr><w:rtl w:val="0"/></w:rPr><w:t xml:space="preserve">Underground Sewerage</w:t></w:r></w:p></w:tc><w:tc><w:tcPr><w:gridSpan w:val="2"/></w:tcPr><w:p><w:pPr><w:spacing w:line="276" w:lineRule="auto"/><w:rPr/></w:pPr><w:r><w:rPr><w:rtl w:val="0"/></w:rPr></w:r></w:p></w:tc></w:tr><w:tr><w:trPr><w:cantSplit w:val="0"/><w:tblHeader w:val="0"/></w:trPr><w:tc><w:tcPr><w:vMerge w:val="continue"/></w:tcPr><w:p><w:pPr><w:keepNext w:val="0"/><w:keepLines w:val="0"/><w:pageBreakBefore w:val="0"/><w:widowControl w:val="0"/><w:pBdr><w:top w:space="0" w:sz="0" w:val="nil"/><w:left w:space="0" w:sz="0" w:val="nil"/><w:bottom w:space="0" w:sz="0" w:val="nil"/><w:right w:space="0" w:sz="0" w:val="nil"/><w:between w:space="0" w:sz="0" w:val="nil"/></w:pBdr><w:shd w:fill="auto" w:val="clear"/><w:spacing w:after="0" w:before="0" w:line="276" w:lineRule="auto"/><w:ind w:left="0" w:right="0" w:firstLine="0"/><w:jc w:val="left"/><w:rPr/></w:pPr><w:r><w:rPr><w:rtl w:val="0"/></w:rPr></w:r></w:p></w:tc><w:tc><w:tcPr/><w:p><w:pPr><w:spacing w:line="276" w:lineRule="auto"/><w:rPr/></w:pPr><w:r><w:rPr><w:rtl w:val="0"/></w:rPr><w:t xml:space="preserve">Car Parking – Open / Covered</w:t></w:r></w:p></w:tc><w:tc><w:tcPr><w:gridSpan w:val="2"/></w:tcPr><w:p><w:pPr><w:spacing w:line="276" w:lineRule="auto"/><w:rPr/></w:pPr><w:r><w:rPr><w:rtl w:val="0"/></w:rPr></w:r></w:p></w:tc></w:tr><w:tr><w:trPr><w:cantSplit w:val="0"/><w:tblHeader w:val="0"/></w:trPr><w:tc><w:tcPr><w:vMerge w:val="continue"/></w:tcPr><w:p><w:pPr><w:keepNext w:val="0"/><w:keepLines w:val="0"/><w:pageBreakBefore w:val="0"/><w:widowControl w:val="0"/><w:pBdr><w:top w:space="0" w:sz="0" w:val="nil"/><w:left w:space="0" w:sz="0" w:val="nil"/><w:bottom w:space="0" w:sz="0" w:val="nil"/><w:right w:space="0" w:sz="0" w:val="nil"/><w:between w:space="0" w:sz="0" w:val="nil"/></w:pBdr><w:shd w:fill="auto" w:val="clear"/><w:spacing w:after="0" w:before="0" w:line="276" w:lineRule="auto"/><w:ind w:left="0" w:right="0" w:firstLine="0"/><w:jc w:val="left"/><w:rPr/></w:pPr><w:r><w:rPr><w:rtl w:val="0"/></w:rPr></w:r></w:p></w:tc><w:tc><w:tcPr/><w:p><w:pPr><w:spacing w:line="276" w:lineRule="auto"/><w:rPr/></w:pPr><w:r><w:rPr><w:rtl w:val="0"/></w:rPr><w:t xml:space="preserve">Does Compound wall exist?</w:t></w:r></w:p></w:tc><w:tc><w:tcPr><w:gridSpan w:val="2"/></w:tcPr><w:p><w:pPr><w:spacing w:line="276" w:lineRule="auto"/><w:rPr/></w:pPr><w:r><w:rPr><w:rtl w:val="0"/></w:rPr></w:r></w:p></w:tc></w:tr><w:tr><w:trPr><w:cantSplit w:val="0"/><w:tblHeader w:val="0"/></w:trPr><w:tc><w:tcPr><w:vMerge w:val="continue"/></w:tcPr><w:p><w:pPr><w:keepNext w:val="0"/><w:keepLines w:val="0"/><w:pageBreakBefore w:val="0"/><w:widowControl w:val="0"/><w:pBdr><w:top w:space="0" w:sz="0" w:val="nil"/><w:left w:space="0" w:sz="0" w:val="nil"/><w:bottom w:space="0" w:sz="0" w:val="nil"/><w:right w:space="0" w:sz="0" w:val="nil"/><w:between w:space="0" w:sz="0" w:val="nil"/></w:pBdr><w:shd w:fill="auto" w:val="clear"/><w:spacing w:after="0" w:before="0" w:line="276" w:lineRule="auto"/><w:ind w:left="0" w:right="0" w:firstLine="0"/><w:jc w:val="left"/><w:rPr/></w:pPr><w:r><w:rPr><w:rtl w:val="0"/></w:rPr></w:r></w:p></w:tc><w:tc><w:tcPr/><w:p><w:pPr><w:spacing w:line="276" w:lineRule="auto"/><w:rPr/></w:pPr><w:r><w:rPr><w:rtl w:val="0"/></w:rPr><w:t xml:space="preserve">Is pavement laid around the Flat?</w:t></w:r></w:p></w:tc><w:tc><w:tcPr><w:gridSpan w:val="2"/></w:tcPr><w:p><w:pPr><w:spacing w:line="276" w:lineRule="auto"/><w:rPr/></w:pPr><w:r><w:rPr><w:rtl w:val="0"/></w:rPr></w:r></w:p></w:tc></w:tr><w:tr><w:trPr><w:cantSplit w:val="0"/><w:tblHeader w:val="0"/></w:trPr><w:tc><w:tcPr/><w:p><w:pPr><w:spacing w:line="276" w:lineRule="auto"/><w:rPr><w:b w:val="1"/><w:bCs w:val="1"/></w:rPr></w:pPr><w:r><w:rPr><w:b w:val="1"/><w:bCs w:val="1"/><w:rtl w:val="0"/></w:rPr><w:t xml:space="preserve">III</w:t></w:r></w:p></w:tc><w:tc><w:tcPr/><w:p><w:pPr><w:spacing w:line="276" w:lineRule="auto"/><w:rPr><w:b w:val="1"/><w:bCs w:val="1"/></w:rPr></w:pPr><w:r><w:rPr><w:b w:val="1"/><w:bCs w:val="1"/><w:rtl w:val="0"/></w:rPr><w:t xml:space="preserve">FLAT</w:t></w:r></w:p></w:tc><w:tc><w:tcPr><w:gridSpan w:val="2"/></w:tcPr><w:p><w:pPr><w:spacing w:line="276" w:lineRule="auto"/><w:jc w:val="center"/><w:rPr/></w:pPr><w:r><w:rPr><w:rtl w:val="0"/></w:rPr></w:r></w:p></w:tc></w:tr><w:tr><w:trPr><w:cantSplit w:val="0"/><w:tblHeader w:val="0"/></w:trPr><w:tc><w:tcPr/><w:p><w:pPr><w:spacing w:line="276" w:lineRule="auto"/><w:rPr/></w:pPr><w:r><w:rPr><w:rtl w:val="0"/></w:rPr><w:t xml:space="preserve">1</w:t></w:r></w:p></w:tc><w:tc><w:tcPr/><w:p><w:pPr><w:spacing w:line="276" w:lineRule="auto"/><w:rPr/></w:pPr><w:r><w:rPr><w:rtl w:val="0"/></w:rPr><w:t xml:space="preserve">The floor on which the Flat is situated</w:t></w:r></w:p></w:tc><w:tc><w:tcPr><w:gridSpan w:val="2"/></w:tcPr><w:p><w:pPr><w:spacing w:line="276" w:lineRule="auto"/><w:rPr/></w:pPr><w:r><w:rPr><w:rtl w:val="0"/></w:rPr></w:r></w:p></w:tc></w:tr><w:tr><w:trPr><w:cantSplit w:val="0"/><w:tblHeader w:val="0"/></w:trPr><w:tc><w:tcPr/><w:p><w:pPr><w:spacing w:line="276" w:lineRule="auto"/><w:rPr/></w:pPr><w:r><w:rPr><w:rtl w:val="0"/></w:rPr><w:t xml:space="preserve">2</w:t></w:r></w:p></w:tc><w:tc><w:tcPr/><w:p><w:pPr><w:spacing w:line="276" w:lineRule="auto"/><w:rPr/></w:pPr><w:r><w:rPr><w:rtl w:val="0"/></w:rPr><w:t xml:space="preserve">Door No. of the Flat</w:t></w:r></w:p></w:tc><w:tc><w:tcPr><w:gridSpan w:val="2"/></w:tcPr><w:p><w:pPr><w:spacing w:line="276" w:lineRule="auto"/><w:rPr/></w:pPr><w:r><w:rPr><w:rtl w:val="0"/></w:rPr></w:r></w:p></w:tc></w:tr><w:tr><w:trPr><w:cantSplit w:val="0"/><w:tblHeader w:val="0"/></w:trPr><w:tc><w:tcPr><w:vMerge w:val="restart"/></w:tcPr><w:p><w:pPr><w:spacing w:line="276" w:lineRule="auto"/><w:rPr/></w:pPr><w:r><w:rPr><w:rtl w:val="0"/></w:rPr><w:t xml:space="preserve">3</w:t></w:r></w:p></w:tc><w:tc><w:tcPr/><w:p><w:pPr><w:spacing w:line="276" w:lineRule="auto"/><w:rPr/></w:pPr><w:r><w:rPr><w:rtl w:val="0"/></w:rPr><w:t xml:space="preserve">Specification of the Flat</w:t></w:r></w:p></w:tc><w:tc><w:tcPr><w:gridSpan w:val="2"/></w:tcPr><w:p><w:pPr><w:spacing w:line="276" w:lineRule="auto"/><w:rPr/></w:pPr><w:r><w:rPr><w:rtl w:val="0"/></w:rPr></w:r></w:p></w:tc></w:tr><w:tr><w:trPr><w:cantSplit w:val="0"/><w:tblHeader w:val="0"/></w:trPr><w:tc><w:tcPr><w:vMerge w:val="continue"/></w:tcPr><w:p><w:pPr><w:keepNext w:val="0"/><w:keepLines w:val="0"/><w:pageBreakBefore w:val="0"/><w:widowControl w:val="0"/><w:pBdr><w:top w:space="0" w:sz="0" w:val="nil"/><w:left w:space="0" w:sz="0" w:val="nil"/><w:bottom w:space="0" w:sz="0" w:val="nil"/><w:right w:space="0" w:sz="0" w:val="nil"/><w:between w:space="0" w:sz="0" w:val="nil"/></w:pBdr><w:shd w:fill="auto" w:val="clear"/><w:spacing w:after="0" w:before="0" w:line="276" w:lineRule="auto"/><w:ind w:left="0" w:right="0" w:firstLine="0"/><w:jc w:val="left"/><w:rPr/></w:pPr><w:r><w:rPr><w:rtl w:val="0"/></w:rPr></w:r></w:p></w:tc><w:tc><w:tcPr/><w:p><w:pPr><w:spacing w:line="276" w:lineRule="auto"/><w:rPr/></w:pPr><w:r><w:rPr><w:rtl w:val="0"/></w:rPr><w:t xml:space="preserve">Roof</w:t></w:r></w:p></w:tc><w:tc><w:tcPr><w:gridSpan w:val="2"/></w:tcPr><w:p><w:pPr><w:spacing w:line="276" w:lineRule="auto"/><w:rPr/></w:pPr><w:r><w:rPr><w:rtl w:val="0"/></w:rPr></w:r></w:p></w:tc></w:tr><w:tr><w:trPr><w:cantSplit w:val="0"/><w:tblHeader w:val="0"/></w:trPr><w:tc><w:tcPr><w:vMerge w:val="continue"/></w:tcPr><w:p><w:pPr><w:keepNext w:val="0"/><w:keepLines w:val="0"/><w:pageBreakBefore w:val="0"/><w:widowControl w:val="0"/><w:pBdr><w:top w:space="0" w:sz="0" w:val="nil"/><w:left w:space="0" w:sz="0" w:val="nil"/><w:bottom w:space="0" w:sz="0" w:val="nil"/><w:right w:space="0" w:sz="0" w:val="nil"/><w:between w:space="0" w:sz="0" w:val="nil"/></w:pBdr><w:shd w:fill="auto" w:val="clear"/><w:spacing w:after="0" w:before="0" w:line="276" w:lineRule="auto"/><w:ind w:left="0" w:right="0" w:firstLine="0"/><w:jc w:val="left"/><w:rPr/></w:pPr><w:r><w:rPr><w:rtl w:val="0"/></w:rPr></w:r></w:p></w:tc><w:tc><w:tcPr/><w:p><w:pPr><w:spacing w:line="276" w:lineRule="auto"/><w:rPr/></w:pPr><w:r><w:rPr><w:rtl w:val="0"/></w:rPr><w:t xml:space="preserve">Flooring</w:t></w:r></w:p></w:tc><w:tc><w:tcPr><w:gridSpan w:val="2"/></w:tcPr><w:p><w:pPr><w:spacing w:line="276" w:lineRule="auto"/><w:rPr/></w:pPr><w:r><w:rPr><w:rtl w:val="0"/></w:rPr></w:r></w:p></w:tc></w:tr><w:tr><w:trPr><w:cantSplit w:val="0"/><w:tblHeader w:val="0"/></w:trPr><w:tc><w:tcPr><w:vMerge w:val="continue"/></w:tcPr><w:p><w:pPr><w:keepNext w:val="0"/><w:keepLines w:val="0"/><w:pageBreakBefore w:val="0"/><w:widowControl w:val="0"/><w:pBdr><w:top w:space="0" w:sz="0" w:val="nil"/><w:left w:space="0" w:sz="0" w:val="nil"/><w:bottom w:space="0" w:sz="0" w:val="nil"/><w:right w:space="0" w:sz="0" w:val="nil"/><w:between w:space="0" w:sz="0" w:val="nil"/></w:pBdr><w:shd w:fill="auto" w:val="clear"/><w:spacing w:after="0" w:before="0" w:line="276" w:lineRule="auto"/><w:ind w:left="0" w:right="0" w:firstLine="0"/><w:jc w:val="left"/><w:rPr/></w:pPr><w:r><w:rPr><w:rtl w:val="0"/></w:rPr></w:r></w:p></w:tc><w:tc><w:tcPr/><w:p><w:pPr><w:spacing w:line="276" w:lineRule="auto"/><w:rPr/></w:pPr><w:r><w:rPr><w:rtl w:val="0"/></w:rPr><w:t xml:space="preserve">Doors</w:t></w:r></w:p></w:tc><w:tc><w:tcPr><w:gridSpan w:val="2"/></w:tcPr><w:p><w:pPr><w:spacing w:line="276" w:lineRule="auto"/><w:rPr/></w:pPr><w:r><w:rPr><w:rtl w:val="0"/></w:rPr></w:r></w:p></w:tc></w:tr><w:tr><w:trPr><w:cantSplit w:val="0"/><w:tblHeader w:val="0"/></w:trPr><w:tc><w:tcPr><w:vMerge w:val="continue"/></w:tcPr><w:p><w:pPr><w:keepNext w:val="0"/><w:keepLines w:val="0"/><w:pageBreakBefore w:val="0"/><w:widowControl w:val="0"/><w:pBdr><w:top w:space="0" w:sz="0" w:val="nil"/><w:left w:space="0" w:sz="0" w:val="nil"/><w:bottom w:space="0" w:sz="0" w:val="nil"/><w:right w:space="0" w:sz="0" w:val="nil"/><w:between w:space="0" w:sz="0" w:val="nil"/></w:pBdr><w:shd w:fill="auto" w:val="clear"/><w:spacing w:after="0" w:before="0" w:line="276" w:lineRule="auto"/><w:ind w:left="0" w:right="0" w:firstLine="0"/><w:jc w:val="left"/><w:rPr/></w:pPr><w:r><w:rPr><w:rtl w:val="0"/></w:rPr></w:r></w:p></w:tc><w:tc><w:tcPr/><w:p><w:pPr><w:spacing w:line="276" w:lineRule="auto"/><w:rPr/></w:pPr><w:r><w:rPr><w:rtl w:val="0"/></w:rPr><w:t xml:space="preserve">Windows</w:t></w:r></w:p></w:tc><w:tc><w:tcPr><w:gridSpan w:val="2"/></w:tcPr><w:p><w:pPr><w:spacing w:line="276" w:lineRule="auto"/><w:rPr/></w:pPr><w:r><w:rPr><w:rtl w:val="0"/></w:rPr></w:r></w:p></w:tc></w:tr><w:tr><w:trPr><w:cantSplit w:val="0"/><w:tblHeader w:val="0"/></w:trPr><w:tc><w:tcPr><w:vMerge w:val="continue"/></w:tcPr><w:p><w:pPr><w:keepNext w:val="0"/><w:keepLines w:val="0"/><w:pageBreakBefore w:val="0"/><w:widowControl w:val="0"/><w:pBdr><w:top w:space="0" w:sz="0" w:val="nil"/><w:left w:space="0" w:sz="0" w:val="nil"/><w:bottom w:space="0" w:sz="0" w:val="nil"/><w:right w:space="0" w:sz="0" w:val="nil"/><w:between w:space="0" w:sz="0" w:val="nil"/></w:pBdr><w:shd w:fill="auto" w:val="clear"/><w:spacing w:after="0" w:before="0" w:line="276" w:lineRule="auto"/><w:ind w:left="0" w:right="0" w:firstLine="0"/><w:jc w:val="left"/><w:rPr/></w:pPr><w:r><w:rPr><w:rtl w:val="0"/></w:rPr></w:r></w:p></w:tc><w:tc><w:tcPr/><w:p><w:pPr><w:spacing w:line="276" w:lineRule="auto"/><w:rPr/></w:pPr><w:r><w:rPr><w:rtl w:val="0"/></w:rPr><w:t xml:space="preserve">Fittings</w:t></w:r></w:p></w:tc><w:tc><w:tcPr><w:gridSpan w:val="2"/></w:tcPr><w:p><w:pPr><w:spacing w:line="276" w:lineRule="auto"/><w:rPr/></w:pPr><w:r><w:rPr><w:rtl w:val="0"/></w:rPr></w:r></w:p></w:tc></w:tr><w:tr><w:trPr><w:cantSplit w:val="0"/><w:tblHeader w:val="0"/></w:trPr><w:tc><w:tcPr><w:vMerge w:val="continue"/></w:tcPr><w:p><w:pPr><w:keepNext w:val="0"/><w:keepLines w:val="0"/><w:pageBreakBefore w:val="0"/><w:widowControl w:val="0"/><w:pBdr><w:top w:space="0" w:sz="0" w:val="nil"/><w:left w:space="0" w:sz="0" w:val="nil"/><w:bottom w:space="0" w:sz="0" w:val="nil"/><w:right w:space="0" w:sz="0" w:val="nil"/><w:between w:space="0" w:sz="0" w:val="nil"/></w:pBdr><w:shd w:fill="auto" w:val="clear"/><w:spacing w:after="0" w:before="0" w:line="276" w:lineRule="auto"/><w:ind w:left="0" w:right="0" w:firstLine="0"/><w:jc w:val="left"/><w:rPr/></w:pPr><w:r><w:rPr><w:rtl w:val="0"/></w:rPr></w:r></w:p></w:tc><w:tc><w:tcPr/><w:p><w:pPr><w:spacing w:line="276" w:lineRule="auto"/><w:rPr/></w:pPr><w:r><w:rPr><w:rtl w:val="0"/></w:rPr><w:t xml:space="preserve">Finishing</w:t></w:r></w:p></w:tc><w:tc><w:tcPr><w:gridSpan w:val="2"/></w:tcPr><w:p><w:pPr><w:spacing w:line="276" w:lineRule="auto"/><w:rPr/></w:pPr><w:r><w:rPr><w:rtl w:val="0"/></w:rPr></w:r></w:p></w:tc></w:tr><w:tr><w:trPr><w:cantSplit w:val="0"/><w:tblHeader w:val="0"/></w:trPr><w:tc><w:tcPr><w:vMerge w:val="restart"/></w:tcPr><w:p><w:pPr><w:spacing w:line="276" w:lineRule="auto"/><w:rPr/></w:pPr><w:r><w:rPr><w:rtl w:val="0"/></w:rPr><w:t xml:space="preserve">4</w:t></w:r></w:p></w:tc><w:tc><w:tcPr/><w:p><w:pPr><w:spacing w:line="276" w:lineRule="auto"/><w:rPr/></w:pPr><w:r><w:rPr><w:rtl w:val="0"/></w:rPr><w:t xml:space="preserve">House Tax</w:t></w:r></w:p></w:tc><w:tc><w:tcPr><w:gridSpan w:val="2"/></w:tcPr><w:p><w:pPr><w:spacing w:line="276" w:lineRule="auto"/><w:rPr/></w:pPr><w:r><w:rPr><w:rtl w:val="0"/></w:rPr></w:r></w:p></w:tc></w:tr><w:tr><w:trPr><w:cantSplit w:val="0"/><w:tblHeader w:val="0"/></w:trPr><w:tc><w:tcPr><w:vMerge w:val="continue"/></w:tcPr><w:p><w:pPr><w:keepNext w:val="0"/><w:keepLines w:val="0"/><w:pageBreakBefore w:val="0"/><w:widowControl w:val="0"/><w:pBdr><w:top w:space="0" w:sz="0" w:val="nil"/><w:left w:space="0" w:sz="0" w:val="nil"/><w:bottom w:space="0" w:sz="0" w:val="nil"/><w:right w:space="0" w:sz="0" w:val="nil"/><w:between w:space="0" w:sz="0" w:val="nil"/></w:pBdr><w:shd w:fill="auto" w:val="clear"/><w:spacing w:after="0" w:before="0" w:line="276" w:lineRule="auto"/><w:ind w:left="0" w:right="0" w:firstLine="0"/><w:jc w:val="left"/><w:rPr/></w:pPr><w:r><w:rPr><w:rtl w:val="0"/></w:rPr></w:r></w:p></w:tc><w:tc><w:tcPr/><w:p><w:pPr><w:spacing w:line="276" w:lineRule="auto"/><w:rPr/></w:pPr><w:r><w:rPr><w:rtl w:val="0"/></w:rPr><w:t xml:space="preserve">Assessment No.</w:t></w:r></w:p></w:tc><w:tc><w:tcPr><w:gridSpan w:val="2"/></w:tcPr><w:p><w:pPr><w:spacing w:line="276" w:lineRule="auto"/><w:rPr/></w:pPr><w:r><w:rPr><w:rtl w:val="0"/></w:rPr></w:r></w:p></w:tc></w:tr><w:tr><w:trPr><w:cantSplit w:val="0"/><w:tblHeader w:val="0"/></w:trPr><w:tc><w:tcPr><w:vMerge w:val="continue"/></w:tcPr><w:p><w:pPr><w:keepNext w:val="0"/><w:keepLines w:val="0"/><w:pageBreakBefore w:val="0"/><w:widowControl w:val="0"/><w:pBdr><w:top w:space="0" w:sz="0" w:val="nil"/><w:left w:space="0" w:sz="0" w:val="nil"/><w:bottom w:space="0" w:sz="0" w:val="nil"/><w:right w:space="0" w:sz="0" w:val="nil"/><w:between w:space="0" w:sz="0" w:val="nil"/></w:pBdr><w:shd w:fill="auto" w:val="clear"/><w:spacing w:after="0" w:before="0" w:line="276" w:lineRule="auto"/><w:ind w:left="0" w:right="0" w:firstLine="0"/><w:jc w:val="left"/><w:rPr/></w:pPr><w:r><w:rPr><w:rtl w:val="0"/></w:rPr></w:r></w:p></w:tc><w:tc><w:tcPr/><w:p><w:pPr><w:spacing w:line="276" w:lineRule="auto"/><w:rPr/></w:pPr><w:r><w:rPr><w:rtl w:val="0"/></w:rPr><w:t xml:space="preserve">Tax paid in the name of</w:t></w:r></w:p></w:tc><w:tc><w:tcPr><w:gridSpan w:val="2"/></w:tcPr><w:p><w:pPr><w:spacing w:line="276" w:lineRule="auto"/><w:rPr/></w:pPr><w:r><w:rPr><w:rtl w:val="0"/></w:rPr></w:r></w:p></w:tc></w:tr><w:tr><w:trPr><w:cantSplit w:val="0"/><w:tblHeader w:val="0"/></w:trPr><w:tc><w:tcPr><w:vMerge w:val="continue"/></w:tcPr><w:p><w:pPr><w:keepNext w:val="0"/><w:keepLines w:val="0"/><w:pageBreakBefore w:val="0"/><w:widowControl w:val="0"/><w:pBdr><w:top w:space="0" w:sz="0" w:val="nil"/><w:left w:space="0" w:sz="0" w:val="nil"/><w:bottom w:space="0" w:sz="0" w:val="nil"/><w:right w:space="0" w:sz="0" w:val="nil"/><w:between w:space="0" w:sz="0" w:val="nil"/></w:pBdr><w:shd w:fill="auto" w:val="clear"/><w:spacing w:after="0" w:before="0" w:line="276" w:lineRule="auto"/><w:ind w:left="0" w:right="0" w:firstLine="0"/><w:jc w:val="left"/><w:rPr/></w:pPr><w:r><w:rPr><w:rtl w:val="0"/></w:rPr></w:r></w:p></w:tc><w:tc><w:tcPr/><w:p><w:pPr><w:spacing w:line="276" w:lineRule="auto"/><w:rPr/></w:pPr><w:r><w:rPr><w:rtl w:val="0"/></w:rPr><w:t xml:space="preserve">Tax amount</w:t></w:r></w:p></w:tc><w:tc><w:tcPr><w:gridSpan w:val="2"/></w:tcPr><w:p><w:pPr><w:spacing w:line="276" w:lineRule="auto"/><w:rPr/></w:pPr><w:r><w:rPr><w:rtl w:val="0"/></w:rPr></w:r></w:p></w:tc></w:tr><w:tr><w:trPr><w:cantSplit w:val="0"/><w:tblHeader w:val="0"/></w:trPr><w:tc><w:tcPr><w:vMerge w:val="restart"/></w:tcPr><w:p><w:pPr><w:spacing w:line="276" w:lineRule="auto"/><w:rPr/></w:pPr><w:r><w:rPr><w:rtl w:val="0"/></w:rPr><w:t xml:space="preserve">5</w:t></w:r></w:p><w:p><w:pPr><w:spacing w:line="276" w:lineRule="auto"/><w:rPr/></w:pPr><w:r><w:rPr><w:rtl w:val="0"/></w:rPr></w:r></w:p></w:tc><w:tc><w:tcPr/><w:p><w:pPr><w:spacing w:line="276" w:lineRule="auto"/><w:rPr/></w:pPr><w:r><w:rPr><w:rtl w:val="0"/></w:rPr><w:t xml:space="preserve">Electricity Service Connection no.</w:t></w:r></w:p></w:tc><w:tc><w:tcPr><w:gridSpan w:val="2"/></w:tcPr><w:p><w:pPr><w:spacing w:line="276" w:lineRule="auto"/><w:jc w:val="both"/><w:rPr/></w:pPr><w:r><w:rPr><w:rtl w:val="0"/></w:rPr></w:r></w:p></w:tc></w:tr><w:tr><w:trPr><w:cantSplit w:val="0"/><w:tblHeader w:val="0"/></w:trPr><w:tc><w:tcPr><w:vMerge w:val="continue"/></w:tcPr><w:p><w:pPr><w:keepNext w:val="0"/><w:keepLines w:val="0"/><w:pageBreakBefore w:val="0"/><w:widowControl w:val="0"/><w:pBdr><w:top w:space="0" w:sz="0" w:val="nil"/><w:left w:space="0" w:sz="0" w:val="nil"/><w:bottom w:space="0" w:sz="0" w:val="nil"/><w:right w:space="0" w:sz="0" w:val="nil"/><w:between w:space="0" w:sz="0" w:val="nil"/></w:pBdr><w:shd w:fill="auto" w:val="clear"/><w:spacing w:after="0" w:before="0" w:line="276" w:lineRule="auto"/><w:ind w:left="0" w:right="0" w:firstLine="0"/><w:jc w:val="left"/><w:rPr/></w:pPr><w:r><w:rPr><w:rtl w:val="0"/></w:rPr></w:r></w:p></w:tc><w:tc><w:tcPr/><w:p><w:pPr><w:spacing w:line="276" w:lineRule="auto"/><w:rPr/></w:pPr><w:r><w:rPr><w:rtl w:val="0"/></w:rPr><w:t xml:space="preserve">Meter Card is in the name of</w:t></w:r></w:p></w:tc><w:tc><w:tcPr><w:gridSpan w:val="2"/></w:tcPr><w:p><w:pPr><w:spacing w:line="276" w:lineRule="auto"/><w:rPr><w:b w:val="1"/><w:bCs w:val="1"/></w:rPr></w:pPr><w:r><w:rPr><w:rtl w:val="0"/></w:rPr></w:r></w:p></w:tc></w:tr><w:tr><w:trPr><w:cantSplit w:val="0"/><w:tblHeader w:val="0"/></w:trPr><w:tc><w:tcPr/><w:p><w:pPr><w:spacing w:line="276" w:lineRule="auto"/><w:rPr/></w:pPr><w:r><w:rPr><w:rtl w:val="0"/></w:rPr><w:t xml:space="preserve">6</w:t></w:r></w:p></w:tc><w:tc><w:tcPr/><w:p><w:pPr><w:spacing w:line="276" w:lineRule="auto"/><w:rPr/></w:pPr><w:r><w:rPr><w:rtl w:val="0"/></w:rPr><w:t xml:space="preserve">How is the maintenance of the Flat?</w:t></w:r></w:p></w:tc><w:tc><w:tcPr><w:gridSpan w:val="2"/></w:tcPr><w:p><w:pPr><w:spacing w:line="276" w:lineRule="auto"/><w:rPr/></w:pPr><w:r><w:rPr><w:rtl w:val="0"/></w:rPr></w:r></w:p></w:tc></w:tr><w:tr><w:trPr><w:cantSplit w:val="0"/><w:tblHeader w:val="0"/></w:trPr><w:tc><w:tcPr/><w:p><w:pPr><w:spacing w:line="276" w:lineRule="auto"/><w:rPr/></w:pPr><w:r><w:rPr><w:rtl w:val="0"/></w:rPr><w:t xml:space="preserve">7</w:t></w:r></w:p></w:tc><w:tc><w:tcPr/><w:p><w:pPr><w:spacing w:line="276" w:lineRule="auto"/><w:rPr/></w:pPr><w:r><w:rPr><w:rtl w:val="0"/></w:rPr><w:t xml:space="preserve">Sale Deed executed in the name of</w:t></w:r></w:p></w:tc><w:tc><w:tcPr><w:gridSpan w:val="2"/></w:tcPr><w:p><w:pPr><w:spacing w:line="276" w:lineRule="auto"/><w:rPr/></w:pPr><w:r><w:rPr><w:rtl w:val="0"/></w:rPr></w:r></w:p></w:tc></w:tr><w:tr><w:trPr><w:cantSplit w:val="0"/><w:tblHeader w:val="0"/></w:trPr><w:tc><w:tcPr/><w:p><w:pPr><w:spacing w:line="276" w:lineRule="auto"/><w:rPr/></w:pPr><w:r><w:rPr><w:rtl w:val="0"/></w:rPr><w:t xml:space="preserve">8</w:t></w:r></w:p></w:tc><w:tc><w:tcPr/><w:p><w:pPr><w:spacing w:line="276" w:lineRule="auto"/><w:rPr/></w:pPr><w:r><w:rPr><w:rtl w:val="0"/></w:rPr><w:t xml:space="preserve">What is the undivided area of land as per Sale Deed?</w:t></w:r></w:p></w:tc><w:tc><w:tcPr><w:gridSpan w:val="2"/></w:tcPr><w:p><w:pPr><w:spacing w:line="276" w:lineRule="auto"/><w:rPr/></w:pPr><w:r><w:rPr><w:rtl w:val="0"/></w:rPr></w:r></w:p></w:tc></w:tr><w:tr><w:trPr><w:cantSplit w:val="0"/><w:tblHeader w:val="0"/></w:trPr><w:tc><w:tcPr/><w:p><w:pPr><w:spacing w:line="276" w:lineRule="auto"/><w:rPr/></w:pPr><w:r><w:rPr><w:rtl w:val="0"/></w:rPr><w:t xml:space="preserve">9</w:t></w:r></w:p></w:tc><w:tc><w:tcPr/><w:p><w:pPr><w:spacing w:line="276" w:lineRule="auto"/><w:rPr/></w:pPr><w:r><w:rPr><w:rtl w:val="0"/></w:rPr><w:t xml:space="preserve">What is the plinth area of the Flat?</w:t></w:r></w:p></w:tc><w:tc><w:tcPr><w:gridSpan w:val="2"/></w:tcPr><w:p><w:pPr><w:jc w:val="both"/><w:rPr/></w:pPr><w:r><w:rPr><w:rtl w:val="0"/></w:rPr></w:r></w:p></w:tc></w:tr><w:tr><w:trPr><w:cantSplit w:val="0"/><w:tblHeader w:val="0"/></w:trPr><w:tc><w:tcPr/><w:p><w:pPr><w:spacing w:line="276" w:lineRule="auto"/><w:rPr/></w:pPr><w:r><w:rPr><w:rtl w:val="0"/></w:rPr><w:t xml:space="preserve">10</w:t></w:r></w:p></w:tc><w:tc><w:tcPr/><w:p><w:pPr><w:spacing w:line="276" w:lineRule="auto"/><w:rPr/></w:pPr><w:r><w:rPr><w:rtl w:val="0"/></w:rPr><w:t xml:space="preserve">What is the floor space index (app.)</w:t></w:r></w:p></w:tc><w:tc><w:tcPr><w:gridSpan w:val="2"/></w:tcPr><w:p><w:pPr><w:spacing w:line="276" w:lineRule="auto"/><w:rPr/></w:pPr><w:r><w:rPr><w:rtl w:val="0"/></w:rPr></w:r></w:p></w:tc></w:tr><w:tr><w:trPr><w:cantSplit w:val="0"/><w:tblHeader w:val="0"/></w:trPr><w:tc><w:tcPr/><w:p><w:pPr><w:spacing w:line="276" w:lineRule="auto"/><w:rPr/></w:pPr><w:r><w:rPr><w:rtl w:val="0"/></w:rPr><w:t xml:space="preserve">11</w:t></w:r></w:p></w:tc><w:tc><w:tcPr/><w:p><w:pPr><w:spacing w:line="276" w:lineRule="auto"/><w:rPr/></w:pPr><w:r><w:rPr><w:rtl w:val="0"/></w:rPr><w:t xml:space="preserve">What is the Carpet &amp; Built-up Area of the Flat?</w:t></w:r></w:p></w:tc><w:tc><w:tcPr><w:gridSpan w:val="2"/></w:tcPr><w:p><w:pPr><w:spacing w:line="276" w:lineRule="auto"/><w:jc w:val="both"/><w:rPr/></w:pPr><w:r><w:rPr><w:rtl w:val="0"/></w:rPr></w:r></w:p></w:tc></w:tr><w:tr><w:trPr><w:cantSplit w:val="0"/><w:tblHeader w:val="0"/></w:trPr><w:tc><w:tcPr/><w:p><w:pPr><w:spacing w:line="276" w:lineRule="auto"/><w:rPr/></w:pPr><w:r><w:rPr><w:rtl w:val="0"/></w:rPr><w:t xml:space="preserve">12</w:t></w:r></w:p></w:tc><w:tc><w:tcPr/><w:p><w:pPr><w:spacing w:line="276" w:lineRule="auto"/><w:rPr/></w:pPr><w:r><w:rPr><w:rtl w:val="0"/></w:rPr><w:t xml:space="preserve">Is it Posh/ I class / Medium / Ordinary?</w:t></w:r></w:p></w:tc><w:tc><w:tcPr><w:gridSpan w:val="2"/></w:tcPr><w:p><w:pPr><w:spacing w:line="276" w:lineRule="auto"/><w:rPr/></w:pPr><w:r><w:rPr><w:rtl w:val="0"/></w:rPr></w:r></w:p></w:tc></w:tr><w:tr><w:trPr><w:cantSplit w:val="0"/><w:tblHeader w:val="0"/></w:trPr><w:tc><w:tcPr/><w:p><w:pPr><w:spacing w:line="276" w:lineRule="auto"/><w:rPr/></w:pPr><w:r><w:rPr><w:rtl w:val="0"/></w:rPr><w:t xml:space="preserve">13</w:t></w:r></w:p></w:tc><w:tc><w:tcPr/><w:p><w:pPr><w:spacing w:line="276" w:lineRule="auto"/><w:rPr/></w:pPr><w:r><w:rPr><w:rtl w:val="0"/></w:rPr><w:t xml:space="preserve">Is it being used for Residential or Commercial Purpose?</w:t></w:r></w:p></w:tc><w:tc><w:tcPr><w:gridSpan w:val="2"/></w:tcPr><w:p><w:pPr><w:spacing w:line="276" w:lineRule="auto"/><w:rPr/></w:pPr><w:r><w:rPr><w:rtl w:val="0"/></w:rPr></w:r></w:p></w:tc></w:tr><w:tr><w:trPr><w:cantSplit w:val="0"/><w:tblHeader w:val="0"/></w:trPr><w:tc><w:tcPr/><w:p><w:pPr><w:spacing w:line="276" w:lineRule="auto"/><w:rPr/></w:pPr><w:r><w:rPr><w:rtl w:val="0"/></w:rPr><w:t xml:space="preserve">14</w:t></w:r></w:p></w:tc><w:tc><w:tcPr/><w:p><w:pPr><w:spacing w:line="276" w:lineRule="auto"/><w:rPr/></w:pPr><w:r><w:rPr><w:rtl w:val="0"/></w:rPr><w:t xml:space="preserve">Is it Owner-occupied or let out?</w:t></w:r></w:p></w:tc><w:tc><w:tcPr><w:gridSpan w:val="2"/></w:tcPr><w:p><w:pPr><w:spacing w:line="276" w:lineRule="auto"/><w:rPr/></w:pPr><w:r><w:rPr><w:rtl w:val="0"/></w:rPr></w:r></w:p></w:tc></w:tr><w:tr><w:trPr><w:cantSplit w:val="0"/><w:tblHeader w:val="0"/></w:trPr><w:tc><w:tcPr/><w:p><w:pPr><w:spacing w:line="276" w:lineRule="auto"/><w:rPr/></w:pPr><w:r><w:rPr><w:rtl w:val="0"/></w:rPr><w:t xml:space="preserve">15</w:t></w:r></w:p></w:tc><w:tc><w:tcPr/><w:p><w:pPr><w:spacing w:line="276" w:lineRule="auto"/><w:rPr/></w:pPr><w:r><w:rPr><w:rtl w:val="0"/></w:rPr><w:t xml:space="preserve">If rented, what is the monthly rent?</w:t></w:r></w:p></w:tc><w:tc><w:tcPr><w:gridSpan w:val="2"/></w:tcPr><w:p><w:pPr><w:spacing w:after="7" w:line="276" w:lineRule="auto"/><w:ind w:left="1" w:firstLine="0"/><w:rPr/></w:pPr><w:r><w:rPr><w:rtl w:val="0"/></w:rPr></w:r></w:p></w:tc></w:tr><w:tr><w:trPr><w:cantSplit w:val="0"/><w:tblHeader w:val="0"/></w:trPr><w:tc><w:tcPr/><w:p><w:pPr><w:spacing w:line="276" w:lineRule="auto"/><w:rPr><w:b w:val="1"/><w:bCs w:val="1"/></w:rPr></w:pPr><w:r><w:rPr><w:b w:val="1"/><w:bCs w:val="1"/><w:rtl w:val="0"/></w:rPr><w:t xml:space="preserve">IV</w:t></w:r></w:p></w:tc><w:tc><w:tcPr/><w:p><w:pPr><w:spacing w:line="276" w:lineRule="auto"/><w:rPr><w:b w:val="1"/><w:bCs w:val="1"/></w:rPr></w:pPr><w:r><w:rPr><w:b w:val="1"/><w:bCs w:val="1"/><w:rtl w:val="0"/></w:rPr><w:t xml:space="preserve">MARKETABILITY</w:t></w:r></w:p></w:tc><w:tc><w:tcPr><w:gridSpan w:val="2"/></w:tcPr><w:p><w:pPr><w:spacing w:line="276" w:lineRule="auto"/><w:rPr/></w:pPr><w:r><w:rPr><w:rtl w:val="0"/></w:rPr></w:r></w:p></w:tc></w:tr><w:tr><w:trPr><w:cantSplit w:val="0"/><w:tblHeader w:val="0"/></w:trPr><w:tc><w:tcPr/><w:p><w:pPr><w:spacing w:line="276" w:lineRule="auto"/><w:rPr/></w:pPr><w:r><w:rPr><w:rtl w:val="0"/></w:rPr><w:t xml:space="preserve">1</w:t></w:r></w:p></w:tc><w:tc><w:tcPr/><w:p><w:pPr><w:spacing w:line="276" w:lineRule="auto"/><w:rPr/></w:pPr><w:r><w:rPr><w:rtl w:val="0"/></w:rPr><w:t xml:space="preserve">How is the marketability?</w:t></w:r></w:p></w:tc><w:tc><w:tcPr><w:gridSpan w:val="2"/></w:tcPr><w:p><w:pPr><w:spacing w:line="276" w:lineRule="auto"/><w:rPr/></w:pPr><w:r><w:rPr><w:rtl w:val="0"/></w:rPr></w:r></w:p></w:tc></w:tr><w:tr><w:trPr><w:cantSplit w:val="0"/><w:tblHeader w:val="0"/></w:trPr><w:tc><w:tcPr/><w:p><w:pPr><w:rPr/></w:pPr><w:r><w:rPr><w:rtl w:val="0"/></w:rPr><w:t xml:space="preserve">2</w:t></w:r></w:p></w:tc><w:tc><w:tcPr/><w:p><w:pPr><w:rPr/></w:pPr><w:r><w:rPr><w:rtl w:val="0"/></w:rPr><w:t xml:space="preserve">What are the factors favouring for an extra Potential Value?</w:t></w:r></w:p></w:tc><w:tc><w:tcPr><w:gridSpan w:val="2"/></w:tcPr><w:p><w:pPr><w:rPr/></w:pPr><w:r><w:rPr><w:rtl w:val="0"/></w:rPr></w:r></w:p></w:tc></w:tr><w:tr><w:trPr><w:cantSplit w:val="0"/><w:tblHeader w:val="0"/></w:trPr><w:tc><w:tcPr/><w:p><w:pPr><w:rPr/></w:pPr><w:r><w:rPr><w:rtl w:val="0"/></w:rPr><w:t xml:space="preserve">3</w:t></w:r></w:p></w:tc><w:tc><w:tcPr/><w:p><w:pPr><w:rPr/></w:pPr><w:r><w:rPr><w:rtl w:val="0"/></w:rPr><w:t xml:space="preserve">Any negative factors are observed which affect the Market value in general?</w:t></w:r></w:p></w:tc><w:tc><w:tcPr><w:gridSpan w:val="2"/></w:tcPr><w:p><w:pPr><w:rPr/></w:pPr><w:r><w:rPr><w:rtl w:val="0"/></w:rPr></w:r></w:p></w:tc></w:tr><w:tr><w:trPr><w:cantSplit w:val="0"/><w:tblHeader w:val="0"/></w:trPr><w:tc><w:tcPr/><w:p><w:pPr><w:rPr><w:b w:val="1"/><w:bCs w:val="1"/></w:rPr></w:pPr><w:r><w:rPr><w:b w:val="1"/><w:bCs w:val="1"/><w:rtl w:val="0"/></w:rPr><w:t xml:space="preserve">V</w:t></w:r></w:p></w:tc><w:tc><w:tcPr/><w:p><w:pPr><w:rPr><w:b w:val="1"/><w:bCs w:val="1"/></w:rPr></w:pPr><w:r><w:rPr><w:b w:val="1"/><w:bCs w:val="1"/><w:rtl w:val="0"/></w:rPr><w:t xml:space="preserve">Rate</w:t></w:r></w:p></w:tc><w:tc><w:tcPr><w:gridSpan w:val="2"/></w:tcPr><w:p><w:pPr><w:rPr/></w:pPr><w:r><w:rPr><w:rtl w:val="0"/></w:rPr></w:r></w:p></w:tc></w:tr><w:tr><w:trPr><w:cantSplit w:val="0"/><w:tblHeader w:val="0"/></w:trPr><w:tc><w:tcPr/><w:p><w:pPr><w:rPr/></w:pPr><w:r><w:rPr><w:rtl w:val="0"/></w:rPr><w:t xml:space="preserve">1</w:t></w:r></w:p></w:tc><w:tc><w:tcPr/><w:p><w:pPr><w:rPr/></w:pPr><w:r><w:rPr><w:rtl w:val="0"/></w:rPr><w:t xml:space="preserve">After analysing the comparable sale instances, what is the composite rate for a similar flat with same Specifications in the adjoining locality?</w:t></w:r></w:p></w:tc><w:tc><w:tcPr><w:gridSpan w:val="2"/></w:tcPr><w:p><w:pPr><w:rPr/></w:pPr><w:r><w:rPr><w:rtl w:val="0"/></w:rPr></w:r></w:p></w:tc></w:tr><w:tr><w:trPr><w:cantSplit w:val="0"/><w:tblHeader w:val="0"/></w:trPr><w:tc><w:tcPr/><w:p><w:pPr><w:rPr/></w:pPr><w:r><w:rPr><w:rtl w:val="0"/></w:rPr><w:t xml:space="preserve">2</w:t></w:r></w:p></w:tc><w:tc><w:tcPr/><w:p><w:pPr><w:rPr/></w:pPr><w:r><w:rPr><w:rtl w:val="0"/></w:rPr><w:t xml:space="preserve">Assuming it is a new construction, what is the</w:t></w:r></w:p><w:p><w:pPr><w:rPr/></w:pPr><w:r><w:rPr><w:rtl w:val="0"/></w:rPr><w:t xml:space="preserve">adopted basic composite are of the flat under valuation after comparing with the specifications and other factors with the flat under comparison (give details).</w:t></w:r></w:p></w:tc><w:tc><w:tcPr><w:gridSpan w:val="2"/></w:tcPr><w:p><w:pPr><w:rPr><w:b w:val="1"/><w:bCs w:val="1"/></w:rPr></w:pPr><w:r><w:rPr><w:rtl w:val="0"/></w:rPr></w:r></w:p></w:tc></w:tr><w:tr><w:trPr><w:cantSplit w:val="0"/><w:tblHeader w:val="0"/></w:trPr><w:tc><w:tcPr><w:vMerge w:val="restart"/></w:tcPr><w:p><w:pPr><w:rPr/></w:pPr><w:r><w:rPr><w:rtl w:val="0"/></w:rPr><w:t xml:space="preserve">3</w:t></w:r></w:p></w:tc><w:tc><w:tcPr/><w:p><w:pPr><w:rPr/></w:pPr><w:r><w:rPr><w:rtl w:val="0"/></w:rPr><w:t xml:space="preserve">Break-up for the rate</w:t></w:r></w:p></w:tc><w:tc><w:tcPr><w:gridSpan w:val="2"/></w:tcPr><w:p><w:pPr><w:rPr/></w:pPr><w:r><w:rPr><w:rtl w:val="0"/></w:rPr></w:r></w:p></w:tc></w:tr><w:tr><w:trPr><w:cantSplit w:val="0"/><w:tblHeader w:val="0"/></w:trPr><w:tc><w:tcPr><w:vMerge w:val="continue"/></w:tcPr><w:p><w:pPr><w:keepNext w:val="0"/><w:keepLines w:val="0"/><w:pageBreakBefore w:val="0"/><w:widowControl w:val="0"/><w:pBdr><w:top w:space="0" w:sz="0" w:val="nil"/><w:left w:space="0" w:sz="0" w:val="nil"/><w:bottom w:space="0" w:sz="0" w:val="nil"/><w:right w:space="0" w:sz="0" w:val="nil"/><w:between w:space="0" w:sz="0" w:val="nil"/></w:pBdr><w:shd w:fill="auto" w:val="clear"/><w:spacing w:after="0" w:before="0" w:line="276" w:lineRule="auto"/><w:ind w:left="0" w:right="0" w:firstLine="0"/><w:jc w:val="left"/><w:rPr/></w:pPr><w:r><w:rPr><w:rtl w:val="0"/></w:rPr></w:r></w:p></w:tc><w:tc><w:tcPr/><w:p><w:pPr><w:rPr/></w:pPr><w:r><w:rPr><w:rtl w:val="0"/></w:rPr><w:t xml:space="preserve">i) Flat + Services</w:t></w:r></w:p></w:tc><w:tc><w:tcPr><w:gridSpan w:val="2"/></w:tcPr><w:p><w:pPr><w:rPr/></w:pPr><w:r><w:rPr><w:rtl w:val="0"/></w:rPr></w:r></w:p></w:tc></w:tr><w:tr><w:trPr><w:cantSplit w:val="0"/><w:tblHeader w:val="0"/></w:trPr><w:tc><w:tcPr><w:vMerge w:val="continue"/></w:tcPr><w:p><w:pPr><w:keepNext w:val="0"/><w:keepLines w:val="0"/><w:pageBreakBefore w:val="0"/><w:widowControl w:val="0"/><w:pBdr><w:top w:space="0" w:sz="0" w:val="nil"/><w:left w:space="0" w:sz="0" w:val="nil"/><w:bottom w:space="0" w:sz="0" w:val="nil"/><w:right w:space="0" w:sz="0" w:val="nil"/><w:between w:space="0" w:sz="0" w:val="nil"/></w:pBdr><w:shd w:fill="auto" w:val="clear"/><w:spacing w:after="0" w:before="0" w:line="276" w:lineRule="auto"/><w:ind w:left="0" w:right="0" w:firstLine="0"/><w:jc w:val="left"/><w:rPr/></w:pPr><w:r><w:rPr><w:rtl w:val="0"/></w:rPr></w:r></w:p></w:tc><w:tc><w:tcPr/><w:p><w:pPr><w:rPr/></w:pPr><w:r><w:rPr><w:rtl w:val="0"/></w:rPr><w:t xml:space="preserve">ii) Land + Others</w:t></w:r></w:p></w:tc><w:tc><w:tcPr><w:gridSpan w:val="2"/></w:tcPr><w:p><w:pPr><w:rPr/></w:pPr><w:r><w:rPr><w:rtl w:val="0"/></w:rPr></w:r></w:p></w:tc></w:tr><w:tr><w:trPr><w:cantSplit w:val="0"/><w:tblHeader w:val="0"/></w:trPr><w:tc><w:tcPr/><w:p><w:pPr><w:rPr/></w:pPr><w:r><w:rPr><w:rtl w:val="0"/></w:rPr><w:t xml:space="preserve">4</w:t></w:r></w:p></w:tc><w:tc><w:tcPr/><w:p><w:pPr><w:rPr/></w:pPr><w:r><w:rPr><w:rtl w:val="0"/></w:rPr><w:t xml:space="preserve">Guideline rate obtained from the Registrar’s office (an Evidence thereof to be enclosed)</w:t></w:r></w:p></w:tc><w:tc><w:tcPr><w:gridSpan w:val="2"/></w:tcPr><w:p><w:pPr><w:rPr/></w:pPr><w:r><w:rPr><w:rtl w:val="0"/></w:rPr></w:r></w:p></w:tc></w:tr><w:tr><w:trPr><w:cantSplit w:val="0"/><w:tblHeader w:val="0"/></w:trPr><w:tc><w:tcPr/><w:p><w:pPr><w:rPr><w:b w:val="1"/><w:bCs w:val="1"/></w:rPr></w:pPr><w:r><w:rPr><w:b w:val="1"/><w:bCs w:val="1"/><w:rtl w:val="0"/></w:rPr><w:t xml:space="preserve">VI</w:t></w:r></w:p></w:tc><w:tc><w:tcPr><w:gridSpan w:val="3"/></w:tcPr><w:p><w:pPr><w:rPr><w:b w:val="1"/><w:bCs w:val="1"/></w:rPr></w:pPr><w:r><w:rPr><w:b w:val="1"/><w:bCs w:val="1"/><w:rtl w:val="0"/></w:rPr><w:t xml:space="preserve">COMPOSITE RATE ADOPTED AFTER DEPRECIATION</w:t></w:r></w:p></w:tc></w:tr><w:tr><w:trPr><w:cantSplit w:val="0"/><w:tblHeader w:val="0"/></w:trPr><w:tc><w:tcPr><w:vMerge w:val="restart"/></w:tcPr><w:p><w:pPr><w:rPr/></w:pPr><w:r><w:rPr><w:rtl w:val="0"/></w:rPr><w:t xml:space="preserve">a.</w:t></w:r></w:p></w:tc><w:tc><w:tcPr/><w:p><w:pPr><w:rPr/></w:pPr><w:r><w:rPr><w:rtl w:val="0"/></w:rPr><w:t xml:space="preserve">Depreciation Flat rate</w:t></w:r></w:p></w:tc><w:tc><w:tcPr><w:gridSpan w:val="2"/></w:tcPr><w:p><w:pPr><w:rPr/></w:pPr><w:r><w:rPr><w:rtl w:val="0"/></w:rPr></w:r></w:p></w:tc></w:tr><w:tr><w:trPr><w:cantSplit w:val="0"/><w:tblHeader w:val="0"/></w:trPr><w:tc><w:tcPr><w:vMerge w:val="continue"/></w:tcPr><w:p><w:pPr><w:keepNext w:val="0"/><w:keepLines w:val="0"/><w:pageBreakBefore w:val="0"/><w:widowControl w:val="0"/><w:pBdr><w:top w:space="0" w:sz="0" w:val="nil"/><w:left w:space="0" w:sz="0" w:val="nil"/><w:bottom w:space="0" w:sz="0" w:val="nil"/><w:right w:space="0" w:sz="0" w:val="nil"/><w:between w:space="0" w:sz="0" w:val="nil"/></w:pBdr><w:shd w:fill="auto" w:val="clear"/><w:spacing w:after="0" w:before="0" w:line="276" w:lineRule="auto"/><w:ind w:left="0" w:right="0" w:firstLine="0"/><w:jc w:val="left"/><w:rPr/></w:pPr><w:r><w:rPr><w:rtl w:val="0"/></w:rPr></w:r></w:p></w:tc><w:tc><w:tcPr/><w:p><w:pPr><w:rPr/></w:pPr><w:r><w:rPr><w:rtl w:val="0"/></w:rPr><w:t xml:space="preserve">Replacement cost of Flat with Services (v (3)i)</w:t></w:r></w:p></w:tc><w:tc><w:tcPr><w:gridSpan w:val="2"/></w:tcPr><w:p><w:pPr><w:rPr/></w:pPr><w:r><w:rPr><w:rtl w:val="0"/></w:rPr></w:r></w:p></w:tc></w:tr><w:tr><w:trPr><w:cantSplit w:val="0"/><w:tblHeader w:val="0"/></w:trPr><w:tc><w:tcPr><w:vMerge w:val="continue"/></w:tcPr><w:p><w:pPr><w:keepNext w:val="0"/><w:keepLines w:val="0"/><w:pageBreakBefore w:val="0"/><w:widowControl w:val="0"/><w:pBdr><w:top w:space="0" w:sz="0" w:val="nil"/><w:left w:space="0" w:sz="0" w:val="nil"/><w:bottom w:space="0" w:sz="0" w:val="nil"/><w:right w:space="0" w:sz="0" w:val="nil"/><w:between w:space="0" w:sz="0" w:val="nil"/></w:pBdr><w:shd w:fill="auto" w:val="clear"/><w:spacing w:after="0" w:before="0" w:line="276" w:lineRule="auto"/><w:ind w:left="0" w:right="0" w:firstLine="0"/><w:jc w:val="left"/><w:rPr/></w:pPr><w:r><w:rPr><w:rtl w:val="0"/></w:rPr></w:r></w:p></w:tc><w:tc><w:tcPr/><w:p><w:pPr><w:rPr/></w:pPr><w:r><w:rPr><w:rtl w:val="0"/></w:rPr><w:t xml:space="preserve">Age of the Flat</w:t></w:r></w:p></w:tc><w:tc><w:tcPr><w:gridSpan w:val="2"/></w:tcPr><w:p><w:pPr><w:rPr/></w:pPr><w:r><w:rPr><w:rtl w:val="0"/></w:rPr></w:r></w:p></w:tc></w:tr><w:tr><w:trPr><w:cantSplit w:val="0"/><w:tblHeader w:val="0"/></w:trPr><w:tc><w:tcPr><w:vMerge w:val="continue"/></w:tcPr><w:p><w:pPr><w:keepNext w:val="0"/><w:keepLines w:val="0"/><w:pageBreakBefore w:val="0"/><w:widowControl w:val="0"/><w:pBdr><w:top w:space="0" w:sz="0" w:val="nil"/><w:left w:space="0" w:sz="0" w:val="nil"/><w:bottom w:space="0" w:sz="0" w:val="nil"/><w:right w:space="0" w:sz="0" w:val="nil"/><w:between w:space="0" w:sz="0" w:val="nil"/></w:pBdr><w:shd w:fill="auto" w:val="clear"/><w:spacing w:after="0" w:before="0" w:line="276" w:lineRule="auto"/><w:ind w:left="0" w:right="0" w:firstLine="0"/><w:jc w:val="left"/><w:rPr/></w:pPr><w:r><w:rPr><w:rtl w:val="0"/></w:rPr></w:r></w:p></w:tc><w:tc><w:tcPr/><w:p><w:pPr><w:rPr/></w:pPr><w:r><w:rPr><w:rtl w:val="0"/></w:rPr><w:t xml:space="preserve">Life of the Flat estimated</w:t></w:r></w:p></w:tc><w:tc><w:tcPr><w:gridSpan w:val="2"/></w:tcPr><w:p><w:pPr><w:rPr/></w:pPr><w:r><w:rPr><w:rtl w:val="0"/></w:rPr></w:r></w:p></w:tc></w:tr><w:tr><w:trPr><w:cantSplit w:val="0"/><w:tblHeader w:val="0"/></w:trPr><w:tc><w:tcPr><w:vMerge w:val="continue"/></w:tcPr><w:p><w:pPr><w:keepNext w:val="0"/><w:keepLines w:val="0"/><w:pageBreakBefore w:val="0"/><w:widowControl w:val="0"/><w:pBdr><w:top w:space="0" w:sz="0" w:val="nil"/><w:left w:space="0" w:sz="0" w:val="nil"/><w:bottom w:space="0" w:sz="0" w:val="nil"/><w:right w:space="0" w:sz="0" w:val="nil"/><w:between w:space="0" w:sz="0" w:val="nil"/></w:pBdr><w:shd w:fill="auto" w:val="clear"/><w:spacing w:after="0" w:before="0" w:line="276" w:lineRule="auto"/><w:ind w:left="0" w:right="0" w:firstLine="0"/><w:jc w:val="left"/><w:rPr/></w:pPr><w:r><w:rPr><w:rtl w:val="0"/></w:rPr></w:r></w:p></w:tc><w:tc><w:tcPr/><w:p><w:pPr><w:rPr/></w:pPr><w:r><w:rPr><w:rtl w:val="0"/></w:rPr><w:t xml:space="preserve">Depreciation percentage assuming the salvage values 100%</w:t></w:r></w:p></w:tc><w:tc><w:tcPr><w:gridSpan w:val="2"/></w:tcPr><w:p><w:pPr><w:jc w:val="both"/><w:rPr/></w:pPr><w:r><w:rPr><w:rtl w:val="0"/></w:rPr></w:r></w:p></w:tc></w:tr><w:tr><w:trPr><w:cantSplit w:val="0"/><w:tblHeader w:val="0"/></w:trPr><w:tc><w:tcPr><w:vMerge w:val="continue"/></w:tcPr><w:p><w:pPr><w:keepNext w:val="0"/><w:keepLines w:val="0"/><w:pageBreakBefore w:val="0"/><w:widowControl w:val="0"/><w:pBdr><w:top w:space="0" w:sz="0" w:val="nil"/><w:left w:space="0" w:sz="0" w:val="nil"/><w:bottom w:space="0" w:sz="0" w:val="nil"/><w:right w:space="0" w:sz="0" w:val="nil"/><w:between w:space="0" w:sz="0" w:val="nil"/></w:pBdr><w:shd w:fill="auto" w:val="clear"/><w:spacing w:after="0" w:before="0" w:line="276" w:lineRule="auto"/><w:ind w:left="0" w:right="0" w:firstLine="0"/><w:jc w:val="left"/><w:rPr/></w:pPr><w:r><w:rPr><w:rtl w:val="0"/></w:rPr></w:r></w:p></w:tc><w:tc><w:tcPr/><w:p><w:pPr><w:rPr/></w:pPr><w:r><w:rPr><w:rtl w:val="0"/></w:rPr><w:t xml:space="preserve">Depreciated Ratio of the Flat</w:t></w:r></w:p></w:tc><w:tc><w:tcPr><w:gridSpan w:val="2"/></w:tcPr><w:p><w:pPr><w:rPr/></w:pPr><w:r><w:rPr><w:rtl w:val="0"/></w:rPr></w:r></w:p></w:tc></w:tr><w:tr><w:trPr><w:cantSplit w:val="0"/><w:tblHeader w:val="0"/></w:trPr><w:tc><w:tcPr><w:vMerge w:val="restart"/></w:tcPr><w:p><w:pPr><w:rPr/></w:pPr><w:r><w:rPr><w:rtl w:val="0"/></w:rPr><w:t xml:space="preserve">b.</w:t></w:r></w:p></w:tc><w:tc><w:tcPr/><w:p><w:pPr><w:rPr/></w:pPr><w:r><w:rPr><w:rtl w:val="0"/></w:rPr><w:t xml:space="preserve">Total composite rate arrived for valuation</w:t></w:r></w:p></w:tc><w:tc><w:tcPr><w:gridSpan w:val="2"/></w:tcPr><w:p><w:pPr><w:rPr/></w:pPr><w:r><w:rPr><w:rtl w:val="0"/></w:rPr></w:r></w:p></w:tc></w:tr><w:tr><w:trPr><w:cantSplit w:val="0"/><w:tblHeader w:val="0"/></w:trPr><w:tc><w:tcPr><w:vMerge w:val="continue"/></w:tcPr><w:p><w:pPr><w:keepNext w:val="0"/><w:keepLines w:val="0"/><w:pageBreakBefore w:val="0"/><w:widowControl w:val="0"/><w:pBdr><w:top w:space="0" w:sz="0" w:val="nil"/><w:left w:space="0" w:sz="0" w:val="nil"/><w:bottom w:space="0" w:sz="0" w:val="nil"/><w:right w:space="0" w:sz="0" w:val="nil"/><w:between w:space="0" w:sz="0" w:val="nil"/></w:pBdr><w:shd w:fill="auto" w:val="clear"/><w:spacing w:after="0" w:before="0" w:line="276" w:lineRule="auto"/><w:ind w:left="0" w:right="0" w:firstLine="0"/><w:jc w:val="left"/><w:rPr/></w:pPr><w:r><w:rPr><w:rtl w:val="0"/></w:rPr></w:r></w:p></w:tc><w:tc><w:tcPr/><w:p><w:pPr><w:rPr/></w:pPr><w:r><w:rPr><w:rtl w:val="0"/></w:rPr><w:t xml:space="preserve">Depreciated Flat rate VI (a)</w:t></w:r></w:p></w:tc><w:tc><w:tcPr><w:gridSpan w:val="2"/></w:tcPr><w:p><w:pPr><w:rPr/></w:pPr><w:r><w:rPr><w:rtl w:val="0"/></w:rPr></w:r></w:p></w:tc></w:tr><w:tr><w:trPr><w:cantSplit w:val="0"/><w:tblHeader w:val="0"/></w:trPr><w:tc><w:tcPr><w:vMerge w:val="continue"/></w:tcPr><w:p><w:pPr><w:keepNext w:val="0"/><w:keepLines w:val="0"/><w:pageBreakBefore w:val="0"/><w:widowControl w:val="0"/><w:pBdr><w:top w:space="0" w:sz="0" w:val="nil"/><w:left w:space="0" w:sz="0" w:val="nil"/><w:bottom w:space="0" w:sz="0" w:val="nil"/><w:right w:space="0" w:sz="0" w:val="nil"/><w:between w:space="0" w:sz="0" w:val="nil"/></w:pBdr><w:shd w:fill="auto" w:val="clear"/><w:spacing w:after="0" w:before="0" w:line="276" w:lineRule="auto"/><w:ind w:left="0" w:right="0" w:firstLine="0"/><w:jc w:val="left"/><w:rPr/></w:pPr><w:r><w:rPr><w:rtl w:val="0"/></w:rPr></w:r></w:p></w:tc><w:tc><w:tcPr/><w:p><w:pPr><w:rPr/></w:pPr><w:r><w:rPr><w:rtl w:val="0"/></w:rPr><w:t xml:space="preserve">Rate for Land &amp; other V (3) ii</w:t></w:r></w:p></w:tc><w:tc><w:tcPr><w:gridSpan w:val="2"/></w:tcPr><w:p><w:pPr><w:rPr/></w:pPr><w:r><w:rPr><w:rtl w:val="0"/></w:rPr></w:r></w:p></w:tc></w:tr><w:tr><w:trPr><w:cantSplit w:val="0"/><w:tblHeader w:val="0"/></w:trPr><w:tc><w:tcPr><w:vMerge w:val="continue"/></w:tcPr><w:p><w:pPr><w:keepNext w:val="0"/><w:keepLines w:val="0"/><w:pageBreakBefore w:val="0"/><w:widowControl w:val="0"/><w:pBdr><w:top w:space="0" w:sz="0" w:val="nil"/><w:left w:space="0" w:sz="0" w:val="nil"/><w:bottom w:space="0" w:sz="0" w:val="nil"/><w:right w:space="0" w:sz="0" w:val="nil"/><w:between w:space="0" w:sz="0" w:val="nil"/></w:pBdr><w:shd w:fill="auto" w:val="clear"/><w:spacing w:after="0" w:before="0" w:line="276" w:lineRule="auto"/><w:ind w:left="0" w:right="0" w:firstLine="0"/><w:jc w:val="left"/><w:rPr/></w:pPr><w:r><w:rPr><w:rtl w:val="0"/></w:rPr></w:r></w:p></w:tc><w:tc><w:tcPr/><w:p><w:pPr><w:rPr/></w:pPr><w:r><w:rPr><w:rtl w:val="0"/></w:rPr><w:t xml:space="preserve">Total Composite Rate</w:t></w:r></w:p></w:tc><w:tc><w:tcPr><w:gridSpan w:val="2"/></w:tcPr><w:p><w:pPr><w:rPr><w:b w:val="1"/><w:bCs w:val="1"/></w:rPr></w:pPr><w:r><w:rPr><w:rtl w:val="0"/></w:rPr></w:r></w:p></w:tc></w:tr></w:tbl><w:p><w:pPr><w:keepNext w:val="0"/><w:keepLines w:val="0"/><w:pageBreakBefore w:val="0"/><w:widowControl w:val="1"/><w:pBdr><w:top w:space="0" w:sz="0" w:val="nil"/><w:left w:space="0" w:sz="0" w:val="nil"/><w:bottom w:space="0" w:sz="0" w:val="nil"/><w:right w:space="0" w:sz="0" w:val="nil"/><w:between w:space="0" w:sz="0" w:val="nil"/></w:pBdr><w:shd w:fill="auto" w:val="clear"/><w:spacing w:after="0" w:before="0" w:line="240" w:lineRule="auto"/><w:ind w:left="0" w:right="0" w:firstLine="0"/><w:jc w:val="left"/><w:rPr><w:rFonts w:ascii="Calibri" w:cs="Calibri" w:eastAsia="Calibri" w:hAnsi="Calibri"/><w:b w:val="1"/><w:bCs w:val="1"/><w:i w:val="0"/><w:iCs w:val="0"/><w:smallCaps w:val="0"/><w:strike w:val="0"/><w:color w:val="000000"/><w:sz w:val="22"/><w:szCs w:val="22"/><w:u w:val="none"/><w:shd w:fill="auto" w:val="clear"/><w:vertAlign w:val="baseline"/></w:rPr></w:pPr><w:r><w:rPr><w:rtl w:val="0"/></w:rPr></w:r></w:p><w:p><w:pPr><w:rPr><w:b w:val="1"/><w:bCs w:val="1"/></w:rPr></w:pPr><w:r><w:br w:type="page"/></w:r><w:r><w:rPr><w:rtl w:val="0"/></w:rPr></w:r></w:p><w:p><w:pPr><w:keepNext w:val="0"/><w:keepLines w:val="0"/><w:pageBreakBefore w:val="0"/><w:widowControl w:val="1"/><w:pBdr><w:top w:space="0" w:sz="0" w:val="nil"/><w:left w:space="0" w:sz="0" w:val="nil"/><w:bottom w:space="0" w:sz="0" w:val="nil"/><w:right w:space="0" w:sz="0" w:val="nil"/><w:between w:space="0" w:sz="0" w:val="nil"/></w:pBdr><w:shd w:fill="auto" w:val="clear"/><w:spacing w:after="0" w:before="0" w:line="240" w:lineRule="auto"/><w:ind w:left="0" w:right="0" w:firstLine="0"/><w:jc w:val="left"/><w:rPr><w:rFonts w:ascii="Calibri" w:cs="Calibri" w:eastAsia="Calibri" w:hAnsi="Calibri"/><w:b w:val="1"/><w:bCs w:val="1"/><w:i w:val="0"/><w:iCs w:val="0"/><w:smallCaps w:val="0"/><w:strike w:val="0"/><w:color w:val="000000"/><w:sz w:val="22"/><w:szCs w:val="22"/><w:u w:val="none"/><w:shd w:fill="auto" w:val="clear"/><w:vertAlign w:val="baseline"/></w:rPr></w:pPr><w:r><w:rPr><w:rFonts w:ascii="Calibri" w:cs="Calibri" w:eastAsia="Calibri" w:hAnsi="Calibri"/><w:b w:val="1"/><w:bCs w:val="1"/><w:i w:val="0"/><w:iCs w:val="0"/><w:smallCaps w:val="0"/><w:strike w:val="0"/><w:color w:val="000000"/><w:sz w:val="22"/><w:szCs w:val="22"/><w:u w:val="none"/><w:shd w:fill="auto" w:val="clear"/><w:vertAlign w:val="baseline"/><w:rtl w:val="0"/></w:rPr><w:t xml:space="preserve">Details of Valuation:</w:t></w:r></w:p><w:tbl><w:tblPr><w:tblStyle w:val="Table2"/><w:tblW w:w="10632.0" w:type="dxa"/><w:jc w:val="left"/><w:tblInd w:w="-176.0" w:type="dxa"/><w:tblBorders><w:top w:color="000000" w:space="0" w:sz="4" w:val="single"/><w:left w:color="000000" w:space="0" w:sz="4" w:val="single"/><w:bottom w:color="000000" w:space="0" w:sz="4" w:val="single"/><w:right w:color="000000" w:space="0" w:sz="4" w:val="single"/><w:insideH w:color="000000" w:space="0" w:sz="4" w:val="single"/><w:insideV w:color="000000" w:space="0" w:sz="4" w:val="single"/></w:tblBorders><w:tblLayout w:type="fixed"/><w:tblLook w:val="0400"/></w:tblPr><w:tblGrid><w:gridCol w:w="920"/><w:gridCol w:w="4017"/><w:gridCol w:w="1557"/><w:gridCol w:w="1728"/><w:gridCol w:w="2410"/><w:tblGridChange w:id="0"><w:tblGrid><w:gridCol w:w="920"/><w:gridCol w:w="4017"/><w:gridCol w:w="1557"/><w:gridCol w:w="1728"/><w:gridCol w:w="2410"/></w:tblGrid></w:tblGridChange></w:tblGrid><w:tr><w:trPr><w:cantSplit w:val="0"/><w:tblHeader w:val="0"/></w:trPr><w:tc><w:tcPr/><w:p><w:pPr><w:jc w:val="center"/><w:rPr><w:b w:val="1"/><w:bCs w:val="1"/></w:rPr></w:pPr><w:r><w:rPr><w:b w:val="1"/><w:bCs w:val="1"/><w:rtl w:val="0"/></w:rPr><w:t xml:space="preserve">Sr. No</w:t></w:r></w:p></w:tc><w:tc><w:tcPr/><w:p><w:pPr><w:jc w:val="center"/><w:rPr><w:b w:val="1"/><w:bCs w:val="1"/></w:rPr></w:pPr><w:r><w:rPr><w:b w:val="1"/><w:bCs w:val="1"/><w:rtl w:val="0"/></w:rPr><w:t xml:space="preserve">Description</w:t></w:r></w:p></w:tc><w:tc><w:tcPr/><w:p><w:pPr><w:jc w:val="center"/><w:rPr><w:b w:val="1"/><w:bCs w:val="1"/><w:highlight w:val="yellow"/></w:rPr></w:pPr><w:r><w:rPr><w:b w:val="1"/><w:bCs w:val="1"/><w:highlight w:val="yellow"/><w:rtl w:val="0"/></w:rPr><w:t xml:space="preserve"> Built up Area</w:t></w:r></w:p></w:tc><w:tc><w:tcPr/><w:p><w:pPr><w:jc w:val="center"/><w:rPr><w:b w:val="1"/><w:bCs w:val="1"/><w:highlight w:val="yellow"/></w:rPr></w:pPr><w:r><w:rPr><w:b w:val="1"/><w:bCs w:val="1"/><w:highlight w:val="yellow"/><w:rtl w:val="0"/></w:rPr><w:t xml:space="preserve">Rate per sq. ft.</w:t></w:r></w:p><w:p><w:pPr><w:jc w:val="center"/><w:rPr><w:b w:val="1"/><w:bCs w:val="1"/><w:highlight w:val="yellow"/></w:rPr></w:pPr><w:r><w:rPr><w:b w:val="1"/><w:bCs w:val="1"/><w:highlight w:val="yellow"/><w:rtl w:val="0"/></w:rPr><w:t xml:space="preserve">(Rs. / sq. ft.)</w:t></w:r></w:p></w:tc><w:tc><w:tcPr/><w:p><w:pPr><w:jc w:val="center"/><w:rPr><w:b w:val="1"/><w:bCs w:val="1"/><w:highlight w:val="yellow"/></w:rPr></w:pPr><w:r><w:rPr><w:b w:val="1"/><w:bCs w:val="1"/><w:highlight w:val="yellow"/><w:rtl w:val="0"/></w:rPr><w:t xml:space="preserve">Estimated Value Rs.</w:t></w:r></w:p></w:tc></w:tr><w:tr><w:trPr><w:cantSplit w:val="0"/><w:trHeight w:val="419" w:hRule="atLeast"/><w:tblHeader w:val="0"/></w:trPr><w:tc><w:tcPr/><w:p><w:pPr><w:rPr/></w:pPr><w:r><w:rPr><w:rtl w:val="0"/></w:rPr><w:t xml:space="preserve">1</w:t></w:r></w:p></w:tc><w:tc><w:tcPr/><w:p><w:pPr><w:rPr/></w:pPr><w:r><w:rPr><w:rtl w:val="0"/></w:rPr><w:t xml:space="preserve">Present value of the Flat No. 4901</w:t></w:r></w:p></w:tc><w:tc><w:tcPr/><w:p><w:pPr><w:jc w:val="center"/><w:rPr><w:b w:val="1"/><w:bCs w:val="1"/><w:highlight w:val="yellow"/></w:rPr></w:pPr><w:r><w:rPr><w:b w:val="1"/><w:bCs w:val="1"/><w:highlight w:val="yellow"/><w:rtl w:val="0"/></w:rPr><w:t xml:space="preserve">2825</w:t></w:r></w:p></w:tc><w:tc>&lt;w:tcPr/&gt;&lt;w:p&gt;&lt;w:pPr&gt;&lt;w:jc w:val="center"/&gt;&lt;w:rPr&gt;&lt;w:b w:val="1"/&gt;&lt;w:bCs w:val="1"/&gt;&lt;w:highlight w:val="yellow"/&gt;&lt;/w:rPr&gt;&lt;/w:pPr&gt;&lt;w:r&gt;&lt;w:rPr&gt;&lt;w:b w:val="1"/&gt;&lt;w:bCs w:val="1"/&gt;&lt;w:highlight w:val="yellow"/&gt;&lt;w:rtl w:val="0"/&gt;&lt;/w:rPr&gt;&lt;w:t xml:space="preserve"&gt;{compositeRatePerSqFt}</w:t></w:r></w:p></w:tc><w:tc>&lt;w:tcPr/&gt;&lt;w:p&gt;&lt;w:pPr&gt;&lt;w:jc w:val="center"/&gt;&lt;w:rPr&gt;&lt;w:highlight w:val="yellow"/&gt;&lt;/w:rPr&gt;&lt;/w:pPr&gt;&lt;w:r&gt;&lt;w:rPr&gt;&lt;w:b w:val="1"/&gt;&lt;w:bCs w:val="1"/&gt;&lt;w:highlight w:val="yellow"/&gt;&lt;w:rtl w:val="0"/&gt;&lt;/w:rPr&gt;&lt;w:t xml:space="preserve"&gt;{buildingValue}</w:t></w:r><w:r><w:rPr><w:rtl w:val="0"/></w:rPr></w:r></w:p></w:tc></w:tr><w:tr><w:trPr><w:cantSplit w:val="0"/><w:trHeight w:val="419" w:hRule="atLeast"/><w:tblHeader w:val="0"/></w:trPr><w:tc><w:tcPr/><w:p><w:pPr><w:rPr/></w:pPr><w:r><w:rPr><w:rtl w:val="0"/></w:rPr><w:t xml:space="preserve">2</w:t></w:r></w:p></w:tc><w:tc><w:tcPr/><w:p><w:pPr><w:rPr/></w:pPr><w:r><w:rPr><w:rtl w:val="0"/></w:rPr><w:t xml:space="preserve">Car Parking</w:t></w:r></w:p></w:tc><w:tc><w:tcPr/><w:p><w:pPr><w:jc w:val="center"/><w:rPr><w:b w:val="1"/><w:bCs w:val="1"/><w:highlight w:val="yellow"/></w:rPr></w:pPr><w:r><w:rPr><w:b w:val="1"/><w:bCs w:val="1"/><w:highlight w:val="yellow"/><w:rtl w:val="0"/></w:rPr><w:t xml:space="preserve">3</w:t></w:r></w:p></w:tc><w:tc>&lt;w:tcPr/&gt;&lt;w:p&gt;&lt;w:pPr&gt;&lt;w:jc w:val="center"/&gt;&lt;w:rPr&gt;&lt;w:b w:val="1"/&gt;&lt;w:bCs w:val="1"/&gt;&lt;w:highlight w:val="yellow"/&gt;&lt;/w:rPr&gt;&lt;/w:pPr&gt;&lt;w:r&gt;&lt;w:rPr&gt;&lt;w:b w:val="1"/&gt;&lt;w:bCs w:val="1"/&gt;&lt;w:highlight w:val="yellow"/&gt;&lt;w:rtl w:val="0"/&gt;&lt;/w:rPr&gt;&lt;w:t xml:space="preserve"&gt;{carParkingValuePerUnit}</w:t></w:r></w:p></w:tc><w:tc>&lt;w:tcPr/&gt;&lt;w:p&gt;&lt;w:pPr&gt;&lt;w:jc w:val="center"/&gt;&lt;w:rPr&gt;&lt;w:b w:val="1"/&gt;&lt;w:bCs w:val="1"/&gt;&lt;w:highlight w:val="yellow"/&gt;&lt;/w:rPr&gt;&lt;/w:pPr&gt;&lt;w:r&gt;&lt;w:rPr&gt;&lt;w:b w:val="1"/&gt;&lt;w:bCs w:val="1"/&gt;&lt;w:highlight w:val="yellow"/&gt;&lt;w:rtl w:val="0"/&gt;&lt;/w:rPr&gt;&lt;w:t xml:space="preserve"&gt;{carParkingTotalValue}</w:t></w:r></w:p></w:tc></w:tr><w:tr><w:trPr><w:cantSplit w:val="0"/><w:trHeight w:val="419" w:hRule="atLeast"/><w:tblHeader w:val="0"/></w:trPr><w:tc><w:tcPr/><w:p><w:pPr><w:rPr/></w:pPr><w:r><w:rPr><w:rtl w:val="0"/></w:rPr><w:t xml:space="preserve">3</w:t></w:r></w:p></w:tc><w:tc><w:tcPr><w:gridSpan w:val="3"/></w:tcPr><w:p><w:pPr><w:rPr><w:b w:val="1"/><w:bCs w:val="1"/><w:highlight w:val="yellow"/></w:rPr></w:pPr><w:r><w:rPr><w:highlight w:val="yellow"/><w:rtl w:val="0"/></w:rPr><w:t xml:space="preserve">Summary of Value </w:t></w:r><w:r><w:rPr><w:rtl w:val="0"/></w:rPr></w:r></w:p></w:tc><w:tc>&lt;w:tcPr/&gt;&lt;w:p&gt;&lt;w:pPr&gt;&lt;w:jc w:val="center"/&gt;&lt;w:rPr&gt;&lt;w:b w:val="1"/&gt;&lt;w:bCs w:val="1"/&gt;&lt;w:highlight w:val="yellow"/&gt;&lt;/w:rPr&gt;&lt;/w:pPr&gt;&lt;w:r&gt;&lt;w:rPr&gt;&lt;w:b w:val="1"/&gt;&lt;w:bCs w:val="1"/&gt;&lt;w:highlight w:val="yellow"/&gt;&lt;w:rtl w:val="0"/&gt;&lt;/w:rPr&gt;&lt;w:t xml:space="preserve"&gt;{finalValue}</w:t></w:r></w:p></w:tc></w:tr></w:tbl><w:p><w:pPr><w:spacing w:after="120" w:line="480" w:lineRule="auto"/><w:jc w:val="both"/><w:rPr><w:b w:val="1"/><w:bCs w:val="1"/></w:rPr></w:pPr><w:r><w:rPr><w:rtl w:val="0"/></w:rPr></w:r></w:p><w:p><w:pPr><w:spacing w:after="120" w:line="480" w:lineRule="auto"/><w:jc w:val="both"/><w:rPr><w:b w:val="1"/><w:bCs w:val="1"/></w:rPr></w:pPr><w:r><w:rPr><w:b w:val="1"/><w:bCs w:val="1"/><w:rtl w:val="0"/></w:rPr><w:t xml:space="preserve">Remarks:</w:t></w:r></w:p><w:p><w:pPr><w:keepNext w:val="0"/><w:keepLines w:val="0"/><w:pageBreakBefore w:val="0"/><w:widowControl w:val="1"/><w:numPr><w:ilvl w:val="0"/><w:numId w:val="5"/></w:numPr><w:pBdr><w:top w:space="0" w:sz="0" w:val="nil"/><w:left w:space="0" w:sz="0" w:val="nil"/><w:bottom w:space="0" w:sz="0" w:val="nil"/><w:right w:space="0" w:sz="0" w:val="nil"/><w:between w:space="0" w:sz="0" w:val="nil"/></w:pBdr><w:shd w:fill="auto" w:val="clear"/><w:spacing w:after="0" w:before="0" w:line="480" w:lineRule="auto"/><w:ind w:left="360" w:right="0" w:hanging="360"/><w:jc w:val="both"/><w:rPr><w:rFonts w:ascii="Calibri" w:cs="Calibri" w:eastAsia="Calibri" w:hAnsi="Calibri"/><w:b w:val="0"/><w:bCs w:val="0"/><w:i w:val="0"/><w:iCs w:val="0"/><w:smallCaps w:val="0"/><w:strike w:val="0"/><w:color w:val="000000"/><w:sz w:val="22"/><w:szCs w:val="22"/><w:u w:val="none"/><w:shd w:fill="auto" w:val="clear"/><w:vertAlign w:val="baseline"/></w:rPr></w:pPr><w:r><w:rPr><w:rFonts w:ascii="Calibri" w:cs="Calibri" w:eastAsia="Calibri" w:hAnsi="Calibri"/><w:b w:val="0"/><w:bCs w:val="0"/><w:i w:val="0"/><w:iCs w:val="0"/><w:smallCaps w:val="0"/><w:strike w:val="0"/><w:color w:val="000000"/><w:sz w:val="22"/><w:szCs w:val="22"/><w:u w:val="none"/><w:shd w:fill="auto" w:val="clear"/><w:vertAlign w:val="baseline"/><w:rtl w:val="0"/></w:rPr><w:t xml:space="preserve">Report finalized based on site visit and copy of Agreement for sale, Part OC, Index II, Share Certificate, Property Tax, etc. However, we have not been Provided, C.C., Typical Floor Plan, Approved plan, Electricity Bill, title report, etc. for Verification Purposed. </w:t></w:r></w:p><w:p><w:pPr><w:keepNext w:val="0"/><w:keepLines w:val="0"/><w:pageBreakBefore w:val="0"/><w:widowControl w:val="1"/><w:numPr><w:ilvl w:val="0"/><w:numId w:val="5"/></w:numPr><w:pBdr><w:top w:space="0" w:sz="0" w:val="nil"/><w:left w:space="0" w:sz="0" w:val="nil"/><w:bottom w:space="0" w:sz="0" w:val="nil"/><w:right w:space="0" w:sz="0" w:val="nil"/><w:between w:space="0" w:sz="0" w:val="nil"/></w:pBdr><w:shd w:fill="auto" w:val="clear"/><w:spacing w:after="0" w:before="0" w:line="480" w:lineRule="auto"/><w:ind w:left="360" w:right="0" w:hanging="360"/><w:jc w:val="both"/><w:rPr><w:rFonts w:ascii="Calibri" w:cs="Calibri" w:eastAsia="Calibri" w:hAnsi="Calibri"/><w:b w:val="0"/><w:bCs w:val="0"/><w:i w:val="0"/><w:iCs w:val="0"/><w:smallCaps w:val="0"/><w:strike w:val="0"/><w:color w:val="000000"/><w:sz w:val="22"/><w:szCs w:val="22"/><w:u w:val="none"/><w:shd w:fill="auto" w:val="clear"/><w:vertAlign w:val="baseline"/></w:rPr></w:pPr><w:r><w:rPr><w:rFonts w:ascii="Calibri" w:cs="Calibri" w:eastAsia="Calibri" w:hAnsi="Calibri"/><w:b w:val="0"/><w:bCs w:val="0"/><w:i w:val="0"/><w:iCs w:val="0"/><w:smallCaps w:val="0"/><w:strike w:val="0"/><w:color w:val="000000"/><w:sz w:val="22"/><w:szCs w:val="22"/><w:u w:val="none"/><w:shd w:fill="auto" w:val="clear"/><w:vertAlign w:val="baseline"/><w:rtl w:val="0"/></w:rPr><w:t xml:space="preserve">The said property is owner occupied at the time of visit.</w:t></w:r></w:p><w:p><w:pPr><w:keepNext w:val="0"/><w:keepLines w:val="0"/><w:pageBreakBefore w:val="0"/><w:widowControl w:val="1"/><w:numPr><w:ilvl w:val="0"/><w:numId w:val="5"/></w:numPr><w:pBdr><w:top w:space="0" w:sz="0" w:val="nil"/><w:left w:space="0" w:sz="0" w:val="nil"/><w:bottom w:space="0" w:sz="0" w:val="nil"/><w:right w:space="0" w:sz="0" w:val="nil"/><w:between w:space="0" w:sz="0" w:val="nil"/></w:pBdr><w:shd w:fill="auto" w:val="clear"/><w:spacing w:after="0" w:before="0" w:line="480" w:lineRule="auto"/><w:ind w:left="360" w:right="0" w:hanging="360"/><w:jc w:val="both"/><w:rPr><w:rFonts w:ascii="Calibri" w:cs="Calibri" w:eastAsia="Calibri" w:hAnsi="Calibri"/><w:b w:val="0"/><w:bCs w:val="0"/><w:i w:val="0"/><w:iCs w:val="0"/><w:smallCaps w:val="0"/><w:strike w:val="0"/><w:color w:val="000000"/><w:sz w:val="22"/><w:szCs w:val="22"/><w:u w:val="none"/><w:shd w:fill="auto" w:val="clear"/><w:vertAlign w:val="baseline"/></w:rPr></w:pPr><w:r><w:rPr><w:rFonts w:ascii="Calibri" w:cs="Calibri" w:eastAsia="Calibri" w:hAnsi="Calibri"/><w:b w:val="0"/><w:bCs w:val="0"/><w:i w:val="0"/><w:iCs w:val="0"/><w:smallCaps w:val="0"/><w:strike w:val="0"/><w:color w:val="000000"/><w:sz w:val="22"/><w:szCs w:val="22"/><w:u w:val="none"/><w:shd w:fill="auto" w:val="clear"/><w:vertAlign w:val="baseline"/><w:rtl w:val="0"/></w:rPr><w:t xml:space="preserve">Flat number was displayed on main entrance door.</w:t></w:r></w:p><w:p><w:pPr><w:keepNext w:val="0"/><w:keepLines w:val="0"/><w:pageBreakBefore w:val="0"/><w:widowControl w:val="1"/><w:numPr><w:ilvl w:val="0"/><w:numId w:val="5"/></w:numPr><w:pBdr><w:top w:space="0" w:sz="0" w:val="nil"/><w:left w:space="0" w:sz="0" w:val="nil"/><w:bottom w:space="0" w:sz="0" w:val="nil"/><w:right w:space="0" w:sz="0" w:val="nil"/><w:between w:space="0" w:sz="0" w:val="nil"/></w:pBdr><w:shd w:fill="auto" w:val="clear"/><w:spacing w:after="0" w:before="0" w:line="480" w:lineRule="auto"/><w:ind w:left="360" w:right="0" w:hanging="360"/><w:jc w:val="both"/><w:rPr><w:rFonts w:ascii="Calibri" w:cs="Calibri" w:eastAsia="Calibri" w:hAnsi="Calibri"/><w:b w:val="0"/><w:bCs w:val="0"/><w:i w:val="0"/><w:iCs w:val="0"/><w:smallCaps w:val="0"/><w:strike w:val="0"/><w:color w:val="000000"/><w:sz w:val="22"/><w:szCs w:val="22"/><w:u w:val="none"/><w:shd w:fill="auto" w:val="clear"/><w:vertAlign w:val="baseline"/></w:rPr></w:pPr><w:r><w:rPr><w:rFonts w:ascii="Calibri" w:cs="Calibri" w:eastAsia="Calibri" w:hAnsi="Calibri"/><w:b w:val="0"/><w:bCs w:val="0"/><w:i w:val="0"/><w:iCs w:val="0"/><w:smallCaps w:val="0"/><w:strike w:val="0"/><w:color w:val="000000"/><w:sz w:val="22"/><w:szCs w:val="22"/><w:u w:val="none"/><w:shd w:fill="auto" w:val="clear"/><w:vertAlign w:val="baseline"/><w:rtl w:val="0"/></w:rPr><w:t xml:space="preserve">The said property is situated in residential area.</w:t></w:r></w:p><w:p><w:pPr><w:keepNext w:val="0"/><w:keepLines w:val="0"/><w:pageBreakBefore w:val="0"/><w:widowControl w:val="1"/><w:numPr><w:ilvl w:val="0"/><w:numId w:val="5"/></w:numPr><w:pBdr><w:top w:space="0" w:sz="0" w:val="nil"/><w:left w:space="0" w:sz="0" w:val="nil"/><w:bottom w:space="0" w:sz="0" w:val="nil"/><w:right w:space="0" w:sz="0" w:val="nil"/><w:between w:space="0" w:sz="0" w:val="nil"/></w:pBdr><w:shd w:fill="auto" w:val="clear"/><w:spacing w:after="0" w:before="0" w:line="480" w:lineRule="auto"/><w:ind w:left="360" w:right="0" w:hanging="360"/><w:jc w:val="both"/><w:rPr><w:rFonts w:ascii="Calibri" w:cs="Calibri" w:eastAsia="Calibri" w:hAnsi="Calibri"/><w:b w:val="0"/><w:bCs w:val="0"/><w:i w:val="0"/><w:iCs w:val="0"/><w:smallCaps w:val="0"/><w:strike w:val="0"/><w:color w:val="000000"/><w:sz w:val="22"/><w:szCs w:val="22"/><w:u w:val="none"/><w:shd w:fill="auto" w:val="clear"/><w:vertAlign w:val="baseline"/></w:rPr></w:pPr><w:r><w:rPr><w:rFonts w:ascii="Calibri" w:cs="Calibri" w:eastAsia="Calibri" w:hAnsi="Calibri"/><w:b w:val="0"/><w:bCs w:val="0"/><w:i w:val="0"/><w:iCs w:val="0"/><w:smallCaps w:val="0"/><w:strike w:val="0"/><w:color w:val="000000"/><w:sz w:val="22"/><w:szCs w:val="22"/><w:u w:val="none"/><w:shd w:fill="auto" w:val="clear"/><w:vertAlign w:val="baseline"/><w:rtl w:val="0"/></w:rPr><w:t xml:space="preserve">Property is inspected as shown by Mrs. Moksha  (Owner). </w:t></w:r></w:p><w:p><w:pPr><w:keepNext w:val="0"/><w:keepLines w:val="0"/><w:pageBreakBefore w:val="0"/><w:widowControl w:val="1"/><w:numPr><w:ilvl w:val="0"/><w:numId w:val="5"/></w:numPr><w:pBdr><w:top w:space="0" w:sz="0" w:val="nil"/><w:left w:space="0" w:sz="0" w:val="nil"/><w:bottom w:space="0" w:sz="0" w:val="nil"/><w:right w:space="0" w:sz="0" w:val="nil"/><w:between w:space="0" w:sz="0" w:val="nil"/></w:pBdr><w:shd w:fill="auto" w:val="clear"/><w:spacing w:after="0" w:before="0" w:line="480" w:lineRule="auto"/><w:ind w:left="360" w:right="0" w:hanging="360"/><w:jc w:val="both"/><w:rPr><w:rFonts w:ascii="Calibri" w:cs="Calibri" w:eastAsia="Calibri" w:hAnsi="Calibri"/><w:b w:val="0"/><w:bCs w:val="0"/><w:i w:val="0"/><w:iCs w:val="0"/><w:smallCaps w:val="0"/><w:strike w:val="0"/><w:color w:val="000000"/><w:sz w:val="22"/><w:szCs w:val="22"/><w:u w:val="none"/><w:shd w:fill="auto" w:val="clear"/><w:vertAlign w:val="baseline"/></w:rPr></w:pPr><w:r><w:rPr><w:rFonts w:ascii="Calibri" w:cs="Calibri" w:eastAsia="Calibri" w:hAnsi="Calibri"/><w:b w:val="0"/><w:bCs w:val="0"/><w:i w:val="0"/><w:iCs w:val="0"/><w:smallCaps w:val="0"/><w:strike w:val="0"/><w:color w:val="000000"/><w:sz w:val="22"/><w:szCs w:val="22"/><w:u w:val="none"/><w:shd w:fill="auto" w:val="clear"/><w:vertAlign w:val="baseline"/><w:rtl w:val="0"/></w:rPr><w:t xml:space="preserve">We consider the area given in the Agreement for sale/Index II declared by the party and submitted for registration with the government authorities as final for valuation purpose. Any area that is not stated in the Agreement for sale/Index II is not considered for valuation unless the area is measured by us in which case that may be considered for valuation purpose.</w:t></w:r></w:p><w:p><w:pPr><w:keepNext w:val="0"/><w:keepLines w:val="0"/><w:pageBreakBefore w:val="0"/><w:widowControl w:val="1"/><w:numPr><w:ilvl w:val="0"/><w:numId w:val="5"/></w:numPr><w:pBdr><w:top w:space="0" w:sz="0" w:val="nil"/><w:left w:space="0" w:sz="0" w:val="nil"/><w:bottom w:space="0" w:sz="0" w:val="nil"/><w:right w:space="0" w:sz="0" w:val="nil"/><w:between w:space="0" w:sz="0" w:val="nil"/></w:pBdr><w:shd w:fill="auto" w:val="clear"/><w:spacing w:after="0" w:before="0" w:line="480" w:lineRule="auto"/><w:ind w:left="360" w:right="425" w:hanging="360"/><w:jc w:val="both"/><w:rPr><w:rFonts w:ascii="Calibri" w:cs="Calibri" w:eastAsia="Calibri" w:hAnsi="Calibri"/><w:b w:val="0"/><w:bCs w:val="0"/><w:i w:val="0"/><w:iCs w:val="0"/><w:smallCaps w:val="0"/><w:strike w:val="0"/><w:color w:val="000000"/><w:sz w:val="22"/><w:szCs w:val="22"/><w:u w:val="none"/><w:shd w:fill="auto" w:val="clear"/><w:vertAlign w:val="baseline"/></w:rPr></w:pPr><w:r><w:rPr><w:rFonts w:ascii="Calibri" w:cs="Calibri" w:eastAsia="Calibri" w:hAnsi="Calibri"/><w:b w:val="0"/><w:bCs w:val="0"/><w:i w:val="0"/><w:iCs w:val="0"/><w:smallCaps w:val="0"/><w:strike w:val="0"/><w:color w:val="000000"/><w:sz w:val="22"/><w:szCs w:val="22"/><w:u w:val="none"/><w:shd w:fill="auto" w:val="clear"/><w:vertAlign w:val="baseline"/><w:rtl w:val="0"/></w:rPr><w:t xml:space="preserve">The scope of our valuation work is only for banks financial/loan purpose. Further, please be noted that this report shall not be used for any litigation purpose. </w:t></w:r></w:p><w:p><w:pPr><w:numPr><w:ilvl w:val="0"/><w:numId w:val="5"/></w:numPr><w:spacing w:after="0" w:line="480" w:lineRule="auto"/><w:ind w:left="360" w:right="425" w:hanging="360"/><w:jc w:val="both"/><w:rPr/></w:pPr><w:r><w:rPr><w:rtl w:val="0"/></w:rPr><w:t xml:space="preserve">Encumbrance of Loan, Government and other dues, stamp duty, registration charges, transfer charges etc, if any are not considered in the valuation. We assumed that the assets are free from encumbrance unless otherwise stated to us by the party in writing.</w:t></w:r></w:p><w:p><w:pPr><w:keepNext w:val="0"/><w:keepLines w:val="0"/><w:pageBreakBefore w:val="0"/><w:widowControl w:val="1"/><w:numPr><w:ilvl w:val="0"/><w:numId w:val="5"/></w:numPr><w:pBdr><w:top w:space="0" w:sz="0" w:val="nil"/><w:left w:space="0" w:sz="0" w:val="nil"/><w:bottom w:space="0" w:sz="0" w:val="nil"/><w:right w:space="0" w:sz="0" w:val="nil"/><w:between w:space="0" w:sz="0" w:val="nil"/></w:pBdr><w:shd w:fill="auto" w:val="clear"/><w:spacing w:after="0" w:before="0" w:line="480" w:lineRule="auto"/><w:ind w:left="360" w:right="425" w:hanging="360"/><w:jc w:val="both"/><w:rPr><w:rFonts w:ascii="Calibri" w:cs="Calibri" w:eastAsia="Calibri" w:hAnsi="Calibri"/><w:b w:val="0"/><w:bCs w:val="0"/><w:i w:val="0"/><w:iCs w:val="0"/><w:smallCaps w:val="0"/><w:strike w:val="0"/><w:color w:val="000000"/><w:sz w:val="22"/><w:szCs w:val="22"/><w:u w:val="none"/><w:shd w:fill="auto" w:val="clear"/><w:vertAlign w:val="baseline"/></w:rPr></w:pPr><w:r><w:rPr><w:rFonts w:ascii="Calibri" w:cs="Calibri" w:eastAsia="Calibri" w:hAnsi="Calibri"/><w:b w:val="0"/><w:bCs w:val="0"/><w:i w:val="0"/><w:iCs w:val="0"/><w:smallCaps w:val="0"/><w:strike w:val="0"/><w:color w:val="000000"/><w:sz w:val="22"/><w:szCs w:val="22"/><w:u w:val="none"/><w:shd w:fill="auto" w:val="clear"/><w:vertAlign w:val="baseline"/><w:rtl w:val="0"/></w:rPr><w:t xml:space="preserve">The value given in our report is the estimate of the Fair Market value of the property as on date, considering various aspects of the property as mentioned above.  </w:t></w:r></w:p><w:p><w:pPr><w:rPr/></w:pPr><w:r><w:br w:type="page"/></w:r><w:r><w:rPr><w:rtl w:val="0"/></w:rPr></w:r></w:p><w:p><w:pPr><w:keepNext w:val="0"/><w:keepLines w:val="0"/><w:pageBreakBefore w:val="0"/><w:widowControl w:val="1"/><w:pBdr><w:top w:space="0" w:sz="0" w:val="nil"/><w:left w:space="0" w:sz="0" w:val="nil"/><w:bottom w:space="0" w:sz="0" w:val="nil"/><w:right w:space="0" w:sz="0" w:val="nil"/><w:between w:space="0" w:sz="0" w:val="nil"/></w:pBdr><w:shd w:fill="auto" w:val="clear"/><w:spacing w:after="0" w:before="0" w:line="276" w:lineRule="auto"/><w:ind w:left="0" w:right="0" w:firstLine="0"/><w:jc w:val="both"/><w:rPr><w:rFonts w:ascii="Calibri" w:cs="Calibri" w:eastAsia="Calibri" w:hAnsi="Calibri"/><w:b w:val="1"/><w:bCs w:val="1"/><w:i w:val="0"/><w:iCs w:val="0"/><w:smallCaps w:val="0"/><w:strike w:val="0"/><w:color w:val="000000"/><w:sz w:val="22"/><w:szCs w:val="22"/><w:u w:val="none"/><w:shd w:fill="auto" w:val="clear"/><w:vertAlign w:val="baseline"/></w:rPr></w:pPr><w:r><w:rPr><w:rtl w:val="0"/></w:rPr></w:r></w:p><w:p><w:pPr><w:keepNext w:val="0"/><w:keepLines w:val="0"/><w:pageBreakBefore w:val="0"/><w:widowControl w:val="1"/><w:pBdr><w:top w:space="0" w:sz="0" w:val="nil"/><w:left w:space="0" w:sz="0" w:val="nil"/><w:bottom w:space="0" w:sz="0" w:val="nil"/><w:right w:space="0" w:sz="0" w:val="nil"/><w:between w:space="0" w:sz="0" w:val="nil"/></w:pBdr><w:shd w:fill="auto" w:val="clear"/><w:spacing w:after="0" w:before="0" w:line="276" w:lineRule="auto"/><w:ind w:left="0" w:right="0" w:firstLine="0"/><w:jc w:val="both"/><w:rPr><w:rFonts w:ascii="Calibri" w:cs="Calibri" w:eastAsia="Calibri" w:hAnsi="Calibri"/><w:b w:val="1"/><w:bCs w:val="1"/><w:i w:val="0"/><w:iCs w:val="0"/><w:smallCaps w:val="0"/><w:strike w:val="0"/><w:color w:val="000000"/><w:sz w:val="22"/><w:szCs w:val="22"/><w:u w:val="none"/><w:shd w:fill="auto" w:val="clear"/><w:vertAlign w:val="baseline"/></w:rPr></w:pPr><w:r><w:rPr><w:rFonts w:ascii="Calibri" w:cs="Calibri" w:eastAsia="Calibri" w:hAnsi="Calibri"/><w:b w:val="1"/><w:bCs w:val="1"/><w:i w:val="0"/><w:iCs w:val="0"/><w:smallCaps w:val="0"/><w:strike w:val="0"/><w:color w:val="000000"/><w:sz w:val="22"/><w:szCs w:val="22"/><w:u w:val="none"/><w:shd w:fill="auto" w:val="clear"/><w:vertAlign w:val="baseline"/><w:rtl w:val="0"/></w:rPr><w:t xml:space="preserve">As a result of my appraisal and analysis, it is my considered opinion that the present market value of the Above property in prevailing condition with aforesaid specifications is value </w:t></w:r><w:r><w:rPr><w:rFonts w:ascii="Calibri" w:cs="Calibri" w:eastAsia="Calibri" w:hAnsi="Calibri"/><w:b w:val="1"/><w:bCs w:val="1"/><w:i w:val="0"/><w:iCs w:val="0"/><w:smallCaps w:val="0"/><w:strike w:val="0"/><w:color w:val="000000"/><w:sz w:val="22"/><w:szCs w:val="22"/><w:highlight w:val="yellow"/><w:u w:val="none"/><w:vertAlign w:val="baseline"/><w:rtl w:val="0"/></w:rPr><w:t xml:space="preserve">{finalValue} ({finalValueWords})</w:t></w:r><w:r><w:rPr><w:rFonts w:ascii="Calibri" w:cs="Calibri" w:eastAsia="Calibri" w:hAnsi="Calibri"/><w:b w:val="1"/><w:bCs w:val="1"/><w:i w:val="0"/><w:iCs w:val="0"/><w:smallCaps w:val="0"/><w:strike w:val="0"/><w:color w:val="000000"/><w:sz w:val="22"/><w:szCs w:val="22"/><w:u w:val="none"/><w:shd w:fill="auto" w:val="clear"/><w:vertAlign w:val="baseline"/><w:rtl w:val="0"/></w:rPr><w:t xml:space="preserve"> </w:t></w:r></w:p><w:p><w:pPr><w:keepNext w:val="0"/><w:keepLines w:val="0"/><w:pageBreakBefore w:val="0"/><w:widowControl w:val="1"/><w:pBdr><w:top w:space="0" w:sz="0" w:val="nil"/><w:left w:space="0" w:sz="0" w:val="nil"/><w:bottom w:space="0" w:sz="0" w:val="nil"/><w:right w:space="0" w:sz="0" w:val="nil"/><w:between w:space="0" w:sz="0" w:val="nil"/></w:pBdr><w:shd w:fill="auto" w:val="clear"/><w:spacing w:after="0" w:before="0" w:line="276" w:lineRule="auto"/><w:ind w:left="0" w:right="0" w:firstLine="0"/><w:jc w:val="both"/><w:rPr><w:rFonts w:ascii="Calibri" w:cs="Calibri" w:eastAsia="Calibri" w:hAnsi="Calibri"/><w:b w:val="1"/><w:bCs w:val="1"/><w:i w:val="0"/><w:iCs w:val="0"/><w:smallCaps w:val="0"/><w:strike w:val="0"/><w:color w:val="000000"/><w:sz w:val="22"/><w:szCs w:val="22"/><w:u w:val="none"/><w:shd w:fill="auto" w:val="clear"/><w:vertAlign w:val="baseline"/></w:rPr></w:pPr><w:r><w:rPr><w:rtl w:val="0"/></w:rPr></w:r></w:p><w:tbl><w:tblPr><w:tblStyle w:val="Table3"/><w:tblW w:w="10150.0" w:type="dxa"/><w:jc w:val="left"/><w:tblBorders><w:top w:color="000000" w:space="0" w:sz="4" w:val="single"/><w:left w:color="000000" w:space="0" w:sz="4" w:val="single"/><w:bottom w:color="000000" w:space="0" w:sz="4" w:val="single"/><w:right w:color="000000" w:space="0" w:sz="4" w:val="single"/><w:insideH w:color="000000" w:space="0" w:sz="4" w:val="single"/><w:insideV w:color="000000" w:space="0" w:sz="4" w:val="single"/></w:tblBorders><w:tblLayout w:type="fixed"/><w:tblLook w:val="0400"/></w:tblPr><w:tblGrid><w:gridCol w:w="657"/><w:gridCol w:w="4142"/><w:gridCol w:w="5351"/><w:tblGridChange w:id="0"><w:tblGrid><w:gridCol w:w="657"/><w:gridCol w:w="4142"/><w:gridCol w:w="5351"/></w:tblGrid></w:tblGridChange></w:tblGrid><w:tr><w:trPr><w:cantSplit w:val="0"/><w:trHeight w:val="505" w:hRule="atLeast"/><w:tblHeader w:val="0"/></w:trPr><w:tc><w:tcPr/><w:p><w:pPr><w:keepNext w:val="0"/><w:keepLines w:val="0"/><w:pageBreakBefore w:val="0"/><w:widowControl w:val="1"/><w:pBdr><w:top w:space="0" w:sz="0" w:val="nil"/><w:left w:space="0" w:sz="0" w:val="nil"/><w:bottom w:space="0" w:sz="0" w:val="nil"/><w:right w:space="0" w:sz="0" w:val="nil"/><w:between w:space="0" w:sz="0" w:val="nil"/></w:pBdr><w:shd w:fill="auto" w:val="clear"/><w:spacing w:after="0" w:before="0" w:line="276" w:lineRule="auto"/><w:ind w:left="0" w:right="0" w:firstLine="0"/><w:jc w:val="center"/><w:rPr><w:rFonts w:ascii="Calibri" w:cs="Calibri" w:eastAsia="Calibri" w:hAnsi="Calibri"/><w:b w:val="1"/><w:bCs w:val="1"/><w:i w:val="0"/><w:iCs w:val="0"/><w:smallCaps w:val="0"/><w:strike w:val="0"/><w:color w:val="000000"/><w:sz w:val="22"/><w:szCs w:val="22"/><w:u w:val="none"/><w:shd w:fill="auto" w:val="clear"/><w:vertAlign w:val="baseline"/></w:rPr></w:pPr><w:r><w:rPr><w:rFonts w:ascii="Calibri" w:cs="Calibri" w:eastAsia="Calibri" w:hAnsi="Calibri"/><w:b w:val="1"/><w:bCs w:val="1"/><w:i w:val="0"/><w:iCs w:val="0"/><w:smallCaps w:val="0"/><w:strike w:val="0"/><w:color w:val="000000"/><w:sz w:val="22"/><w:szCs w:val="22"/><w:u w:val="none"/><w:shd w:fill="auto" w:val="clear"/><w:vertAlign w:val="baseline"/><w:rtl w:val="0"/></w:rPr><w:t xml:space="preserve">1</w:t></w:r></w:p></w:tc><w:tc><w:tcPr/><w:p><w:pPr><w:keepNext w:val="0"/><w:keepLines w:val="0"/><w:pageBreakBefore w:val="0"/><w:widowControl w:val="1"/><w:pBdr><w:top w:space="0" w:sz="0" w:val="nil"/><w:left w:space="0" w:sz="0" w:val="nil"/><w:bottom w:space="0" w:sz="0" w:val="nil"/><w:right w:space="0" w:sz="0" w:val="nil"/><w:between w:space="0" w:sz="0" w:val="nil"/></w:pBdr><w:shd w:fill="auto" w:val="clear"/><w:spacing w:after="0" w:before="0" w:line="276" w:lineRule="auto"/><w:ind w:left="0" w:right="0" w:firstLine="0"/><w:jc w:val="left"/><w:rPr><w:rFonts w:ascii="Calibri" w:cs="Calibri" w:eastAsia="Calibri" w:hAnsi="Calibri"/><w:b w:val="1"/><w:bCs w:val="1"/><w:i w:val="0"/><w:iCs w:val="0"/><w:smallCaps w:val="0"/><w:strike w:val="0"/><w:color w:val="000000"/><w:sz w:val="22"/><w:szCs w:val="22"/><w:u w:val="none"/><w:shd w:fill="auto" w:val="clear"/><w:vertAlign w:val="baseline"/></w:rPr></w:pPr><w:r><w:rPr><w:rFonts w:ascii="Calibri" w:cs="Calibri" w:eastAsia="Calibri" w:hAnsi="Calibri"/><w:b w:val="1"/><w:bCs w:val="1"/><w:i w:val="0"/><w:iCs w:val="0"/><w:smallCaps w:val="0"/><w:strike w:val="0"/><w:color w:val="000000"/><w:sz w:val="22"/><w:szCs w:val="22"/><w:u w:val="none"/><w:shd w:fill="auto" w:val="clear"/><w:vertAlign w:val="baseline"/><w:rtl w:val="0"/></w:rPr><w:t xml:space="preserve">Fair Market Value of immovable property:</w:t></w:r></w:p></w:tc><w:tc><w:tcPr/><w:p><w:pPr><w:keepNext w:val="0"/><w:keepLines w:val="0"/><w:pageBreakBefore w:val="0"/><w:widowControl w:val="1"/><w:pBdr><w:top w:space="0" w:sz="0" w:val="nil"/><w:left w:space="0" w:sz="0" w:val="nil"/><w:bottom w:space="0" w:sz="0" w:val="nil"/><w:right w:space="0" w:sz="0" w:val="nil"/><w:between w:space="0" w:sz="0" w:val="nil"/></w:pBdr><w:shd w:fill="auto" w:val="clear"/><w:spacing w:after="0" w:before="0" w:line="276" w:lineRule="auto"/><w:ind w:left="0" w:right="0" w:firstLine="0"/><w:jc w:val="both"/><w:rPr><w:rFonts w:ascii="Calibri" w:cs="Calibri" w:eastAsia="Calibri" w:hAnsi="Calibri"/><w:b w:val="1"/><w:bCs w:val="1"/><w:i w:val="0"/><w:iCs w:val="0"/><w:smallCaps w:val="0"/><w:strike w:val="0"/><w:color w:val="000000"/><w:sz w:val="22"/><w:szCs w:val="22"/><w:u w:val="none"/><w:shd w:fill="auto" w:val="clear"/><w:vertAlign w:val="baseline"/></w:rPr></w:pPr><w:r><w:rPr><w:rtl w:val="0"/></w:rPr></w:r></w:p></w:tc></w:tr><w:tr><w:trPr><w:cantSplit w:val="0"/><w:trHeight w:val="781" w:hRule="atLeast"/><w:tblHeader w:val="0"/></w:trPr><w:tc><w:tcPr/><w:p><w:pPr><w:keepNext w:val="0"/><w:keepLines w:val="0"/><w:pageBreakBefore w:val="0"/><w:widowControl w:val="1"/><w:pBdr><w:top w:space="0" w:sz="0" w:val="nil"/><w:left w:space="0" w:sz="0" w:val="nil"/><w:bottom w:space="0" w:sz="0" w:val="nil"/><w:right w:space="0" w:sz="0" w:val="nil"/><w:between w:space="0" w:sz="0" w:val="nil"/></w:pBdr><w:shd w:fill="auto" w:val="clear"/><w:spacing w:after="0" w:before="0" w:line="276" w:lineRule="auto"/><w:ind w:left="0" w:right="0" w:firstLine="0"/><w:jc w:val="center"/><w:rPr><w:rFonts w:ascii="Calibri" w:cs="Calibri" w:eastAsia="Calibri" w:hAnsi="Calibri"/><w:b w:val="1"/><w:bCs w:val="1"/><w:i w:val="0"/><w:iCs w:val="0"/><w:smallCaps w:val="0"/><w:strike w:val="0"/><w:color w:val="000000"/><w:sz w:val="22"/><w:szCs w:val="22"/><w:u w:val="none"/><w:shd w:fill="auto" w:val="clear"/><w:vertAlign w:val="baseline"/></w:rPr></w:pPr><w:r><w:rPr><w:rFonts w:ascii="Calibri" w:cs="Calibri" w:eastAsia="Calibri" w:hAnsi="Calibri"/><w:b w:val="1"/><w:bCs w:val="1"/><w:i w:val="0"/><w:iCs w:val="0"/><w:smallCaps w:val="0"/><w:strike w:val="0"/><w:color w:val="000000"/><w:sz w:val="22"/><w:szCs w:val="22"/><w:u w:val="none"/><w:shd w:fill="auto" w:val="clear"/><w:vertAlign w:val="baseline"/><w:rtl w:val="0"/></w:rPr><w:t xml:space="preserve">2</w:t></w:r></w:p></w:tc><w:tc><w:tcPr/><w:p><w:pPr><w:keepNext w:val="0"/><w:keepLines w:val="0"/><w:pageBreakBefore w:val="0"/><w:widowControl w:val="1"/><w:pBdr><w:top w:space="0" w:sz="0" w:val="nil"/><w:left w:space="0" w:sz="0" w:val="nil"/><w:bottom w:space="0" w:sz="0" w:val="nil"/><w:right w:space="0" w:sz="0" w:val="nil"/><w:between w:space="0" w:sz="0" w:val="nil"/></w:pBdr><w:shd w:fill="auto" w:val="clear"/><w:spacing w:after="0" w:before="0" w:line="276" w:lineRule="auto"/><w:ind w:left="0" w:right="0" w:firstLine="0"/><w:jc w:val="left"/><w:rPr><w:rFonts w:ascii="Calibri" w:cs="Calibri" w:eastAsia="Calibri" w:hAnsi="Calibri"/><w:b w:val="1"/><w:bCs w:val="1"/><w:i w:val="0"/><w:iCs w:val="0"/><w:smallCaps w:val="0"/><w:strike w:val="0"/><w:color w:val="000000"/><w:sz w:val="22"/><w:szCs w:val="22"/><w:u w:val="none"/><w:shd w:fill="auto" w:val="clear"/><w:vertAlign w:val="baseline"/></w:rPr></w:pPr><w:r><w:rPr><w:rFonts w:ascii="Calibri" w:cs="Calibri" w:eastAsia="Calibri" w:hAnsi="Calibri"/><w:b w:val="1"/><w:bCs w:val="1"/><w:i w:val="0"/><w:iCs w:val="0"/><w:smallCaps w:val="0"/><w:strike w:val="0"/><w:color w:val="000000"/><w:sz w:val="22"/><w:szCs w:val="22"/><w:u w:val="none"/><w:shd w:fill="auto" w:val="clear"/><w:vertAlign w:val="baseline"/><w:rtl w:val="0"/></w:rPr><w:t xml:space="preserve">Realizable Value of immovable property: (90%)</w:t></w:r></w:p></w:tc><w:tc><w:tcPr/><w:p><w:pPr><w:keepNext w:val="0"/><w:keepLines w:val="0"/><w:pageBreakBefore w:val="0"/><w:widowControl w:val="1"/><w:pBdr><w:top w:space="0" w:sz="0" w:val="nil"/><w:left w:space="0" w:sz="0" w:val="nil"/><w:bottom w:space="0" w:sz="0" w:val="nil"/><w:right w:space="0" w:sz="0" w:val="nil"/><w:between w:space="0" w:sz="0" w:val="nil"/></w:pBdr><w:shd w:fill="auto" w:val="clear"/><w:spacing w:after="0" w:before="0" w:line="276" w:lineRule="auto"/><w:ind w:left="0" w:right="0" w:firstLine="0"/><w:jc w:val="left"/><w:rPr><w:rFonts w:ascii="Calibri" w:cs="Calibri" w:eastAsia="Calibri" w:hAnsi="Calibri"/><w:b w:val="1"/><w:bCs w:val="1"/><w:i w:val="0"/><w:iCs w:val="0"/><w:smallCaps w:val="0"/><w:strike w:val="0"/><w:color w:val="000000"/><w:sz w:val="22"/><w:szCs w:val="22"/><w:u w:val="none"/><w:shd w:fill="auto" w:val="clear"/><w:vertAlign w:val="baseline"/></w:rPr></w:pPr><w:r><w:rPr><w:rtl w:val="0"/></w:rPr></w:r></w:p></w:tc></w:tr><w:tr><w:trPr><w:cantSplit w:val="0"/><w:trHeight w:val="768" w:hRule="atLeast"/><w:tblHeader w:val="0"/></w:trPr><w:tc><w:tcPr/><w:p><w:pPr><w:keepNext w:val="0"/><w:keepLines w:val="0"/><w:pageBreakBefore w:val="0"/><w:widowControl w:val="1"/><w:pBdr><w:top w:space="0" w:sz="0" w:val="nil"/><w:left w:space="0" w:sz="0" w:val="nil"/><w:bottom w:space="0" w:sz="0" w:val="nil"/><w:right w:space="0" w:sz="0" w:val="nil"/><w:between w:space="0" w:sz="0" w:val="nil"/></w:pBdr><w:shd w:fill="auto" w:val="clear"/><w:spacing w:after="0" w:before="0" w:line="276" w:lineRule="auto"/><w:ind w:left="0" w:right="0" w:firstLine="0"/><w:jc w:val="center"/><w:rPr><w:rFonts w:ascii="Calibri" w:cs="Calibri" w:eastAsia="Calibri" w:hAnsi="Calibri"/><w:b w:val="1"/><w:bCs w:val="1"/><w:i w:val="0"/><w:iCs w:val="0"/><w:smallCaps w:val="0"/><w:strike w:val="0"/><w:color w:val="000000"/><w:sz w:val="22"/><w:szCs w:val="22"/><w:u w:val="none"/><w:shd w:fill="auto" w:val="clear"/><w:vertAlign w:val="baseline"/></w:rPr></w:pPr><w:r><w:rPr><w:rFonts w:ascii="Calibri" w:cs="Calibri" w:eastAsia="Calibri" w:hAnsi="Calibri"/><w:b w:val="1"/><w:bCs w:val="1"/><w:i w:val="0"/><w:iCs w:val="0"/><w:smallCaps w:val="0"/><w:strike w:val="0"/><w:color w:val="000000"/><w:sz w:val="22"/><w:szCs w:val="22"/><w:u w:val="none"/><w:shd w:fill="auto" w:val="clear"/><w:vertAlign w:val="baseline"/><w:rtl w:val="0"/></w:rPr><w:t xml:space="preserve">3</w:t></w:r></w:p></w:tc><w:tc><w:tcPr/><w:p><w:pPr><w:keepNext w:val="0"/><w:keepLines w:val="0"/><w:pageBreakBefore w:val="0"/><w:widowControl w:val="1"/><w:pBdr><w:top w:space="0" w:sz="0" w:val="nil"/><w:left w:space="0" w:sz="0" w:val="nil"/><w:bottom w:space="0" w:sz="0" w:val="nil"/><w:right w:space="0" w:sz="0" w:val="nil"/><w:between w:space="0" w:sz="0" w:val="nil"/></w:pBdr><w:shd w:fill="auto" w:val="clear"/><w:spacing w:after="0" w:before="0" w:line="276" w:lineRule="auto"/><w:ind w:left="0" w:right="0" w:firstLine="0"/><w:jc w:val="left"/><w:rPr><w:rFonts w:ascii="Calibri" w:cs="Calibri" w:eastAsia="Calibri" w:hAnsi="Calibri"/><w:b w:val="1"/><w:bCs w:val="1"/><w:i w:val="0"/><w:iCs w:val="0"/><w:smallCaps w:val="0"/><w:strike w:val="0"/><w:color w:val="000000"/><w:sz w:val="22"/><w:szCs w:val="22"/><w:u w:val="none"/><w:shd w:fill="auto" w:val="clear"/><w:vertAlign w:val="baseline"/></w:rPr></w:pPr><w:r><w:rPr><w:rFonts w:ascii="Calibri" w:cs="Calibri" w:eastAsia="Calibri" w:hAnsi="Calibri"/><w:b w:val="1"/><w:bCs w:val="1"/><w:i w:val="0"/><w:iCs w:val="0"/><w:smallCaps w:val="0"/><w:strike w:val="0"/><w:color w:val="000000"/><w:sz w:val="22"/><w:szCs w:val="22"/><w:u w:val="none"/><w:shd w:fill="auto" w:val="clear"/><w:vertAlign w:val="baseline"/><w:rtl w:val="0"/></w:rPr><w:t xml:space="preserve">Distress Sale Value of immovable property: (80%)</w:t></w:r></w:p></w:tc><w:tc><w:tcPr/><w:p><w:pPr><w:keepNext w:val="0"/><w:keepLines w:val="0"/><w:pageBreakBefore w:val="0"/><w:widowControl w:val="1"/><w:pBdr><w:top w:space="0" w:sz="0" w:val="nil"/><w:left w:space="0" w:sz="0" w:val="nil"/><w:bottom w:space="0" w:sz="0" w:val="nil"/><w:right w:space="0" w:sz="0" w:val="nil"/><w:between w:space="0" w:sz="0" w:val="nil"/></w:pBdr><w:shd w:fill="auto" w:val="clear"/><w:spacing w:after="0" w:before="0" w:line="276" w:lineRule="auto"/><w:ind w:left="0" w:right="0" w:firstLine="0"/><w:jc w:val="left"/><w:rPr><w:rFonts w:ascii="Calibri" w:cs="Calibri" w:eastAsia="Calibri" w:hAnsi="Calibri"/><w:b w:val="1"/><w:bCs w:val="1"/><w:i w:val="0"/><w:iCs w:val="0"/><w:smallCaps w:val="0"/><w:strike w:val="0"/><w:color w:val="000000"/><w:sz w:val="22"/><w:szCs w:val="22"/><w:u w:val="none"/><w:shd w:fill="auto" w:val="clear"/><w:vertAlign w:val="baseline"/></w:rPr></w:pPr><w:r><w:rPr><w:rtl w:val="0"/></w:rPr></w:r></w:p></w:tc></w:tr><w:tr><w:trPr><w:cantSplit w:val="0"/><w:trHeight w:val="539" w:hRule="atLeast"/><w:tblHeader w:val="0"/></w:trPr><w:tc><w:tcPr/><w:p><w:pPr><w:keepNext w:val="0"/><w:keepLines w:val="0"/><w:pageBreakBefore w:val="0"/><w:widowControl w:val="1"/><w:pBdr><w:top w:space="0" w:sz="0" w:val="nil"/><w:left w:space="0" w:sz="0" w:val="nil"/><w:bottom w:space="0" w:sz="0" w:val="nil"/><w:right w:space="0" w:sz="0" w:val="nil"/><w:between w:space="0" w:sz="0" w:val="nil"/></w:pBdr><w:shd w:fill="auto" w:val="clear"/><w:spacing w:after="0" w:before="0" w:line="276" w:lineRule="auto"/><w:ind w:left="0" w:right="0" w:firstLine="0"/><w:jc w:val="center"/><w:rPr><w:rFonts w:ascii="Calibri" w:cs="Calibri" w:eastAsia="Calibri" w:hAnsi="Calibri"/><w:b w:val="1"/><w:bCs w:val="1"/><w:i w:val="0"/><w:iCs w:val="0"/><w:smallCaps w:val="0"/><w:strike w:val="0"/><w:color w:val="000000"/><w:sz w:val="22"/><w:szCs w:val="22"/><w:u w:val="none"/><w:shd w:fill="auto" w:val="clear"/><w:vertAlign w:val="baseline"/></w:rPr></w:pPr><w:r><w:rPr><w:rFonts w:ascii="Calibri" w:cs="Calibri" w:eastAsia="Calibri" w:hAnsi="Calibri"/><w:b w:val="1"/><w:bCs w:val="1"/><w:i w:val="0"/><w:iCs w:val="0"/><w:smallCaps w:val="0"/><w:strike w:val="0"/><w:color w:val="000000"/><w:sz w:val="22"/><w:szCs w:val="22"/><w:u w:val="none"/><w:shd w:fill="auto" w:val="clear"/><w:vertAlign w:val="baseline"/><w:rtl w:val="0"/></w:rPr><w:t xml:space="preserve">4</w:t></w:r></w:p></w:tc><w:tc><w:tcPr/><w:p><w:pPr><w:keepNext w:val="0"/><w:keepLines w:val="0"/><w:pageBreakBefore w:val="0"/><w:widowControl w:val="1"/><w:pBdr><w:top w:space="0" w:sz="0" w:val="nil"/><w:left w:space="0" w:sz="0" w:val="nil"/><w:bottom w:space="0" w:sz="0" w:val="nil"/><w:right w:space="0" w:sz="0" w:val="nil"/><w:between w:space="0" w:sz="0" w:val="nil"/></w:pBdr><w:shd w:fill="auto" w:val="clear"/><w:spacing w:after="0" w:before="0" w:line="276" w:lineRule="auto"/><w:ind w:left="0" w:right="0" w:firstLine="0"/><w:jc w:val="left"/><w:rPr><w:rFonts w:ascii="Calibri" w:cs="Calibri" w:eastAsia="Calibri" w:hAnsi="Calibri"/><w:b w:val="1"/><w:bCs w:val="1"/><w:i w:val="0"/><w:iCs w:val="0"/><w:smallCaps w:val="0"/><w:strike w:val="0"/><w:color w:val="000000"/><w:sz w:val="22"/><w:szCs w:val="22"/><w:u w:val="none"/><w:shd w:fill="auto" w:val="clear"/><w:vertAlign w:val="baseline"/></w:rPr></w:pPr><w:r><w:rPr><w:rFonts w:ascii="Calibri" w:cs="Calibri" w:eastAsia="Calibri" w:hAnsi="Calibri"/><w:b w:val="1"/><w:bCs w:val="1"/><w:i w:val="0"/><w:iCs w:val="0"/><w:smallCaps w:val="0"/><w:strike w:val="0"/><w:color w:val="000000"/><w:sz w:val="22"/><w:szCs w:val="22"/><w:u w:val="none"/><w:shd w:fill="auto" w:val="clear"/><w:vertAlign w:val="baseline"/><w:rtl w:val="0"/></w:rPr><w:t xml:space="preserve">Guideline Value (value as per Circle Rates),</w:t></w:r></w:p><w:p><w:pPr><w:keepNext w:val="0"/><w:keepLines w:val="0"/><w:pageBreakBefore w:val="0"/><w:widowControl w:val="1"/><w:pBdr><w:top w:space="0" w:sz="0" w:val="nil"/><w:left w:space="0" w:sz="0" w:val="nil"/><w:bottom w:space="0" w:sz="0" w:val="nil"/><w:right w:space="0" w:sz="0" w:val="nil"/><w:between w:space="0" w:sz="0" w:val="nil"/></w:pBdr><w:shd w:fill="auto" w:val="clear"/><w:spacing w:after="0" w:before="0" w:line="276" w:lineRule="auto"/><w:ind w:left="0" w:right="0" w:firstLine="0"/><w:jc w:val="left"/><w:rPr><w:rFonts w:ascii="Calibri" w:cs="Calibri" w:eastAsia="Calibri" w:hAnsi="Calibri"/><w:b w:val="1"/><w:bCs w:val="1"/><w:i w:val="0"/><w:iCs w:val="0"/><w:smallCaps w:val="0"/><w:strike w:val="0"/><w:color w:val="000000"/><w:sz w:val="22"/><w:szCs w:val="22"/><w:u w:val="none"/><w:shd w:fill="auto" w:val="clear"/><w:vertAlign w:val="baseline"/></w:rPr></w:pPr><w:r><w:rPr><w:rFonts w:ascii="Calibri" w:cs="Calibri" w:eastAsia="Calibri" w:hAnsi="Calibri"/><w:b w:val="1"/><w:bCs w:val="1"/><w:i w:val="0"/><w:iCs w:val="0"/><w:smallCaps w:val="0"/><w:strike w:val="0"/><w:color w:val="000000"/><w:sz w:val="22"/><w:szCs w:val="22"/><w:u w:val="none"/><w:shd w:fill="auto" w:val="clear"/><w:vertAlign w:val="baseline"/><w:rtl w:val="0"/></w:rPr><w:t xml:space="preserve">if applicable, in the area where immovable property is situated</w:t></w:r></w:p></w:tc><w:tc><w:tcPr/><w:p><w:pPr><w:keepNext w:val="0"/><w:keepLines w:val="0"/><w:pageBreakBefore w:val="0"/><w:widowControl w:val="1"/><w:pBdr><w:top w:space="0" w:sz="0" w:val="nil"/><w:left w:space="0" w:sz="0" w:val="nil"/><w:bottom w:space="0" w:sz="0" w:val="nil"/><w:right w:space="0" w:sz="0" w:val="nil"/><w:between w:space="0" w:sz="0" w:val="nil"/></w:pBdr><w:shd w:fill="auto" w:val="clear"/><w:spacing w:after="0" w:before="0" w:line="276" w:lineRule="auto"/><w:ind w:left="0" w:right="0" w:firstLine="0"/><w:jc w:val="left"/><w:rPr><w:rFonts w:ascii="Calibri" w:cs="Calibri" w:eastAsia="Calibri" w:hAnsi="Calibri"/><w:b w:val="1"/><w:bCs w:val="1"/><w:i w:val="0"/><w:iCs w:val="0"/><w:smallCaps w:val="0"/><w:strike w:val="0"/><w:color w:val="000000"/><w:sz w:val="22"/><w:szCs w:val="22"/><w:u w:val="none"/><w:shd w:fill="auto" w:val="clear"/><w:vertAlign w:val="baseline"/></w:rPr></w:pPr><w:r><w:rPr><w:rtl w:val="0"/></w:rPr></w:r></w:p></w:tc></w:tr><w:tr><w:trPr><w:cantSplit w:val="0"/><w:trHeight w:val="311" w:hRule="atLeast"/><w:tblHeader w:val="0"/></w:trPr><w:tc><w:tcPr/><w:p><w:pPr><w:keepNext w:val="0"/><w:keepLines w:val="0"/><w:pageBreakBefore w:val="0"/><w:widowControl w:val="1"/><w:pBdr><w:top w:space="0" w:sz="0" w:val="nil"/><w:left w:space="0" w:sz="0" w:val="nil"/><w:bottom w:space="0" w:sz="0" w:val="nil"/><w:right w:space="0" w:sz="0" w:val="nil"/><w:between w:space="0" w:sz="0" w:val="nil"/></w:pBdr><w:shd w:fill="auto" w:val="clear"/><w:spacing w:after="0" w:before="0" w:line="276" w:lineRule="auto"/><w:ind w:left="0" w:right="0" w:firstLine="0"/><w:jc w:val="center"/><w:rPr><w:rFonts w:ascii="Calibri" w:cs="Calibri" w:eastAsia="Calibri" w:hAnsi="Calibri"/><w:b w:val="1"/><w:bCs w:val="1"/><w:i w:val="0"/><w:iCs w:val="0"/><w:smallCaps w:val="0"/><w:strike w:val="0"/><w:color w:val="000000"/><w:sz w:val="22"/><w:szCs w:val="22"/><w:u w:val="none"/><w:shd w:fill="auto" w:val="clear"/><w:vertAlign w:val="baseline"/></w:rPr></w:pPr><w:r><w:rPr><w:rFonts w:ascii="Calibri" w:cs="Calibri" w:eastAsia="Calibri" w:hAnsi="Calibri"/><w:b w:val="1"/><w:bCs w:val="1"/><w:i w:val="0"/><w:iCs w:val="0"/><w:smallCaps w:val="0"/><w:strike w:val="0"/><w:color w:val="000000"/><w:sz w:val="22"/><w:szCs w:val="22"/><w:u w:val="none"/><w:shd w:fill="auto" w:val="clear"/><w:vertAlign w:val="baseline"/><w:rtl w:val="0"/></w:rPr><w:t xml:space="preserve">5</w:t></w:r></w:p></w:tc><w:tc><w:tcPr/><w:p><w:pPr><w:keepNext w:val="0"/><w:keepLines w:val="0"/><w:pageBreakBefore w:val="0"/><w:widowControl w:val="1"/><w:pBdr><w:top w:space="0" w:sz="0" w:val="nil"/><w:left w:space="0" w:sz="0" w:val="nil"/><w:bottom w:space="0" w:sz="0" w:val="nil"/><w:right w:space="0" w:sz="0" w:val="nil"/><w:between w:space="0" w:sz="0" w:val="nil"/></w:pBdr><w:shd w:fill="auto" w:val="clear"/><w:spacing w:after="0" w:before="0" w:line="276" w:lineRule="auto"/><w:ind w:left="0" w:right="0" w:firstLine="0"/><w:jc w:val="left"/><w:rPr><w:rFonts w:ascii="Calibri" w:cs="Calibri" w:eastAsia="Calibri" w:hAnsi="Calibri"/><w:b w:val="1"/><w:bCs w:val="1"/><w:i w:val="0"/><w:iCs w:val="0"/><w:smallCaps w:val="0"/><w:strike w:val="0"/><w:color w:val="000000"/><w:sz w:val="22"/><w:szCs w:val="22"/><w:u w:val="none"/><w:shd w:fill="auto" w:val="clear"/><w:vertAlign w:val="baseline"/></w:rPr></w:pPr><w:r><w:rPr><w:rFonts w:ascii="Calibri" w:cs="Calibri" w:eastAsia="Calibri" w:hAnsi="Calibri"/><w:b w:val="1"/><w:bCs w:val="1"/><w:i w:val="0"/><w:iCs w:val="0"/><w:smallCaps w:val="0"/><w:strike w:val="0"/><w:color w:val="000000"/><w:sz w:val="22"/><w:szCs w:val="22"/><w:u w:val="none"/><w:shd w:fill="auto" w:val="clear"/><w:vertAlign w:val="baseline"/><w:rtl w:val="0"/></w:rPr><w:t xml:space="preserve">Insurance Value</w:t></w:r></w:p></w:tc><w:tc><w:tcPr/><w:p><w:pPr><w:keepNext w:val="0"/><w:keepLines w:val="0"/><w:pageBreakBefore w:val="0"/><w:widowControl w:val="1"/><w:pBdr><w:top w:space="0" w:sz="0" w:val="nil"/><w:left w:space="0" w:sz="0" w:val="nil"/><w:bottom w:space="0" w:sz="0" w:val="nil"/><w:right w:space="0" w:sz="0" w:val="nil"/><w:between w:space="0" w:sz="0" w:val="nil"/></w:pBdr><w:shd w:fill="auto" w:val="clear"/><w:spacing w:after="0" w:before="0" w:line="276" w:lineRule="auto"/><w:ind w:left="0" w:right="0" w:firstLine="0"/><w:jc w:val="left"/><w:rPr><w:rFonts w:ascii="Calibri" w:cs="Calibri" w:eastAsia="Calibri" w:hAnsi="Calibri"/><w:b w:val="1"/><w:bCs w:val="1"/><w:i w:val="0"/><w:iCs w:val="0"/><w:smallCaps w:val="0"/><w:strike w:val="0"/><w:color w:val="000000"/><w:sz w:val="22"/><w:szCs w:val="22"/><w:u w:val="none"/><w:shd w:fill="auto" w:val="clear"/><w:vertAlign w:val="baseline"/></w:rPr></w:pPr><w:r><w:rPr><w:rtl w:val="0"/></w:rPr></w:r></w:p></w:tc></w:tr><w:tr><w:trPr><w:cantSplit w:val="0"/><w:trHeight w:val="390" w:hRule="atLeast"/><w:tblHeader w:val="0"/></w:trPr><w:tc><w:tcPr/><w:p><w:pPr><w:keepNext w:val="0"/><w:keepLines w:val="0"/><w:pageBreakBefore w:val="0"/><w:widowControl w:val="1"/><w:pBdr><w:top w:space="0" w:sz="0" w:val="nil"/><w:left w:space="0" w:sz="0" w:val="nil"/><w:bottom w:space="0" w:sz="0" w:val="nil"/><w:right w:space="0" w:sz="0" w:val="nil"/><w:between w:space="0" w:sz="0" w:val="nil"/></w:pBdr><w:shd w:fill="auto" w:val="clear"/><w:spacing w:after="0" w:before="0" w:line="276" w:lineRule="auto"/><w:ind w:left="0" w:right="0" w:firstLine="0"/><w:jc w:val="center"/><w:rPr><w:rFonts w:ascii="Calibri" w:cs="Calibri" w:eastAsia="Calibri" w:hAnsi="Calibri"/><w:b w:val="1"/><w:bCs w:val="1"/><w:i w:val="0"/><w:iCs w:val="0"/><w:smallCaps w:val="0"/><w:strike w:val="0"/><w:color w:val="000000"/><w:sz w:val="22"/><w:szCs w:val="22"/><w:u w:val="none"/><w:shd w:fill="auto" w:val="clear"/><w:vertAlign w:val="baseline"/></w:rPr></w:pPr><w:r><w:rPr><w:rFonts w:ascii="Calibri" w:cs="Calibri" w:eastAsia="Calibri" w:hAnsi="Calibri"/><w:b w:val="1"/><w:bCs w:val="1"/><w:i w:val="0"/><w:iCs w:val="0"/><w:smallCaps w:val="0"/><w:strike w:val="0"/><w:color w:val="000000"/><w:sz w:val="22"/><w:szCs w:val="22"/><w:u w:val="none"/><w:shd w:fill="auto" w:val="clear"/><w:vertAlign w:val="baseline"/><w:rtl w:val="0"/></w:rPr><w:t xml:space="preserve">6</w:t></w:r></w:p></w:tc><w:tc><w:tcPr/><w:p><w:pPr><w:keepNext w:val="0"/><w:keepLines w:val="0"/><w:pageBreakBefore w:val="0"/><w:widowControl w:val="1"/><w:pBdr><w:top w:space="0" w:sz="0" w:val="nil"/><w:left w:space="0" w:sz="0" w:val="nil"/><w:bottom w:space="0" w:sz="0" w:val="nil"/><w:right w:space="0" w:sz="0" w:val="nil"/><w:between w:space="0" w:sz="0" w:val="nil"/></w:pBdr><w:shd w:fill="auto" w:val="clear"/><w:spacing w:after="0" w:before="0" w:line="276" w:lineRule="auto"/><w:ind w:left="0" w:right="0" w:firstLine="0"/><w:jc w:val="left"/><w:rPr><w:rFonts w:ascii="Calibri" w:cs="Calibri" w:eastAsia="Calibri" w:hAnsi="Calibri"/><w:b w:val="1"/><w:bCs w:val="1"/><w:i w:val="0"/><w:iCs w:val="0"/><w:smallCaps w:val="0"/><w:strike w:val="0"/><w:color w:val="000000"/><w:sz w:val="22"/><w:szCs w:val="22"/><w:u w:val="none"/><w:shd w:fill="auto" w:val="clear"/><w:vertAlign w:val="baseline"/></w:rPr></w:pPr><w:r><w:rPr><w:rFonts w:ascii="Calibri" w:cs="Calibri" w:eastAsia="Calibri" w:hAnsi="Calibri"/><w:b w:val="1"/><w:bCs w:val="1"/><w:i w:val="0"/><w:iCs w:val="0"/><w:smallCaps w:val="0"/><w:strike w:val="0"/><w:color w:val="000000"/><w:sz w:val="22"/><w:szCs w:val="22"/><w:u w:val="none"/><w:shd w:fill="auto" w:val="clear"/><w:vertAlign w:val="baseline"/><w:rtl w:val="0"/></w:rPr><w:t xml:space="preserve">Date of purchase of immovable property:</w:t></w:r></w:p></w:tc><w:tc><w:tcPr/><w:p><w:pPr><w:keepNext w:val="0"/><w:keepLines w:val="0"/><w:pageBreakBefore w:val="0"/><w:widowControl w:val="1"/><w:pBdr><w:top w:space="0" w:sz="0" w:val="nil"/><w:left w:space="0" w:sz="0" w:val="nil"/><w:bottom w:space="0" w:sz="0" w:val="nil"/><w:right w:space="0" w:sz="0" w:val="nil"/><w:between w:space="0" w:sz="0" w:val="nil"/></w:pBdr><w:shd w:fill="auto" w:val="clear"/><w:spacing w:after="0" w:before="0" w:line="276" w:lineRule="auto"/><w:ind w:left="0" w:right="0" w:firstLine="0"/><w:jc w:val="left"/><w:rPr><w:rFonts w:ascii="Calibri" w:cs="Calibri" w:eastAsia="Calibri" w:hAnsi="Calibri"/><w:b w:val="1"/><w:bCs w:val="1"/><w:i w:val="0"/><w:iCs w:val="0"/><w:smallCaps w:val="0"/><w:strike w:val="0"/><w:color w:val="000000"/><w:sz w:val="22"/><w:szCs w:val="22"/><w:u w:val="none"/><w:shd w:fill="auto" w:val="clear"/><w:vertAlign w:val="baseline"/></w:rPr></w:pPr><w:r><w:rPr><w:rtl w:val="0"/></w:rPr></w:r></w:p></w:tc></w:tr><w:tr><w:trPr><w:cantSplit w:val="0"/><w:trHeight w:val="377" w:hRule="atLeast"/><w:tblHeader w:val="0"/></w:trPr><w:tc><w:tcPr/><w:p><w:pPr><w:keepNext w:val="0"/><w:keepLines w:val="0"/><w:pageBreakBefore w:val="0"/><w:widowControl w:val="1"/><w:pBdr><w:top w:space="0" w:sz="0" w:val="nil"/><w:left w:space="0" w:sz="0" w:val="nil"/><w:bottom w:space="0" w:sz="0" w:val="nil"/><w:right w:space="0" w:sz="0" w:val="nil"/><w:between w:space="0" w:sz="0" w:val="nil"/></w:pBdr><w:shd w:fill="auto" w:val="clear"/><w:spacing w:after="0" w:before="0" w:line="276" w:lineRule="auto"/><w:ind w:left="0" w:right="0" w:firstLine="0"/><w:jc w:val="center"/><w:rPr><w:rFonts w:ascii="Calibri" w:cs="Calibri" w:eastAsia="Calibri" w:hAnsi="Calibri"/><w:b w:val="1"/><w:bCs w:val="1"/><w:i w:val="0"/><w:iCs w:val="0"/><w:smallCaps w:val="0"/><w:strike w:val="0"/><w:color w:val="000000"/><w:sz w:val="22"/><w:szCs w:val="22"/><w:u w:val="none"/><w:shd w:fill="auto" w:val="clear"/><w:vertAlign w:val="baseline"/></w:rPr></w:pPr><w:r><w:rPr><w:rFonts w:ascii="Calibri" w:cs="Calibri" w:eastAsia="Calibri" w:hAnsi="Calibri"/><w:b w:val="1"/><w:bCs w:val="1"/><w:i w:val="0"/><w:iCs w:val="0"/><w:smallCaps w:val="0"/><w:strike w:val="0"/><w:color w:val="000000"/><w:sz w:val="22"/><w:szCs w:val="22"/><w:u w:val="none"/><w:shd w:fill="auto" w:val="clear"/><w:vertAlign w:val="baseline"/><w:rtl w:val="0"/></w:rPr><w:t xml:space="preserve">7</w:t></w:r></w:p></w:tc><w:tc><w:tcPr/><w:p><w:pPr><w:keepNext w:val="0"/><w:keepLines w:val="0"/><w:pageBreakBefore w:val="0"/><w:widowControl w:val="1"/><w:pBdr><w:top w:space="0" w:sz="0" w:val="nil"/><w:left w:space="0" w:sz="0" w:val="nil"/><w:bottom w:space="0" w:sz="0" w:val="nil"/><w:right w:space="0" w:sz="0" w:val="nil"/><w:between w:space="0" w:sz="0" w:val="nil"/></w:pBdr><w:shd w:fill="auto" w:val="clear"/><w:spacing w:after="0" w:before="0" w:line="276" w:lineRule="auto"/><w:ind w:left="0" w:right="0" w:firstLine="0"/><w:jc w:val="left"/><w:rPr><w:rFonts w:ascii="Calibri" w:cs="Calibri" w:eastAsia="Calibri" w:hAnsi="Calibri"/><w:b w:val="1"/><w:bCs w:val="1"/><w:i w:val="0"/><w:iCs w:val="0"/><w:smallCaps w:val="0"/><w:strike w:val="0"/><w:color w:val="000000"/><w:sz w:val="22"/><w:szCs w:val="22"/><w:u w:val="none"/><w:shd w:fill="auto" w:val="clear"/><w:vertAlign w:val="baseline"/></w:rPr></w:pPr><w:r><w:rPr><w:rFonts w:ascii="Calibri" w:cs="Calibri" w:eastAsia="Calibri" w:hAnsi="Calibri"/><w:b w:val="1"/><w:bCs w:val="1"/><w:i w:val="0"/><w:iCs w:val="0"/><w:smallCaps w:val="0"/><w:strike w:val="0"/><w:color w:val="000000"/><w:sz w:val="22"/><w:szCs w:val="22"/><w:u w:val="none"/><w:shd w:fill="auto" w:val="clear"/><w:vertAlign w:val="baseline"/><w:rtl w:val="0"/></w:rPr><w:t xml:space="preserve">Purchase Price of immovable property:</w:t></w:r></w:p></w:tc><w:tc>&lt;w:tcPr/&gt;&lt;w:p&gt;&lt;w:pPr&gt;&lt;w:keepNext w:val="0"/&gt;&lt;w:keepLines w:val="0"/&gt;&lt;w:pageBreakBefore w:val="0"/&gt;&lt;w:widowControl w:val="1"/&gt;&lt;w:pBdr&gt;&lt;w:top w:space="0" w:sz="0" w:val="nil"/&gt;&lt;w:left w:space="0" w:sz="0" w:val="nil"/&gt;&lt;w:bottom w:space="0" w:sz="0" w:val="nil"/&gt;&lt;w:right w:space="0" w:sz="0" w:val="nil"/&gt;&lt;w:between w:space="0" w:sz="0" w:val="nil"/&gt;&lt;/w:pBdr&gt;&lt;w:shd w:fill="auto" w:val="clear"/&gt;&lt;w:spacing w:after="0" w:before="0" w:line="276" w:lineRule="auto"/&gt;&lt;w:ind w:left="0" w:right="0" w:firstLine="0"/&gt;&lt;w:jc w:val="left"/&gt;&lt;w:rPr&gt;&lt;w:rFonts w:ascii="Calibri" w:cs="Calibri" w:eastAsia="Calibri" w:hAnsi="Calibri"/&gt;&lt;w:b w:val="1"/&gt;&lt;w:bCs w:val="1"/&gt;&lt;w:i w:val="0"/&gt;&lt;w:iCs w:val="0"/&gt;&lt;w:smallCaps w:val="0"/&gt;&lt;w:strike w:val="0"/&gt;&lt;w:color w:val="000000"/&gt;&lt;w:sz w:val="22"/&gt;&lt;w:szCs w:val="22"/&gt;&lt;w:u w:val="none"/&gt;&lt;w:shd w:fill="auto" w:val="clear"/&gt;&lt;w:vertAlign w:val="baseline"/&gt;&lt;/w:rPr&gt;&lt;/w:pPr&gt;&lt;w:r&gt;&lt;w:rPr&gt;&lt;w:rtl w:val="0"/&gt;&lt;/w:rPr&gt;&lt;/w:r&gt;&lt;/w:p&gt;&lt;/w:tc&gt;&lt;/w:tr&gt;&lt;/w:tbl&gt;&lt;w:p&gt;&lt;w:pPr&gt;&lt;w:keepNext w:val="0"/&gt;&lt;w:keepLines w:val="0"/&gt;&lt;w:pageBreakBefore w:val="0"/&gt;&lt;w:widowControl w:val="1"/&gt;&lt;w:pBdr&gt;&lt;w:top w:space="0" w:sz="0" w:val="nil"/&gt;&lt;w:left w:space="0" w:sz="0" w:val="nil"/&gt;&lt;w:bottom w:space="0" w:sz="0" w:val="nil"/&gt;&lt;w:right w:space="0" w:sz="0" w:val="nil"/&gt;&lt;w:between w:space="0" w:sz="0" w:val="nil"/&gt;&lt;/w:pBdr&gt;&lt;w:shd w:fill="auto" w:val="clear"/&gt;&lt;w:spacing w:after="0" w:before="0" w:line="276" w:lineRule="auto"/&gt;&lt;w:ind w:left="0" w:right="-426" w:firstLine="0"/&gt;&lt;w:jc w:val="left"/&gt;&lt;w:rPr&gt;&lt;w:rFonts w:ascii="Calibri" w:cs="Calibri" w:eastAsia="Calibri" w:hAnsi="Calibri"/&gt;&lt;w:b w:val="1"/&gt;&lt;w:bCs w:val="1"/&gt;&lt;w:i w:val="0"/&gt;&lt;w:iCs w:val="0"/&gt;&lt;w:smallCaps w:val="0"/&gt;&lt;w:strike w:val="0"/&gt;&lt;w:color w:val="000000"/&gt;&lt;w:sz w:val="22"/&gt;&lt;w:szCs w:val="22"/&gt;&lt;w:u w:val="none"/&gt;&lt;w:shd w:fill="auto" w:val="clear"/&gt;&lt;w:vertAlign w:val="baseline"/&gt;&lt;/w:rPr&gt;&lt;/w:pPr&gt;&lt;w:r&gt;&lt;w:rPr&gt;&lt;w:rtl w:val="0"/&gt;&lt;/w:rPr&gt;&lt;/w:r&gt;&lt;/w:p&gt;&lt;w:p&gt;&lt;w:pPr&gt;&lt;w:keepNext w:val="0"/&gt;&lt;w:keepLines w:val="0"/&gt;&lt;w:pageBreakBefore w:val="0"/&gt;&lt;w:widowControl w:val="1"/&gt;&lt;w:pBdr&gt;&lt;w:top w:space="0" w:sz="0" w:val="nil"/&gt;&lt;w:left w:space="0" w:sz="0" w:val="nil"/&gt;&lt;w:bottom w:space="0" w:sz="0" w:val="nil"/&gt;&lt;w:right w:space="0" w:sz="0" w:val="nil"/&gt;&lt;w:between w:space="0" w:sz="0" w:val="nil"/&gt;&lt;/w:pBdr&gt;&lt;w:shd w:fill="auto" w:val="clear"/&gt;&lt;w:spacing w:after="0" w:before="0" w:line="240" w:lineRule="auto"/&gt;&lt;w:ind w:left="0" w:right="-142" w:firstLine="0"/&gt;&lt;w:jc w:val="left"/&gt;&lt;w:rPr&gt;&lt;w:rFonts w:ascii="Calibri" w:cs="Calibri" w:eastAsia="Calibri" w:hAnsi="Calibri"/&gt;&lt;w:b w:val="1"/&gt;&lt;w:bCs w:val="1"/&gt;&lt;w:i w:val="0"/&gt;&lt;w:iCs w:val="0"/&gt;&lt;w:smallCaps w:val="0"/&gt;&lt;w:strike w:val="0"/&gt;&lt;w:color w:val="000000"/&gt;&lt;w:sz w:val="22"/&gt;&lt;w:szCs w:val="22"/&gt;&lt;w:u w:val="none"/&gt;&lt;w:shd w:fill="auto" w:val="clear"/&gt;&lt;w:vertAlign w:val="baseline"/&gt;&lt;/w:rPr&gt;&lt;/w:pPr&gt;&lt;w:r&gt;&lt;w:rPr&gt;&lt;w:rFonts w:ascii="Calibri" w:cs="Calibri" w:eastAsia="Calibri" w:hAnsi="Calibri"/&gt;&lt;w:b w:val="1"/&gt;&lt;w:bCs w:val="1"/&gt;&lt;w:i w:val="0"/&gt;&lt;w:iCs w:val="0"/&gt;&lt;w:smallCaps w:val="0"/&gt;&lt;w:strike w:val="0"/&gt;&lt;w:color w:val="000000"/&gt;&lt;w:sz w:val="22"/&gt;&lt;w:szCs w:val="22"/&gt;&lt;w:u w:val="none"/&gt;&lt;w:shd w:fill="auto" w:val="clear"/&gt;&lt;w:vertAlign w:val="baseline"/&gt;&lt;w:rtl w:val="0"/&gt;&lt;/w:rPr&gt;&lt;w:t xml:space="preserve"&gt;Place: {firmCity}</w:t></w:r></w:p><w:p><w:pPr><w:keepNext w:val="0"/><w:keepLines w:val="0"/><w:pageBreakBefore w:val="0"/><w:widowControl w:val="1"/><w:pBdr><w:top w:space="0" w:sz="0" w:val="nil"/><w:left w:space="0" w:sz="0" w:val="nil"/><w:bottom w:space="0" w:sz="0" w:val="nil"/><w:right w:space="0" w:sz="0" w:val="nil"/><w:between w:space="0" w:sz="0" w:val="nil"/></w:pBdr><w:shd w:fill="auto" w:val="clear"/><w:spacing w:after="0" w:before="0" w:line="240" w:lineRule="auto"/><w:ind w:left="0" w:right="-142" w:firstLine="0"/><w:jc w:val="left"/><w:rPr><w:rFonts w:ascii="Calibri" w:cs="Calibri" w:eastAsia="Calibri" w:hAnsi="Calibri"/><w:b w:val="1"/><w:bCs w:val="1"/><w:i w:val="0"/><w:iCs w:val="0"/><w:smallCaps w:val="0"/><w:strike w:val="0"/><w:color w:val="000000"/><w:sz w:val="22"/><w:szCs w:val="22"/><w:u w:val="none"/><w:shd w:fill="auto" w:val="clear"/><w:vertAlign w:val="baseline"/></w:rPr></w:pPr><w:r><w:rPr><w:rFonts w:ascii="Calibri" w:cs="Calibri" w:eastAsia="Calibri" w:hAnsi="Calibri"/><w:b w:val="1"/><w:bCs w:val="1"/><w:i w:val="0"/><w:iCs w:val="0"/><w:smallCaps w:val="0"/><w:strike w:val="0"/><w:color w:val="000000"/><w:sz w:val="22"/><w:szCs w:val="22"/><w:u w:val="none"/><w:shd w:fill="auto" w:val="clear"/><w:vertAlign w:val="baseline"/><w:rtl w:val="0"/></w:rPr><w:t xml:space="preserve">Date: </w:t></w:r><w:r><w:rPr><w:rFonts w:ascii="Calibri" w:cs="Calibri" w:eastAsia="Calibri" w:hAnsi="Calibri"/><w:b w:val="1"/><w:bCs w:val="1"/><w:i w:val="0"/><w:iCs w:val="0"/><w:smallCaps w:val="0"/><w:strike w:val="0"/><w:color w:val="000000"/><w:sz w:val="22"/><w:szCs w:val="22"/><w:highlight w:val="yellow"/><w:u w:val="none"/><w:vertAlign w:val="baseline"/><w:rtl w:val="0"/></w:rPr><w:t xml:space="preserve">{reportDate}</w:t></w:r><w:r><w:rPr><w:rFonts w:ascii="Calibri" w:cs="Calibri" w:eastAsia="Calibri" w:hAnsi="Calibri"/><w:b w:val="1"/><w:bCs w:val="1"/><w:i w:val="0"/><w:iCs w:val="0"/><w:smallCaps w:val="0"/><w:strike w:val="0"/><w:color w:val="000000"/><w:sz w:val="22"/><w:szCs w:val="22"/><w:u w:val="none"/><w:shd w:fill="auto" w:val="clear"/><w:vertAlign w:val="baseline"/><w:rtl w:val="0"/></w:rPr><w:tab/>&lt;/w:r&gt;&lt;/w:p&gt;&lt;w:p&gt;&lt;w:pPr&gt;&lt;w:keepNext w:val="0"/&gt;&lt;w:keepLines w:val="0"/&gt;&lt;w:pageBreakBefore w:val="0"/&gt;&lt;w:widowControl w:val="1"/&gt;&lt;w:pBdr&gt;&lt;w:top w:space="0" w:sz="0" w:val="nil"/&gt;&lt;w:left w:space="0" w:sz="0" w:val="nil"/&gt;&lt;w:bottom w:space="0" w:sz="0" w:val="nil"/&gt;&lt;w:right w:space="0" w:sz="0" w:val="nil"/&gt;&lt;w:between w:space="0" w:sz="0" w:val="nil"/&gt;&lt;/w:pBdr&gt;&lt;w:shd w:fill="auto" w:val="clear"/&gt;&lt;w:spacing w:after="0" w:before="0" w:line="240" w:lineRule="auto"/&gt;&lt;w:ind w:left="0" w:right="-142" w:firstLine="0"/&gt;&lt;w:jc w:val="left"/&gt;&lt;w:rPr&gt;&lt;w:rFonts w:ascii="Calibri" w:cs="Calibri" w:eastAsia="Calibri" w:hAnsi="Calibri"/&gt;&lt;w:b w:val="1"/&gt;&lt;w:bCs w:val="1"/&gt;&lt;w:i w:val="0"/&gt;&lt;w:iCs w:val="0"/&gt;&lt;w:smallCaps w:val="0"/&gt;&lt;w:strike w:val="0"/&gt;&lt;w:color w:val="000000"/&gt;&lt;w:sz w:val="22"/&gt;&lt;w:szCs w:val="22"/&gt;&lt;w:u w:val="none"/&gt;&lt;w:shd w:fill="auto" w:val="clear"/&gt;&lt;w:vertAlign w:val="baseline"/&gt;&lt;/w:rPr&gt;&lt;/w:pPr&gt;&lt;w:r&gt;&lt;w:rPr&gt;&lt;w:rtl w:val="0"/&gt;&lt;/w:rPr&gt;&lt;/w:r&gt;&lt;/w:p&gt;&lt;w:p&gt;&lt;w:pPr&gt;&lt;w:keepNext w:val="0"/&gt;&lt;w:keepLines w:val="0"/&gt;&lt;w:pageBreakBefore w:val="0"/&gt;&lt;w:widowControl w:val="1"/&gt;&lt;w:pBdr&gt;&lt;w:top w:space="0" w:sz="0" w:val="nil"/&gt;&lt;w:left w:space="0" w:sz="0" w:val="nil"/&gt;&lt;w:bottom w:space="0" w:sz="0" w:val="nil"/&gt;&lt;w:right w:space="0" w:sz="0" w:val="nil"/&gt;&lt;w:between w:space="0" w:sz="0" w:val="nil"/&gt;&lt;/w:pBdr&gt;&lt;w:shd w:fill="auto" w:val="clear"/&gt;&lt;w:spacing w:after="0" w:before="0" w:line="240" w:lineRule="auto"/&gt;&lt;w:ind w:left="0" w:right="0" w:firstLine="0"/&gt;&lt;w:jc w:val="left"/&gt;&lt;w:rPr&gt;&lt;w:rFonts w:ascii="Calibri" w:cs="Calibri" w:eastAsia="Calibri" w:hAnsi="Calibri"/&gt;&lt;w:b w:val="0"/&gt;&lt;w:bCs w:val="0"/&gt;&lt;w:i w:val="0"/&gt;&lt;w:iCs w:val="0"/&gt;&lt;w:smallCaps w:val="0"/&gt;&lt;w:strike w:val="0"/&gt;&lt;w:color w:val="000000"/&gt;&lt;w:sz w:val="36.66666666666667"/&gt;&lt;w:szCs w:val="36.66666666666667"/&gt;&lt;w:u w:val="none"/&gt;&lt;w:shd w:fill="auto" w:val="clear"/&gt;&lt;w:vertAlign w:val="superscript"/&gt;&lt;/w:rPr&gt;&lt;/w:pPr&gt;&lt;w:r&gt;&lt;w:rPr&gt;&lt;w:rtl w:val="0"/&gt;&lt;/w:rPr&gt;&lt;/w:r&gt;&lt;/w:p&gt;&lt;w:p&gt;&lt;w:pPr&gt;&lt;w:keepNext w:val="0"/&gt;&lt;w:keepLines w:val="0"/&gt;&lt;w:pageBreakBefore w:val="0"/&gt;&lt;w:widowControl w:val="1"/&gt;&lt;w:pBdr&gt;&lt;w:top w:space="0" w:sz="0" w:val="nil"/&gt;&lt;w:left w:space="0" w:sz="0" w:val="nil"/&gt;&lt;w:bottom w:space="0" w:sz="0" w:val="nil"/&gt;&lt;w:right w:space="0" w:sz="0" w:val="nil"/&gt;&lt;w:between w:space="0" w:sz="0" w:val="nil"/&gt;&lt;/w:pBdr&gt;&lt;w:shd w:fill="auto" w:val="clear"/&gt;&lt;w:spacing w:after="0" w:before="0" w:line="240" w:lineRule="auto"/&gt;&lt;w:ind w:left="0" w:right="0" w:firstLine="0"/&gt;&lt;w:jc w:val="left"/&gt;&lt;w:rPr&gt;&lt;w:rFonts w:ascii="Calibri" w:cs="Calibri" w:eastAsia="Calibri" w:hAnsi="Calibri"/&gt;&lt;w:b w:val="0"/&gt;&lt;w:bCs w:val="0"/&gt;&lt;w:i w:val="0"/&gt;&lt;w:iCs w:val="0"/&gt;&lt;w:smallCaps w:val="0"/&gt;&lt;w:strike w:val="0"/&gt;&lt;w:color w:val="000000"/&gt;&lt;w:sz w:val="22"/&gt;&lt;w:szCs w:val="22"/&gt;&lt;w:u w:val="none"/&gt;&lt;w:shd w:fill="auto" w:val="clear"/&gt;&lt;w:vertAlign w:val="baseline"/&gt;&lt;/w:rPr&gt;&lt;/w:pPr&gt;&lt;w:r&gt;&lt;w:rPr&gt;&lt;w:rtl w:val="0"/&gt;&lt;/w:rPr&gt;&lt;/w:r&gt;&lt;/w:p&gt;&lt;w:p&gt;&lt;w:pPr&gt;&lt;w:keepNext w:val="0"/&gt;&lt;w:keepLines w:val="0"/&gt;&lt;w:pageBreakBefore w:val="0"/&gt;&lt;w:widowControl w:val="1"/&gt;&lt;w:pBdr&gt;&lt;w:top w:space="0" w:sz="0" w:val="nil"/&gt;&lt;w:left w:space="0" w:sz="0" w:val="nil"/&gt;&lt;w:bottom w:space="0" w:sz="0" w:val="nil"/&gt;&lt;w:right w:space="0" w:sz="0" w:val="nil"/&gt;&lt;w:between w:space="0" w:sz="0" w:val="nil"/&gt;&lt;/w:pBdr&gt;&lt;w:shd w:fill="auto" w:val="clear"/&gt;&lt;w:spacing w:after="0" w:before="0" w:line="240" w:lineRule="auto"/&gt;&lt;w:ind w:left="0" w:right="0" w:firstLine="0"/&gt;&lt;w:jc w:val="left"/&gt;&lt;w:rPr&gt;&lt;w:rFonts w:ascii="Calibri" w:cs="Calibri" w:eastAsia="Calibri" w:hAnsi="Calibri"/&gt;&lt;w:b w:val="0"/&gt;&lt;w:bCs w:val="0"/&gt;&lt;w:i w:val="0"/&gt;&lt;w:iCs w:val="0"/&gt;&lt;w:smallCaps w:val="0"/&gt;&lt;w:strike w:val="0"/&gt;&lt;w:color w:val="000000"/&gt;&lt;w:sz w:val="22"/&gt;&lt;w:szCs w:val="22"/&gt;&lt;w:u w:val="none"/&gt;&lt;w:shd w:fill="auto" w:val="clear"/&gt;&lt;w:vertAlign w:val="baseline"/&gt;&lt;/w:rPr&gt;&lt;/w:pPr&gt;&lt;w:r&gt;&lt;w:rPr&gt;&lt;w:rtl w:val="0"/&gt;&lt;/w:rPr&gt;&lt;/w:r&gt;&lt;/w:p&gt;&lt;w:p&gt;&lt;w:pPr&gt;&lt;w:keepNext w:val="0"/&gt;&lt;w:keepLines w:val="0"/&gt;&lt;w:pageBreakBefore w:val="0"/&gt;&lt;w:widowControl w:val="1"/&gt;&lt;w:pBdr&gt;&lt;w:top w:space="0" w:sz="0" w:val="nil"/&gt;&lt;w:left w:space="0" w:sz="0" w:val="nil"/&gt;&lt;w:bottom w:space="0" w:sz="0" w:val="nil"/&gt;&lt;w:right w:space="0" w:sz="0" w:val="nil"/&gt;&lt;w:between w:space="0" w:sz="0" w:val="nil"/&gt;&lt;/w:pBdr&gt;&lt;w:shd w:fill="auto" w:val="clear"/&gt;&lt;w:spacing w:after="0" w:before="149" w:line="216" w:lineRule="auto"/&gt;&lt;w:ind w:left="0" w:right="2614" w:firstLine="0"/&gt;&lt;w:jc w:val="both"/&gt;&lt;w:rPr&gt;&lt;w:rFonts w:ascii="Calibri" w:cs="Calibri" w:eastAsia="Calibri" w:hAnsi="Calibri"/&gt;&lt;w:b w:val="1"/&gt;&lt;w:bCs w:val="1"/&gt;&lt;w:i w:val="0"/&gt;&lt;w:iCs w:val="0"/&gt;&lt;w:smallCaps w:val="0"/&gt;&lt;w:strike w:val="0"/&gt;&lt;w:color w:val="000000"/&gt;&lt;w:sz w:val="22"/&gt;&lt;w:szCs w:val="22"/&gt;&lt;w:u w:val="none"/&gt;&lt;w:shd w:fill="auto" w:val="clear"/&gt;&lt;w:vertAlign w:val="baseline"/&gt;&lt;/w:rPr&gt;&lt;/w:pPr&gt;&lt;w:r&gt;&lt;w:rPr&gt;&lt;w:rFonts w:ascii="Calibri" w:cs="Calibri" w:eastAsia="Calibri" w:hAnsi="Calibri"/&gt;&lt;w:b w:val="1"/&gt;&lt;w:bCs w:val="1"/&gt;&lt;w:i w:val="0"/&gt;&lt;w:iCs w:val="0"/&gt;&lt;w:smallCaps w:val="0"/&gt;&lt;w:strike w:val="0"/&gt;&lt;w:color w:val="000000"/&gt;&lt;w:sz w:val="22"/&gt;&lt;w:szCs w:val="22"/&gt;&lt;w:u w:val="none"/&gt;&lt;w:shd w:fill="auto" w:val="clear"/&gt;&lt;w:vertAlign w:val="baseline"/&gt;&lt;w:rtl w:val="0"/&gt;&lt;/w:rPr&gt;&lt;w:t xml:space="preserve"&gt;{rvFullName}</w:t></w:r></w:p><w:p><w:pPr><w:keepNext w:val="0"/><w:keepLines w:val="0"/><w:pageBreakBefore w:val="0"/><w:widowControl w:val="1"/><w:pBdr><w:top w:space="0" w:sz="0" w:val="nil"/>&lt;w:left w:space="0" w:sz="0" w:val="nil"/&gt;&lt;w:bottom w:space="0" w:sz="0" w:val="nil"/&gt;&lt;w:right w:space="0" w:sz="0" w:val="nil"/&gt;&lt;w:between w:space="0" w:sz="0" w:val="nil"/&gt;&lt;/w:pBdr&gt;&lt;w:shd w:fill="auto" w:val="clear"/&gt;&lt;w:tabs&gt;&lt;w:tab w:val="left" w:leader="none" w:pos="4320"/&gt;&lt;w:tab w:val="left" w:leader="none" w:pos="6120"/&gt;&lt;/w:tabs&gt;&lt;w:spacing w:after="0" w:before="0" w:line="216" w:lineRule="auto"/&gt;&lt;w:ind w:left="0" w:right="2189" w:firstLine="0"/&gt;&lt;w:jc w:val="both"/&gt;&lt;w:rPr&gt;&lt;w:rFonts w:ascii="Calibri" w:cs="Calibri" w:eastAsia="Calibri" w:hAnsi="Calibri"/&gt;&lt;w:b w:val="1"/&gt;&lt;w:bCs w:val="1"/&gt;&lt;w:i w:val="0"/&gt;&lt;w:iCs w:val="0"/&gt;&lt;w:smallCaps w:val="0"/&gt;&lt;w:strike w:val="0"/&gt;&lt;w:color w:val="000000"/&gt;&lt;w:sz w:val="22"/&gt;&lt;w:szCs w:val="22"/&gt;&lt;w:u w:val="none"/&gt;&lt;w:shd w:fill="auto" w:val="clear"/&gt;&lt;w:vertAlign w:val="baseline"/&gt;&lt;/w:rPr&gt;&lt;/w:pPr&gt;&lt;w:r&gt;&lt;w:rPr&gt;&lt;w:rFonts w:ascii="Calibri" w:cs="Calibri" w:eastAsia="Calibri" w:hAnsi="Calibri"/&gt;&lt;w:b w:val="1"/&gt;&lt;w:bCs w:val="1"/&gt;&lt;w:i w:val="0"/&gt;&lt;w:iCs w:val="0"/&gt;&lt;w:smallCaps w:val="0"/&gt;&lt;w:strike w:val="0"/&gt;&lt;w:color w:val="000000"/&gt;&lt;w:sz w:val="22"/&gt;&lt;w:szCs w:val="22"/&gt;&lt;w:u w:val="none"/&gt;&lt;w:shd w:fill="auto" w:val="clear"/&gt;&lt;w:vertAlign w:val="baseline"/&gt;&lt;w:rtl w:val="0"/&gt;&lt;/w:rPr&gt;&lt;w:t xml:space="preserve"&gt;{rvQualifications}</w:t></w:r></w:p><w:p><w:pPr><w:keepNext w:val="0"/><w:keepLines w:val="0"/><w:pageBreakBefore w:val="0"/><w:widowControl w:val="1"/><w:pBdr><w:top w:space="0" w:sz="0" w:val="nil"/><w:left w:space="0" w:sz="0" w:val="nil"/><w:bottom w:space="0" w:sz="0" w:val="nil"/><w:right w:space="0" w:sz="0" w:val="nil"/><w:between w:space="0" w:sz="0" w:val="nil"/></w:pBdr><w:shd w:fill="auto" w:val="clear"/><w:tabs><w:tab w:val="left" w:leader="none" w:pos="4320"/><w:tab w:val="left" w:leader="none" w:pos="6120"/></w:tabs><w:spacing w:after="0" w:before="0" w:line="216" w:lineRule="auto"/><w:ind w:left="0" w:right="2189" w:firstLine="0"/><w:jc w:val="both"/><w:rPr><w:rFonts w:ascii="Calibri" w:cs="Calibri" w:eastAsia="Calibri" w:hAnsi="Calibri"/><w:b w:val="1"/><w:bCs w:val="1"/><w:i w:val="0"/><w:iCs w:val="0"/><w:smallCaps w:val="0"/><w:strike w:val="0"/><w:color w:val="000000"/><w:sz w:val="22"/><w:szCs w:val="22"/><w:u w:val="none"/><w:shd w:fill="auto" w:val="clear"/><w:vertAlign w:val="baseline"/></w:rPr></w:pPr><w:r><w:rPr><w:rFonts w:ascii="Calibri" w:cs="Calibri" w:eastAsia="Calibri" w:hAnsi="Calibri"/><w:b w:val="1"/><w:bCs w:val="1"/><w:i w:val="0"/><w:iCs w:val="0"/><w:smallCaps w:val="0"/><w:strike w:val="0"/><w:color w:val="000000"/><w:sz w:val="22"/><w:szCs w:val="22"/><w:u w:val="none"/><w:shd w:fill="auto" w:val="clear"/><w:vertAlign w:val="baseline"/><w:rtl w:val="0"/></w:rPr><w:t xml:space="preserve">Govt. Regd. Valuer  </w:t></w:r></w:p><w:p><w:pPr><w:keepNext w:val="0"/><w:keepLines w:val="0"/><w:pageBreakBefore w:val="0"/><w:widowControl w:val="1"/><w:pBdr><w:top w:space="0" w:sz="0" w:val="nil"/><w:left w:space="0" w:sz="0" w:val="nil"/><w:bottom w:space="0" w:sz="0" w:val="nil"/><w:right w:space="0" w:sz="0" w:val="nil"/><w:between w:space="0" w:sz="0" w:val="nil"/></w:pBdr><w:shd w:fill="auto" w:val="clear"/><w:tabs><w:tab w:val="left" w:leader="none" w:pos="4320"/><w:tab w:val="left" w:leader="none" w:pos="6120"/></w:tabs><w:spacing w:after="0" w:before="0" w:line="216" w:lineRule="auto"/><w:ind w:left="0" w:right="2189" w:firstLine="0"/><w:jc w:val="both"/><w:rPr><w:rFonts w:ascii="Calibri" w:cs="Calibri" w:eastAsia="Calibri" w:hAnsi="Calibri"/><w:b w:val="1"/><w:bCs w:val="1"/><w:i w:val="0"/><w:iCs w:val="0"/><w:smallCaps w:val="0"/><w:strike w:val="0"/><w:color w:val="000000"/><w:sz w:val="22"/><w:szCs w:val="22"/><w:u w:val="none"/><w:shd w:fill="auto" w:val="clear"/><w:vertAlign w:val="baseline"/></w:rPr></w:pPr><w:r><w:rPr><w:rFonts w:ascii="Calibri" w:cs="Calibri" w:eastAsia="Calibri" w:hAnsi="Calibri"/><w:b w:val="1"/><w:bCs w:val="1"/><w:i w:val="0"/><w:iCs w:val="0"/><w:smallCaps w:val="0"/><w:strike w:val="0"/><w:color w:val="000000"/><w:sz w:val="22"/><w:szCs w:val="22"/><w:u w:val="none"/><w:shd w:fill="auto" w:val="clear"/><w:vertAlign w:val="baseline"/><w:rtl w:val="0"/></w:rPr><w:t xml:space="preserve">Panel Valuer of Punjab National Bank</w:t></w:r></w:p><w:p><w:pPr><w:rPr><w:b w:val="1"/><w:bCs w:val="1"/></w:rPr></w:pPr><w:r><w:rPr><w:b w:val="1"/><w:bCs w:val="1"/><w:rtl w:val="0"/></w:rPr><w:t xml:space="preserve"> ({rvIbbiRegNo})</w:t></w:r></w:p><w:p><w:pPr><w:spacing w:after="0" w:before="70" w:lineRule="auto"/><w:ind w:right="2621"/><w:jc w:val="both"/><w:rPr><w:b w:val="1"/><w:bCs w:val="1"/></w:rPr></w:pPr><w:r><w:rPr><w:rtl w:val="0"/></w:rPr></w:r></w:p><w:p><w:pPr><w:spacing w:before="0" w:lineRule="auto"/><w:ind w:right="2621"/><w:jc w:val="both"/><w:rPr><w:b w:val="1"/><w:bCs w:val="1"/></w:rPr></w:pPr><w:r><w:br w:type="column"/></w:r><w:r><w:rPr><w:b w:val="1"/><w:bCs w:val="1"/><w:rtl w:val="0"/></w:rPr><w:t xml:space="preserve">I hereby declare that:</w:t></w:r></w:p><w:p><w:pPr><w:keepNext w:val="0"/><w:keepLines w:val="0"/><w:pageBreakBefore w:val="0"/><w:widowControl w:val="0"/><w:numPr><w:ilvl w:val="0"/><w:numId w:val="2"/></w:numPr><w:pBdr><w:top w:space="0" w:sz="0" w:val="nil"/>&lt;w:left w:space="0" w:sz="0" w:val="nil"/&gt;&lt;w:bottom w:space="0" w:sz="0" w:val="nil"/&gt;&lt;w:right w:space="0" w:sz="0" w:val="nil"/&gt;&lt;w:between w:space="0" w:sz="0" w:val="nil"/&gt;&lt;/w:pBdr&gt;&lt;w:shd w:fill="auto" w:val="clear"/&gt;&lt;w:tabs&gt;&lt;w:tab w:val="left" w:leader="none" w:pos="953"/&gt;&lt;/w:tabs&gt;&lt;w:spacing w:after="0" w:before="37" w:line="312" w:lineRule="auto"/&gt;&lt;w:ind w:left="806" w:right="122" w:hanging="360"/&gt;&lt;w:jc w:val="both"/&gt;&lt;w:rPr&gt;&lt;w:rFonts w:ascii="Calibri" w:cs="Calibri" w:eastAsia="Calibri" w:hAnsi="Calibri"/&gt;&lt;w:b w:val="0"/&gt;&lt;w:bCs w:val="0"/&gt;&lt;w:i w:val="0"/&gt;&lt;w:iCs w:val="0"/&gt;&lt;w:smallCaps w:val="0"/&gt;&lt;w:strike w:val="0"/&gt;&lt;w:color w:val="000000"/&gt;&lt;w:sz w:val="22"/&gt;&lt;w:szCs w:val="22"/&gt;&lt;w:u w:val="none"/&gt;&lt;w:shd w:fill="auto" w:val="clear"/&gt;&lt;w:vertAlign w:val="baseline"/&gt;&lt;/w:rPr&gt;&lt;/w:pPr&gt;&lt;w:r&gt;&lt;w:rPr&gt;&lt;w:rFonts w:ascii="Calibri" w:cs="Calibri" w:eastAsia="Calibri" w:hAnsi="Calibri"/&gt;&lt;w:b w:val="0"/&gt;&lt;w:bCs w:val="0"/&gt;&lt;w:i w:val="0"/&gt;&lt;w:iCs w:val="0"/&gt;&lt;w:smallCaps w:val="0"/&gt;&lt;w:strike w:val="0"/&gt;&lt;w:color w:val="000000"/&gt;&lt;w:sz w:val="22"/&gt;&lt;w:szCs w:val="22"/&gt;&lt;w:u w:val="none"/&gt;&lt;w:shd w:fill="auto" w:val="clear"/&gt;&lt;w:vertAlign w:val="baseline"/&gt;&lt;w:rtl w:val="0"/&gt;&lt;/w:rPr&gt;&lt;w:t xml:space="preserve"&gt;The information furnished is my valuation report dated {reportDate} is true and correct to the best of my knowledge and belief and I have made an impartial and true valuation of the property. </w:t></w:r></w:p><w:p><w:pPr><w:keepNext w:val="0"/><w:keepLines w:val="0"/><w:pageBreakBefore w:val="0"/><w:widowControl w:val="0"/><w:numPr><w:ilvl w:val="0"/><w:numId w:val="2"/></w:numPr><w:pBdr><w:top w:space="0" w:sz="0" w:val="nil"/><w:left w:space="0" w:sz="0" w:val="nil"/><w:bottom w:space="0" w:sz="0" w:val="nil"/><w:right w:space="0" w:sz="0" w:val="nil"/><w:between w:space="0" w:sz="0" w:val="nil"/></w:pBdr><w:shd w:fill="auto" w:val="clear"/><w:tabs><w:tab w:val="left" w:leader="none" w:pos="953"/></w:tabs><w:spacing w:after="0" w:before="0" w:line="312" w:lineRule="auto"/><w:ind w:left="806" w:right="0" w:hanging="360"/><w:jc w:val="both"/><w:rPr><w:rFonts w:ascii="Calibri" w:cs="Calibri" w:eastAsia="Calibri" w:hAnsi="Calibri"/><w:b w:val="0"/><w:bCs w:val="0"/><w:i w:val="0"/><w:iCs w:val="0"/><w:smallCaps w:val="0"/><w:strike w:val="0"/><w:color w:val="000000"/><w:sz w:val="22"/><w:szCs w:val="22"/><w:u w:val="none"/><w:shd w:fill="auto" w:val="clear"/><w:vertAlign w:val="baseline"/></w:rPr></w:pPr><w:r><w:rPr><w:rFonts w:ascii="Calibri" w:cs="Calibri" w:eastAsia="Calibri" w:hAnsi="Calibri"/><w:b w:val="0"/><w:bCs w:val="0"/><w:i w:val="0"/><w:iCs w:val="0"/><w:smallCaps w:val="0"/><w:strike w:val="0"/><w:color w:val="000000"/><w:sz w:val="22"/><w:szCs w:val="22"/><w:u w:val="none"/><w:shd w:fill="auto" w:val="clear"/><w:vertAlign w:val="baseline"/><w:rtl w:val="0"/></w:rPr><w:t xml:space="preserve">I have no direct or indirect interest in the property valued.</w:t></w:r></w:p><w:p><w:pPr><w:keepNext w:val="0"/><w:keepLines w:val="0"/><w:pageBreakBefore w:val="0"/><w:widowControl w:val="0"/><w:numPr><w:ilvl w:val="0"/><w:numId w:val="2"/></w:numPr><w:pBdr><w:top w:space="0" w:sz="0" w:val="nil"/>&lt;w:left w:space="0" w:sz="0" w:val="nil"/&gt;&lt;w:bottom w:space="0" w:sz="0" w:val="nil"/&gt;&lt;w:right w:space="0" w:sz="0" w:val="nil"/&gt;&lt;w:between w:space="0" w:sz="0" w:val="nil"/&gt;&lt;/w:pBdr&gt;&lt;w:shd w:fill="auto" w:val="clear"/&gt;&lt;w:tabs&gt;&lt;w:tab w:val="left" w:leader="none" w:pos="953"/&gt;&lt;/w:tabs&gt;&lt;w:spacing w:after="0" w:before="0" w:line="312" w:lineRule="auto"/&gt;&lt;w:ind w:left="806" w:right="0" w:hanging="360"/&gt;&lt;w:jc w:val="both"/&gt;&lt;w:rPr&gt;&lt;w:rFonts w:ascii="Calibri" w:cs="Calibri" w:eastAsia="Calibri" w:hAnsi="Calibri"/&gt;&lt;w:b w:val="0"/&gt;&lt;w:bCs w:val="0"/&gt;&lt;w:i w:val="0"/&gt;&lt;w:iCs w:val="0"/&gt;&lt;w:smallCaps w:val="0"/&gt;&lt;w:strike w:val="0"/&gt;&lt;w:color w:val="000000"/&gt;&lt;w:sz w:val="22"/&gt;&lt;w:szCs w:val="22"/&gt;&lt;w:u w:val="none"/&gt;&lt;w:shd w:fill="auto" w:val="clear"/&gt;&lt;w:vertAlign w:val="baseline"/&gt;&lt;/w:rPr&gt;&lt;/w:pPr&gt;&lt;w:r&gt;&lt;w:rPr&gt;&lt;w:rFonts w:ascii="Calibri" w:cs="Calibri" w:eastAsia="Calibri" w:hAnsi="Calibri"/&gt;&lt;w:b w:val="0"/&gt;&lt;w:bCs w:val="0"/&gt;&lt;w:i w:val="0"/&gt;&lt;w:iCs w:val="0"/&gt;&lt;w:smallCaps w:val="0"/&gt;&lt;w:strike w:val="0"/&gt;&lt;w:color w:val="000000"/&gt;&lt;w:sz w:val="22"/&gt;&lt;w:szCs w:val="22"/&gt;&lt;w:u w:val="none"/&gt;&lt;w:shd w:fill="auto" w:val="clear"/&gt;&lt;w:vertAlign w:val="baseline"/&gt;&lt;w:rtl w:val="0"/&gt;&lt;/w:rPr&gt;&lt;w:t xml:space="preserve"&gt;Our Engineer Mr. Jitendra Bhagat has inspected the property on {inspectionDate}. </w:t></w:r></w:p><w:p><w:pPr><w:keepNext w:val="0"/><w:keepLines w:val="0"/><w:pageBreakBefore w:val="0"/><w:widowControl w:val="0"/><w:numPr><w:ilvl w:val="0"/><w:numId w:val="2"/></w:numPr><w:pBdr><w:top w:space="0" w:sz="0" w:val="nil"/><w:left w:space="0" w:sz="0" w:val="nil"/><w:bottom w:space="0" w:sz="0" w:val="nil"/><w:right w:space="0" w:sz="0" w:val="nil"/><w:between w:space="0" w:sz="0" w:val="nil"/></w:pBdr><w:shd w:fill="auto" w:val="clear"/><w:tabs><w:tab w:val="left" w:leader="none" w:pos="953"/></w:tabs><w:spacing w:after="0" w:before="0" w:line="312" w:lineRule="auto"/><w:ind w:left="806" w:right="118" w:hanging="360"/><w:jc w:val="both"/><w:rPr><w:rFonts w:ascii="Calibri" w:cs="Calibri" w:eastAsia="Calibri" w:hAnsi="Calibri"/><w:b w:val="0"/><w:bCs w:val="0"/><w:i w:val="0"/><w:iCs w:val="0"/><w:smallCaps w:val="0"/><w:strike w:val="0"/><w:color w:val="000000"/><w:sz w:val="22"/><w:szCs w:val="22"/><w:u w:val="none"/><w:shd w:fill="auto" w:val="clear"/><w:vertAlign w:val="baseline"/></w:rPr></w:pPr><w:r><w:rPr><w:rFonts w:ascii="Calibri" w:cs="Calibri" w:eastAsia="Calibri" w:hAnsi="Calibri"/><w:b w:val="0"/><w:bCs w:val="0"/><w:i w:val="0"/><w:iCs w:val="0"/><w:smallCaps w:val="0"/><w:strike w:val="0"/><w:color w:val="000000"/><w:sz w:val="22"/><w:szCs w:val="22"/><w:u w:val="none"/><w:shd w:fill="auto" w:val="clear"/><w:vertAlign w:val="baseline"/><w:rtl w:val="0"/></w:rPr><w:t xml:space="preserve">I have not been convicted of any offence and sentenced to a term of imprisonment. </w:t></w:r></w:p><w:p><w:pPr><w:keepNext w:val="0"/><w:keepLines w:val="0"/><w:pageBreakBefore w:val="0"/><w:widowControl w:val="0"/><w:numPr><w:ilvl w:val="0"/><w:numId w:val="2"/></w:numPr><w:pBdr><w:top w:space="0" w:sz="0" w:val="nil"/><w:left w:space="0" w:sz="0" w:val="nil"/><w:bottom w:space="0" w:sz="0" w:val="nil"/><w:right w:space="0" w:sz="0" w:val="nil"/><w:between w:space="0" w:sz="0" w:val="nil"/></w:pBdr><w:shd w:fill="auto" w:val="clear"/><w:tabs><w:tab w:val="left" w:leader="none" w:pos="953"/></w:tabs><w:spacing w:after="0" w:before="0" w:line="312" w:lineRule="auto"/><w:ind w:left="806" w:right="0" w:hanging="360"/><w:jc w:val="both"/><w:rPr><w:rFonts w:ascii="Calibri" w:cs="Calibri" w:eastAsia="Calibri" w:hAnsi="Calibri"/><w:b w:val="0"/><w:bCs w:val="0"/><w:i w:val="0"/><w:iCs w:val="0"/><w:smallCaps w:val="0"/><w:strike w:val="0"/><w:color w:val="000000"/><w:sz w:val="22"/><w:szCs w:val="22"/><w:u w:val="none"/><w:shd w:fill="auto" w:val="clear"/><w:vertAlign w:val="baseline"/></w:rPr></w:pPr><w:r><w:rPr><w:rFonts w:ascii="Calibri" w:cs="Calibri" w:eastAsia="Calibri" w:hAnsi="Calibri"/><w:b w:val="0"/><w:bCs w:val="0"/><w:i w:val="0"/><w:iCs w:val="0"/><w:smallCaps w:val="0"/><w:strike w:val="0"/><w:color w:val="000000"/><w:sz w:val="22"/><w:szCs w:val="22"/><w:u w:val="none"/><w:shd w:fill="auto" w:val="clear"/><w:vertAlign w:val="baseline"/><w:rtl w:val="0"/></w:rPr><w:t xml:space="preserve">I have not been found guilty of misconduct in my professional capacity.</w:t></w:r></w:p><w:p><w:pPr><w:keepNext w:val="0"/><w:keepLines w:val="0"/><w:pageBreakBefore w:val="0"/><w:widowControl w:val="0"/><w:numPr><w:ilvl w:val="0"/><w:numId w:val="2"/></w:numPr><w:pBdr><w:top w:space="0" w:sz="0" w:val="nil"/><w:left w:space="0" w:sz="0" w:val="nil"/><w:bottom w:space="0" w:sz="0" w:val="nil"/><w:right w:space="0" w:sz="0" w:val="nil"/><w:between w:space="0" w:sz="0" w:val="nil"/></w:pBdr><w:shd w:fill="auto" w:val="clear"/><w:tabs><w:tab w:val="left" w:leader="none" w:pos="953"/></w:tabs><w:spacing w:after="0" w:before="0" w:line="312" w:lineRule="auto"/><w:ind w:left="806" w:right="0" w:hanging="360"/><w:jc w:val="both"/><w:rPr><w:rFonts w:ascii="Calibri" w:cs="Calibri" w:eastAsia="Calibri" w:hAnsi="Calibri"/><w:b w:val="0"/><w:bCs w:val="0"/><w:i w:val="0"/><w:iCs w:val="0"/><w:smallCaps w:val="0"/><w:strike w:val="0"/><w:color w:val="000000"/><w:sz w:val="22"/><w:szCs w:val="22"/><w:u w:val="none"/><w:shd w:fill="auto" w:val="clear"/><w:vertAlign w:val="baseline"/></w:rPr></w:pPr><w:r><w:rPr><w:rFonts w:ascii="Calibri" w:cs="Calibri" w:eastAsia="Calibri" w:hAnsi="Calibri"/><w:b w:val="0"/><w:bCs w:val="0"/><w:i w:val="0"/><w:iCs w:val="0"/><w:smallCaps w:val="0"/><w:strike w:val="0"/><w:color w:val="000000"/><w:sz w:val="22"/><w:szCs w:val="22"/><w:u w:val="none"/><w:shd w:fill="auto" w:val="clear"/><w:vertAlign w:val="baseline"/><w:rtl w:val="0"/></w:rPr><w:t xml:space="preserve">I have read the Handbook on Policy Standards and procedure for Real Estate valuation, 2011 of the IBA and this report is in conformity to the “Standard” enshrined for valuation in the Part-B of the above handbook to the best of my ability.</w:t></w:r></w:p><w:p><w:pPr><w:keepNext w:val="0"/><w:keepLines w:val="0"/><w:pageBreakBefore w:val="0"/><w:widowControl w:val="0"/><w:numPr><w:ilvl w:val="0"/><w:numId w:val="2"/></w:numPr><w:pBdr><w:top w:space="0" w:sz="0" w:val="nil"/><w:left w:space="0" w:sz="0" w:val="nil"/><w:bottom w:space="0" w:sz="0" w:val="nil"/><w:right w:space="0" w:sz="0" w:val="nil"/><w:between w:space="0" w:sz="0" w:val="nil"/></w:pBdr><w:shd w:fill="auto" w:val="clear"/><w:tabs><w:tab w:val="left" w:leader="none" w:pos="953"/></w:tabs><w:spacing w:after="0" w:before="0" w:line="312" w:lineRule="auto"/><w:ind w:left="806" w:right="0" w:hanging="360"/><w:jc w:val="both"/><w:rPr><w:rFonts w:ascii="Calibri" w:cs="Calibri" w:eastAsia="Calibri" w:hAnsi="Calibri"/><w:b w:val="0"/><w:bCs w:val="0"/><w:i w:val="0"/><w:iCs w:val="0"/><w:smallCaps w:val="0"/><w:strike w:val="0"/><w:color w:val="000000"/><w:sz w:val="22"/><w:szCs w:val="22"/><w:u w:val="none"/><w:shd w:fill="auto" w:val="clear"/><w:vertAlign w:val="baseline"/></w:rPr></w:pPr><w:r><w:rPr><w:rFonts w:ascii="Calibri" w:cs="Calibri" w:eastAsia="Calibri" w:hAnsi="Calibri"/><w:b w:val="0"/><w:bCs w:val="0"/><w:i w:val="0"/><w:iCs w:val="0"/><w:smallCaps w:val="0"/><w:strike w:val="0"/><w:color w:val="000000"/><w:sz w:val="22"/><w:szCs w:val="22"/><w:u w:val="none"/><w:shd w:fill="auto" w:val="clear"/><w:vertAlign w:val="baseline"/><w:rtl w:val="0"/></w:rPr><w:t xml:space="preserve">I have Read the International Valuation Standards (IVS) and the report submitted to the Bank of the respective asset class is in conformity to the “Standard” as enshrined for valuation in the IVS in “General standard” and “Asset Standards” as applicable.</w:t></w:r></w:p><w:p><w:pPr><w:keepNext w:val="0"/><w:keepLines w:val="0"/><w:pageBreakBefore w:val="0"/><w:widowControl w:val="0"/><w:numPr><w:ilvl w:val="0"/><w:numId w:val="2"/></w:numPr><w:pBdr><w:top w:space="0" w:sz="0" w:val="nil"/><w:left w:space="0" w:sz="0" w:val="nil"/><w:bottom w:space="0" w:sz="0" w:val="nil"/><w:right w:space="0" w:sz="0" w:val="nil"/><w:between w:space="0" w:sz="0" w:val="nil"/></w:pBdr><w:shd w:fill="auto" w:val="clear"/><w:tabs><w:tab w:val="left" w:leader="none" w:pos="953"/></w:tabs><w:spacing w:after="0" w:before="0" w:line="312" w:lineRule="auto"/><w:ind w:left="806" w:right="0" w:hanging="360"/><w:jc w:val="both"/><w:rPr><w:rFonts w:ascii="Calibri" w:cs="Calibri" w:eastAsia="Calibri" w:hAnsi="Calibri"/><w:b w:val="0"/><w:bCs w:val="0"/><w:i w:val="0"/><w:iCs w:val="0"/><w:smallCaps w:val="0"/><w:strike w:val="0"/><w:color w:val="000000"/><w:sz w:val="22"/><w:szCs w:val="22"/><w:u w:val="none"/><w:shd w:fill="auto" w:val="clear"/><w:vertAlign w:val="baseline"/></w:rPr></w:pPr><w:r><w:rPr><w:rFonts w:ascii="Calibri" w:cs="Calibri" w:eastAsia="Calibri" w:hAnsi="Calibri"/><w:b w:val="0"/><w:bCs w:val="0"/><w:i w:val="0"/><w:iCs w:val="0"/><w:smallCaps w:val="0"/><w:strike w:val="0"/><w:color w:val="000000"/><w:sz w:val="22"/><w:szCs w:val="22"/><w:u w:val="none"/><w:shd w:fill="auto" w:val="clear"/><w:vertAlign w:val="baseline"/><w:rtl w:val="0"/></w:rPr><w:t xml:space="preserve">I abide by the Model Code of Conduct for empanelment of valuer in the Bank. (Annexure III-A signed Copy of Same to be taken and kept along with this declaration).</w:t></w:r></w:p><w:p><w:pPr><w:keepNext w:val="0"/><w:keepLines w:val="0"/><w:pageBreakBefore w:val="0"/><w:widowControl w:val="0"/><w:numPr><w:ilvl w:val="0"/><w:numId w:val="2"/></w:numPr><w:pBdr><w:top w:space="0" w:sz="0" w:val="nil"/><w:left w:space="0" w:sz="0" w:val="nil"/><w:bottom w:space="0" w:sz="0" w:val="nil"/><w:right w:space="0" w:sz="0" w:val="nil"/><w:between w:space="0" w:sz="0" w:val="nil"/></w:pBdr><w:shd w:fill="auto" w:val="clear"/><w:tabs><w:tab w:val="left" w:leader="none" w:pos="953"/></w:tabs><w:spacing w:after="0" w:before="0" w:line="312" w:lineRule="auto"/><w:ind w:left="806" w:right="0" w:hanging="360"/><w:jc w:val="both"/><w:rPr><w:rFonts w:ascii="Calibri" w:cs="Calibri" w:eastAsia="Calibri" w:hAnsi="Calibri"/><w:b w:val="0"/><w:bCs w:val="0"/><w:i w:val="0"/><w:iCs w:val="0"/><w:smallCaps w:val="0"/><w:strike w:val="0"/><w:color w:val="000000"/><w:sz w:val="22"/><w:szCs w:val="22"/><w:u w:val="none"/><w:shd w:fill="auto" w:val="clear"/><w:vertAlign w:val="baseline"/></w:rPr></w:pPr><w:r><w:rPr><w:rFonts w:ascii="Calibri" w:cs="Calibri" w:eastAsia="Calibri" w:hAnsi="Calibri"/><w:b w:val="0"/><w:bCs w:val="0"/><w:i w:val="0"/><w:iCs w:val="0"/><w:smallCaps w:val="0"/><w:strike w:val="0"/><w:color w:val="000000"/><w:sz w:val="22"/><w:szCs w:val="22"/><w:u w:val="none"/><w:shd w:fill="auto" w:val="clear"/><w:vertAlign w:val="baseline"/><w:rtl w:val="0"/></w:rPr><w:t xml:space="preserve">I am registered under Section 34 AB of the Wealth Tax Act, 1957.</w:t></w:r></w:p><w:p><w:pPr><w:keepNext w:val="0"/><w:keepLines w:val="0"/><w:pageBreakBefore w:val="0"/><w:widowControl w:val="0"/><w:numPr><w:ilvl w:val="0"/><w:numId w:val="2"/></w:numPr><w:pBdr><w:top w:space="0" w:sz="0" w:val="nil"/><w:left w:space="0" w:sz="0" w:val="nil"/><w:bottom w:space="0" w:sz="0" w:val="nil"/><w:right w:space="0" w:sz="0" w:val="nil"/><w:between w:space="0" w:sz="0" w:val="nil"/></w:pBdr><w:shd w:fill="auto" w:val="clear"/><w:tabs><w:tab w:val="left" w:leader="none" w:pos="953"/></w:tabs><w:spacing w:after="0" w:before="0" w:line="312" w:lineRule="auto"/><w:ind w:left="806" w:right="0" w:hanging="360"/><w:jc w:val="both"/><w:rPr><w:rFonts w:ascii="Calibri" w:cs="Calibri" w:eastAsia="Calibri" w:hAnsi="Calibri"/><w:b w:val="0"/><w:bCs w:val="0"/><w:i w:val="0"/><w:iCs w:val="0"/><w:smallCaps w:val="0"/><w:strike w:val="0"/><w:color w:val="000000"/><w:sz w:val="22"/><w:szCs w:val="22"/><w:u w:val="none"/><w:shd w:fill="auto" w:val="clear"/><w:vertAlign w:val="baseline"/></w:rPr></w:pPr><w:r><w:rPr><w:rFonts w:ascii="Calibri" w:cs="Calibri" w:eastAsia="Calibri" w:hAnsi="Calibri"/><w:b w:val="0"/><w:bCs w:val="0"/><w:i w:val="0"/><w:iCs w:val="0"/><w:smallCaps w:val="0"/><w:strike w:val="0"/><w:color w:val="000000"/><w:sz w:val="22"/><w:szCs w:val="22"/><w:u w:val="none"/><w:shd w:fill="auto" w:val="clear"/><w:vertAlign w:val="baseline"/><w:rtl w:val="0"/></w:rPr><w:t xml:space="preserve">I am the proprietor / partner / authorized official of the firm / company, who is competent to sign this valuation report.</w:t></w:r></w:p><w:p><w:pPr><w:keepNext w:val="0"/><w:keepLines w:val="0"/><w:pageBreakBefore w:val="0"/><w:widowControl w:val="0"/><w:numPr><w:ilvl w:val="0"/><w:numId w:val="2"/></w:numPr><w:pBdr><w:top w:space="0" w:sz="0" w:val="nil"/><w:left w:space="0" w:sz="0" w:val="nil"/><w:bottom w:space="0" w:sz="0" w:val="nil"/><w:right w:space="0" w:sz="0" w:val="nil"/><w:between w:space="0" w:sz="0" w:val="nil"/></w:pBdr><w:shd w:fill="auto" w:val="clear"/><w:tabs><w:tab w:val="left" w:leader="none" w:pos="953"/></w:tabs><w:spacing w:after="0" w:before="0" w:line="312" w:lineRule="auto"/><w:ind w:left="806" w:right="0" w:hanging="360"/><w:jc w:val="both"/><w:rPr><w:rFonts w:ascii="Calibri" w:cs="Calibri" w:eastAsia="Calibri" w:hAnsi="Calibri"/><w:b w:val="0"/><w:bCs w:val="0"/><w:i w:val="0"/><w:iCs w:val="0"/><w:smallCaps w:val="0"/><w:strike w:val="0"/><w:color w:val="000000"/><w:sz w:val="22"/><w:szCs w:val="22"/><w:u w:val="none"/><w:shd w:fill="auto" w:val="clear"/><w:vertAlign w:val="baseline"/></w:rPr></w:pPr><w:r><w:rPr><w:rFonts w:ascii="Calibri" w:cs="Calibri" w:eastAsia="Calibri" w:hAnsi="Calibri"/><w:b w:val="0"/><w:bCs w:val="0"/><w:i w:val="0"/><w:iCs w:val="0"/><w:smallCaps w:val="0"/><w:strike w:val="0"/><w:color w:val="000000"/><w:sz w:val="22"/><w:szCs w:val="22"/><w:u w:val="none"/><w:shd w:fill="auto" w:val="clear"/><w:vertAlign w:val="baseline"/><w:rtl w:val="0"/></w:rPr><w:t xml:space="preserve">Further, I hereby provide the Following information.</w:t></w:r></w:p><w:tbl><w:tblPr><w:tblStyle w:val="Table4"/><w:tblpPr w:leftFromText="180" w:rightFromText="180" w:topFromText="0" w:bottomFromText="0" w:vertAnchor="page" w:horzAnchor="margin" w:tblpX="0" w:tblpY="777"/><w:tblW w:w="9569.0" w:type="dxa"/><w:jc w:val="left"/><w:tblBorders><w:top w:color="000000" w:space="0" w:sz="6" w:val="single"/><w:left w:color="000000" w:space="0" w:sz="6" w:val="single"/><w:bottom w:color="000000" w:space="0" w:sz="6" w:val="single"/><w:right w:color="000000" w:space="0" w:sz="6" w:val="single"/><w:insideH w:color="000000" w:space="0" w:sz="6" w:val="single"/><w:insideV w:color="000000" w:space="0" w:sz="6" w:val="single"/></w:tblBorders><w:tblLayout w:type="fixed"/><w:tblLook w:val="0000"/></w:tblPr><w:tblGrid><w:gridCol w:w="813"/><w:gridCol w:w="4014"/><w:gridCol w:w="4742"/><w:tblGridChange w:id="0"><w:tblGrid><w:gridCol w:w="813"/><w:gridCol w:w="4014"/><w:gridCol w:w="4742"/></w:tblGrid></w:tblGridChange></w:tblGrid><w:tr><w:trPr><w:cantSplit w:val="0"/><w:trHeight w:val="389" w:hRule="atLeast"/><w:tblHeader w:val="0"/></w:trPr><w:tc><w:tcPr/><w:p><w:pPr><w:keepNext w:val="0"/><w:keepLines w:val="0"/><w:pageBreakBefore w:val="0"/><w:widowControl w:val="0"/><w:pBdr><w:top w:space="0" w:sz="0" w:val="nil"/><w:left w:space="0" w:sz="0" w:val="nil"/><w:bottom w:space="0" w:sz="0" w:val="nil"/><w:right w:space="0" w:sz="0" w:val="nil"/><w:between w:space="0" w:sz="0" w:val="nil"/></w:pBdr><w:shd w:fill="auto" w:val="clear"/><w:spacing w:after="0" w:before="0" w:line="240" w:lineRule="auto"/><w:ind w:left="105" w:right="0" w:firstLine="0"/><w:jc w:val="left"/><w:rPr><w:rFonts w:ascii="Calibri" w:cs="Calibri" w:eastAsia="Calibri" w:hAnsi="Calibri"/><w:b w:val="0"/><w:bCs w:val="0"/><w:i w:val="0"/><w:iCs w:val="0"/><w:smallCaps w:val="0"/><w:strike w:val="0"/><w:color w:val="000000"/><w:sz w:val="22"/><w:szCs w:val="22"/><w:u w:val="none"/><w:shd w:fill="auto" w:val="clear"/><w:vertAlign w:val="baseline"/></w:rPr></w:pPr><w:r><w:rPr><w:rFonts w:ascii="Calibri" w:cs="Calibri" w:eastAsia="Calibri" w:hAnsi="Calibri"/><w:b w:val="0"/><w:bCs w:val="0"/><w:i w:val="0"/><w:iCs w:val="0"/><w:smallCaps w:val="0"/><w:strike w:val="0"/><w:color w:val="000000"/><w:sz w:val="22"/><w:szCs w:val="22"/><w:u w:val="none"/><w:shd w:fill="auto" w:val="clear"/><w:vertAlign w:val="baseline"/><w:rtl w:val="0"/></w:rPr><w:t xml:space="preserve">Sr. No.</w:t></w:r></w:p></w:tc><w:tc><w:tcPr/><w:p><w:pPr><w:keepNext w:val="0"/><w:keepLines w:val="0"/><w:pageBreakBefore w:val="0"/><w:widowControl w:val="0"/><w:pBdr><w:top w:space="0" w:sz="0" w:val="nil"/><w:left w:space="0" w:sz="0" w:val="nil"/><w:bottom w:space="0" w:sz="0" w:val="nil"/><w:right w:space="0" w:sz="0" w:val="nil"/><w:between w:space="0" w:sz="0" w:val="nil"/></w:pBdr><w:shd w:fill="auto" w:val="clear"/><w:spacing w:after="0" w:before="0" w:line="240" w:lineRule="auto"/><w:ind w:left="105" w:right="0" w:firstLine="0"/><w:jc w:val="center"/><w:rPr><w:rFonts w:ascii="Calibri" w:cs="Calibri" w:eastAsia="Calibri" w:hAnsi="Calibri"/><w:b w:val="0"/><w:bCs w:val="0"/><w:i w:val="0"/><w:iCs w:val="0"/><w:smallCaps w:val="0"/><w:strike w:val="0"/><w:color w:val="000000"/><w:sz w:val="22"/><w:szCs w:val="22"/><w:u w:val="none"/><w:shd w:fill="auto" w:val="clear"/><w:vertAlign w:val="baseline"/></w:rPr></w:pPr><w:r><w:rPr><w:rFonts w:ascii="Calibri" w:cs="Calibri" w:eastAsia="Calibri" w:hAnsi="Calibri"/><w:b w:val="0"/><w:bCs w:val="0"/><w:i w:val="0"/><w:iCs w:val="0"/><w:smallCaps w:val="0"/><w:strike w:val="0"/><w:color w:val="000000"/><w:sz w:val="22"/><w:szCs w:val="22"/><w:u w:val="none"/><w:shd w:fill="auto" w:val="clear"/><w:vertAlign w:val="baseline"/><w:rtl w:val="0"/></w:rPr><w:t xml:space="preserve">Particulars</w:t></w:r></w:p></w:tc><w:tc><w:tcPr/><w:p><w:pPr><w:keepNext w:val="0"/><w:keepLines w:val="0"/><w:pageBreakBefore w:val="0"/><w:widowControl w:val="0"/><w:pBdr><w:top w:space="0" w:sz="0" w:val="nil"/><w:left w:space="0" w:sz="0" w:val="nil"/><w:bottom w:space="0" w:sz="0" w:val="nil"/><w:right w:space="0" w:sz="0" w:val="nil"/><w:between w:space="0" w:sz="0" w:val="nil"/></w:pBdr><w:shd w:fill="auto" w:val="clear"/><w:spacing w:after="0" w:before="0" w:line="240" w:lineRule="auto"/><w:ind w:left="105" w:right="0" w:firstLine="0"/><w:jc w:val="center"/><w:rPr><w:rFonts w:ascii="Calibri" w:cs="Calibri" w:eastAsia="Calibri" w:hAnsi="Calibri"/><w:b w:val="0"/><w:bCs w:val="0"/><w:i w:val="0"/><w:iCs w:val="0"/><w:smallCaps w:val="0"/><w:strike w:val="0"/><w:color w:val="000000"/><w:sz w:val="22"/><w:szCs w:val="22"/><w:u w:val="none"/><w:shd w:fill="auto" w:val="clear"/><w:vertAlign w:val="baseline"/></w:rPr></w:pPr><w:r><w:rPr><w:rFonts w:ascii="Calibri" w:cs="Calibri" w:eastAsia="Calibri" w:hAnsi="Calibri"/><w:b w:val="0"/><w:bCs w:val="0"/><w:i w:val="0"/><w:iCs w:val="0"/><w:smallCaps w:val="0"/><w:strike w:val="0"/><w:color w:val="000000"/><w:sz w:val="22"/><w:szCs w:val="22"/><w:u w:val="none"/><w:shd w:fill="auto" w:val="clear"/><w:vertAlign w:val="baseline"/><w:rtl w:val="0"/></w:rPr><w:t xml:space="preserve">Valuer comment</w:t></w:r></w:p></w:tc></w:tr><w:tr><w:trPr><w:cantSplit w:val="0"/><w:trHeight w:val="389" w:hRule="atLeast"/><w:tblHeader w:val="0"/></w:trPr><w:tc><w:tcPr/><w:p><w:pPr><w:keepNext w:val="0"/><w:keepLines w:val="0"/><w:pageBreakBefore w:val="0"/><w:widowControl w:val="0"/><w:numPr><w:ilvl w:val="0"/><w:numId w:val="3"/></w:numPr><w:pBdr><w:top w:space="0" w:sz="0" w:val="nil"/><w:left w:space="0" w:sz="0" w:val="nil"/><w:bottom w:space="0" w:sz="0" w:val="nil"/><w:right w:space="0" w:sz="0" w:val="nil"/><w:between w:space="0" w:sz="0" w:val="nil"/></w:pBdr><w:shd w:fill="auto" w:val="clear"/><w:spacing w:after="0" w:before="0" w:line="240" w:lineRule="auto"/><w:ind w:left="644" w:right="0" w:hanging="360"/><w:jc w:val="both"/><w:rPr><w:rFonts w:ascii="Calibri" w:cs="Calibri" w:eastAsia="Calibri" w:hAnsi="Calibri"/><w:b w:val="0"/><w:bCs w:val="0"/><w:i w:val="0"/><w:iCs w:val="0"/><w:smallCaps w:val="0"/><w:strike w:val="0"/><w:color w:val="000000"/><w:sz w:val="22"/><w:szCs w:val="22"/><w:u w:val="none"/><w:shd w:fill="auto" w:val="clear"/><w:vertAlign w:val="baseline"/></w:rPr></w:pPr><w:r><w:rPr><w:rtl w:val="0"/></w:rPr></w:r></w:p></w:tc><w:tc><w:tcPr/><w:p><w:pPr><w:keepNext w:val="0"/><w:keepLines w:val="0"/><w:pageBreakBefore w:val="0"/><w:widowControl w:val="0"/><w:pBdr><w:top w:space="0" w:sz="0" w:val="nil"/><w:left w:space="0" w:sz="0" w:val="nil"/><w:bottom w:space="0" w:sz="0" w:val="nil"/><w:right w:space="0" w:sz="0" w:val="nil"/><w:between w:space="0" w:sz="0" w:val="nil"/></w:pBdr><w:shd w:fill="auto" w:val="clear"/><w:spacing w:after="0" w:before="0" w:line="240" w:lineRule="auto"/><w:ind w:left="105" w:right="0" w:firstLine="0"/><w:jc w:val="left"/><w:rPr><w:rFonts w:ascii="Calibri" w:cs="Calibri" w:eastAsia="Calibri" w:hAnsi="Calibri"/><w:b w:val="0"/><w:bCs w:val="0"/><w:i w:val="0"/><w:iCs w:val="0"/><w:smallCaps w:val="0"/><w:strike w:val="0"/><w:color w:val="000000"/><w:sz w:val="22"/><w:szCs w:val="22"/><w:u w:val="none"/><w:shd w:fill="auto" w:val="clear"/><w:vertAlign w:val="baseline"/></w:rPr></w:pPr><w:r><w:rPr><w:rFonts w:ascii="Calibri" w:cs="Calibri" w:eastAsia="Calibri" w:hAnsi="Calibri"/><w:b w:val="0"/><w:bCs w:val="0"/><w:i w:val="0"/><w:iCs w:val="0"/><w:smallCaps w:val="0"/><w:strike w:val="0"/><w:color w:val="000000"/><w:sz w:val="22"/><w:szCs w:val="22"/><w:u w:val="none"/><w:shd w:fill="auto" w:val="clear"/><w:vertAlign w:val="baseline"/><w:rtl w:val="0"/></w:rPr><w:t xml:space="preserve">Background information of the asset being valued;</w:t></w:r></w:p></w:tc><w:tc><w:tcPr/><w:p><w:pPr><w:keepNext w:val="0"/><w:keepLines w:val="0"/><w:pageBreakBefore w:val="0"/><w:widowControl w:val="0"/><w:pBdr><w:top w:space="0" w:sz="0" w:val="nil"/><w:left w:space="0" w:sz="0" w:val="nil"/><w:bottom w:space="0" w:sz="0" w:val="nil"/><w:right w:space="0" w:sz="0" w:val="nil"/><w:between w:space="0" w:sz="0" w:val="nil"/></w:pBdr><w:shd w:fill="auto" w:val="clear"/><w:spacing w:after="0" w:before="0" w:line="240" w:lineRule="auto"/><w:ind w:left="104" w:right="134" w:firstLine="0"/><w:jc w:val="both"/><w:rPr><w:rFonts w:ascii="Calibri" w:cs="Calibri" w:eastAsia="Calibri" w:hAnsi="Calibri"/><w:b w:val="0"/><w:bCs w:val="0"/><w:i w:val="0"/><w:iCs w:val="0"/><w:smallCaps w:val="0"/><w:strike w:val="0"/><w:color w:val="000000"/><w:sz w:val="22"/><w:szCs w:val="22"/><w:highlight w:val="yellow"/><w:u w:val="none"/><w:vertAlign w:val="baseline"/></w:rPr></w:pPr><w:r><w:rPr><w:rtl w:val="0"/></w:rPr></w:r></w:p></w:tc></w:tr><w:tr><w:trPr><w:cantSplit w:val="0"/><w:trHeight w:val="389" w:hRule="atLeast"/><w:tblHeader w:val="0"/></w:trPr><w:tc><w:tcPr/><w:p><w:pPr><w:keepNext w:val="0"/><w:keepLines w:val="0"/><w:pageBreakBefore w:val="0"/><w:widowControl w:val="0"/><w:numPr><w:ilvl w:val="0"/><w:numId w:val="3"/></w:numPr><w:pBdr><w:top w:space="0" w:sz="0" w:val="nil"/><w:left w:space="0" w:sz="0" w:val="nil"/><w:bottom w:space="0" w:sz="0" w:val="nil"/><w:right w:space="0" w:sz="0" w:val="nil"/><w:between w:space="0" w:sz="0" w:val="nil"/></w:pBdr><w:shd w:fill="auto" w:val="clear"/><w:spacing w:after="0" w:before="0" w:line="240" w:lineRule="auto"/><w:ind w:left="644" w:right="0" w:hanging="360"/><w:jc w:val="both"/><w:rPr><w:rFonts w:ascii="Calibri" w:cs="Calibri" w:eastAsia="Calibri" w:hAnsi="Calibri"/><w:b w:val="0"/><w:bCs w:val="0"/><w:i w:val="0"/><w:iCs w:val="0"/><w:smallCaps w:val="0"/><w:strike w:val="0"/><w:color w:val="000000"/><w:sz w:val="22"/><w:szCs w:val="22"/><w:u w:val="none"/><w:shd w:fill="auto" w:val="clear"/><w:vertAlign w:val="baseline"/></w:rPr></w:pPr><w:r><w:rPr><w:rtl w:val="0"/></w:rPr></w:r></w:p></w:tc><w:tc><w:tcPr/><w:p><w:pPr><w:keepNext w:val="0"/><w:keepLines w:val="0"/><w:pageBreakBefore w:val="0"/><w:widowControl w:val="0"/><w:pBdr><w:top w:space="0" w:sz="0" w:val="nil"/><w:left w:space="0" w:sz="0" w:val="nil"/><w:bottom w:space="0" w:sz="0" w:val="nil"/><w:right w:space="0" w:sz="0" w:val="nil"/><w:between w:space="0" w:sz="0" w:val="nil"/></w:pBdr><w:shd w:fill="auto" w:val="clear"/><w:spacing w:after="0" w:before="0" w:line="240" w:lineRule="auto"/><w:ind w:left="104" w:right="0" w:firstLine="0"/><w:jc w:val="left"/><w:rPr><w:rFonts w:ascii="Calibri" w:cs="Calibri" w:eastAsia="Calibri" w:hAnsi="Calibri"/><w:b w:val="0"/><w:bCs w:val="0"/><w:i w:val="0"/><w:iCs w:val="0"/><w:smallCaps w:val="0"/><w:strike w:val="0"/><w:color w:val="000000"/><w:sz w:val="22"/><w:szCs w:val="22"/><w:u w:val="none"/><w:shd w:fill="auto" w:val="clear"/><w:vertAlign w:val="baseline"/></w:rPr></w:pPr><w:r><w:rPr><w:rFonts w:ascii="Calibri" w:cs="Calibri" w:eastAsia="Calibri" w:hAnsi="Calibri"/><w:b w:val="0"/><w:bCs w:val="0"/><w:i w:val="0"/><w:iCs w:val="0"/><w:smallCaps w:val="0"/><w:strike w:val="0"/><w:color w:val="000000"/><w:sz w:val="22"/><w:szCs w:val="22"/><w:u w:val="none"/><w:shd w:fill="auto" w:val="clear"/><w:vertAlign w:val="baseline"/><w:rtl w:val="0"/></w:rPr><w:t xml:space="preserve">Purpose of valuation and appointing authority</w:t></w:r></w:p></w:tc><w:tc><w:tcPr/><w:p><w:pPr><w:keepNext w:val="0"/><w:keepLines w:val="0"/><w:pageBreakBefore w:val="0"/><w:widowControl w:val="0"/><w:pBdr><w:top w:space="0" w:sz="0" w:val="nil"/><w:left w:space="0" w:sz="0" w:val="nil"/><w:bottom w:space="0" w:sz="0" w:val="nil"/><w:right w:space="0" w:sz="0" w:val="nil"/><w:between w:space="0" w:sz="0" w:val="nil"/></w:pBdr><w:shd w:fill="auto" w:val="clear"/><w:spacing w:after="0" w:before="0" w:line="240" w:lineRule="auto"/><w:ind w:left="104" w:right="134" w:firstLine="0"/><w:jc w:val="both"/><w:rPr><w:rFonts w:ascii="Calibri" w:cs="Calibri" w:eastAsia="Calibri" w:hAnsi="Calibri"/><w:b w:val="0"/><w:bCs w:val="0"/><w:i w:val="0"/><w:iCs w:val="0"/><w:smallCaps w:val="0"/><w:strike w:val="0"/><w:color w:val="000000"/><w:sz w:val="22"/><w:szCs w:val="22"/><w:highlight w:val="yellow"/><w:u w:val="none"/><w:vertAlign w:val="baseline"/></w:rPr></w:pPr><w:r><w:rPr><w:rtl w:val="0"/></w:rPr></w:r></w:p></w:tc></w:tr><w:tr><w:trPr><w:cantSplit w:val="0"/><w:trHeight w:val="389" w:hRule="atLeast"/><w:tblHeader w:val="0"/></w:trPr><w:tc><w:tcPr/><w:p><w:pPr><w:keepNext w:val="0"/><w:keepLines w:val="0"/><w:pageBreakBefore w:val="0"/><w:widowControl w:val="0"/><w:numPr><w:ilvl w:val="0"/><w:numId w:val="3"/></w:numPr><w:pBdr><w:top w:space="0" w:sz="0" w:val="nil"/><w:left w:space="0" w:sz="0" w:val="nil"/><w:bottom w:space="0" w:sz="0" w:val="nil"/><w:right w:space="0" w:sz="0" w:val="nil"/><w:between w:space="0" w:sz="0" w:val="nil"/></w:pBdr><w:shd w:fill="auto" w:val="clear"/><w:spacing w:after="0" w:before="0" w:line="240" w:lineRule="auto"/><w:ind w:left="644" w:right="0" w:hanging="360"/><w:jc w:val="both"/><w:rPr><w:rFonts w:ascii="Calibri" w:cs="Calibri" w:eastAsia="Calibri" w:hAnsi="Calibri"/><w:b w:val="0"/><w:bCs w:val="0"/><w:i w:val="0"/><w:iCs w:val="0"/><w:smallCaps w:val="0"/><w:strike w:val="0"/><w:color w:val="000000"/><w:sz w:val="22"/><w:szCs w:val="22"/><w:u w:val="none"/><w:shd w:fill="auto" w:val="clear"/><w:vertAlign w:val="baseline"/></w:rPr></w:pPr><w:r><w:rPr><w:rtl w:val="0"/></w:rPr></w:r></w:p></w:tc><w:tc><w:tcPr/><w:p><w:pPr><w:keepNext w:val="0"/><w:keepLines w:val="0"/><w:pageBreakBefore w:val="0"/><w:widowControl w:val="0"/><w:pBdr><w:top w:space="0" w:sz="0" w:val="nil"/><w:left w:space="0" w:sz="0" w:val="nil"/><w:bottom w:space="0" w:sz="0" w:val="nil"/><w:right w:space="0" w:sz="0" w:val="nil"/><w:between w:space="0" w:sz="0" w:val="nil"/></w:pBdr><w:shd w:fill="auto" w:val="clear"/><w:spacing w:after="0" w:before="1" w:line="240" w:lineRule="auto"/><w:ind w:left="105" w:right="91" w:firstLine="0"/><w:jc w:val="left"/><w:rPr><w:rFonts w:ascii="Calibri" w:cs="Calibri" w:eastAsia="Calibri" w:hAnsi="Calibri"/><w:b w:val="0"/><w:bCs w:val="0"/><w:i w:val="0"/><w:iCs w:val="0"/><w:smallCaps w:val="0"/><w:strike w:val="0"/><w:color w:val="000000"/><w:sz w:val="22"/><w:szCs w:val="22"/><w:u w:val="none"/><w:shd w:fill="auto" w:val="clear"/><w:vertAlign w:val="baseline"/></w:rPr></w:pPr><w:r><w:rPr><w:rFonts w:ascii="Calibri" w:cs="Calibri" w:eastAsia="Calibri" w:hAnsi="Calibri"/><w:b w:val="0"/><w:bCs w:val="0"/><w:i w:val="0"/><w:iCs w:val="0"/><w:smallCaps w:val="0"/><w:strike w:val="0"/><w:color w:val="000000"/><w:sz w:val="22"/><w:szCs w:val="22"/><w:u w:val="none"/><w:shd w:fill="auto" w:val="clear"/><w:vertAlign w:val="baseline"/><w:rtl w:val="0"/></w:rPr><w:t xml:space="preserve">Identity of the valuer and any other experts involved in the valuation;</w:t></w:r></w:p></w:tc><w:tc><w:tcPr/><w:p><w:pPr><w:keepNext w:val="0"/><w:keepLines w:val="0"/><w:pageBreakBefore w:val="0"/><w:widowControl w:val="0"/><w:pBdr><w:top w:space="0" w:sz="0" w:val="nil"/><w:left w:space="0" w:sz="0" w:val="nil"/><w:bottom w:space="0" w:sz="0" w:val="nil"/><w:right w:space="0" w:sz="0" w:val="nil"/><w:between w:space="0" w:sz="0" w:val="nil"/></w:pBdr><w:shd w:fill="auto" w:val="clear"/><w:spacing w:after="0" w:before="0" w:line="240" w:lineRule="auto"/><w:ind w:left="104" w:right="134" w:firstLine="0"/><w:jc w:val="both"/><w:rPr><w:rFonts w:ascii="Calibri" w:cs="Calibri" w:eastAsia="Calibri" w:hAnsi="Calibri"/><w:b w:val="0"/><w:bCs w:val="0"/><w:i w:val="0"/><w:iCs w:val="0"/><w:smallCaps w:val="0"/><w:strike w:val="0"/><w:color w:val="000000"/><w:sz w:val="22"/><w:szCs w:val="22"/><w:u w:val="none"/><w:shd w:fill="auto" w:val="clear"/><w:vertAlign w:val="baseline"/></w:rPr></w:pPr><w:r><w:rPr><w:rtl w:val="0"/></w:rPr></w:r></w:p></w:tc></w:tr><w:tr><w:trPr><w:cantSplit w:val="0"/><w:trHeight w:val="389" w:hRule="atLeast"/><w:tblHeader w:val="0"/></w:trPr><w:tc><w:tcPr/><w:p><w:pPr><w:keepNext w:val="0"/><w:keepLines w:val="0"/><w:pageBreakBefore w:val="0"/><w:widowControl w:val="0"/><w:numPr><w:ilvl w:val="0"/><w:numId w:val="3"/></w:numPr><w:pBdr><w:top w:space="0" w:sz="0" w:val="nil"/><w:left w:space="0" w:sz="0" w:val="nil"/><w:bottom w:space="0" w:sz="0" w:val="nil"/><w:right w:space="0" w:sz="0" w:val="nil"/><w:between w:space="0" w:sz="0" w:val="nil"/></w:pBdr><w:shd w:fill="auto" w:val="clear"/><w:spacing w:after="0" w:before="0" w:line="240" w:lineRule="auto"/><w:ind w:left="644" w:right="0" w:hanging="360"/><w:jc w:val="both"/><w:rPr><w:rFonts w:ascii="Calibri" w:cs="Calibri" w:eastAsia="Calibri" w:hAnsi="Calibri"/><w:b w:val="0"/><w:bCs w:val="0"/><w:i w:val="0"/><w:iCs w:val="0"/><w:smallCaps w:val="0"/><w:strike w:val="0"/><w:color w:val="000000"/><w:sz w:val="22"/><w:szCs w:val="22"/><w:u w:val="none"/><w:shd w:fill="auto" w:val="clear"/><w:vertAlign w:val="baseline"/></w:rPr></w:pPr><w:r><w:rPr><w:rtl w:val="0"/></w:rPr></w:r></w:p></w:tc><w:tc><w:tcPr/><w:p><w:pPr><w:keepNext w:val="0"/><w:keepLines w:val="0"/><w:pageBreakBefore w:val="0"/><w:widowControl w:val="0"/><w:pBdr><w:top w:space="0" w:sz="0" w:val="nil"/><w:left w:space="0" w:sz="0" w:val="nil"/><w:bottom w:space="0" w:sz="0" w:val="nil"/><w:right w:space="0" w:sz="0" w:val="nil"/><w:between w:space="0" w:sz="0" w:val="nil"/></w:pBdr><w:shd w:fill="auto" w:val="clear"/><w:spacing w:after="0" w:before="0" w:line="240" w:lineRule="auto"/><w:ind w:left="104" w:right="0" w:firstLine="0"/><w:jc w:val="left"/><w:rPr><w:rFonts w:ascii="Calibri" w:cs="Calibri" w:eastAsia="Calibri" w:hAnsi="Calibri"/><w:b w:val="0"/><w:bCs w:val="0"/><w:i w:val="0"/><w:iCs w:val="0"/><w:smallCaps w:val="0"/><w:strike w:val="0"/><w:color w:val="000000"/><w:sz w:val="22"/><w:szCs w:val="22"/><w:u w:val="none"/><w:shd w:fill="auto" w:val="clear"/><w:vertAlign w:val="baseline"/></w:rPr></w:pPr><w:r><w:rPr><w:rFonts w:ascii="Calibri" w:cs="Calibri" w:eastAsia="Calibri" w:hAnsi="Calibri"/><w:b w:val="0"/><w:bCs w:val="0"/><w:i w:val="0"/><w:iCs w:val="0"/><w:smallCaps w:val="0"/><w:strike w:val="0"/><w:color w:val="000000"/><w:sz w:val="22"/><w:szCs w:val="22"/><w:u w:val="none"/><w:shd w:fill="auto" w:val="clear"/><w:vertAlign w:val="baseline"/><w:rtl w:val="0"/></w:rPr><w:t xml:space="preserve">Disclosure of valuer interest or conflict, if any;</w:t></w:r></w:p></w:tc><w:tc><w:tcPr/><w:p><w:pPr><w:keepNext w:val="0"/><w:keepLines w:val="0"/><w:pageBreakBefore w:val="0"/><w:widowControl w:val="0"/><w:pBdr><w:top w:space="0" w:sz="0" w:val="nil"/><w:left w:space="0" w:sz="0" w:val="nil"/><w:bottom w:space="0" w:sz="0" w:val="nil"/><w:right w:space="0" w:sz="0" w:val="nil"/><w:between w:space="0" w:sz="0" w:val="nil"/></w:pBdr><w:shd w:fill="auto" w:val="clear"/><w:spacing w:after="0" w:before="0" w:line="240" w:lineRule="auto"/><w:ind w:left="104" w:right="134" w:firstLine="0"/><w:jc w:val="both"/><w:rPr><w:rFonts w:ascii="Calibri" w:cs="Calibri" w:eastAsia="Calibri" w:hAnsi="Calibri"/><w:b w:val="0"/><w:bCs w:val="0"/><w:i w:val="0"/><w:iCs w:val="0"/><w:smallCaps w:val="0"/><w:strike w:val="0"/><w:color w:val="000000"/><w:sz w:val="22"/><w:szCs w:val="22"/><w:highlight w:val="yellow"/><w:u w:val="none"/><w:vertAlign w:val="baseline"/></w:rPr></w:pPr><w:r><w:rPr><w:rtl w:val="0"/></w:rPr></w:r></w:p></w:tc></w:tr><w:tr><w:trPr><w:cantSplit w:val="0"/><w:trHeight w:val="389" w:hRule="atLeast"/><w:tblHeader w:val="0"/></w:trPr><w:tc><w:tcPr/><w:p><w:pPr><w:keepNext w:val="0"/><w:keepLines w:val="0"/><w:pageBreakBefore w:val="0"/><w:widowControl w:val="0"/><w:numPr><w:ilvl w:val="0"/><w:numId w:val="3"/></w:numPr><w:pBdr><w:top w:space="0" w:sz="0" w:val="nil"/><w:left w:space="0" w:sz="0" w:val="nil"/><w:bottom w:space="0" w:sz="0" w:val="nil"/><w:right w:space="0" w:sz="0" w:val="nil"/><w:between w:space="0" w:sz="0" w:val="nil"/></w:pBdr><w:shd w:fill="auto" w:val="clear"/><w:spacing w:after="0" w:before="0" w:line="240" w:lineRule="auto"/><w:ind w:left="644" w:right="0" w:hanging="360"/><w:jc w:val="both"/><w:rPr><w:rFonts w:ascii="Calibri" w:cs="Calibri" w:eastAsia="Calibri" w:hAnsi="Calibri"/><w:b w:val="0"/><w:bCs w:val="0"/><w:i w:val="0"/><w:iCs w:val="0"/><w:smallCaps w:val="0"/><w:strike w:val="0"/><w:color w:val="000000"/><w:sz w:val="22"/><w:szCs w:val="22"/><w:u w:val="none"/><w:shd w:fill="auto" w:val="clear"/><w:vertAlign w:val="baseline"/></w:rPr></w:pPr><w:r><w:rPr><w:rtl w:val="0"/></w:rPr></w:r></w:p></w:tc><w:tc><w:tcPr/><w:p><w:pPr><w:keepNext w:val="0"/><w:keepLines w:val="0"/><w:pageBreakBefore w:val="0"/><w:widowControl w:val="0"/><w:pBdr><w:top w:space="0" w:sz="0" w:val="nil"/><w:left w:space="0" w:sz="0" w:val="nil"/><w:bottom w:space="0" w:sz="0" w:val="nil"/><w:right w:space="0" w:sz="0" w:val="nil"/><w:between w:space="0" w:sz="0" w:val="nil"/></w:pBdr><w:shd w:fill="auto" w:val="clear"/><w:spacing w:after="0" w:before="0" w:line="240" w:lineRule="auto"/><w:ind w:left="104" w:right="0" w:firstLine="0"/><w:jc w:val="left"/><w:rPr><w:rFonts w:ascii="Calibri" w:cs="Calibri" w:eastAsia="Calibri" w:hAnsi="Calibri"/><w:b w:val="0"/><w:bCs w:val="0"/><w:i w:val="0"/><w:iCs w:val="0"/><w:smallCaps w:val="0"/><w:strike w:val="0"/><w:color w:val="000000"/><w:sz w:val="22"/><w:szCs w:val="22"/><w:u w:val="none"/><w:shd w:fill="auto" w:val="clear"/><w:vertAlign w:val="baseline"/></w:rPr></w:pPr><w:r><w:rPr><w:rFonts w:ascii="Calibri" w:cs="Calibri" w:eastAsia="Calibri" w:hAnsi="Calibri"/><w:b w:val="0"/><w:bCs w:val="0"/><w:i w:val="0"/><w:iCs w:val="0"/><w:smallCaps w:val="0"/><w:strike w:val="0"/><w:color w:val="000000"/><w:sz w:val="22"/><w:szCs w:val="22"/><w:u w:val="none"/><w:shd w:fill="auto" w:val="clear"/><w:vertAlign w:val="baseline"/><w:rtl w:val="0"/></w:rPr><w:t xml:space="preserve">Date of appointment, valuation date and date of report;</w:t></w:r></w:p></w:tc><w:tc><w:tcPr/><w:p><w:pPr><w:keepNext w:val="0"/><w:keepLines w:val="0"/><w:pageBreakBefore w:val="0"/><w:widowControl w:val="0"/><w:pBdr><w:top w:space="0" w:sz="0" w:val="nil"/><w:left w:space="0" w:sz="0" w:val="nil"/><w:bottom w:space="0" w:sz="0" w:val="nil"/><w:right w:space="0" w:sz="0" w:val="nil"/><w:between w:space="0" w:sz="0" w:val="nil"/></w:pBdr><w:shd w:fill="auto" w:val="clear"/><w:spacing w:after="0" w:before="0" w:line="240" w:lineRule="auto"/><w:ind w:left="104" w:right="134" w:firstLine="0"/><w:jc w:val="both"/><w:rPr><w:rFonts w:ascii="Calibri" w:cs="Calibri" w:eastAsia="Calibri" w:hAnsi="Calibri"/><w:b w:val="0"/><w:bCs w:val="0"/><w:i w:val="0"/><w:iCs w:val="0"/><w:smallCaps w:val="0"/><w:strike w:val="0"/><w:color w:val="000000"/><w:sz w:val="22"/><w:szCs w:val="22"/><w:u w:val="none"/><w:shd w:fill="auto" w:val="clear"/><w:vertAlign w:val="baseline"/></w:rPr></w:pPr><w:r><w:rPr><w:rtl w:val="0"/></w:rPr></w:r></w:p></w:tc></w:tr><w:tr><w:trPr><w:cantSplit w:val="0"/><w:trHeight w:val="389" w:hRule="atLeast"/><w:tblHeader w:val="0"/></w:trPr><w:tc><w:tcPr/><w:p><w:pPr><w:keepNext w:val="0"/><w:keepLines w:val="0"/><w:pageBreakBefore w:val="0"/><w:widowControl w:val="0"/><w:numPr><w:ilvl w:val="0"/><w:numId w:val="3"/></w:numPr><w:pBdr><w:top w:space="0" w:sz="0" w:val="nil"/><w:left w:space="0" w:sz="0" w:val="nil"/><w:bottom w:space="0" w:sz="0" w:val="nil"/><w:right w:space="0" w:sz="0" w:val="nil"/><w:between w:space="0" w:sz="0" w:val="nil"/></w:pBdr><w:shd w:fill="auto" w:val="clear"/><w:spacing w:after="0" w:before="0" w:line="240" w:lineRule="auto"/><w:ind w:left="644" w:right="0" w:hanging="360"/><w:jc w:val="both"/><w:rPr><w:rFonts w:ascii="Calibri" w:cs="Calibri" w:eastAsia="Calibri" w:hAnsi="Calibri"/><w:b w:val="0"/><w:bCs w:val="0"/><w:i w:val="0"/><w:iCs w:val="0"/><w:smallCaps w:val="0"/><w:strike w:val="0"/><w:color w:val="000000"/><w:sz w:val="22"/><w:szCs w:val="22"/><w:u w:val="none"/><w:shd w:fill="auto" w:val="clear"/><w:vertAlign w:val="baseline"/></w:rPr></w:pPr><w:r><w:rPr><w:rtl w:val="0"/></w:rPr></w:r></w:p></w:tc><w:tc><w:tcPr/><w:p><w:pPr><w:keepNext w:val="0"/><w:keepLines w:val="0"/><w:pageBreakBefore w:val="0"/><w:widowControl w:val="0"/><w:pBdr><w:top w:space="0" w:sz="0" w:val="nil"/><w:left w:space="0" w:sz="0" w:val="nil"/><w:bottom w:space="0" w:sz="0" w:val="nil"/><w:right w:space="0" w:sz="0" w:val="nil"/><w:between w:space="0" w:sz="0" w:val="nil"/></w:pBdr><w:shd w:fill="auto" w:val="clear"/><w:spacing w:after="0" w:before="0" w:line="240" w:lineRule="auto"/><w:ind w:left="104" w:right="0" w:firstLine="0"/><w:jc w:val="left"/><w:rPr><w:rFonts w:ascii="Calibri" w:cs="Calibri" w:eastAsia="Calibri" w:hAnsi="Calibri"/><w:b w:val="0"/><w:bCs w:val="0"/><w:i w:val="0"/><w:iCs w:val="0"/><w:smallCaps w:val="0"/><w:strike w:val="0"/><w:color w:val="000000"/><w:sz w:val="22"/><w:szCs w:val="22"/><w:u w:val="none"/><w:shd w:fill="auto" w:val="clear"/><w:vertAlign w:val="baseline"/></w:rPr></w:pPr><w:r><w:rPr><w:rFonts w:ascii="Calibri" w:cs="Calibri" w:eastAsia="Calibri" w:hAnsi="Calibri"/><w:b w:val="0"/><w:bCs w:val="0"/><w:i w:val="0"/><w:iCs w:val="0"/><w:smallCaps w:val="0"/><w:strike w:val="0"/><w:color w:val="000000"/><w:sz w:val="22"/><w:szCs w:val="22"/><w:u w:val="none"/><w:shd w:fill="auto" w:val="clear"/><w:vertAlign w:val="baseline"/><w:rtl w:val="0"/></w:rPr><w:t xml:space="preserve">Inspections and/or investigations undertaken;</w:t></w:r></w:p></w:tc><w:tc><w:tcPr/><w:p><w:pPr><w:keepNext w:val="0"/><w:keepLines w:val="0"/><w:pageBreakBefore w:val="0"/><w:widowControl w:val="0"/><w:pBdr><w:top w:space="0" w:sz="0" w:val="nil"/><w:left w:space="0" w:sz="0" w:val="nil"/><w:bottom w:space="0" w:sz="0" w:val="nil"/><w:right w:space="0" w:sz="0" w:val="nil"/><w:between w:space="0" w:sz="0" w:val="nil"/></w:pBdr><w:shd w:fill="auto" w:val="clear"/><w:spacing w:after="0" w:before="0" w:line="240" w:lineRule="auto"/><w:ind w:left="104" w:right="134" w:firstLine="0"/><w:jc w:val="both"/><w:rPr><w:rFonts w:ascii="Calibri" w:cs="Calibri" w:eastAsia="Calibri" w:hAnsi="Calibri"/><w:b w:val="0"/><w:bCs w:val="0"/><w:i w:val="0"/><w:iCs w:val="0"/><w:smallCaps w:val="0"/><w:strike w:val="0"/><w:color w:val="000000"/><w:sz w:val="22"/><w:szCs w:val="22"/><w:u w:val="none"/><w:shd w:fill="auto" w:val="clear"/><w:vertAlign w:val="baseline"/></w:rPr></w:pPr><w:r><w:rPr><w:rtl w:val="0"/></w:rPr></w:r></w:p></w:tc></w:tr><w:tr><w:trPr><w:cantSplit w:val="0"/><w:trHeight w:val="389" w:hRule="atLeast"/><w:tblHeader w:val="0"/></w:trPr><w:tc><w:tcPr/><w:p><w:pPr><w:keepNext w:val="0"/><w:keepLines w:val="0"/><w:pageBreakBefore w:val="0"/><w:widowControl w:val="0"/><w:numPr><w:ilvl w:val="0"/><w:numId w:val="3"/></w:numPr><w:pBdr><w:top w:space="0" w:sz="0" w:val="nil"/><w:left w:space="0" w:sz="0" w:val="nil"/><w:bottom w:space="0" w:sz="0" w:val="nil"/><w:right w:space="0" w:sz="0" w:val="nil"/><w:between w:space="0" w:sz="0" w:val="nil"/></w:pBdr><w:shd w:fill="auto" w:val="clear"/><w:spacing w:after="0" w:before="0" w:line="240" w:lineRule="auto"/><w:ind w:left="644" w:right="0" w:hanging="360"/><w:jc w:val="both"/><w:rPr><w:rFonts w:ascii="Calibri" w:cs="Calibri" w:eastAsia="Calibri" w:hAnsi="Calibri"/><w:b w:val="0"/><w:bCs w:val="0"/><w:i w:val="0"/><w:iCs w:val="0"/><w:smallCaps w:val="0"/><w:strike w:val="0"/><w:color w:val="000000"/><w:sz w:val="22"/><w:szCs w:val="22"/><w:u w:val="none"/><w:shd w:fill="auto" w:val="clear"/><w:vertAlign w:val="baseline"/></w:rPr></w:pPr><w:r><w:rPr><w:rtl w:val="0"/></w:rPr></w:r></w:p></w:tc><w:tc><w:tcPr/><w:p><w:pPr><w:keepNext w:val="0"/><w:keepLines w:val="0"/><w:pageBreakBefore w:val="0"/><w:widowControl w:val="0"/><w:pBdr><w:top w:space="0" w:sz="0" w:val="nil"/><w:left w:space="0" w:sz="0" w:val="nil"/><w:bottom w:space="0" w:sz="0" w:val="nil"/><w:right w:space="0" w:sz="0" w:val="nil"/><w:between w:space="0" w:sz="0" w:val="nil"/></w:pBdr><w:shd w:fill="auto" w:val="clear"/><w:spacing w:after="0" w:before="1" w:line="240" w:lineRule="auto"/><w:ind w:left="105" w:right="91" w:firstLine="0"/><w:jc w:val="left"/><w:rPr><w:rFonts w:ascii="Calibri" w:cs="Calibri" w:eastAsia="Calibri" w:hAnsi="Calibri"/><w:b w:val="0"/><w:bCs w:val="0"/><w:i w:val="0"/><w:iCs w:val="0"/><w:smallCaps w:val="0"/><w:strike w:val="0"/><w:color w:val="000000"/><w:sz w:val="22"/><w:szCs w:val="22"/><w:u w:val="none"/><w:shd w:fill="auto" w:val="clear"/><w:vertAlign w:val="baseline"/></w:rPr></w:pPr><w:r><w:rPr><w:rFonts w:ascii="Calibri" w:cs="Calibri" w:eastAsia="Calibri" w:hAnsi="Calibri"/><w:b w:val="0"/><w:bCs w:val="0"/><w:i w:val="0"/><w:iCs w:val="0"/><w:smallCaps w:val="0"/><w:strike w:val="0"/><w:color w:val="000000"/><w:sz w:val="22"/><w:szCs w:val="22"/><w:u w:val="none"/><w:shd w:fill="auto" w:val="clear"/><w:vertAlign w:val="baseline"/><w:rtl w:val="0"/></w:rPr><w:t xml:space="preserve">Nature and sources of the information used or relied upon;</w:t></w:r></w:p></w:tc><w:tc><w:tcPr/><w:p><w:pPr><w:keepNext w:val="0"/><w:keepLines w:val="0"/><w:pageBreakBefore w:val="0"/><w:widowControl w:val="0"/><w:pBdr><w:top w:space="0" w:sz="0" w:val="nil"/><w:left w:space="0" w:sz="0" w:val="nil"/><w:bottom w:space="0" w:sz="0" w:val="nil"/><w:right w:space="0" w:sz="0" w:val="nil"/><w:between w:space="0" w:sz="0" w:val="nil"/></w:pBdr><w:shd w:fill="auto" w:val="clear"/><w:spacing w:after="0" w:before="0" w:line="240" w:lineRule="auto"/><w:ind w:left="149" w:right="134" w:firstLine="0"/><w:jc w:val="both"/><w:rPr><w:rFonts w:ascii="Calibri" w:cs="Calibri" w:eastAsia="Calibri" w:hAnsi="Calibri"/><w:b w:val="0"/><w:bCs w:val="0"/><w:i w:val="0"/><w:iCs w:val="0"/><w:smallCaps w:val="0"/><w:strike w:val="0"/><w:color w:val="000000"/><w:sz w:val="22"/><w:szCs w:val="22"/><w:u w:val="none"/><w:shd w:fill="auto" w:val="clear"/><w:vertAlign w:val="baseline"/></w:rPr></w:pPr><w:r><w:rPr><w:rtl w:val="0"/></w:rPr></w:r></w:p></w:tc></w:tr><w:tr><w:trPr><w:cantSplit w:val="0"/><w:trHeight w:val="389" w:hRule="atLeast"/><w:tblHeader w:val="0"/></w:trPr><w:tc><w:tcPr/><w:p><w:pPr><w:keepNext w:val="0"/><w:keepLines w:val="0"/><w:pageBreakBefore w:val="0"/><w:widowControl w:val="0"/><w:numPr><w:ilvl w:val="0"/><w:numId w:val="3"/></w:numPr><w:pBdr><w:top w:space="0" w:sz="0" w:val="nil"/><w:left w:space="0" w:sz="0" w:val="nil"/><w:bottom w:space="0" w:sz="0" w:val="nil"/><w:right w:space="0" w:sz="0" w:val="nil"/><w:between w:space="0" w:sz="0" w:val="nil"/></w:pBdr><w:shd w:fill="auto" w:val="clear"/><w:spacing w:after="0" w:before="0" w:line="240" w:lineRule="auto"/><w:ind w:left="644" w:right="0" w:hanging="360"/><w:jc w:val="both"/><w:rPr><w:rFonts w:ascii="Calibri" w:cs="Calibri" w:eastAsia="Calibri" w:hAnsi="Calibri"/><w:b w:val="0"/><w:bCs w:val="0"/><w:i w:val="0"/><w:iCs w:val="0"/><w:smallCaps w:val="0"/><w:strike w:val="0"/><w:color w:val="000000"/><w:sz w:val="22"/><w:szCs w:val="22"/><w:u w:val="none"/><w:shd w:fill="auto" w:val="clear"/><w:vertAlign w:val="baseline"/></w:rPr></w:pPr><w:r><w:rPr><w:rtl w:val="0"/></w:rPr></w:r></w:p></w:tc><w:tc><w:tcPr/><w:p><w:pPr><w:keepNext w:val="0"/><w:keepLines w:val="0"/><w:pageBreakBefore w:val="0"/><w:widowControl w:val="0"/><w:pBdr><w:top w:space="0" w:sz="0" w:val="nil"/><w:left w:space="0" w:sz="0" w:val="nil"/><w:bottom w:space="0" w:sz="0" w:val="nil"/><w:right w:space="0" w:sz="0" w:val="nil"/><w:between w:space="0" w:sz="0" w:val="nil"/></w:pBdr><w:shd w:fill="auto" w:val="clear"/><w:spacing w:after="0" w:before="0" w:line="240" w:lineRule="auto"/><w:ind w:left="105" w:right="0" w:firstLine="0"/><w:jc w:val="left"/><w:rPr><w:rFonts w:ascii="Calibri" w:cs="Calibri" w:eastAsia="Calibri" w:hAnsi="Calibri"/><w:b w:val="0"/><w:bCs w:val="0"/><w:i w:val="0"/><w:iCs w:val="0"/><w:smallCaps w:val="0"/><w:strike w:val="0"/><w:color w:val="000000"/><w:sz w:val="22"/><w:szCs w:val="22"/><w:u w:val="none"/><w:shd w:fill="auto" w:val="clear"/><w:vertAlign w:val="baseline"/></w:rPr></w:pPr><w:r><w:rPr><w:rFonts w:ascii="Calibri" w:cs="Calibri" w:eastAsia="Calibri" w:hAnsi="Calibri"/><w:b w:val="0"/><w:bCs w:val="0"/><w:i w:val="0"/><w:iCs w:val="0"/><w:smallCaps w:val="0"/><w:strike w:val="0"/><w:color w:val="000000"/><w:sz w:val="22"/><w:szCs w:val="22"/><w:u w:val="none"/><w:shd w:fill="auto" w:val="clear"/><w:vertAlign w:val="baseline"/><w:rtl w:val="0"/></w:rPr><w:t xml:space="preserve">Procedures adopted in carrying out the valuation and valuation standards followed;</w:t></w:r></w:p></w:tc><w:tc><w:tcPr/><w:p><w:pPr><w:keepNext w:val="0"/><w:keepLines w:val="0"/><w:pageBreakBefore w:val="0"/><w:widowControl w:val="0"/><w:pBdr><w:top w:space="0" w:sz="0" w:val="nil"/><w:left w:space="0" w:sz="0" w:val="nil"/><w:bottom w:space="0" w:sz="0" w:val="nil"/><w:right w:space="0" w:sz="0" w:val="nil"/><w:between w:space="0" w:sz="0" w:val="nil"/></w:pBdr><w:shd w:fill="auto" w:val="clear"/><w:spacing w:after="0" w:before="0" w:line="240" w:lineRule="auto"/><w:ind w:left="104" w:right="134" w:firstLine="0"/><w:jc w:val="both"/><w:rPr><w:rFonts w:ascii="Calibri" w:cs="Calibri" w:eastAsia="Calibri" w:hAnsi="Calibri"/><w:b w:val="0"/><w:bCs w:val="0"/><w:i w:val="0"/><w:iCs w:val="0"/><w:smallCaps w:val="0"/><w:strike w:val="0"/><w:color w:val="000000"/><w:sz w:val="22"/><w:szCs w:val="22"/><w:u w:val="none"/><w:shd w:fill="auto" w:val="clear"/><w:vertAlign w:val="baseline"/></w:rPr></w:pPr><w:r><w:rPr><w:rtl w:val="0"/></w:rPr></w:r></w:p></w:tc></w:tr><w:tr><w:trPr><w:cantSplit w:val="0"/><w:trHeight w:val="389" w:hRule="atLeast"/><w:tblHeader w:val="0"/></w:trPr><w:tc><w:tcPr><w:tcBorders><w:top w:color="000000" w:space="0" w:sz="4" w:val="single"/></w:tcBorders></w:tcPr><w:p><w:pPr><w:keepNext w:val="0"/><w:keepLines w:val="0"/><w:pageBreakBefore w:val="0"/><w:widowControl w:val="0"/><w:numPr><w:ilvl w:val="0"/><w:numId w:val="3"/></w:numPr><w:pBdr><w:top w:space="0" w:sz="0" w:val="nil"/><w:left w:space="0" w:sz="0" w:val="nil"/><w:bottom w:space="0" w:sz="0" w:val="nil"/><w:right w:space="0" w:sz="0" w:val="nil"/><w:between w:space="0" w:sz="0" w:val="nil"/></w:pBdr><w:shd w:fill="auto" w:val="clear"/><w:spacing w:after="0" w:before="0" w:line="240" w:lineRule="auto"/><w:ind w:left="644" w:right="0" w:hanging="360"/><w:jc w:val="both"/><w:rPr><w:rFonts w:ascii="Calibri" w:cs="Calibri" w:eastAsia="Calibri" w:hAnsi="Calibri"/><w:b w:val="0"/><w:bCs w:val="0"/><w:i w:val="0"/><w:iCs w:val="0"/><w:smallCaps w:val="0"/><w:strike w:val="0"/><w:color w:val="000000"/><w:sz w:val="22"/><w:szCs w:val="22"/><w:u w:val="none"/><w:shd w:fill="auto" w:val="clear"/><w:vertAlign w:val="baseline"/></w:rPr></w:pPr><w:r><w:rPr><w:rtl w:val="0"/></w:rPr></w:r></w:p></w:tc><w:tc><w:tcPr><w:tcBorders><w:top w:color="000000" w:space="0" w:sz="4" w:val="single"/></w:tcBorders></w:tcPr><w:p><w:pPr><w:keepNext w:val="0"/><w:keepLines w:val="0"/><w:pageBreakBefore w:val="0"/><w:widowControl w:val="0"/><w:pBdr><w:top w:space="0" w:sz="0" w:val="nil"/><w:left w:space="0" w:sz="0" w:val="nil"/><w:bottom w:space="0" w:sz="0" w:val="nil"/><w:right w:space="0" w:sz="0" w:val="nil"/><w:between w:space="0" w:sz="0" w:val="nil"/></w:pBdr><w:shd w:fill="auto" w:val="clear"/><w:spacing w:after="0" w:before="0" w:line="240" w:lineRule="auto"/><w:ind w:left="104" w:right="0" w:firstLine="0"/><w:jc w:val="left"/><w:rPr><w:rFonts w:ascii="Calibri" w:cs="Calibri" w:eastAsia="Calibri" w:hAnsi="Calibri"/><w:b w:val="0"/><w:bCs w:val="0"/><w:i w:val="0"/><w:iCs w:val="0"/><w:smallCaps w:val="0"/><w:strike w:val="0"/><w:color w:val="000000"/><w:sz w:val="22"/><w:szCs w:val="22"/><w:u w:val="none"/><w:shd w:fill="auto" w:val="clear"/><w:vertAlign w:val="baseline"/></w:rPr></w:pPr><w:r><w:rPr><w:rFonts w:ascii="Calibri" w:cs="Calibri" w:eastAsia="Calibri" w:hAnsi="Calibri"/><w:b w:val="0"/><w:bCs w:val="0"/><w:i w:val="0"/><w:iCs w:val="0"/><w:smallCaps w:val="0"/><w:strike w:val="0"/><w:color w:val="000000"/><w:sz w:val="22"/><w:szCs w:val="22"/><w:u w:val="none"/><w:shd w:fill="auto" w:val="clear"/><w:vertAlign w:val="baseline"/><w:rtl w:val="0"/></w:rPr><w:t xml:space="preserve">Restrictions on use of the report, if any;</w:t></w:r></w:p></w:tc><w:tc><w:tcPr><w:tcBorders><w:top w:color="000000" w:space="0" w:sz="4" w:val="single"/></w:tcBorders></w:tcPr><w:p><w:pPr><w:keepNext w:val="0"/><w:keepLines w:val="0"/><w:pageBreakBefore w:val="0"/><w:widowControl w:val="0"/><w:pBdr><w:top w:space="0" w:sz="0" w:val="nil"/><w:left w:space="0" w:sz="0" w:val="nil"/><w:bottom w:space="0" w:sz="0" w:val="nil"/><w:right w:space="0" w:sz="0" w:val="nil"/><w:between w:space="0" w:sz="0" w:val="nil"/></w:pBdr><w:shd w:fill="auto" w:val="clear"/><w:spacing w:after="0" w:before="0" w:line="240" w:lineRule="auto"/><w:ind w:left="104" w:right="134" w:firstLine="0"/><w:jc w:val="both"/><w:rPr><w:rFonts w:ascii="Calibri" w:cs="Calibri" w:eastAsia="Calibri" w:hAnsi="Calibri"/><w:b w:val="0"/><w:bCs w:val="0"/><w:i w:val="0"/><w:iCs w:val="0"/><w:smallCaps w:val="0"/><w:strike w:val="0"/><w:color w:val="000000"/><w:sz w:val="22"/><w:szCs w:val="22"/><w:highlight w:val="yellow"/><w:u w:val="none"/><w:vertAlign w:val="baseline"/></w:rPr></w:pPr><w:r><w:rPr><w:rtl w:val="0"/></w:rPr></w:r></w:p></w:tc></w:tr><w:tr><w:trPr><w:cantSplit w:val="0"/><w:trHeight w:val="461" w:hRule="atLeast"/><w:tblHeader w:val="0"/></w:trPr><w:tc><w:tcPr/><w:p><w:pPr><w:keepNext w:val="0"/><w:keepLines w:val="0"/><w:pageBreakBefore w:val="0"/><w:widowControl w:val="0"/><w:numPr><w:ilvl w:val="0"/><w:numId w:val="3"/></w:numPr><w:pBdr><w:top w:space="0" w:sz="0" w:val="nil"/><w:left w:space="0" w:sz="0" w:val="nil"/><w:bottom w:space="0" w:sz="0" w:val="nil"/><w:right w:space="0" w:sz="0" w:val="nil"/><w:between w:space="0" w:sz="0" w:val="nil"/></w:pBdr><w:shd w:fill="auto" w:val="clear"/><w:spacing w:after="0" w:before="0" w:line="240" w:lineRule="auto"/><w:ind w:left="644" w:right="0" w:hanging="360"/><w:jc w:val="both"/><w:rPr><w:rFonts w:ascii="Calibri" w:cs="Calibri" w:eastAsia="Calibri" w:hAnsi="Calibri"/><w:b w:val="0"/><w:bCs w:val="0"/><w:i w:val="0"/><w:iCs w:val="0"/><w:smallCaps w:val="0"/><w:strike w:val="0"/><w:color w:val="000000"/><w:sz w:val="22"/><w:szCs w:val="22"/><w:u w:val="none"/><w:shd w:fill="auto" w:val="clear"/><w:vertAlign w:val="baseline"/></w:rPr></w:pPr><w:r><w:rPr><w:rtl w:val="0"/></w:rPr></w:r></w:p></w:tc><w:tc><w:tcPr/><w:p><w:pPr><w:keepNext w:val="0"/><w:keepLines w:val="0"/><w:pageBreakBefore w:val="0"/><w:widowControl w:val="0"/><w:pBdr><w:top w:space="0" w:sz="0" w:val="nil"/><w:left w:space="0" w:sz="0" w:val="nil"/><w:bottom w:space="0" w:sz="0" w:val="nil"/><w:right w:space="0" w:sz="0" w:val="nil"/><w:between w:space="0" w:sz="0" w:val="nil"/></w:pBdr><w:shd w:fill="auto" w:val="clear"/><w:spacing w:after="0" w:before="0" w:line="240" w:lineRule="auto"/><w:ind w:left="105" w:right="0" w:firstLine="0"/><w:jc w:val="left"/><w:rPr><w:rFonts w:ascii="Calibri" w:cs="Calibri" w:eastAsia="Calibri" w:hAnsi="Calibri"/><w:b w:val="0"/><w:bCs w:val="0"/><w:i w:val="0"/><w:iCs w:val="0"/><w:smallCaps w:val="0"/><w:strike w:val="0"/><w:color w:val="000000"/><w:sz w:val="22"/><w:szCs w:val="22"/><w:u w:val="none"/><w:shd w:fill="auto" w:val="clear"/><w:vertAlign w:val="baseline"/></w:rPr></w:pPr><w:r><w:rPr><w:rFonts w:ascii="Calibri" w:cs="Calibri" w:eastAsia="Calibri" w:hAnsi="Calibri"/><w:b w:val="0"/><w:bCs w:val="0"/><w:i w:val="0"/><w:iCs w:val="0"/><w:smallCaps w:val="0"/><w:strike w:val="0"/><w:color w:val="000000"/><w:sz w:val="22"/><w:szCs w:val="22"/><w:u w:val="none"/><w:shd w:fill="auto" w:val="clear"/><w:vertAlign w:val="baseline"/><w:rtl w:val="0"/></w:rPr><w:t xml:space="preserve">Major factors that were taken into account during the valuation;</w:t></w:r></w:p></w:tc><w:tc><w:tcPr/><w:p><w:pPr><w:keepNext w:val="0"/><w:keepLines w:val="0"/><w:pageBreakBefore w:val="0"/><w:widowControl w:val="0"/><w:pBdr><w:top w:space="0" w:sz="0" w:val="nil"/><w:left w:space="0" w:sz="0" w:val="nil"/><w:bottom w:space="0" w:sz="0" w:val="nil"/><w:right w:space="0" w:sz="0" w:val="nil"/><w:between w:space="0" w:sz="0" w:val="nil"/></w:pBdr><w:shd w:fill="auto" w:val="clear"/><w:spacing w:after="0" w:before="0" w:line="240" w:lineRule="auto"/><w:ind w:left="104" w:right="134" w:firstLine="0"/><w:jc w:val="both"/><w:rPr><w:rFonts w:ascii="Calibri" w:cs="Calibri" w:eastAsia="Calibri" w:hAnsi="Calibri"/><w:b w:val="0"/><w:bCs w:val="0"/><w:i w:val="0"/><w:iCs w:val="0"/><w:smallCaps w:val="0"/><w:strike w:val="0"/><w:color w:val="000000"/><w:sz w:val="22"/><w:szCs w:val="22"/><w:highlight w:val="yellow"/><w:u w:val="none"/><w:vertAlign w:val="baseline"/></w:rPr></w:pPr><w:r><w:rPr><w:rtl w:val="0"/></w:rPr></w:r></w:p></w:tc></w:tr><w:tr><w:trPr><w:cantSplit w:val="0"/><w:trHeight w:val="461" w:hRule="atLeast"/><w:tblHeader w:val="0"/></w:trPr><w:tc><w:tcPr/><w:p><w:pPr><w:keepNext w:val="0"/><w:keepLines w:val="0"/><w:pageBreakBefore w:val="0"/><w:widowControl w:val="0"/><w:numPr><w:ilvl w:val="0"/><w:numId w:val="3"/></w:numPr><w:pBdr><w:top w:space="0" w:sz="0" w:val="nil"/><w:left w:space="0" w:sz="0" w:val="nil"/><w:bottom w:space="0" w:sz="0" w:val="nil"/><w:right w:space="0" w:sz="0" w:val="nil"/><w:between w:space="0" w:sz="0" w:val="nil"/></w:pBdr><w:shd w:fill="auto" w:val="clear"/><w:spacing w:after="0" w:before="0" w:line="240" w:lineRule="auto"/><w:ind w:left="644" w:right="0" w:hanging="360"/><w:jc w:val="both"/><w:rPr><w:rFonts w:ascii="Calibri" w:cs="Calibri" w:eastAsia="Calibri" w:hAnsi="Calibri"/><w:b w:val="0"/><w:bCs w:val="0"/><w:i w:val="0"/><w:iCs w:val="0"/><w:smallCaps w:val="0"/><w:strike w:val="0"/><w:color w:val="000000"/><w:sz w:val="22"/><w:szCs w:val="22"/><w:u w:val="none"/><w:shd w:fill="auto" w:val="clear"/><w:vertAlign w:val="baseline"/></w:rPr></w:pPr><w:r><w:rPr><w:rtl w:val="0"/></w:rPr></w:r></w:p></w:tc><w:tc><w:tcPr/><w:p><w:pPr><w:keepNext w:val="0"/><w:keepLines w:val="0"/><w:pageBreakBefore w:val="0"/><w:widowControl w:val="0"/><w:pBdr><w:top w:space="0" w:sz="0" w:val="nil"/><w:left w:space="0" w:sz="0" w:val="nil"/><w:bottom w:space="0" w:sz="0" w:val="nil"/><w:right w:space="0" w:sz="0" w:val="nil"/><w:between w:space="0" w:sz="0" w:val="nil"/></w:pBdr><w:shd w:fill="auto" w:val="clear"/><w:spacing w:after="0" w:before="0" w:line="240" w:lineRule="auto"/><w:ind w:left="105" w:right="0" w:firstLine="0"/><w:jc w:val="left"/><w:rPr><w:rFonts w:ascii="Calibri" w:cs="Calibri" w:eastAsia="Calibri" w:hAnsi="Calibri"/><w:b w:val="0"/><w:bCs w:val="0"/><w:i w:val="0"/><w:iCs w:val="0"/><w:smallCaps w:val="0"/><w:strike w:val="0"/><w:color w:val="000000"/><w:sz w:val="22"/><w:szCs w:val="22"/><w:u w:val="none"/><w:shd w:fill="auto" w:val="clear"/><w:vertAlign w:val="baseline"/></w:rPr></w:pPr><w:r><w:rPr><w:rFonts w:ascii="Calibri" w:cs="Calibri" w:eastAsia="Calibri" w:hAnsi="Calibri"/><w:b w:val="0"/><w:bCs w:val="0"/><w:i w:val="0"/><w:iCs w:val="0"/><w:smallCaps w:val="0"/><w:strike w:val="0"/><w:color w:val="000000"/><w:sz w:val="22"/><w:szCs w:val="22"/><w:u w:val="none"/><w:shd w:fill="auto" w:val="clear"/><w:vertAlign w:val="baseline"/><w:rtl w:val="0"/></w:rPr><w:t xml:space="preserve">Major factors that were not taken into account during valuation;</w:t></w:r></w:p></w:tc><w:tc><w:tcPr/><w:p><w:pPr><w:keepNext w:val="0"/><w:keepLines w:val="0"/><w:pageBreakBefore w:val="0"/><w:widowControl w:val="0"/><w:pBdr><w:top w:space="0" w:sz="0" w:val="nil"/><w:left w:space="0" w:sz="0" w:val="nil"/><w:bottom w:space="0" w:sz="0" w:val="nil"/><w:right w:space="0" w:sz="0" w:val="nil"/><w:between w:space="0" w:sz="0" w:val="nil"/></w:pBdr><w:shd w:fill="auto" w:val="clear"/><w:spacing w:after="0" w:before="0" w:line="240" w:lineRule="auto"/><w:ind w:left="104" w:right="134" w:firstLine="0"/><w:jc w:val="both"/><w:rPr><w:rFonts w:ascii="Calibri" w:cs="Calibri" w:eastAsia="Calibri" w:hAnsi="Calibri"/><w:b w:val="0"/><w:bCs w:val="0"/><w:i w:val="0"/><w:iCs w:val="0"/><w:smallCaps w:val="0"/><w:strike w:val="0"/><w:color w:val="000000"/><w:sz w:val="22"/><w:szCs w:val="22"/><w:u w:val="none"/><w:shd w:fill="auto" w:val="clear"/><w:vertAlign w:val="baseline"/></w:rPr></w:pPr><w:r><w:rPr><w:rtl w:val="0"/></w:rPr></w:r></w:p></w:tc></w:tr><w:tr><w:trPr><w:cantSplit w:val="0"/><w:trHeight w:val="389" w:hRule="atLeast"/><w:tblHeader w:val="0"/></w:trPr><w:tc><w:tcPr/><w:p><w:pPr><w:keepNext w:val="0"/><w:keepLines w:val="0"/><w:pageBreakBefore w:val="0"/><w:widowControl w:val="0"/><w:numPr><w:ilvl w:val="0"/><w:numId w:val="3"/></w:numPr><w:pBdr><w:top w:space="0" w:sz="0" w:val="nil"/><w:left w:space="0" w:sz="0" w:val="nil"/><w:bottom w:space="0" w:sz="0" w:val="nil"/><w:right w:space="0" w:sz="0" w:val="nil"/><w:between w:space="0" w:sz="0" w:val="nil"/></w:pBdr><w:shd w:fill="auto" w:val="clear"/><w:spacing w:after="0" w:before="0" w:line="240" w:lineRule="auto"/><w:ind w:left="644" w:right="0" w:hanging="360"/><w:jc w:val="both"/><w:rPr><w:rFonts w:ascii="Calibri" w:cs="Calibri" w:eastAsia="Calibri" w:hAnsi="Calibri"/><w:b w:val="0"/><w:bCs w:val="0"/><w:i w:val="0"/><w:iCs w:val="0"/><w:smallCaps w:val="0"/><w:strike w:val="0"/><w:color w:val="000000"/><w:sz w:val="22"/><w:szCs w:val="22"/><w:u w:val="none"/><w:shd w:fill="auto" w:val="clear"/><w:vertAlign w:val="baseline"/></w:rPr></w:pPr><w:r><w:rPr><w:rtl w:val="0"/></w:rPr></w:r></w:p></w:tc><w:tc><w:tcPr/><w:p><w:pPr><w:keepNext w:val="0"/><w:keepLines w:val="0"/><w:pageBreakBefore w:val="0"/><w:widowControl w:val="0"/><w:pBdr><w:top w:space="0" w:sz="0" w:val="nil"/><w:left w:space="0" w:sz="0" w:val="nil"/><w:bottom w:space="0" w:sz="0" w:val="nil"/><w:right w:space="0" w:sz="0" w:val="nil"/><w:between w:space="0" w:sz="0" w:val="nil"/></w:pBdr><w:shd w:fill="auto" w:val="clear"/><w:spacing w:after="0" w:before="0" w:line="240" w:lineRule="auto"/><w:ind w:left="105" w:right="96" w:firstLine="0"/><w:jc w:val="left"/><w:rPr><w:rFonts w:ascii="Calibri" w:cs="Calibri" w:eastAsia="Calibri" w:hAnsi="Calibri"/><w:b w:val="0"/><w:bCs w:val="0"/><w:i w:val="0"/><w:iCs w:val="0"/><w:smallCaps w:val="0"/><w:strike w:val="0"/><w:color w:val="000000"/><w:sz w:val="22"/><w:szCs w:val="22"/><w:u w:val="none"/><w:shd w:fill="auto" w:val="clear"/><w:vertAlign w:val="baseline"/></w:rPr></w:pPr><w:r><w:rPr><w:rFonts w:ascii="Calibri" w:cs="Calibri" w:eastAsia="Calibri" w:hAnsi="Calibri"/><w:b w:val="0"/><w:bCs w:val="0"/><w:i w:val="0"/><w:iCs w:val="0"/><w:smallCaps w:val="0"/><w:strike w:val="0"/><w:color w:val="000000"/><w:sz w:val="22"/><w:szCs w:val="22"/><w:u w:val="none"/><w:shd w:fill="auto" w:val="clear"/><w:vertAlign w:val="baseline"/><w:rtl w:val="0"/></w:rPr><w:t xml:space="preserve">Caveats, limitations and disclaimers to the extent they explain or elucidate the limitations faced by valuer, which shall not be for the purpose of limiting his responsibility for the valuation report.</w:t></w:r></w:p></w:tc><w:tc><w:tcPr/><w:p><w:pPr><w:keepNext w:val="0"/><w:keepLines w:val="0"/><w:pageBreakBefore w:val="0"/><w:widowControl w:val="0"/><w:pBdr><w:top w:space="0" w:sz="0" w:val="nil"/><w:left w:space="0" w:sz="0" w:val="nil"/><w:bottom w:space="0" w:sz="0" w:val="nil"/><w:right w:space="0" w:sz="0" w:val="nil"/><w:between w:space="0" w:sz="0" w:val="nil"/></w:pBdr><w:shd w:fill="auto" w:val="clear"/><w:spacing w:after="0" w:before="0" w:line="240" w:lineRule="auto"/><w:ind w:left="104" w:right="134" w:firstLine="0"/><w:jc w:val="both"/><w:rPr><w:rFonts w:ascii="Calibri" w:cs="Calibri" w:eastAsia="Calibri" w:hAnsi="Calibri"/><w:b w:val="0"/><w:bCs w:val="0"/><w:i w:val="0"/><w:iCs w:val="0"/><w:smallCaps w:val="0"/><w:strike w:val="0"/><w:color w:val="000000"/><w:sz w:val="22"/><w:szCs w:val="22"/><w:highlight w:val="yellow"/><w:u w:val="none"/><w:vertAlign w:val="baseline"/></w:rPr></w:pPr><w:r><w:rPr><w:rtl w:val="0"/></w:rPr></w:r></w:p></w:tc></w:tr></w:tbl><w:p><w:pPr><w:rPr><w:b w:val="1"/><w:bCs w:val="1"/></w:rPr></w:pPr><w:r><w:rPr><w:rtl w:val="0"/></w:rPr></w:r></w:p><w:p><w:pPr><w:rPr><w:b w:val="1"/><w:bCs w:val="1"/></w:rPr></w:pPr><w:r><w:rPr><w:rtl w:val="0"/></w:rPr></w:r></w:p><w:p><w:pPr><w:rPr><w:b w:val="1"/><w:bCs w:val="1"/></w:rPr></w:pPr><w:r><w:br w:type="page"/></w:r><w:r><w:rPr><w:rtl w:val="0"/></w:rPr></w:r></w:p><w:p><w:pPr><w:jc w:val="center"/><w:rPr><w:b w:val="1"/><w:bCs w:val="1"/></w:rPr></w:pPr><w:r><w:rPr><w:b w:val="1"/><w:bCs w:val="1"/><w:rtl w:val="0"/></w:rPr><w:t xml:space="preserve">MODEL CODE OF CONDUCT FOR VALUERS</w:t></w:r></w:p><w:p><w:pPr><w:spacing w:line="256" w:lineRule="auto"/><w:jc w:val="center"/><w:rPr><w:b w:val="1"/><w:bCs w:val="1"/></w:rPr></w:pPr><w:r><w:rPr><w:b w:val="1"/><w:bCs w:val="1"/><w:rtl w:val="0"/></w:rPr><w:t xml:space="preserve">{Adopted in line with Companies (Registered Valuers and Valuation Rules, 2017)}</w:t></w:r></w:p><w:p><w:pPr><w:spacing w:line="256" w:lineRule="auto"/><w:rPr/></w:pPr><w:r><w:rPr><w:rtl w:val="0"/></w:rPr><w:t xml:space="preserve">All valuers empanelled with bank shall strictly adhere to the following code of conduct: </w:t></w:r></w:p><w:p><w:pPr><w:spacing w:after="0" w:line="256" w:lineRule="auto"/><w:rPr><w:b w:val="1"/><w:bCs w:val="1"/></w:rPr></w:pPr><w:r><w:rPr><w:b w:val="1"/><w:bCs w:val="1"/><w:rtl w:val="0"/></w:rPr><w:t xml:space="preserve">Integrity and Fairness </w:t></w:r></w:p><w:p><w:pPr><w:spacing w:after="0" w:line="256" w:lineRule="auto"/><w:rPr/></w:pPr><w:r><w:rPr><w:rtl w:val="0"/></w:rPr><w:t xml:space="preserve">1. A valuer shall, in the conduct of his/its business, follow high standards of integrity and fairness in all his/its dealings with his/its clients and other valuers. </w:t></w:r></w:p><w:p><w:pPr><w:spacing w:after="0" w:line="256" w:lineRule="auto"/><w:rPr/></w:pPr><w:r><w:rPr><w:rtl w:val="0"/></w:rPr><w:t xml:space="preserve">2. A valuer shall maintain integrity by being honest, straightforward, and forthright in all professional relationships. </w:t></w:r></w:p><w:p><w:pPr><w:spacing w:after="0" w:line="256" w:lineRule="auto"/><w:rPr/></w:pPr><w:r><w:rPr><w:rtl w:val="0"/></w:rPr><w:t xml:space="preserve">3. A valuer shall endeavour to ensure that he/it provides true and adequate information and shall not misrepresent any facts or situations.</w:t></w:r></w:p><w:p><w:pPr><w:spacing w:after="0" w:line="256" w:lineRule="auto"/><w:rPr/></w:pPr><w:r><w:rPr><w:rtl w:val="0"/></w:rPr><w:t xml:space="preserve"> 4. A valuer shall refrain from being involved in any action that would bring disrepute to the profession. </w:t></w:r></w:p><w:p><w:pPr><w:spacing w:after="0" w:line="256" w:lineRule="auto"/><w:rPr/></w:pPr><w:r><w:rPr><w:rtl w:val="0"/></w:rPr><w:t xml:space="preserve">5 A valuer shall keep public interest foremost while delivering his services. </w:t></w:r></w:p><w:p><w:pPr><w:spacing w:after="0" w:line="256" w:lineRule="auto"/><w:rPr><w:b w:val="1"/><w:bCs w:val="1"/></w:rPr></w:pPr><w:r><w:rPr><w:b w:val="1"/><w:bCs w:val="1"/><w:rtl w:val="0"/></w:rPr><w:t xml:space="preserve">Professional Competence and Due Care </w:t></w:r></w:p><w:p><w:pPr><w:spacing w:after="0" w:line="256" w:lineRule="auto"/><w:rPr/></w:pPr><w:r><w:rPr><w:rtl w:val="0"/></w:rPr><w:t xml:space="preserve">6. A valuer shall render at all times high standards of service, exercise due diligence, ensure proper care and exercise independent professional judgment. </w:t></w:r></w:p><w:p><w:pPr><w:spacing w:after="0" w:line="256" w:lineRule="auto"/><w:rPr/></w:pPr><w:r><w:rPr><w:rtl w:val="0"/></w:rPr><w:t xml:space="preserve">7. A valuer shall carry out professional services in accordance with the relevant technical and professional standards that may be specified from time to time </w:t></w:r></w:p><w:p><w:pPr><w:spacing w:after="0" w:line="256" w:lineRule="auto"/><w:rPr/></w:pPr><w:r><w:rPr><w:rtl w:val="0"/></w:rPr><w:t xml:space="preserve">8. A valuer shall continuously maintain professional knowledge and skill to provide competent professional service based on up-to-date developments in practice, prevailing regulations/guidelines and techniques.</w:t></w:r></w:p><w:p><w:pPr><w:spacing w:after="0" w:line="256" w:lineRule="auto"/><w:rPr/></w:pPr><w:r><w:rPr><w:rtl w:val="0"/></w:rPr><w:t xml:space="preserve"> 9. In the preparation of a valuation report, the valuer shall not disclaim liability for his/its expertise or deny his/its duty of care, except to the extent that the assumptions are based on statements of fact provided by the company or its auditors or consultants or information available in public domain and not generated by the valuer. </w:t></w:r></w:p><w:p><w:pPr><w:spacing w:after="0" w:line="256" w:lineRule="auto"/><w:rPr/></w:pPr><w:r><w:rPr><w:rtl w:val="0"/></w:rPr><w:t xml:space="preserve">10. A valuer shall not carry out any instruction of the client insofar as they are incompatible with the requirements of integrity, objectivity and independence. </w:t></w:r></w:p><w:p><w:pPr><w:spacing w:after="0" w:line="256" w:lineRule="auto"/><w:rPr/></w:pPr><w:r><w:rPr><w:rtl w:val="0"/></w:rPr><w:t xml:space="preserve">11. A valuer shall clearly state to his client the services that he would be and competent to provide the services for which he would be relying on other valuers or professionals or for which the Independence and Disclosure of Interest. </w:t></w:r></w:p><w:p><w:pPr><w:spacing w:after="0" w:line="256" w:lineRule="auto"/><w:rPr/></w:pPr><w:r><w:rPr><w:rtl w:val="0"/></w:rPr><w:t xml:space="preserve">12. A valuer shall act with objectivity in his/its professional dealings by ensuring that his/its decisions are made without the presence of any bias, conflict of Interest, coercion, or undue influence of any party, whether directly connected to the valuation assignment or not. </w:t></w:r></w:p><w:p><w:pPr><w:spacing w:after="0" w:line="256" w:lineRule="auto"/><w:rPr/></w:pPr><w:r><w:rPr><w:rtl w:val="0"/></w:rPr><w:t xml:space="preserve">13. A valuer shall not take up an assignment If he/it or any of his/its relatives or associates is not independent in terms of association to the company. </w:t></w:r></w:p><w:p><w:pPr><w:spacing w:after="0" w:line="256" w:lineRule="auto"/><w:rPr/></w:pPr><w:r><w:rPr><w:rtl w:val="0"/></w:rPr><w:t xml:space="preserve">14. A valuer shall maintain complete independence in his/its professional relationships and shall conduct the valuation Independent of external influences. </w:t></w:r></w:p><w:p><w:pPr><w:spacing w:after="0" w:line="256" w:lineRule="auto"/><w:rPr/></w:pPr><w:r><w:rPr><w:rtl w:val="0"/></w:rPr><w:t xml:space="preserve">15. A valuer shall wherever necessary disclose to the clients, possible sources of conflicts of duties and interests, while providing unbiased services. </w:t></w:r></w:p><w:p><w:pPr><w:spacing w:after="0" w:line="256" w:lineRule="auto"/><w:rPr/></w:pPr><w:r><w:rPr><w:rtl w:val="0"/></w:rPr><w:t xml:space="preserve">16. A valuer shall not deal in securities of any subject company after any time when he/it first becomes aware of the possibility of his/its association with the valuation, and in accordance with the Securities and Exchange Board of India (Prohibition of Insider Trading) Regulations, 2015 or till the time the valuation report becomes public, whichever is earlier.</w:t></w:r></w:p><w:p><w:pPr><w:spacing w:after="0" w:line="256" w:lineRule="auto"/><w:rPr/></w:pPr><w:r><w:rPr><w:rtl w:val="0"/></w:rPr><w:t xml:space="preserve"> 17. A valuer shall not indulge in &quot;mandate snatching&quot; or offering &quot;convenience valuations&quot; in order to cater to a company or client's needs. </w:t></w:r></w:p><w:p><w:pPr><w:spacing w:after="0" w:line="256" w:lineRule="auto"/><w:rPr/></w:pPr><w:r><w:rPr><w:rtl w:val="0"/></w:rPr><w:t xml:space="preserve">18. As an independent valuer, the valuer shall not charge success fee (Success fees may be defined as a compensation incentive paid to any third party for successful closure of transaction. In this case, approval of credit proposals). </w:t></w:r></w:p><w:p><w:pPr><w:spacing w:after="0" w:line="256" w:lineRule="auto"/><w:rPr/></w:pPr><w:r><w:rPr><w:rtl w:val="0"/></w:rPr><w:t xml:space="preserve">19. In any fairness opinion or independent expert opinion submitted by a valuer, if there has been a prior engagement in an unconnected transaction, the valuer shall declare the association with the company during the last five years. </w:t></w:r></w:p><w:p><w:pPr><w:spacing w:after="0" w:line="256" w:lineRule="auto"/><w:rPr><w:b w:val="1"/><w:bCs w:val="1"/></w:rPr></w:pPr><w:r><w:rPr><w:rtl w:val="0"/></w:rPr></w:r></w:p><w:p><w:pPr><w:spacing w:after="0" w:line="256" w:lineRule="auto"/><w:rPr><w:b w:val="1"/><w:bCs w:val="1"/></w:rPr></w:pPr><w:r><w:rPr><w:rtl w:val="0"/></w:rPr></w:r></w:p><w:p><w:pPr><w:spacing w:after="0" w:line="256" w:lineRule="auto"/><w:rPr><w:b w:val="1"/><w:bCs w:val="1"/></w:rPr></w:pPr><w:r><w:rPr><w:rtl w:val="0"/></w:rPr></w:r></w:p><w:p><w:pPr><w:spacing w:after="0" w:line="256" w:lineRule="auto"/><w:rPr><w:b w:val="1"/><w:bCs w:val="1"/></w:rPr></w:pPr><w:r><w:rPr><w:rtl w:val="0"/></w:rPr></w:r></w:p><w:p><w:pPr><w:spacing w:after="0" w:line="256" w:lineRule="auto"/><w:rPr><w:b w:val="1"/><w:bCs w:val="1"/></w:rPr></w:pPr><w:r><w:rPr><w:b w:val="1"/><w:bCs w:val="1"/><w:rtl w:val="0"/></w:rPr><w:t xml:space="preserve">Confidentiality</w:t></w:r></w:p><w:p><w:pPr><w:spacing w:after="0" w:line="256" w:lineRule="auto"/><w:rPr/></w:pPr><w:r><w:rPr><w:rtl w:val="0"/></w:rPr><w:t xml:space="preserve"> 20. A valuer shall not use or divulge to other clients or any other party any confidential information about the subject company, which has come to his/its knowledge without proper and specific authority or unless there is a legal or professional right or duty to disclose.</w:t></w:r></w:p><w:p><w:pPr><w:spacing w:after="0" w:line="256" w:lineRule="auto"/><w:rPr><w:b w:val="1"/><w:bCs w:val="1"/></w:rPr></w:pPr><w:r><w:rPr><w:b w:val="1"/><w:bCs w:val="1"/><w:rtl w:val="0"/></w:rPr><w:t xml:space="preserve">Information Management</w:t></w:r></w:p><w:p><w:pPr><w:spacing w:after="0" w:line="256" w:lineRule="auto"/><w:rPr/></w:pPr><w:r><w:rPr><w:rtl w:val="0"/></w:rPr><w:t xml:space="preserve"> 21. A valuer shall ensure that he/ it maintains written contemporaneous records for any decision taken, the reasons for taking the decision, and the information and evidence in support of such decision. This shall be maintained so as to sufficiently enable a reasonable person to take a view on the appropriateness of his/its decisions and actions. </w:t></w:r></w:p><w:p><w:pPr><w:spacing w:after="0" w:line="256" w:lineRule="auto"/><w:rPr/></w:pPr><w:r><w:rPr><w:rtl w:val="0"/></w:rPr><w:t xml:space="preserve">22. A valuer shall appear, co-operate and be available for inspections and investigations carried out by the authority, any person authorised by the authority, the registered valuers organisation with which he/it is registered or any other statutory regulatory body.</w:t></w:r></w:p><w:p><w:pPr><w:spacing w:after="0" w:line="256" w:lineRule="auto"/><w:rPr/></w:pPr><w:r><w:rPr><w:rtl w:val="0"/></w:rPr><w:t xml:space="preserve">23. A valuer shall provide all information and records as may be required by the authority, the Tribunal, Appellate Tribunal, , the registered valuers organisation with which he/it is any registered, u other statutory regulatory body. </w:t></w:r></w:p><w:p><w:pPr><w:spacing w:after="0" w:line="256" w:lineRule="auto"/><w:rPr/></w:pPr><w:r><w:rPr><w:rtl w:val="0"/></w:rPr><w:t xml:space="preserve">24. A valuer while respecting the confidentiality of information performing professional acquired during the course of services, shall maintain proper working papers for a period of three years or such longer period as required in its contract for a specific valuation, for production before a regulatory authority or for a peer review. In the event of a pending case before the Tribunal or Appellate Tribunal, the record shall be maintained till the disposal of the case. </w:t></w:r></w:p><w:p><w:pPr><w:spacing w:after="0" w:line="256" w:lineRule="auto"/><w:rPr><w:b w:val="1"/><w:bCs w:val="1"/></w:rPr></w:pPr><w:r><w:rPr><w:b w:val="1"/><w:bCs w:val="1"/><w:rtl w:val="0"/></w:rPr><w:t xml:space="preserve">Gifts and hospitality: </w:t></w:r></w:p><w:p><w:pPr><w:spacing w:after="0" w:line="256" w:lineRule="auto"/><w:rPr/></w:pPr><w:r><w:rPr><w:rtl w:val="0"/></w:rPr><w:t xml:space="preserve">25. A valuer or his/its relative shall not accept gifts or hospitality which undermines or affects independence as a valuer. </w:t></w:r></w:p><w:p><w:pPr><w:spacing w:after="0" w:line="256" w:lineRule="auto"/><w:rPr/></w:pPr><w:r><w:rPr><w:rtl w:val="0"/></w:rPr><w:t xml:space="preserve">Explanation. - For the purposes of this code the term 'relative' shall have the same meaning as defined in clause (77) of Section 2 of the Companies Act, 2013 (18 of 2013) </w:t></w:r></w:p><w:p><w:pPr><w:spacing w:after="0" w:line="256" w:lineRule="auto"/><w:rPr/></w:pPr><w:r><w:rPr><w:rtl w:val="0"/></w:rPr><w:t xml:space="preserve">26. A valuer shall not offer gifts or hospitality or a financial or any other advantage to a public servant or any other person with a view to obtain or retain work for himself/ itself, or to obtain or retain an advantage in the conduct of profession for himself/ itself. </w:t></w:r></w:p><w:p><w:pPr><w:spacing w:after="0" w:line="256" w:lineRule="auto"/><w:rPr><w:b w:val="1"/><w:bCs w:val="1"/></w:rPr></w:pPr><w:r><w:rPr><w:b w:val="1"/><w:bCs w:val="1"/><w:rtl w:val="0"/></w:rPr><w:t xml:space="preserve">Remuneration and Costs. </w:t></w:r></w:p><w:p><w:pPr><w:spacing w:after="0" w:line="256" w:lineRule="auto"/><w:rPr/></w:pPr><w:r><w:rPr><w:rtl w:val="0"/></w:rPr><w:t xml:space="preserve">27. A valuer shall provide services for remuneration which is charged in a transparent manner, is a reasonable reflection of the work necessarily and properly undertaken and is not inconsistent with the applicable rules. </w:t></w:r></w:p><w:p><w:pPr><w:spacing w:after="0" w:line="256" w:lineRule="auto"/><w:rPr/></w:pPr><w:r><w:rPr><w:rtl w:val="0"/></w:rPr><w:t xml:space="preserve">28. A valuer shall not accept any fees or charges other than those which are disclosed in a written contract with the person to whom he would be rendering service. </w:t></w:r></w:p><w:p><w:pPr><w:spacing w:line="256" w:lineRule="auto"/><w:rPr><w:b w:val="1"/><w:bCs w:val="1"/></w:rPr></w:pPr><w:r><w:rPr><w:b w:val="1"/><w:bCs w:val="1"/><w:rtl w:val="0"/></w:rPr><w:t xml:space="preserve">Occupation, employability and restrictions. </w:t></w:r></w:p><w:p><w:pPr><w:spacing w:line="256" w:lineRule="auto"/><w:rPr/></w:pPr><w:r><w:rPr><w:rtl w:val="0"/></w:rPr><w:t xml:space="preserve">29. A valuer shall refrain from accepting too many assignments, if he/it is unlikely to be able to devote adequate time to each of his/ its assignments. </w:t></w:r></w:p><w:p><w:pPr><w:spacing w:line="256" w:lineRule="auto"/><w:rPr/></w:pPr><w:r><w:rPr><w:rtl w:val="0"/></w:rPr><w:t xml:space="preserve">30. A valuer shall not conduct business which in the opinion of the authority or the registered valuer organisation discredits the profession. </w:t></w:r></w:p><w:p><w:pPr><w:spacing w:after="0" w:lineRule="auto"/><w:ind w:left="1360" w:right="1352" w:hanging="10"/><w:jc w:val="center"/><w:rPr><w:b w:val="1"/><w:bCs w:val="1"/><w:u w:val="single"/></w:rPr></w:pPr><w:r><w:rPr><w:rtl w:val="0"/></w:rPr></w:r></w:p><w:p><w:pPr><w:spacing w:after="0" w:lineRule="auto"/><w:ind w:left="1360" w:right="1352" w:hanging="10"/><w:jc w:val="center"/><w:rPr><w:b w:val="1"/><w:bCs w:val="1"/><w:u w:val="single"/></w:rPr></w:pPr><w:r><w:rPr><w:rtl w:val="0"/></w:rPr></w:r></w:p><w:p><w:pPr><w:spacing w:after="0" w:lineRule="auto"/><w:ind w:left="1360" w:right="1352" w:hanging="10"/><w:jc w:val="center"/><w:rPr><w:b w:val="1"/><w:bCs w:val="1"/><w:u w:val="single"/></w:rPr></w:pPr><w:r><w:rPr><w:rtl w:val="0"/></w:rPr></w:r></w:p><w:p><w:pPr><w:rPr><w:b w:val="1"/><w:bCs w:val="1"/><w:u w:val="single"/></w:rPr></w:pPr><w:r><w:br w:type="page"/></w:r><w:r><w:rPr><w:rtl w:val="0"/></w:rPr></w:r></w:p><w:p><w:pPr><w:spacing w:after="0" w:lineRule="auto"/><w:ind w:right="0"/><w:jc w:val="center"/><w:rPr><w:b w:val="1"/><w:bCs w:val="1"/><w:sz w:val="26"/><w:szCs w:val="26"/><w:u w:val="single"/></w:rPr></w:pPr><w:r><w:rPr><w:b w:val="1"/><w:bCs w:val="1"/><w:sz w:val="26"/><w:szCs w:val="26"/><w:u w:val="single"/><w:rtl w:val="0"/></w:rPr><w:t xml:space="preserve">Photographs of the Property</w:t></w:r></w:p><w:p><w:pPr><w:ind w:left="-426" w:right="-143" w:firstLine="0"/><w:rPr/></w:pPr><w:r><w:rPr/><w:drawing><wp:inline distB="0" distT="0" distL="0" distR="0"><wp:extent cx="2160741" cy="2880000"/><wp:effectExtent b="0" l="0" r="0" t="0"/><wp:docPr id="3" name="image17.jpg"/><a:graphic><a:graphicData uri="http://schemas.openxmlformats.org/drawingml/2006/picture"><pic:pic><pic:nvPicPr><pic:cNvPr id="0" name="image17.jpg"/><pic:cNvPicPr preferRelativeResize="0"/></pic:nvPicPr><pic:blipFill><a:blip r:embed="rId7"/><a:srcRect b="0" l="0" r="0" t="0"/><a:stretch><a:fillRect/></a:stretch></pic:blipFill><pic:spPr><a:xfrm><a:off x="0" y="0"/><a:ext cx="2160741" cy="2880000"/></a:xfrm><a:prstGeom prst="rect"/><a:ln/></pic:spPr></pic:pic></a:graphicData></a:graphic></wp:inline></w:drawing></w:r><w:r><w:rPr><w:rtl w:val="0"/></w:rPr><w:t xml:space="preserve">    </w:t></w:r><w:r><w:rPr/><w:drawing><wp:inline distB="0" distT="0" distL="0" distR="0"><wp:extent cx="2160741" cy="2880000"/><wp:effectExtent b="0" l="0" r="0" t="0"/><wp:docPr id="2" name="image4.jpg"/><a:graphic><a:graphicData uri="http://schemas.openxmlformats.org/drawingml/2006/picture"><pic:pic><pic:nvPicPr><pic:cNvPr id="0" name="image4.jpg"/><pic:cNvPicPr preferRelativeResize="0"/></pic:nvPicPr><pic:blipFill><a:blip r:embed="rId8"/><a:srcRect b="0" l="0" r="0" t="0"/><a:stretch><a:fillRect/></a:stretch></pic:blipFill><pic:spPr><a:xfrm><a:off x="0" y="0"/><a:ext cx="2160741" cy="2880000"/></a:xfrm><a:prstGeom prst="rect"/><a:ln/></pic:spPr></pic:pic></a:graphicData></a:graphic></wp:inline></w:drawing></w:r><w:r><w:rPr><w:rtl w:val="0"/></w:rPr><w:t xml:space="preserve">    </w:t></w:r><w:r><w:rPr/><w:drawing><wp:inline distB="0" distT="0" distL="0" distR="0"><wp:extent cx="2160000" cy="2880000"/><wp:effectExtent b="0" l="0" r="0" t="0"/><wp:docPr id="5" name="image16.jpg"/><a:graphic><a:graphicData uri="http://schemas.openxmlformats.org/drawingml/2006/picture"><pic:pic><pic:nvPicPr><pic:cNvPr id="0" name="image16.jpg"/><pic:cNvPicPr preferRelativeResize="0"/></pic:nvPicPr><pic:blipFill><a:blip r:embed="rId9"/><a:srcRect b="0" l="0" r="0" t="0"/><a:stretch><a:fillRect/></a:stretch></pic:blipFill><pic:spPr><a:xfrm><a:off x="0" y="0"/><a:ext cx="2160000" cy="2880000"/></a:xfrm><a:prstGeom prst="rect"/><a:ln/></pic:spPr></pic:pic></a:graphicData></a:graphic></wp:inline></w:drawing></w:r><w:r><w:rPr><w:rtl w:val="0"/></w:rPr><w:t xml:space="preserve">    </w:t></w:r></w:p><w:p><w:pPr><w:ind w:left="-426" w:right="-143" w:firstLine="0"/><w:rPr/></w:pPr><w:r><w:rPr/><w:drawing><wp:inline distB="0" distT="0" distL="0" distR="0"><wp:extent cx="2160741" cy="2880000"/><wp:effectExtent b="0" l="0" r="0" t="0"/><wp:docPr id="4" name="image15.jpg"/><a:graphic><a:graphicData uri="http://schemas.openxmlformats.org/drawingml/2006/picture"><pic:pic><pic:nvPicPr><pic:cNvPr id="0" name="image15.jpg"/><pic:cNvPicPr preferRelativeResize="0"/></pic:nvPicPr><pic:blipFill><a:blip r:embed="rId10"/><a:srcRect b="0" l="0" r="0" t="0"/><a:stretch><a:fillRect/></a:stretch></pic:blipFill><pic:spPr><a:xfrm><a:off x="0" y="0"/><a:ext cx="2160741" cy="2880000"/></a:xfrm><a:prstGeom prst="rect"/><a:ln/></pic:spPr></pic:pic></a:graphicData></a:graphic></wp:inline></w:drawing></w:r><w:r><w:rPr><w:rtl w:val="0"/></w:rPr><w:t xml:space="preserve">    </w:t></w:r><w:r><w:rPr/><w:drawing><wp:inline distB="0" distT="0" distL="0" distR="0"><wp:extent cx="2160741" cy="2880000"/><wp:effectExtent b="0" l="0" r="0" t="0"/><wp:docPr id="7" name="image9.jpg"/><a:graphic><a:graphicData uri="http://schemas.openxmlformats.org/drawingml/2006/picture"><pic:pic><pic:nvPicPr><pic:cNvPr id="0" name="image9.jpg"/><pic:cNvPicPr preferRelativeResize="0"/></pic:nvPicPr><pic:blipFill><a:blip r:embed="rId11"/><a:srcRect b="0" l="0" r="0" t="0"/><a:stretch><a:fillRect/></a:stretch></pic:blipFill><pic:spPr><a:xfrm><a:off x="0" y="0"/><a:ext cx="2160741" cy="2880000"/></a:xfrm><a:prstGeom prst="rect"/><a:ln/></pic:spPr></pic:pic></a:graphicData></a:graphic></wp:inline></w:drawing></w:r><w:r><w:rPr><w:rtl w:val="0"/></w:rPr><w:t xml:space="preserve">    </w:t></w:r><w:r><w:rPr/><w:drawing><wp:inline distB="0" distT="0" distL="0" distR="0"><wp:extent cx="2160741" cy="2880000"/><wp:effectExtent b="0" l="0" r="0" t="0"/><wp:docPr id="6" name="image1.jpg"/><a:graphic><a:graphicData uri="http://schemas.openxmlformats.org/drawingml/2006/picture"><pic:pic><pic:nvPicPr><pic:cNvPr id="0" name="image1.jpg"/><pic:cNvPicPr preferRelativeResize="0"/></pic:nvPicPr><pic:blipFill><a:blip r:embed="rId12"/><a:srcRect b="0" l="0" r="0" t="0"/><a:stretch><a:fillRect/></a:stretch></pic:blipFill><pic:spPr><a:xfrm><a:off x="0" y="0"/><a:ext cx="2160741" cy="2880000"/></a:xfrm><a:prstGeom prst="rect"/><a:ln/></pic:spPr></pic:pic></a:graphicData></a:graphic></wp:inline></w:drawing></w:r><w:r><w:rPr><w:rtl w:val="0"/></w:rPr></w:r></w:p><w:p><w:pPr><w:ind w:left="-426" w:right="-143" w:firstLine="0"/><w:rPr/></w:pPr><w:r><w:rPr/><w:drawing><wp:inline distB="0" distT="0" distL="0" distR="0"><wp:extent cx="2160741" cy="2880000"/><wp:effectExtent b="0" l="0" r="0" t="0"/><wp:docPr id="9" name="image5.jpg"/><a:graphic><a:graphicData uri="http://schemas.openxmlformats.org/drawingml/2006/picture"><pic:pic><pic:nvPicPr><pic:cNvPr id="0" name="image5.jpg"/><pic:cNvPicPr preferRelativeResize="0"/></pic:nvPicPr><pic:blipFill><a:blip r:embed="rId13"/><a:srcRect b="0" l="0" r="0" t="0"/><a:stretch><a:fillRect/></a:stretch></pic:blipFill><pic:spPr><a:xfrm><a:off x="0" y="0"/><a:ext cx="2160741" cy="2880000"/></a:xfrm><a:prstGeom prst="rect"/><a:ln/></pic:spPr></pic:pic></a:graphicData></a:graphic></wp:inline></w:drawing></w:r><w:r><w:rPr><w:rtl w:val="0"/></w:rPr><w:t xml:space="preserve">    </w:t></w:r><w:r><w:rPr/><w:drawing><wp:inline distB="0" distT="0" distL="0" distR="0"><wp:extent cx="2160741" cy="2880000"/><wp:effectExtent b="0" l="0" r="0" t="0"/><wp:docPr id="8" name="image10.jpg"/><a:graphic><a:graphicData uri="http://schemas.openxmlformats.org/drawingml/2006/picture"><pic:pic><pic:nvPicPr><pic:cNvPr id="0" name="image10.jpg"/><pic:cNvPicPr preferRelativeResize="0"/></pic:nvPicPr><pic:blipFill><a:blip r:embed="rId14"/><a:srcRect b="0" l="0" r="0" t="0"/><a:stretch><a:fillRect/></a:stretch></pic:blipFill><pic:spPr><a:xfrm><a:off x="0" y="0"/><a:ext cx="2160741" cy="2880000"/></a:xfrm><a:prstGeom prst="rect"/><a:ln/></pic:spPr></pic:pic></a:graphicData></a:graphic></wp:inline></w:drawing></w:r><w:r><w:rPr><w:rtl w:val="0"/></w:rPr><w:t xml:space="preserve">    </w:t></w:r><w:r><w:rPr/><w:drawing><wp:inline distB="0" distT="0" distL="0" distR="0"><wp:extent cx="2160000" cy="2880000"/><wp:effectExtent b="0" l="0" r="0" t="0"/><wp:docPr id="12" name="image6.jpg"/><a:graphic><a:graphicData uri="http://schemas.openxmlformats.org/drawingml/2006/picture"><pic:pic><pic:nvPicPr><pic:cNvPr id="0" name="image6.jpg"/><pic:cNvPicPr preferRelativeResize="0"/></pic:nvPicPr><pic:blipFill><a:blip r:embed="rId15"/><a:srcRect b="0" l="0" r="0" t="0"/><a:stretch><a:fillRect/></a:stretch></pic:blipFill><pic:spPr><a:xfrm><a:off x="0" y="0"/><a:ext cx="2160000" cy="2880000"/></a:xfrm><a:prstGeom prst="rect"/><a:ln/></pic:spPr></pic:pic></a:graphicData></a:graphic></wp:inline></w:drawing></w:r><w:r><w:br w:type="page"/></w:r><w:r><w:rPr><w:rtl w:val="0"/></w:rPr></w:r></w:p><w:p><w:pPr><w:spacing w:after="0" w:lineRule="auto"/><w:ind w:left="-426" w:right="0" w:firstLine="0"/><w:jc w:val="center"/><w:rPr><w:b w:val="1"/><w:bCs w:val="1"/><w:sz w:val="26"/><w:szCs w:val="26"/><w:u w:val="single"/></w:rPr></w:pPr><w:r><w:rPr><w:b w:val="1"/><w:bCs w:val="1"/><w:u w:val="single"/><w:rtl w:val="0"/></w:rPr><w:t xml:space="preserve"> LOCATION MAP</w:t></w:r><w:r><w:rPr><w:rtl w:val="0"/></w:rPr></w:r></w:p><w:p><w:pPr><w:jc w:val="center"/><w:rPr><w:b w:val="1"/><w:bCs w:val="1"/></w:rPr></w:pPr><w:r><w:rPr><w:b w:val="1"/><w:bCs w:val="1"/></w:rPr><w:drawing><wp:inline distB="0" distT="0" distL="0" distR="0"><wp:extent cx="6484551" cy="3985141"/><wp:effectExtent b="0" l="0" r="0" t="0"/><wp:docPr id="10" name="image2.png"/><a:graphic><a:graphicData uri="http://schemas.openxmlformats.org/drawingml/2006/picture"><pic:pic><pic:nvPicPr><pic:cNvPr id="0" name="image2.png"/><pic:cNvPicPr preferRelativeResize="0"/></pic:nvPicPr><pic:blipFill><a:blip r:embed="rId16"/><a:srcRect b="0" l="0" r="0" t="0"/><a:stretch><a:fillRect/></a:stretch></pic:blipFill><pic:spPr><a:xfrm><a:off x="0" y="0"/><a:ext cx="6484551" cy="3985141"/></a:xfrm><a:prstGeom prst="rect"/><a:ln/></pic:spPr></pic:pic></a:graphicData></a:graphic></wp:inline></w:drawing></w:r><w:r><w:rPr><w:rtl w:val="0"/></w:rPr></w:r></w:p><w:p><w:pPr><w:spacing w:after="0" w:lineRule="auto"/><w:jc w:val="center"/><w:rPr><w:b w:val="1"/><w:bCs w:val="1"/><w:sz w:val="24"/><w:szCs w:val="24"/><w:u w:val="single"/></w:rPr></w:pPr><w:r><w:rPr><w:b w:val="1"/><w:bCs w:val="1"/><w:sz w:val="24"/><w:szCs w:val="24"/><w:u w:val="single"/><w:rtl w:val="0"/></w:rPr><w:t xml:space="preserve">GOVT. READY RECKONER RATE {govtRateYear}</w:t></w:r></w:p><w:p><w:pPr><w:spacing w:after="0" w:lineRule="auto"/><w:jc w:val="center"/><w:rPr><w:sz w:val="28"/><w:szCs w:val="28"/><w:u w:val="single"/></w:rPr></w:pPr><w:r><w:rPr><w:sz w:val="28"/><w:szCs w:val="28"/><w:u w:val="single"/></w:rPr><w:drawing><wp:inline distB="0" distT="0" distL="0" distR="0"><wp:extent cx="6485410" cy="4298744"/><wp:effectExtent b="0" l="0" r="0" t="0"/><wp:docPr id="11" name="image14.png"/><a:graphic><a:graphicData uri="http://schemas.openxmlformats.org/drawingml/2006/picture"><pic:pic><pic:nvPicPr><pic:cNvPr id="0" name="image14.png"/><pic:cNvPicPr preferRelativeResize="0"/></pic:nvPicPr><pic:blipFill><a:blip r:embed="rId17"/><a:srcRect b="0" l="0" r="0" t="0"/><a:stretch><a:fillRect/></a:stretch></pic:blipFill><pic:spPr><a:xfrm><a:off x="0" y="0"/><a:ext cx="6485410" cy="4298744"/></a:xfrm><a:prstGeom prst="rect"/><a:ln/></pic:spPr></pic:pic></a:graphicData></a:graphic></wp:inline></w:drawing></w:r><w:r><w:rPr><w:rtl w:val="0"/></w:rPr></w:r></w:p><w:p><w:pPr><w:spacing w:after="0" w:lineRule="auto"/><w:jc w:val="center"/><w:rPr><w:b w:val="1"/><w:bCs w:val="1"/><w:sz w:val="28"/><w:szCs w:val="28"/><w:u w:val="single"/></w:rPr></w:pPr><w:r><w:br w:type="column"/></w:r><w:r><w:rPr><w:b w:val="1"/><w:bCs w:val="1"/><w:sz w:val="28"/><w:szCs w:val="28"/><w:u w:val="single"/><w:rtl w:val="0"/></w:rPr><w:t xml:space="preserve">Comparable</w:t></w:r></w:p><w:p><w:pPr><w:spacing w:after="0" w:lineRule="auto"/><w:jc w:val="center"/><w:rPr><w:sz w:val="28"/><w:szCs w:val="28"/></w:rPr></w:pPr><w:r><w:rPr><w:sz w:val="28"/><w:szCs w:val="28"/></w:rPr><w:drawing><wp:inline distB="0" distT="0" distL="0" distR="0"><wp:extent cx="6484341" cy="3130222"/><wp:effectExtent b="0" l="0" r="0" t="0"/><wp:docPr id="13" name="image8.png"/><a:graphic><a:graphicData uri="http://schemas.openxmlformats.org/drawingml/2006/picture"><pic:pic><pic:nvPicPr><pic:cNvPr id="0" name="image8.png"/><pic:cNvPicPr preferRelativeResize="0"/></pic:nvPicPr><pic:blipFill><a:blip r:embed="rId18"/><a:srcRect b="0" l="0" r="0" t="0"/><a:stretch><a:fillRect/></a:stretch></pic:blipFill><pic:spPr><a:xfrm><a:off x="0" y="0"/><a:ext cx="6484341" cy="3130222"/></a:xfrm><a:prstGeom prst="rect"/><a:ln/></pic:spPr></pic:pic></a:graphicData></a:graphic></wp:inline></w:drawing></w:r><w:r><w:rPr><w:rtl w:val="0"/></w:rPr></w:r></w:p><w:p><w:pPr><w:spacing w:after="0" w:lineRule="auto"/><w:jc w:val="center"/><w:rPr><w:sz w:val="28"/><w:szCs w:val="28"/></w:rPr></w:pPr><w:r><w:rPr><w:sz w:val="28"/><w:szCs w:val="28"/></w:rPr><w:drawing><wp:inline distB="0" distT="0" distL="0" distR="0"><wp:extent cx="6485100" cy="3106506"/><wp:effectExtent b="0" l="0" r="0" t="0"/><wp:docPr id="14" name="image7.png"/><a:graphic><a:graphicData uri="http://schemas.openxmlformats.org/drawingml/2006/picture"><pic:pic><pic:nvPicPr><pic:cNvPr id="0" name="image7.png"/><pic:cNvPicPr preferRelativeResize="0"/></pic:nvPicPr><pic:blipFill><a:blip r:embed="rId19"/><a:srcRect b="0" l="0" r="0" t="0"/><a:stretch><a:fillRect/></a:stretch></pic:blipFill><pic:spPr><a:xfrm><a:off x="0" y="0"/><a:ext cx="6485100" cy="3106506"/></a:xfrm><a:prstGeom prst="rect"/><a:ln/></pic:spPr></pic:pic></a:graphicData></a:graphic></wp:inline></w:drawing></w:r><w:r><w:rPr><w:rtl w:val="0"/></w:rPr></w:r></w:p><w:p><w:pPr><w:spacing w:after="0" w:lineRule="auto"/><w:jc w:val="center"/><w:rPr><w:sz w:val="28"/><w:szCs w:val="28"/><w:u w:val="single"/></w:rPr></w:pPr><w:r><w:rPr><w:sz w:val="28"/><w:szCs w:val="28"/></w:rPr><w:drawing><wp:inline distB="0" distT="0" distL="0" distR="0"><wp:extent cx="6484581" cy="3034019"/><wp:effectExtent b="0" l="0" r="0" t="0"/><wp:docPr id="15" name="image3.png"/><a:graphic><a:graphicData uri="http://schemas.openxmlformats.org/drawingml/2006/picture"><pic:pic><pic:nvPicPr><pic:cNvPr id="0" name="image3.png"/><pic:cNvPicPr preferRelativeResize="0"/></pic:nvPicPr><pic:blipFill><a:blip r:embed="rId20"/><a:srcRect b="0" l="0" r="0" t="0"/><a:stretch><a:fillRect/></a:stretch></pic:blipFill><pic:spPr><a:xfrm><a:off x="0" y="0"/><a:ext cx="6484581" cy="3034019"/></a:xfrm><a:prstGeom prst="rect"/><a:ln/></pic:spPr></pic:pic></a:graphicData></a:graphic></wp:inline></w:drawing></w:r><w:r><w:br w:type="column"/></w:r><w:r><w:rPr><w:rtl w:val="0"/></w:rPr></w:r></w:p><w:p><w:pPr><w:keepNext w:val="0"/><w:keepLines w:val="0"/><w:pageBreakBefore w:val="0"/><w:widowControl w:val="1"/><w:pBdr><w:top w:space="0" w:sz="0" w:val="nil"/><w:left w:space="0" w:sz="0" w:val="nil"/><w:bottom w:space="0" w:sz="0" w:val="nil"/><w:right w:space="0" w:sz="0" w:val="nil"/><w:between w:space="0" w:sz="0" w:val="nil"/></w:pBdr><w:shd w:fill="auto" w:val="clear"/><w:tabs><w:tab w:val="left" w:leader="none" w:pos="4320"/><w:tab w:val="left" w:leader="none" w:pos="6120"/></w:tabs><w:spacing w:after="0" w:before="149" w:line="216" w:lineRule="auto"/><w:ind w:left="0" w:right="0" w:firstLine="0"/><w:jc w:val="center"/><w:rPr><w:rFonts w:ascii="Calibri" w:cs="Calibri" w:eastAsia="Calibri" w:hAnsi="Calibri"/><w:b w:val="1"/><w:bCs w:val="1"/><w:i w:val="0"/><w:iCs w:val="0"/><w:smallCaps w:val="0"/><w:strike w:val="0"/><w:color w:val="000000"/><w:sz w:val="28"/><w:szCs w:val="28"/><w:u w:val="single"/><w:shd w:fill="auto" w:val="clear"/><w:vertAlign w:val="baseline"/></w:rPr></w:pPr><w:r><w:rPr><w:rFonts w:ascii="Calibri" w:cs="Calibri" w:eastAsia="Calibri" w:hAnsi="Calibri"/><w:b w:val="1"/><w:bCs w:val="1"/><w:i w:val="0"/><w:iCs w:val="0"/><w:smallCaps w:val="0"/><w:strike w:val="0"/><w:color w:val="000000"/><w:sz w:val="28"/><w:szCs w:val="28"/><w:u w:val="single"/><w:shd w:fill="auto" w:val="clear"/><w:vertAlign w:val="baseline"/><w:rtl w:val="0"/></w:rPr><w:t xml:space="preserve">PROPERTY DOCUMENT</w:t></w:r></w:p><w:p><w:pPr><w:keepNext w:val="0"/><w:keepLines w:val="0"/><w:pageBreakBefore w:val="0"/><w:widowControl w:val="1"/><w:pBdr><w:top w:space="0" w:sz="0" w:val="nil"/><w:left w:space="0" w:sz="0" w:val="nil"/><w:bottom w:space="0" w:sz="0" w:val="nil"/><w:right w:space="0" w:sz="0" w:val="nil"/><w:between w:space="0" w:sz="0" w:val="nil"/></w:pBdr><w:shd w:fill="auto" w:val="clear"/><w:tabs><w:tab w:val="left" w:leader="none" w:pos="4320"/><w:tab w:val="left" w:leader="none" w:pos="6120"/></w:tabs><w:spacing w:after="0" w:before="0" w:line="216" w:lineRule="auto"/><w:ind w:left="0" w:right="0" w:firstLine="0"/><w:jc w:val="center"/><w:rPr><w:rFonts w:ascii="Calibri" w:cs="Calibri" w:eastAsia="Calibri" w:hAnsi="Calibri"/><w:b w:val="1"/><w:bCs w:val="1"/><w:i w:val="0"/><w:iCs w:val="0"/><w:smallCaps w:val="0"/><w:strike w:val="0"/><w:color w:val="000000"/><w:sz w:val="28"/><w:szCs w:val="28"/><w:u w:val="single"/><w:shd w:fill="auto" w:val="clear"/><w:vertAlign w:val="baseline"/></w:rPr></w:pPr><w:r><w:rPr><w:rFonts w:ascii="Calibri" w:cs="Calibri" w:eastAsia="Calibri" w:hAnsi="Calibri"/><w:b w:val="1"/><w:bCs w:val="1"/><w:i w:val="0"/><w:iCs w:val="0"/><w:smallCaps w:val="0"/><w:strike w:val="0"/><w:color w:val="000000"/><w:sz w:val="28"/><w:szCs w:val="28"/><w:u w:val="single"/><w:shd w:fill="auto" w:val="clear"/><w:vertAlign w:val="baseline"/></w:rPr><w:drawing><wp:inline distB="0" distT="0" distL="0" distR="0"><wp:extent cx="6215659" cy="8360541"/><wp:effectExtent b="0" l="0" r="0" t="0"/><wp:docPr id="16" name="image12.png"/><a:graphic><a:graphicData uri="http://schemas.openxmlformats.org/drawingml/2006/picture"><pic:pic><pic:nvPicPr><pic:cNvPr id="0" name="image12.png"/><pic:cNvPicPr preferRelativeResize="0"/></pic:nvPicPr><pic:blipFill><a:blip r:embed="rId21"/><a:srcRect b="0" l="0" r="0" t="0"/><a:stretch><a:fillRect/></a:stretch></pic:blipFill><pic:spPr><a:xfrm><a:off x="0" y="0"/><a:ext cx="6215659" cy="8360541"/></a:xfrm><a:prstGeom prst="rect"/><a:ln/></pic:spPr></pic:pic></a:graphicData></a:graphic></wp:inline></w:drawing></w:r><w:r><w:rPr><w:rtl w:val="0"/></w:rPr></w:r></w:p><w:p><w:pPr><w:rPr><w:b w:val="1"/><w:bCs w:val="1"/><w:sz w:val="28"/><w:szCs w:val="28"/><w:u w:val="single"/></w:rPr></w:pPr><w:r><w:br w:type="page"/></w:r><w:r><w:rPr><w:rtl w:val="0"/></w:rPr></w:r></w:p><w:p><w:pPr><w:keepNext w:val="0"/><w:keepLines w:val="0"/><w:pageBreakBefore w:val="0"/><w:widowControl w:val="1"/><w:pBdr><w:top w:space="0" w:sz="0" w:val="nil"/><w:left w:space="0" w:sz="0" w:val="nil"/><w:bottom w:space="0" w:sz="0" w:val="nil"/><w:right w:space="0" w:sz="0" w:val="nil"/><w:between w:space="0" w:sz="0" w:val="nil"/></w:pBdr><w:shd w:fill="auto" w:val="clear"/><w:tabs><w:tab w:val="left" w:leader="none" w:pos="4320"/><w:tab w:val="left" w:leader="none" w:pos="6120"/></w:tabs><w:spacing w:after="0" w:before="149" w:line="216" w:lineRule="auto"/><w:ind w:left="0" w:right="0" w:firstLine="0"/><w:jc w:val="left"/><w:rPr><w:rFonts w:ascii="Calibri" w:cs="Calibri" w:eastAsia="Calibri" w:hAnsi="Calibri"/><w:b w:val="1"/><w:bCs w:val="1"/><w:i w:val="0"/><w:iCs w:val="0"/><w:smallCaps w:val="0"/><w:strike w:val="0"/><w:color w:val="000000"/><w:sz w:val="28"/><w:szCs w:val="28"/><w:u w:val="single"/><w:shd w:fill="auto" w:val="clear"/><w:vertAlign w:val="baseline"/></w:rPr></w:pPr><w:r><w:rPr><w:rFonts w:ascii="Calibri" w:cs="Calibri" w:eastAsia="Calibri" w:hAnsi="Calibri"/><w:b w:val="1"/><w:bCs w:val="1"/><w:i w:val="0"/><w:iCs w:val="0"/><w:smallCaps w:val="0"/><w:strike w:val="0"/><w:color w:val="000000"/><w:sz w:val="28"/><w:szCs w:val="28"/><w:u w:val="single"/><w:shd w:fill="auto" w:val="clear"/><w:vertAlign w:val="baseline"/></w:rPr><w:drawing><wp:inline distB="0" distT="0" distL="0" distR="0"><wp:extent cx="6302905" cy="8666495"/><wp:effectExtent b="0" l="0" r="0" t="0"/><wp:docPr id="17" name="image11.png"/><a:graphic><a:graphicData uri="http://schemas.openxmlformats.org/drawingml/2006/picture"><pic:pic><pic:nvPicPr><pic:cNvPr id="0" name="image11.png"/><pic:cNvPicPr preferRelativeResize="0"/></pic:nvPicPr><pic:blipFill><a:blip r:embed="rId22"/><a:srcRect b="0" l="0" r="0" t="0"/><a:stretch><a:fillRect/></a:stretch></pic:blipFill><pic:spPr><a:xfrm><a:off x="0" y="0"/><a:ext cx="6302905" cy="8666495"/></a:xfrm><a:prstGeom prst="rect"/><a:ln/></pic:spPr></pic:pic></a:graphicData></a:graphic></wp:inline></w:drawing></w:r><w:r><w:rPr><w:rtl w:val="0"/></w:rPr></w:r></w:p><w:p><w:pPr><w:rPr><w:b w:val="1"/><w:bCs w:val="1"/><w:sz w:val="28"/><w:szCs w:val="28"/><w:u w:val="single"/></w:rPr></w:pPr><w:r><w:br w:type="page"/></w:r><w:r><w:rPr><w:rtl w:val="0"/></w:rPr></w:r></w:p><w:p><w:pPr><w:keepNext w:val="0"/><w:keepLines w:val="0"/><w:pageBreakBefore w:val="0"/><w:widowControl w:val="1"/><w:pBdr><w:top w:space="0" w:sz="0" w:val="nil"/><w:left w:space="0" w:sz="0" w:val="nil"/><w:bottom w:space="0" w:sz="0" w:val="nil"/><w:right w:space="0" w:sz="0" w:val="nil"/><w:between w:space="0" w:sz="0" w:val="nil"/></w:pBdr><w:shd w:fill="auto" w:val="clear"/><w:tabs><w:tab w:val="left" w:leader="none" w:pos="4320"/><w:tab w:val="left" w:leader="none" w:pos="6120"/></w:tabs><w:spacing w:after="0" w:before="149" w:line="216" w:lineRule="auto"/><w:ind w:left="0" w:right="0" w:firstLine="0"/><w:jc w:val="left"/><w:rPr><w:rFonts w:ascii="Calibri" w:cs="Calibri" w:eastAsia="Calibri" w:hAnsi="Calibri"/><w:b w:val="1"/><w:bCs w:val="1"/><w:i w:val="0"/><w:iCs w:val="0"/><w:smallCaps w:val="0"/><w:strike w:val="0"/><w:color w:val="000000"/><w:sz w:val="28"/><w:szCs w:val="28"/><w:u w:val="single"/><w:shd w:fill="auto" w:val="clear"/><w:vertAlign w:val="baseline"/></w:rPr></w:pPr><w:r><w:rPr><w:rtl w:val="0"/></w:rPr></w:r></w:p><w:p><w:pPr><w:rPr><w:b w:val="1"/><w:bCs w:val="1"/><w:sz w:val="28"/><w:szCs w:val="28"/><w:u w:val="single"/></w:rPr></w:pPr><w:r><w:br w:type="page"/></w:r><w:r><w:rPr><w:rtl w:val="0"/></w:rPr></w:r></w:p><w:p><w:pPr><w:keepNext w:val="0"/><w:keepLines w:val="0"/><w:pageBreakBefore w:val="0"/><w:widowControl w:val="1"/><w:pBdr><w:top w:space="0" w:sz="0" w:val="nil"/><w:left w:space="0" w:sz="0" w:val="nil"/><w:bottom w:space="0" w:sz="0" w:val="nil"/><w:right w:space="0" w:sz="0" w:val="nil"/><w:between w:space="0" w:sz="0" w:val="nil"/></w:pBdr><w:shd w:fill="auto" w:val="clear"/><w:tabs><w:tab w:val="left" w:leader="none" w:pos="4320"/><w:tab w:val="left" w:leader="none" w:pos="6120"/></w:tabs><w:spacing w:after="0" w:before="149" w:line="216" w:lineRule="auto"/><w:ind w:left="0" w:right="0" w:firstLine="0"/><w:jc w:val="left"/><w:rPr><w:rFonts w:ascii="Calibri" w:cs="Calibri" w:eastAsia="Calibri" w:hAnsi="Calibri"/><w:b w:val="1"/><w:bCs w:val="1"/><w:i w:val="0"/><w:iCs w:val="0"/><w:smallCaps w:val="0"/><w:strike w:val="0"/><w:color w:val="000000"/><w:sz w:val="28"/><w:szCs w:val="28"/><w:u w:val="single"/><w:shd w:fill="auto" w:val="clear"/><w:vertAlign w:val="baseline"/></w:rPr></w:pPr><w:r><w:rPr><w:rtl w:val="0"/></w:rPr></w:r></w:p><w:p><w:pPr><w:rPr><w:b w:val="1"/><w:bCs w:val="1"/><w:sz w:val="28"/><w:szCs w:val="28"/><w:u w:val="single"/></w:rPr></w:pPr><w:r><w:br w:type="page"/></w:r><w:r><w:rPr><w:rtl w:val="0"/></w:rPr></w:r></w:p><w:p><w:pPr><w:keepNext w:val="0"/><w:keepLines w:val="0"/><w:pageBreakBefore w:val="0"/><w:widowControl w:val="1"/><w:pBdr><w:top w:space="0" w:sz="0" w:val="nil"/><w:left w:space="0" w:sz="0" w:val="nil"/><w:bottom w:space="0" w:sz="0" w:val="nil"/><w:right w:space="0" w:sz="0" w:val="nil"/><w:between w:space="0" w:sz="0" w:val="nil"/></w:pBdr><w:shd w:fill="auto" w:val="clear"/><w:tabs><w:tab w:val="left" w:leader="none" w:pos="4320"/><w:tab w:val="left" w:leader="none" w:pos="6120"/></w:tabs><w:spacing w:after="0" w:before="149" w:line="216" w:lineRule="auto"/><w:ind w:left="0" w:right="0" w:firstLine="0"/><w:jc w:val="left"/><w:rPr><w:rFonts w:ascii="Calibri" w:cs="Calibri" w:eastAsia="Calibri" w:hAnsi="Calibri"/><w:b w:val="1"/><w:bCs w:val="1"/><w:i w:val="0"/><w:iCs w:val="0"/><w:smallCaps w:val="0"/><w:strike w:val="0"/><w:color w:val="000000"/><w:sz w:val="28"/><w:szCs w:val="28"/><w:u w:val="single"/><w:shd w:fill="auto" w:val="clear"/><w:vertAlign w:val="baseline"/></w:rPr></w:pPr><w:r><w:rPr><w:rtl w:val="0"/></w:rPr></w:r></w:p><w:p><w:pPr><w:rPr><w:b w:val="1"/><w:bCs w:val="1"/><w:sz w:val="28"/><w:szCs w:val="28"/><w:u w:val="single"/></w:rPr></w:pPr><w:r><w:br w:type="page"/></w:r><w:r><w:rPr><w:rtl w:val="0"/></w:rPr></w:r></w:p><w:p><w:pPr><w:keepNext w:val="0"/><w:keepLines w:val="0"/><w:pageBreakBefore w:val="0"/><w:widowControl w:val="1"/><w:pBdr><w:top w:space="0" w:sz="0" w:val="nil"/><w:left w:space="0" w:sz="0" w:val="nil"/><w:bottom w:space="0" w:sz="0" w:val="nil"/><w:right w:space="0" w:sz="0" w:val="nil"/><w:between w:space="0" w:sz="0" w:val="nil"/></w:pBdr><w:shd w:fill="auto" w:val="clear"/><w:tabs><w:tab w:val="left" w:leader="none" w:pos="4320"/><w:tab w:val="left" w:leader="none" w:pos="6120"/></w:tabs><w:spacing w:after="0" w:before="149" w:line="216" w:lineRule="auto"/><w:ind w:left="0" w:right="0" w:firstLine="0"/><w:jc w:val="left"/><w:rPr><w:rFonts w:ascii="Calibri" w:cs="Calibri" w:eastAsia="Calibri" w:hAnsi="Calibri"/><w:b w:val="1"/><w:bCs w:val="1"/><w:i w:val="0"/><w:iCs w:val="0"/><w:smallCaps w:val="0"/><w:strike w:val="0"/><w:color w:val="000000"/><w:sz w:val="28"/><w:szCs w:val="28"/><w:u w:val="single"/><w:shd w:fill="auto" w:val="clear"/><w:vertAlign w:val="baseline"/></w:rPr></w:pPr><w:r><w:rPr><w:rtl w:val="0"/></w:rPr></w:r></w:p><w:sectPr><w:pgSz w:h="16838" w:w="11906" w:orient="portrait"/><w:pgMar w:bottom="709" w:top="709" w:left="992" w:right="709" w:header="709" w:footer="709"/><w:pgNumType w:start="1"/></w:sectPr></w:body></w:document>
+<file path=word/document.xml><?xml version="1.0" encoding="utf-8"?>
+<w:document xmlns:mc="http://schemas.openxmlformats.org/markup-compatibility/2006" xmlns:o="urn:schemas-microsoft-com:office:office" xmlns:r="http://schemas.openxmlformats.org/officeDocument/2006/relationships" xmlns:m="http://schemas.openxmlformats.org/officeDocument/2006/math" xmlns:v="urn:schemas-microsoft-com:vml" xmlns:wp="http://schemas.openxmlformats.org/drawingml/2006/wordprocessingDrawing" xmlns:w10="urn:schemas-microsoft-com:office:word" xmlns:w="http://schemas.openxmlformats.org/wordprocessingml/2006/main" xmlns:wne="http://schemas.microsoft.com/office/word/2006/wordml" xmlns:sl="http://schemas.openxmlformats.org/schemaLibrary/2006/main" xmlns:a="http://schemas.openxmlformats.org/drawingml/2006/main" xmlns:pic="http://schemas.openxmlformats.org/drawingml/2006/picture" xmlns:c="http://schemas.openxmlformats.org/drawingml/2006/chart" xmlns:lc="http://schemas.openxmlformats.org/drawingml/2006/lockedCanvas" xmlns:dgm="http://schemas.openxmlformats.org/drawingml/2006/diagram" xmlns:wps="http://schemas.microsoft.com/office/word/2010/wordprocessingShape" xmlns:wpg="http://schemas.microsoft.com/office/word/2010/wordprocessingGroup" xmlns:w14="http://schemas.microsoft.com/office/word/2010/wordml" xmlns:w15="http://schemas.microsoft.com/office/word/2012/wordml" xmlns:w16="http://schemas.microsoft.com/office/word/2018/wordml" xmlns:w16cex="http://schemas.microsoft.com/office/word/2018/wordml/cex" xmlns:w16cid="http://schemas.microsoft.com/office/word/2016/wordml/cid" xmlns="http://schemas.microsoft.com/office/tasks/2019/documenttasks" xmlns:cr="http://schemas.microsoft.com/office/comments/2020/reactions">
+  <w:body>
+    <w:p>
+      <w:pPr>
+        <w:rPr>
+          <w:b w:val="1"/>
+          <w:bCs w:val="1"/>
+          <w:u w:val="single"/>
+        </w:rPr>
+      </w:pPr>
+      <w:r>
+        <w:rPr>
+          <w:rtl w:val="0"/>
+        </w:rPr>
+      </w:r>
+    </w:p>
+    <w:p>
+      <w:pPr>
+        <w:jc w:val="right"/>
+        <w:rPr>
+          <w:b w:val="1"/>
+          <w:bCs w:val="1"/>
+          <w:u w:val="single"/>
+        </w:rPr>
+      </w:pPr>
+      <w:r>
+        <w:rPr>
+          <w:rtl w:val="0"/>
+        </w:rPr>
+      </w:r>
+    </w:p>
+    <w:p>
+      <w:pPr>
+        <w:jc w:val="right"/>
+        <w:rPr>
+          <w:b w:val="1"/>
+          <w:bCs w:val="1"/>
+          <w:u w:val="single"/>
+        </w:rPr>
+      </w:pPr>
+      <w:r>
+        <w:rPr>
+          <w:rtl w:val="0"/>
+        </w:rPr>
+      </w:r>
+    </w:p>
+    <w:p>
+      <w:pPr>
+        <w:jc w:val="right"/>
+        <w:rPr>
+          <w:b w:val="1"/>
+          <w:bCs w:val="1"/>
+          <w:u w:val="single"/>
+        </w:rPr>
+      </w:pPr>
+      <w:r>
+        <w:rPr>
+          <w:rtl w:val="0"/>
+        </w:rPr>
+      </w:r>
+    </w:p>
+    <w:p>
+      <w:pPr>
+        <w:jc w:val="right"/>
+        <w:rPr>
+          <w:b w:val="1"/>
+          <w:bCs w:val="1"/>
+          <w:u w:val="single"/>
+        </w:rPr>
+      </w:pPr>
+      <w:r>
+        <w:rPr>
+          <w:rtl w:val="0"/>
+        </w:rPr>
+      </w:r>
+    </w:p>
+    <w:p>
+      <w:pPr>
+        <w:jc w:val="right"/>
+        <w:rPr>
+          <w:b w:val="1"/>
+          <w:bCs w:val="1"/>
+          <w:u w:val="single"/>
+        </w:rPr>
+      </w:pPr>
+      <w:r>
+        <w:rPr>
+          <w:rtl w:val="0"/>
+        </w:rPr>
+      </w:r>
+    </w:p>
+    <w:p>
+      <w:pPr>
+        <w:jc w:val="right"/>
+        <w:rPr>
+          <w:b w:val="1"/>
+          <w:bCs w:val="1"/>
+          <w:u w:val="single"/>
+        </w:rPr>
+      </w:pPr>
+      <w:r>
+        <w:rPr>
+          <w:rtl w:val="0"/>
+        </w:rPr>
+      </w:r>
+    </w:p>
+    <w:p>
+      <w:pPr>
+        <w:jc w:val="right"/>
+        <w:rPr>
+          <w:b w:val="1"/>
+          <w:bCs w:val="1"/>
+          <w:u w:val="single"/>
+        </w:rPr>
+      </w:pPr>
+      <w:r>
+        <w:rPr>
+          <w:b w:val="1"/>
+          <w:bCs w:val="1"/>
+          <w:u w:val="single"/>
+          <w:rtl w:val="0"/>
+        </w:rPr>
+        <w:t xml:space="preserve">Appendix-II</w:t>
+      </w:r>
+    </w:p>
+    <w:p>
+      <w:pPr>
+        <w:rPr>
+          <w:b w:val="1"/>
+          <w:bCs w:val="1"/>
+          <w:u w:val="single"/>
+        </w:rPr>
+      </w:pPr>
+      <w:r>
+        <w:rPr>
+          <w:rtl w:val="0"/>
+        </w:rPr>
+      </w:r>
+    </w:p>
+    <w:p>
+      <w:pPr>
+        <w:rPr>
+          <w:b w:val="1"/>
+          <w:bCs w:val="1"/>
+          <w:u w:val="single"/>
+        </w:rPr>
+      </w:pPr>
+      <w:r>
+        <w:rPr>
+          <w:rtl w:val="0"/>
+        </w:rPr>
+      </w:r>
+    </w:p>
+    <w:p>
+      <w:pPr>
+        <w:rPr>
+          <w:b w:val="1"/>
+          <w:bCs w:val="1"/>
+        </w:rPr>
+      </w:pPr>
+      <w:r>
+        <w:rPr>
+          <w:b w:val="1"/>
+          <w:bCs w:val="1"/>
+        </w:rPr>
+        <w:t xml:space="preserve">Ref. No. {firmReferenceNo}                                        Date: {reportDate}VALUATION REPORT OF {ownerName} AtFLAT NO. 4901, 49TH FLOOR, EAST WING, THE WORLD CREST, SENAPATI BAPAT MARG. CS NO. 443, 444, 445(PT), 446 OF VILLAGE LOWER PAREL, MUMBAI 400013FORPNB, LALBAUG BRANCH  -302258526415PUNJAB NATIONAL BANK, {bankBranch}VALUATION REPORT (IN RESPECT OF FLAT)SR.NOParticularsContentI GENERAL  Name  address of the Valuer2.Purpose for which the valuation is made3.a) Date of inspectionb) Date on which the valuation is made4.List of documents produced for perusalAgreement for SalePart Occupancy CertificateIndex IIOther Documents5.Name of the owner(s) and his / their address (es)With Phone no. (details of share of each owner incase of joint ownership)Owner: Contact No.: Ownership: 6.Brief description of the property7.Location of propertyPlot No. / Survey No.Door No.C. T. S. No. / VillageWard / TalukaMandal / DistrictDate of issue and validity of layout of approved map / planApproved map / plan issuing authorityWhether genuineness of authority of approved map / plan is verifiedAny other comments on authentic of approved planComment on unauthorized construction if any  Comment on demolition proceedings if any 8.Postal address of the property9.City / TownResidential AreaCommercial AreaIndustrial Area10.Classification of the areai) High / Middle / Poorii) Urban / Semi Urban / Rural11.Coming under Corporation limit / Village Panchayat / Municipality12.Whether covered under any State / Central Govt. Enactments (e.g. Urban Land Ceiling Act) or notified under agency area / scheduled area / cantonment area13.Boundaries of the property(As per Site)(As per Flat)EastWestNorthSouth14.Dimensions of the site / FlatABAs per the DeedActuals15.Extent of the site15.1Latitude, Longitude,  Co-ordinates of Flat16Extent of the site considered for valuation (least of 13A  13B)17Whether occupied by the owner / tenant? If occupied by tenant, since how long?II.FLAT1.Name of the Apartment 2.Description of the localityResidential / Commercial / Mixed3.Year of Construction4.Number of Floors5.Type of Structure6.Number of Dwelling flats7.Quality of Construction8.Appearance of the Flat9.Maintenance of the Flat10.Facilities AvailableLiftProtected Water SupplyUnderground SewerageCar Parking – Open / CoveredDoes Compound wall exist?Is pavement laid around the Flat?IIIFLAT1The floor on which the Flat is situated2Door No. of the Flat3Specification of the FlatRoofFlooringDoorsWindowsFittingsFinishing4House TaxAssessment No.Tax paid in the name ofTax amount5Electricity Service Connection no.Meter Card is in the name of6How is the maintenance of the Flat?7Sale Deed executed in the name of8What is the undivided area of land as per Sale Deed?9What is the plinth area of the Flat?10What is the floor space index (app.)11What is the Carpet  Built-up Area of the Flat?12Is it Posh/ I class / Medium / Ordinary?13Is it being used for Residential or Commercial Purpose?14Is it Owner-occupied or let out?15If rented, what is the monthly rent?IVMARKETABILITY1How is the marketability?2What are the factors favouring for an extra Potential Value?3Any negative factors are observed which affect the Market value in general?VRate1After analysing the comparable sale instances, what is the composite rate for a similar flat with same Specifications in the adjoining locality?2Assuming it is a new construction, what is theadopted basic composite are of the flat under valuation after comparing with the specifications and other factors with the flat under comparison (give details).3Break-up for the ratei) Flat + Servicesii) Land + Others4Guideline rate obtained from the Registrar’s office (an Evidence thereof to be enclosed)VICOMPOSITE RATE ADOPTED AFTER DEPRECIATIONa.Depreciation Flat rateReplacement cost of Flat with Services (v (3)i)Age of the FlatLife of the Flat estimatedDepreciation percentage assuming the salvage values 100%Depreciated Ratio of the Flatb.Total composite rate arrived for valuationDepreciated Flat rate VI (a)Rate for Land  other V (3) iiTotal Composite RateDetails of Valuation:Sr. NoDescription Built up AreaRate per sq. ft.(Rs. / sq. ft.)Estimated Value Rs.1Present value of the Flat No. 49012825{compositeRatePerSqFt}{buildingValue}2Car Parking3{carParkingValuePerUnit}{carParkingTotalValue}3Summary of Value {finalValue}Remarks:Report finalized based on site visit and copy of Agreement for sale, Part OC, Index II, Share Certificate, Property Tax, etc. However, we have not been Provided, C.C., Typical Floor Plan, Approved plan, Electricity Bill, title report, etc. for Verification Purposed. The said property is owner occupied at the time of visit.Flat number was displayed on main entrance door.The said property is situated in residential area.Property is inspected as shown by Mrs. Moksha  (Owner). We consider the area given in the Agreement for sale/Index II declared by the party and submitted for registration with the government authorities as final for valuation purpose. Any area that is not stated in the Agreement for sale/Index II is not considered for valuation unless the area is measured by us in which case that may be considered for valuation purpose.The scope of our valuation work is only for banks financial/loan purpose. Further, please be noted that this report shall not be used for any litigation purpose. Encumbrance of Loan, Government and other dues, stamp duty, registration charges, transfer charges etc, if any are not considered in the valuation. We assumed that the assets are free from encumbrance unless otherwise stated to us by the party in writing.The value given in our report is the estimate of the Fair Market value of the property as on date, considering various aspects of the property as mentioned above.  As a result of my appraisal and analysis, it is my considered opinion that the present market value of the Above property in prevailing condition with aforesaid specifications is value {finalValue} ({finalValueWords}) 1Fair Market Value of immovable property:2Realizable Value of immovable property: (90%)3Distress Sale Value of immovable property: (80%)4Guideline Value (value as per Circle Rates),if applicable, in the area where immovable property is situated5Insurance Value6Date of purchase of immovable property:7Purchase Price of immovable property:Place: {firmCity}Date: {reportDate}{rvFullName}{rvQualifications}Govt. Regd. Valuer  Panel Valuer of Punjab National Bank ({rvIbbiRegNo})I hereby declare that:The information furnished is my valuation report dated {reportDate} is true and correct to the best of my knowledge and belief and I have made an impartial and true valuation of the property. I have no direct or indirect interest in the property valued.Our Engineer Mr. Jitendra Bhagat has inspected the property on {inspectionDate}. I have not been convicted of any offence and sentenced to a term of imprisonment. I have not been found guilty of misconduct in my professional capacity.I have read the Handbook on Policy Standards and procedure for Real Estate valuation, 2011 of the IBA and this report is in conformity to the “Standard” enshrined for valuation in the Part-B of the above handbook to the best of my ability.I have Read the International Valuation Standards (IVS) and the report submitted to the Bank of the respective asset class is in conformity to the “Standard” as enshrined for valuation in the IVS in “General standard” and “Asset Standards” as applicable.I abide by the Model Code of Conduct for empanelment of valuer in the Bank. (Annexure III-A signed Copy of Same to be taken and kept along with this declaration).I am registered under Section 34 AB of the Wealth Tax Act, 1957.I am the proprietor / partner / authorized official of the firm / company, who is competent to sign this valuation report.Further, I hereby provide the Following information.Sr. No.ParticularsValuer commentBackground information of the asset being valued;Purpose of valuation and appointing authorityIdentity of the valuer and any other experts involved in the valuation;Disclosure of valuer interest or conflict, if any;Date of appointment, valuation date and date of report;Inspections and/or investigations undertaken;Nature and sources of the information used or relied upon;Procedures adopted in carrying out the valuation and valuation standards followed;Restrictions on use of the report, if any;Major factors that were taken into account during the valuation;Major factors that were not taken into account during valuation;Caveats, limitations and disclaimers to the extent they explain or elucidate the limitations faced by valuer, which shall not be for the purpose of limiting his responsibility for the valuation report.MODEL CODE OF CONDUCT FOR VALUERS{Adopted in line with Companies (Registered Valuers and Valuation Rules, 2017)}All valuers empanelled with bank shall strictly adhere to the following code of conduct: Integrity and Fairness 1. A valuer shall, in the conduct of his/its business, follow high standards of integrity and fairness in all his/its dealings with his/its clients and other valuers. 2. A valuer shall maintain integrity by being honest, straightforward, and forthright in all professional relationships. 3. A valuer shall endeavour to ensure that he/it provides true and adequate information and shall not misrepresent any facts or situations. 4. A valuer shall refrain from being involved in any action that would bring disrepute to the profession. 5 A valuer shall keep public interest foremost while delivering his services. Professional Competence and Due Care 6. A valuer shall render at all times high standards of service, exercise due diligence, ensure proper care and exercise independent professional judgment. 7. A valuer shall carry out professional services in accordance with the relevant technical and professional standards that may be specified from time to time 8. A valuer shall continuously maintain professional knowledge and skill to provide competent professional service based on up-to-date developments in practice, prevailing regulations/guidelines and techniques. 9. In the preparation of a valuation report, the valuer shall not disclaim liability for his/its expertise or deny his/its duty of care, except to the extent that the assumptions are based on statements of fact provided by the company or its auditors or consultants or information available in public domain and not generated by the valuer. 10. A valuer shall not carry out any instruction of the client insofar as they are incompatible with the requirements of integrity, objectivity and independence. 11. A valuer shall clearly state to his client the services that he would be and competent to provide the services for which he would be relying on other valuers or professionals or for which the Independence and Disclosure of Interest. 12. A valuer shall act with objectivity in his/its professional dealings by ensuring that his/its decisions are made without the presence of any bias, conflict of Interest, coercion, or undue influence of any party, whether directly connected to the valuation assignment or not. 13. A valuer shall not take up an assignment If he/it or any of his/its relatives or associates is not independent in terms of association to the company. 14. A valuer shall maintain complete independence in his/its professional relationships and shall conduct the valuation Independent of external influences. 15. A valuer shall wherever necessary disclose to the clients, possible sources of conflicts of duties and interests, while providing unbiased services. 16. A valuer shall not deal in securities of any subject company after any time when he/it first becomes aware of the possibility of his/its association with the valuation, and in accordance with the Securities and Exchange Board of India (Prohibition of Insider Trading) Regulations, 2015 or till the time the valuation report becomes public, whichever is earlier. 17. A valuer shall not indulge in mandate snatching or offering convenience valuations in order to cater to a company or client's needs. 18. As an independent valuer, the valuer shall not charge success fee (Success fees may be defined as a compensation incentive paid to any third party for successful closure of transaction. In this case, approval of credit proposals). 19. In any fairness opinion or independent expert opinion submitted by a valuer, if there has been a prior engagement in an unconnected transaction, the valuer shall declare the association with the company during the last five years. Confidentiality 20. A valuer shall not use or divulge to other clients or any other party any confidential information about the subject company, which has come to his/its knowledge without proper and specific authority or unless there is a legal or professional right or duty to disclose.Information Management 21. A valuer shall ensure that he/ it maintains written contemporaneous records for any decision taken, the reasons for taking the decision, and the information and evidence in support of such decision. This shall be maintained so as to sufficiently enable a reasonable person to take a view on the appropriateness of his/its decisions and actions. 22. A valuer shall appear, co-operate and be available for inspections and investigations carried out by the authority, any person authorised by the authority, the registered valuers organisation with which he/it is registered or any other statutory regulatory body.23. A valuer shall provide all information and records as may be required by the authority, the Tribunal, Appellate Tribunal, , the registered valuers organisation with which he/it is any registered, u other statutory regulatory body. 24. A valuer while respecting the confidentiality of information performing professional acquired during the course of services, shall maintain proper working papers for a period of three years or such longer period as required in its contract for a specific valuation, for production before a regulatory authority or for a peer review. In the event of a pending case before the Tribunal or Appellate Tribunal, the record shall be maintained till the disposal of the case. Gifts and hospitality: 25. A valuer or his/its relative shall not accept gifts or hospitality which undermines or affects independence as a valuer. Explanation. - For the purposes of this code the term 'relative' shall have the same meaning as defined in clause (77) of Section 2 of the Companies Act, 2013 (18 of 2013) 26. A valuer shall not offer gifts or hospitality or a financial or any other advantage to a public servant or any other person with a view to obtain or retain work for himself/ itself, or to obtain or retain an advantage in the conduct of profession for himself/ itself. Remuneration and Costs. 27. A valuer shall provide services for remuneration which is charged in a transparent manner, is a reasonable reflection of the work necessarily and properly undertaken and is not inconsistent with the applicable rules. 28. A valuer shall not accept any fees or charges other than those which are disclosed in a written contract with the person to whom he would be rendering service. Occupation, employability and restrictions. 29. A valuer shall refrain from accepting too many assignments, if he/it is unlikely to be able to devote adequate time to each of his/ its assignments. 30. A valuer shall not conduct business which in the opinion of the authority or the registered valuer organisation discredits the profession. Photographs of the Property                             LOCATION MAPGOVT. READY RECKONER RATE {govtRateYear}ComparablePROPERTY DOCUMENT</w:t>
+      </w:r>
+    </w:p>
+  </w:body>
+</w:document>
 </file>
 
 <file path=word/numbering.xml><?xml version="1.0" encoding="utf-8"?>

</xml_diff>